<commit_message>
Point the repository links at the renamed remotes
The GitHub repositories were renamed from swor and swor-front to kinyo and
kinyo-front; update Section 4.3 and the local remotes to match so the links in
the report do not depend on a redirect.

Co-Authored-By: Claude Opus 5 (1M context) <noreply@anthropic.com>
Claude-Session: https://claude.ai/code/session_0196JS1u5qEW9XzS4ZPnTL2s
</commit_message>
<xml_diff>
--- a/docs/Kinyo_ProjectVI_Proposal.docx
+++ b/docs/Kinyo_ProjectVI_Proposal.docx
@@ -16,7 +16,7 @@
           <w:noProof/>
         </w:rPr>
         <w:drawing>
-          <wp:inline distT="0" distB="0" distL="0" distR="0" wp14:anchorId="585537B9" wp14:editId="5847A8DF">
+          <wp:inline distT="0" distB="0" distL="0" distR="0" wp14:anchorId="27C3D77E" wp14:editId="1F2EB592">
             <wp:extent cx="1273012" cy="1114425"/>
             <wp:effectExtent l="0" t="0" r="0" b="0"/>
             <wp:docPr id="1" name="image1.png" descr="Purbanchal University logo"/>
@@ -272,7 +272,7 @@
         <w:spacing w:line="480" w:lineRule="auto"/>
         <w:jc w:val="center"/>
       </w:pPr>
-      <w:bookmarkStart w:id="0" w:name="_Toc239252029"/>
+      <w:bookmarkStart w:id="0" w:name="_Toc239252151"/>
       <w:r>
         <w:rPr>
           <w:b/>
@@ -337,7 +337,7 @@
         <w:spacing w:line="480" w:lineRule="auto"/>
         <w:jc w:val="center"/>
       </w:pPr>
-      <w:bookmarkStart w:id="1" w:name="_Toc239252030"/>
+      <w:bookmarkStart w:id="1" w:name="_Toc239252152"/>
       <w:r>
         <w:rPr>
           <w:b/>
@@ -374,7 +374,7 @@
       <w:r>
         <w:fldChar w:fldCharType="separate"/>
       </w:r>
-      <w:hyperlink w:anchor="_Toc239252029" w:history="1">
+      <w:hyperlink w:anchor="_Toc239252151" w:history="1">
         <w:r>
           <w:rPr>
             <w:rStyle w:val="Hyperlink"/>
@@ -402,7 +402,7 @@
             <w:noProof/>
             <w:webHidden/>
           </w:rPr>
-          <w:instrText xml:space="preserve"> PAGEREF _Toc239252029 \h </w:instrText>
+          <w:instrText xml:space="preserve"> PAGEREF _Toc239252151 \h </w:instrText>
         </w:r>
         <w:r>
           <w:rPr>
@@ -447,7 +447,7 @@
           <w14:ligatures w14:val="standardContextual"/>
         </w:rPr>
       </w:pPr>
-      <w:hyperlink w:anchor="_Toc239252030" w:history="1">
+      <w:hyperlink w:anchor="_Toc239252152" w:history="1">
         <w:r>
           <w:rPr>
             <w:rStyle w:val="Hyperlink"/>
@@ -476,7 +476,7 @@
             <w:noProof/>
             <w:webHidden/>
           </w:rPr>
-          <w:instrText xml:space="preserve"> PAGEREF _Toc239252030 \h </w:instrText>
+          <w:instrText xml:space="preserve"> PAGEREF _Toc239252152 \h </w:instrText>
         </w:r>
         <w:r>
           <w:rPr>
@@ -521,7 +521,7 @@
           <w14:ligatures w14:val="standardContextual"/>
         </w:rPr>
       </w:pPr>
-      <w:hyperlink w:anchor="_Toc239252031" w:history="1">
+      <w:hyperlink w:anchor="_Toc239252153" w:history="1">
         <w:r>
           <w:rPr>
             <w:rStyle w:val="Hyperlink"/>
@@ -550,7 +550,7 @@
             <w:noProof/>
             <w:webHidden/>
           </w:rPr>
-          <w:instrText xml:space="preserve"> PAGEREF _Toc239252031 \h </w:instrText>
+          <w:instrText xml:space="preserve"> PAGEREF _Toc239252153 \h </w:instrText>
         </w:r>
         <w:r>
           <w:rPr>
@@ -595,7 +595,7 @@
           <w14:ligatures w14:val="standardContextual"/>
         </w:rPr>
       </w:pPr>
-      <w:hyperlink w:anchor="_Toc239252032" w:history="1">
+      <w:hyperlink w:anchor="_Toc239252154" w:history="1">
         <w:r>
           <w:rPr>
             <w:rStyle w:val="Hyperlink"/>
@@ -624,7 +624,7 @@
             <w:noProof/>
             <w:webHidden/>
           </w:rPr>
-          <w:instrText xml:space="preserve"> PAGEREF _Toc239252032 \h </w:instrText>
+          <w:instrText xml:space="preserve"> PAGEREF _Toc239252154 \h </w:instrText>
         </w:r>
         <w:r>
           <w:rPr>
@@ -669,7 +669,7 @@
           <w14:ligatures w14:val="standardContextual"/>
         </w:rPr>
       </w:pPr>
-      <w:hyperlink w:anchor="_Toc239252033" w:history="1">
+      <w:hyperlink w:anchor="_Toc239252155" w:history="1">
         <w:r>
           <w:rPr>
             <w:rStyle w:val="Hyperlink"/>
@@ -698,7 +698,7 @@
             <w:noProof/>
             <w:webHidden/>
           </w:rPr>
-          <w:instrText xml:space="preserve"> PAGEREF _Toc239252033 \h </w:instrText>
+          <w:instrText xml:space="preserve"> PAGEREF _Toc239252155 \h </w:instrText>
         </w:r>
         <w:r>
           <w:rPr>
@@ -743,7 +743,7 @@
           <w14:ligatures w14:val="standardContextual"/>
         </w:rPr>
       </w:pPr>
-      <w:hyperlink w:anchor="_Toc239252034" w:history="1">
+      <w:hyperlink w:anchor="_Toc239252156" w:history="1">
         <w:r>
           <w:rPr>
             <w:rStyle w:val="Hyperlink"/>
@@ -772,7 +772,7 @@
             <w:noProof/>
             <w:webHidden/>
           </w:rPr>
-          <w:instrText xml:space="preserve"> PAGEREF _Toc239252034 \h </w:instrText>
+          <w:instrText xml:space="preserve"> PAGEREF _Toc239252156 \h </w:instrText>
         </w:r>
         <w:r>
           <w:rPr>
@@ -817,7 +817,7 @@
           <w14:ligatures w14:val="standardContextual"/>
         </w:rPr>
       </w:pPr>
-      <w:hyperlink w:anchor="_Toc239252035" w:history="1">
+      <w:hyperlink w:anchor="_Toc239252157" w:history="1">
         <w:r>
           <w:rPr>
             <w:rStyle w:val="Hyperlink"/>
@@ -846,7 +846,7 @@
             <w:noProof/>
             <w:webHidden/>
           </w:rPr>
-          <w:instrText xml:space="preserve"> PAGEREF _Toc239252035 \h </w:instrText>
+          <w:instrText xml:space="preserve"> PAGEREF _Toc239252157 \h </w:instrText>
         </w:r>
         <w:r>
           <w:rPr>
@@ -891,7 +891,7 @@
           <w14:ligatures w14:val="standardContextual"/>
         </w:rPr>
       </w:pPr>
-      <w:hyperlink w:anchor="_Toc239252036" w:history="1">
+      <w:hyperlink w:anchor="_Toc239252158" w:history="1">
         <w:r>
           <w:rPr>
             <w:rStyle w:val="Hyperlink"/>
@@ -920,7 +920,7 @@
             <w:noProof/>
             <w:webHidden/>
           </w:rPr>
-          <w:instrText xml:space="preserve"> PAGEREF _Toc239252036 \h </w:instrText>
+          <w:instrText xml:space="preserve"> PAGEREF _Toc239252158 \h </w:instrText>
         </w:r>
         <w:r>
           <w:rPr>
@@ -965,7 +965,7 @@
           <w14:ligatures w14:val="standardContextual"/>
         </w:rPr>
       </w:pPr>
-      <w:hyperlink w:anchor="_Toc239252037" w:history="1">
+      <w:hyperlink w:anchor="_Toc239252159" w:history="1">
         <w:r>
           <w:rPr>
             <w:rStyle w:val="Hyperlink"/>
@@ -994,7 +994,7 @@
             <w:noProof/>
             <w:webHidden/>
           </w:rPr>
-          <w:instrText xml:space="preserve"> PAGEREF _Toc239252037 \h </w:instrText>
+          <w:instrText xml:space="preserve"> PAGEREF _Toc239252159 \h </w:instrText>
         </w:r>
         <w:r>
           <w:rPr>
@@ -1039,7 +1039,7 @@
           <w14:ligatures w14:val="standardContextual"/>
         </w:rPr>
       </w:pPr>
-      <w:hyperlink w:anchor="_Toc239252038" w:history="1">
+      <w:hyperlink w:anchor="_Toc239252160" w:history="1">
         <w:r>
           <w:rPr>
             <w:rStyle w:val="Hyperlink"/>
@@ -1069,7 +1069,7 @@
             <w:noProof/>
             <w:webHidden/>
           </w:rPr>
-          <w:instrText xml:space="preserve"> PAGEREF _Toc239252038 \h </w:instrText>
+          <w:instrText xml:space="preserve"> PAGEREF _Toc239252160 \h </w:instrText>
         </w:r>
         <w:r>
           <w:rPr>
@@ -1114,7 +1114,7 @@
           <w14:ligatures w14:val="standardContextual"/>
         </w:rPr>
       </w:pPr>
-      <w:hyperlink w:anchor="_Toc239252039" w:history="1">
+      <w:hyperlink w:anchor="_Toc239252161" w:history="1">
         <w:r>
           <w:rPr>
             <w:rStyle w:val="Hyperlink"/>
@@ -1144,7 +1144,7 @@
             <w:noProof/>
             <w:webHidden/>
           </w:rPr>
-          <w:instrText xml:space="preserve"> PAGEREF _Toc239252039 \h </w:instrText>
+          <w:instrText xml:space="preserve"> PAGEREF _Toc239252161 \h </w:instrText>
         </w:r>
         <w:r>
           <w:rPr>
@@ -1189,7 +1189,7 @@
           <w14:ligatures w14:val="standardContextual"/>
         </w:rPr>
       </w:pPr>
-      <w:hyperlink w:anchor="_Toc239252040" w:history="1">
+      <w:hyperlink w:anchor="_Toc239252162" w:history="1">
         <w:r>
           <w:rPr>
             <w:rStyle w:val="Hyperlink"/>
@@ -1218,7 +1218,7 @@
             <w:noProof/>
             <w:webHidden/>
           </w:rPr>
-          <w:instrText xml:space="preserve"> PAGEREF _Toc239252040 \h </w:instrText>
+          <w:instrText xml:space="preserve"> PAGEREF _Toc239252162 \h </w:instrText>
         </w:r>
         <w:r>
           <w:rPr>
@@ -1263,7 +1263,7 @@
           <w14:ligatures w14:val="standardContextual"/>
         </w:rPr>
       </w:pPr>
-      <w:hyperlink w:anchor="_Toc239252041" w:history="1">
+      <w:hyperlink w:anchor="_Toc239252163" w:history="1">
         <w:r>
           <w:rPr>
             <w:rStyle w:val="Hyperlink"/>
@@ -1292,7 +1292,7 @@
             <w:noProof/>
             <w:webHidden/>
           </w:rPr>
-          <w:instrText xml:space="preserve"> PAGEREF _Toc239252041 \h </w:instrText>
+          <w:instrText xml:space="preserve"> PAGEREF _Toc239252163 \h </w:instrText>
         </w:r>
         <w:r>
           <w:rPr>
@@ -1337,7 +1337,7 @@
           <w14:ligatures w14:val="standardContextual"/>
         </w:rPr>
       </w:pPr>
-      <w:hyperlink w:anchor="_Toc239252042" w:history="1">
+      <w:hyperlink w:anchor="_Toc239252164" w:history="1">
         <w:r>
           <w:rPr>
             <w:rStyle w:val="Hyperlink"/>
@@ -1366,7 +1366,7 @@
             <w:noProof/>
             <w:webHidden/>
           </w:rPr>
-          <w:instrText xml:space="preserve"> PAGEREF _Toc239252042 \h </w:instrText>
+          <w:instrText xml:space="preserve"> PAGEREF _Toc239252164 \h </w:instrText>
         </w:r>
         <w:r>
           <w:rPr>
@@ -1411,7 +1411,7 @@
           <w14:ligatures w14:val="standardContextual"/>
         </w:rPr>
       </w:pPr>
-      <w:hyperlink w:anchor="_Toc239252043" w:history="1">
+      <w:hyperlink w:anchor="_Toc239252165" w:history="1">
         <w:r>
           <w:rPr>
             <w:rStyle w:val="Hyperlink"/>
@@ -1440,7 +1440,7 @@
             <w:noProof/>
             <w:webHidden/>
           </w:rPr>
-          <w:instrText xml:space="preserve"> PAGEREF _Toc239252043 \h </w:instrText>
+          <w:instrText xml:space="preserve"> PAGEREF _Toc239252165 \h </w:instrText>
         </w:r>
         <w:r>
           <w:rPr>
@@ -1485,7 +1485,7 @@
           <w14:ligatures w14:val="standardContextual"/>
         </w:rPr>
       </w:pPr>
-      <w:hyperlink w:anchor="_Toc239252044" w:history="1">
+      <w:hyperlink w:anchor="_Toc239252166" w:history="1">
         <w:r>
           <w:rPr>
             <w:rStyle w:val="Hyperlink"/>
@@ -1514,7 +1514,7 @@
             <w:noProof/>
             <w:webHidden/>
           </w:rPr>
-          <w:instrText xml:space="preserve"> PAGEREF _Toc239252044 \h </w:instrText>
+          <w:instrText xml:space="preserve"> PAGEREF _Toc239252166 \h </w:instrText>
         </w:r>
         <w:r>
           <w:rPr>
@@ -1559,7 +1559,7 @@
           <w14:ligatures w14:val="standardContextual"/>
         </w:rPr>
       </w:pPr>
-      <w:hyperlink w:anchor="_Toc239252045" w:history="1">
+      <w:hyperlink w:anchor="_Toc239252167" w:history="1">
         <w:r>
           <w:rPr>
             <w:rStyle w:val="Hyperlink"/>
@@ -1588,7 +1588,7 @@
             <w:noProof/>
             <w:webHidden/>
           </w:rPr>
-          <w:instrText xml:space="preserve"> PAGEREF _Toc239252045 \h </w:instrText>
+          <w:instrText xml:space="preserve"> PAGEREF _Toc239252167 \h </w:instrText>
         </w:r>
         <w:r>
           <w:rPr>
@@ -1633,7 +1633,7 @@
           <w14:ligatures w14:val="standardContextual"/>
         </w:rPr>
       </w:pPr>
-      <w:hyperlink w:anchor="_Toc239252046" w:history="1">
+      <w:hyperlink w:anchor="_Toc239252168" w:history="1">
         <w:r>
           <w:rPr>
             <w:rStyle w:val="Hyperlink"/>
@@ -1662,7 +1662,7 @@
             <w:noProof/>
             <w:webHidden/>
           </w:rPr>
-          <w:instrText xml:space="preserve"> PAGEREF _Toc239252046 \h </w:instrText>
+          <w:instrText xml:space="preserve"> PAGEREF _Toc239252168 \h </w:instrText>
         </w:r>
         <w:r>
           <w:rPr>
@@ -1707,7 +1707,7 @@
           <w14:ligatures w14:val="standardContextual"/>
         </w:rPr>
       </w:pPr>
-      <w:hyperlink w:anchor="_Toc239252047" w:history="1">
+      <w:hyperlink w:anchor="_Toc239252169" w:history="1">
         <w:r>
           <w:rPr>
             <w:rStyle w:val="Hyperlink"/>
@@ -1736,7 +1736,7 @@
             <w:noProof/>
             <w:webHidden/>
           </w:rPr>
-          <w:instrText xml:space="preserve"> PAGEREF _Toc239252047 \h </w:instrText>
+          <w:instrText xml:space="preserve"> PAGEREF _Toc239252169 \h </w:instrText>
         </w:r>
         <w:r>
           <w:rPr>
@@ -1781,7 +1781,7 @@
           <w14:ligatures w14:val="standardContextual"/>
         </w:rPr>
       </w:pPr>
-      <w:hyperlink w:anchor="_Toc239252048" w:history="1">
+      <w:hyperlink w:anchor="_Toc239252170" w:history="1">
         <w:r>
           <w:rPr>
             <w:rStyle w:val="Hyperlink"/>
@@ -1810,7 +1810,7 @@
             <w:noProof/>
             <w:webHidden/>
           </w:rPr>
-          <w:instrText xml:space="preserve"> PAGEREF _Toc239252048 \h </w:instrText>
+          <w:instrText xml:space="preserve"> PAGEREF _Toc239252170 \h </w:instrText>
         </w:r>
         <w:r>
           <w:rPr>
@@ -1855,7 +1855,7 @@
           <w14:ligatures w14:val="standardContextual"/>
         </w:rPr>
       </w:pPr>
-      <w:hyperlink w:anchor="_Toc239252049" w:history="1">
+      <w:hyperlink w:anchor="_Toc239252171" w:history="1">
         <w:r>
           <w:rPr>
             <w:rStyle w:val="Hyperlink"/>
@@ -1884,7 +1884,7 @@
             <w:noProof/>
             <w:webHidden/>
           </w:rPr>
-          <w:instrText xml:space="preserve"> PAGEREF _Toc239252049 \h </w:instrText>
+          <w:instrText xml:space="preserve"> PAGEREF _Toc239252171 \h </w:instrText>
         </w:r>
         <w:r>
           <w:rPr>
@@ -1929,7 +1929,7 @@
           <w14:ligatures w14:val="standardContextual"/>
         </w:rPr>
       </w:pPr>
-      <w:hyperlink w:anchor="_Toc239252050" w:history="1">
+      <w:hyperlink w:anchor="_Toc239252172" w:history="1">
         <w:r>
           <w:rPr>
             <w:rStyle w:val="Hyperlink"/>
@@ -1958,7 +1958,7 @@
             <w:noProof/>
             <w:webHidden/>
           </w:rPr>
-          <w:instrText xml:space="preserve"> PAGEREF _Toc239252050 \h </w:instrText>
+          <w:instrText xml:space="preserve"> PAGEREF _Toc239252172 \h </w:instrText>
         </w:r>
         <w:r>
           <w:rPr>
@@ -2003,7 +2003,7 @@
           <w14:ligatures w14:val="standardContextual"/>
         </w:rPr>
       </w:pPr>
-      <w:hyperlink w:anchor="_Toc239252051" w:history="1">
+      <w:hyperlink w:anchor="_Toc239252173" w:history="1">
         <w:r>
           <w:rPr>
             <w:rStyle w:val="Hyperlink"/>
@@ -2032,7 +2032,7 @@
             <w:noProof/>
             <w:webHidden/>
           </w:rPr>
-          <w:instrText xml:space="preserve"> PAGEREF _Toc239252051 \h </w:instrText>
+          <w:instrText xml:space="preserve"> PAGEREF _Toc239252173 \h </w:instrText>
         </w:r>
         <w:r>
           <w:rPr>
@@ -2077,7 +2077,7 @@
           <w14:ligatures w14:val="standardContextual"/>
         </w:rPr>
       </w:pPr>
-      <w:hyperlink w:anchor="_Toc239252052" w:history="1">
+      <w:hyperlink w:anchor="_Toc239252174" w:history="1">
         <w:r>
           <w:rPr>
             <w:rStyle w:val="Hyperlink"/>
@@ -2105,7 +2105,7 @@
             <w:noProof/>
             <w:webHidden/>
           </w:rPr>
-          <w:instrText xml:space="preserve"> PAGEREF _Toc239252052 \h </w:instrText>
+          <w:instrText xml:space="preserve"> PAGEREF _Toc239252174 \h </w:instrText>
         </w:r>
         <w:r>
           <w:rPr>
@@ -2150,7 +2150,7 @@
           <w14:ligatures w14:val="standardContextual"/>
         </w:rPr>
       </w:pPr>
-      <w:hyperlink w:anchor="_Toc239252053" w:history="1">
+      <w:hyperlink w:anchor="_Toc239252175" w:history="1">
         <w:r>
           <w:rPr>
             <w:rStyle w:val="Hyperlink"/>
@@ -2178,7 +2178,7 @@
             <w:noProof/>
             <w:webHidden/>
           </w:rPr>
-          <w:instrText xml:space="preserve"> PAGEREF _Toc239252053 \h </w:instrText>
+          <w:instrText xml:space="preserve"> PAGEREF _Toc239252175 \h </w:instrText>
         </w:r>
         <w:r>
           <w:rPr>
@@ -2223,7 +2223,7 @@
           <w14:ligatures w14:val="standardContextual"/>
         </w:rPr>
       </w:pPr>
-      <w:hyperlink w:anchor="_Toc239252054" w:history="1">
+      <w:hyperlink w:anchor="_Toc239252176" w:history="1">
         <w:r>
           <w:rPr>
             <w:rStyle w:val="Hyperlink"/>
@@ -2251,7 +2251,7 @@
             <w:noProof/>
             <w:webHidden/>
           </w:rPr>
-          <w:instrText xml:space="preserve"> PAGEREF _Toc239252054 \h </w:instrText>
+          <w:instrText xml:space="preserve"> PAGEREF _Toc239252176 \h </w:instrText>
         </w:r>
         <w:r>
           <w:rPr>
@@ -2296,7 +2296,7 @@
           <w14:ligatures w14:val="standardContextual"/>
         </w:rPr>
       </w:pPr>
-      <w:hyperlink w:anchor="_Toc239252055" w:history="1">
+      <w:hyperlink w:anchor="_Toc239252177" w:history="1">
         <w:r>
           <w:rPr>
             <w:rStyle w:val="Hyperlink"/>
@@ -2325,7 +2325,7 @@
             <w:noProof/>
             <w:webHidden/>
           </w:rPr>
-          <w:instrText xml:space="preserve"> PAGEREF _Toc239252055 \h </w:instrText>
+          <w:instrText xml:space="preserve"> PAGEREF _Toc239252177 \h </w:instrText>
         </w:r>
         <w:r>
           <w:rPr>
@@ -2370,7 +2370,7 @@
           <w14:ligatures w14:val="standardContextual"/>
         </w:rPr>
       </w:pPr>
-      <w:hyperlink w:anchor="_Toc239252056" w:history="1">
+      <w:hyperlink w:anchor="_Toc239252178" w:history="1">
         <w:r>
           <w:rPr>
             <w:rStyle w:val="Hyperlink"/>
@@ -2399,7 +2399,7 @@
             <w:noProof/>
             <w:webHidden/>
           </w:rPr>
-          <w:instrText xml:space="preserve"> PAGEREF _Toc239252056 \h </w:instrText>
+          <w:instrText xml:space="preserve"> PAGEREF _Toc239252178 \h </w:instrText>
         </w:r>
         <w:r>
           <w:rPr>
@@ -2444,7 +2444,7 @@
           <w14:ligatures w14:val="standardContextual"/>
         </w:rPr>
       </w:pPr>
-      <w:hyperlink w:anchor="_Toc239252057" w:history="1">
+      <w:hyperlink w:anchor="_Toc239252179" w:history="1">
         <w:r>
           <w:rPr>
             <w:rStyle w:val="Hyperlink"/>
@@ -2473,7 +2473,7 @@
             <w:noProof/>
             <w:webHidden/>
           </w:rPr>
-          <w:instrText xml:space="preserve"> PAGEREF _Toc239252057 \h </w:instrText>
+          <w:instrText xml:space="preserve"> PAGEREF _Toc239252179 \h </w:instrText>
         </w:r>
         <w:r>
           <w:rPr>
@@ -2518,7 +2518,7 @@
           <w14:ligatures w14:val="standardContextual"/>
         </w:rPr>
       </w:pPr>
-      <w:hyperlink w:anchor="_Toc239252058" w:history="1">
+      <w:hyperlink w:anchor="_Toc239252180" w:history="1">
         <w:r>
           <w:rPr>
             <w:rStyle w:val="Hyperlink"/>
@@ -2548,7 +2548,7 @@
             <w:noProof/>
             <w:webHidden/>
           </w:rPr>
-          <w:instrText xml:space="preserve"> PAGEREF _Toc239252058 \h </w:instrText>
+          <w:instrText xml:space="preserve"> PAGEREF _Toc239252180 \h </w:instrText>
         </w:r>
         <w:r>
           <w:rPr>
@@ -2593,7 +2593,7 @@
           <w14:ligatures w14:val="standardContextual"/>
         </w:rPr>
       </w:pPr>
-      <w:hyperlink w:anchor="_Toc239252059" w:history="1">
+      <w:hyperlink w:anchor="_Toc239252181" w:history="1">
         <w:r>
           <w:rPr>
             <w:rStyle w:val="Hyperlink"/>
@@ -2623,7 +2623,7 @@
             <w:noProof/>
             <w:webHidden/>
           </w:rPr>
-          <w:instrText xml:space="preserve"> PAGEREF _Toc239252059 \h </w:instrText>
+          <w:instrText xml:space="preserve"> PAGEREF _Toc239252181 \h </w:instrText>
         </w:r>
         <w:r>
           <w:rPr>
@@ -2668,7 +2668,7 @@
           <w14:ligatures w14:val="standardContextual"/>
         </w:rPr>
       </w:pPr>
-      <w:hyperlink w:anchor="_Toc239252060" w:history="1">
+      <w:hyperlink w:anchor="_Toc239252182" w:history="1">
         <w:r>
           <w:rPr>
             <w:rStyle w:val="Hyperlink"/>
@@ -2697,7 +2697,7 @@
             <w:noProof/>
             <w:webHidden/>
           </w:rPr>
-          <w:instrText xml:space="preserve"> PAGEREF _Toc239252060 \h </w:instrText>
+          <w:instrText xml:space="preserve"> PAGEREF _Toc239252182 \h </w:instrText>
         </w:r>
         <w:r>
           <w:rPr>
@@ -2742,7 +2742,7 @@
           <w14:ligatures w14:val="standardContextual"/>
         </w:rPr>
       </w:pPr>
-      <w:hyperlink w:anchor="_Toc239252061" w:history="1">
+      <w:hyperlink w:anchor="_Toc239252183" w:history="1">
         <w:r>
           <w:rPr>
             <w:rStyle w:val="Hyperlink"/>
@@ -2771,7 +2771,7 @@
             <w:noProof/>
             <w:webHidden/>
           </w:rPr>
-          <w:instrText xml:space="preserve"> PAGEREF _Toc239252061 \h </w:instrText>
+          <w:instrText xml:space="preserve"> PAGEREF _Toc239252183 \h </w:instrText>
         </w:r>
         <w:r>
           <w:rPr>
@@ -2816,7 +2816,7 @@
           <w14:ligatures w14:val="standardContextual"/>
         </w:rPr>
       </w:pPr>
-      <w:hyperlink w:anchor="_Toc239252062" w:history="1">
+      <w:hyperlink w:anchor="_Toc239252184" w:history="1">
         <w:r>
           <w:rPr>
             <w:rStyle w:val="Hyperlink"/>
@@ -2845,7 +2845,7 @@
             <w:noProof/>
             <w:webHidden/>
           </w:rPr>
-          <w:instrText xml:space="preserve"> PAGEREF _Toc239252062 \h </w:instrText>
+          <w:instrText xml:space="preserve"> PAGEREF _Toc239252184 \h </w:instrText>
         </w:r>
         <w:r>
           <w:rPr>
@@ -2890,7 +2890,7 @@
           <w14:ligatures w14:val="standardContextual"/>
         </w:rPr>
       </w:pPr>
-      <w:hyperlink w:anchor="_Toc239252063" w:history="1">
+      <w:hyperlink w:anchor="_Toc239252185" w:history="1">
         <w:r>
           <w:rPr>
             <w:rStyle w:val="Hyperlink"/>
@@ -2919,7 +2919,7 @@
             <w:noProof/>
             <w:webHidden/>
           </w:rPr>
-          <w:instrText xml:space="preserve"> PAGEREF _Toc239252063 \h </w:instrText>
+          <w:instrText xml:space="preserve"> PAGEREF _Toc239252185 \h </w:instrText>
         </w:r>
         <w:r>
           <w:rPr>
@@ -2964,7 +2964,7 @@
           <w14:ligatures w14:val="standardContextual"/>
         </w:rPr>
       </w:pPr>
-      <w:hyperlink w:anchor="_Toc239252064" w:history="1">
+      <w:hyperlink w:anchor="_Toc239252186" w:history="1">
         <w:r>
           <w:rPr>
             <w:rStyle w:val="Hyperlink"/>
@@ -2993,7 +2993,7 @@
             <w:noProof/>
             <w:webHidden/>
           </w:rPr>
-          <w:instrText xml:space="preserve"> PAGEREF _Toc239252064 \h </w:instrText>
+          <w:instrText xml:space="preserve"> PAGEREF _Toc239252186 \h </w:instrText>
         </w:r>
         <w:r>
           <w:rPr>
@@ -3038,7 +3038,7 @@
           <w14:ligatures w14:val="standardContextual"/>
         </w:rPr>
       </w:pPr>
-      <w:hyperlink w:anchor="_Toc239252065" w:history="1">
+      <w:hyperlink w:anchor="_Toc239252187" w:history="1">
         <w:r>
           <w:rPr>
             <w:rStyle w:val="Hyperlink"/>
@@ -3067,7 +3067,7 @@
             <w:noProof/>
             <w:webHidden/>
           </w:rPr>
-          <w:instrText xml:space="preserve"> PAGEREF _Toc239252065 \h </w:instrText>
+          <w:instrText xml:space="preserve"> PAGEREF _Toc239252187 \h </w:instrText>
         </w:r>
         <w:r>
           <w:rPr>
@@ -3112,7 +3112,7 @@
           <w14:ligatures w14:val="standardContextual"/>
         </w:rPr>
       </w:pPr>
-      <w:hyperlink w:anchor="_Toc239252066" w:history="1">
+      <w:hyperlink w:anchor="_Toc239252188" w:history="1">
         <w:r>
           <w:rPr>
             <w:rStyle w:val="Hyperlink"/>
@@ -3141,7 +3141,7 @@
             <w:noProof/>
             <w:webHidden/>
           </w:rPr>
-          <w:instrText xml:space="preserve"> PAGEREF _Toc239252066 \h </w:instrText>
+          <w:instrText xml:space="preserve"> PAGEREF _Toc239252188 \h </w:instrText>
         </w:r>
         <w:r>
           <w:rPr>
@@ -3186,7 +3186,7 @@
           <w14:ligatures w14:val="standardContextual"/>
         </w:rPr>
       </w:pPr>
-      <w:hyperlink w:anchor="_Toc239252067" w:history="1">
+      <w:hyperlink w:anchor="_Toc239252189" w:history="1">
         <w:r>
           <w:rPr>
             <w:rStyle w:val="Hyperlink"/>
@@ -3215,7 +3215,7 @@
             <w:noProof/>
             <w:webHidden/>
           </w:rPr>
-          <w:instrText xml:space="preserve"> PAGEREF _Toc239252067 \h </w:instrText>
+          <w:instrText xml:space="preserve"> PAGEREF _Toc239252189 \h </w:instrText>
         </w:r>
         <w:r>
           <w:rPr>
@@ -3260,7 +3260,7 @@
           <w14:ligatures w14:val="standardContextual"/>
         </w:rPr>
       </w:pPr>
-      <w:hyperlink w:anchor="_Toc239252068" w:history="1">
+      <w:hyperlink w:anchor="_Toc239252190" w:history="1">
         <w:r>
           <w:rPr>
             <w:rStyle w:val="Hyperlink"/>
@@ -3289,7 +3289,7 @@
             <w:noProof/>
             <w:webHidden/>
           </w:rPr>
-          <w:instrText xml:space="preserve"> PAGEREF _Toc239252068 \h </w:instrText>
+          <w:instrText xml:space="preserve"> PAGEREF _Toc239252190 \h </w:instrText>
         </w:r>
         <w:r>
           <w:rPr>
@@ -3336,7 +3336,7 @@
         <w:spacing w:line="480" w:lineRule="auto"/>
         <w:jc w:val="center"/>
       </w:pPr>
-      <w:bookmarkStart w:id="2" w:name="_Toc239252031"/>
+      <w:bookmarkStart w:id="2" w:name="_Toc239252153"/>
       <w:r>
         <w:rPr>
           <w:b/>
@@ -3840,7 +3840,7 @@
         <w:spacing w:line="480" w:lineRule="auto"/>
         <w:jc w:val="center"/>
       </w:pPr>
-      <w:bookmarkStart w:id="3" w:name="_Toc239252032"/>
+      <w:bookmarkStart w:id="3" w:name="_Toc239252154"/>
       <w:r>
         <w:rPr>
           <w:b/>
@@ -3873,7 +3873,7 @@
         <w:spacing w:line="480" w:lineRule="auto"/>
         <w:jc w:val="center"/>
       </w:pPr>
-      <w:bookmarkStart w:id="4" w:name="_Toc239252033"/>
+      <w:bookmarkStart w:id="4" w:name="_Toc239252155"/>
       <w:r>
         <w:rPr>
           <w:b/>
@@ -5257,7 +5257,7 @@
         <w:spacing w:line="480" w:lineRule="auto"/>
         <w:jc w:val="center"/>
       </w:pPr>
-      <w:bookmarkStart w:id="5" w:name="_Toc239252034"/>
+      <w:bookmarkStart w:id="5" w:name="_Toc239252156"/>
       <w:r>
         <w:rPr>
           <w:b/>
@@ -5277,7 +5277,7 @@
         <w:keepNext/>
         <w:spacing w:line="480" w:lineRule="auto"/>
       </w:pPr>
-      <w:bookmarkStart w:id="6" w:name="_Toc239252035"/>
+      <w:bookmarkStart w:id="6" w:name="_Toc239252157"/>
       <w:r>
         <w:rPr>
           <w:b/>
@@ -5359,7 +5359,7 @@
         <w:keepNext/>
         <w:spacing w:line="480" w:lineRule="auto"/>
       </w:pPr>
-      <w:bookmarkStart w:id="7" w:name="_Toc239252036"/>
+      <w:bookmarkStart w:id="7" w:name="_Toc239252158"/>
       <w:r>
         <w:rPr>
           <w:b/>
@@ -5430,7 +5430,7 @@
         <w:keepNext/>
         <w:spacing w:line="480" w:lineRule="auto"/>
       </w:pPr>
-      <w:bookmarkStart w:id="8" w:name="_Toc239252037"/>
+      <w:bookmarkStart w:id="8" w:name="_Toc239252159"/>
       <w:r>
         <w:rPr>
           <w:b/>
@@ -5449,7 +5449,7 @@
         <w:keepNext/>
         <w:spacing w:line="480" w:lineRule="auto"/>
       </w:pPr>
-      <w:bookmarkStart w:id="9" w:name="_Toc239252038"/>
+      <w:bookmarkStart w:id="9" w:name="_Toc239252160"/>
       <w:r>
         <w:rPr>
           <w:b/>
@@ -5478,7 +5478,7 @@
         <w:keepNext/>
         <w:spacing w:line="480" w:lineRule="auto"/>
       </w:pPr>
-      <w:bookmarkStart w:id="10" w:name="_Toc239252039"/>
+      <w:bookmarkStart w:id="10" w:name="_Toc239252161"/>
       <w:r>
         <w:rPr>
           <w:b/>
@@ -5604,7 +5604,7 @@
         <w:keepNext/>
         <w:spacing w:line="480" w:lineRule="auto"/>
       </w:pPr>
-      <w:bookmarkStart w:id="11" w:name="_Toc239252040"/>
+      <w:bookmarkStart w:id="11" w:name="_Toc239252162"/>
       <w:r>
         <w:rPr>
           <w:b/>
@@ -5767,7 +5767,7 @@
         <w:spacing w:line="480" w:lineRule="auto"/>
         <w:jc w:val="center"/>
       </w:pPr>
-      <w:bookmarkStart w:id="12" w:name="_Toc239252041"/>
+      <w:bookmarkStart w:id="12" w:name="_Toc239252163"/>
       <w:r>
         <w:rPr>
           <w:b/>
@@ -5787,7 +5787,7 @@
         <w:keepNext/>
         <w:spacing w:line="480" w:lineRule="auto"/>
       </w:pPr>
-      <w:bookmarkStart w:id="13" w:name="_Toc239252042"/>
+      <w:bookmarkStart w:id="13" w:name="_Toc239252164"/>
       <w:r>
         <w:rPr>
           <w:b/>
@@ -5903,7 +5903,7 @@
         <w:keepNext/>
         <w:spacing w:line="480" w:lineRule="auto"/>
       </w:pPr>
-      <w:bookmarkStart w:id="14" w:name="_Toc239252043"/>
+      <w:bookmarkStart w:id="14" w:name="_Toc239252165"/>
       <w:r>
         <w:rPr>
           <w:b/>
@@ -6528,7 +6528,7 @@
         <w:keepNext/>
         <w:spacing w:line="480" w:lineRule="auto"/>
       </w:pPr>
-      <w:bookmarkStart w:id="15" w:name="_Toc239252044"/>
+      <w:bookmarkStart w:id="15" w:name="_Toc239252166"/>
       <w:r>
         <w:rPr>
           <w:b/>
@@ -6685,7 +6685,7 @@
         <w:keepNext/>
         <w:spacing w:line="480" w:lineRule="auto"/>
       </w:pPr>
-      <w:bookmarkStart w:id="16" w:name="_Toc239252045"/>
+      <w:bookmarkStart w:id="16" w:name="_Toc239252167"/>
       <w:r>
         <w:rPr>
           <w:b/>
@@ -7584,7 +7584,7 @@
         <w:keepNext/>
         <w:spacing w:line="480" w:lineRule="auto"/>
       </w:pPr>
-      <w:bookmarkStart w:id="17" w:name="_Toc239252046"/>
+      <w:bookmarkStart w:id="17" w:name="_Toc239252168"/>
       <w:r>
         <w:rPr>
           <w:b/>
@@ -8066,7 +8066,7 @@
         <w:spacing w:line="480" w:lineRule="auto"/>
         <w:jc w:val="center"/>
       </w:pPr>
-      <w:bookmarkStart w:id="18" w:name="_Toc239252047"/>
+      <w:bookmarkStart w:id="18" w:name="_Toc239252169"/>
       <w:r>
         <w:rPr>
           <w:b/>
@@ -8086,7 +8086,7 @@
         <w:keepNext/>
         <w:spacing w:line="480" w:lineRule="auto"/>
       </w:pPr>
-      <w:bookmarkStart w:id="19" w:name="_Toc239252048"/>
+      <w:bookmarkStart w:id="19" w:name="_Toc239252170"/>
       <w:r>
         <w:rPr>
           <w:b/>
@@ -8170,7 +8170,7 @@
           <w:noProof/>
         </w:rPr>
         <w:drawing>
-          <wp:inline distT="0" distB="0" distL="0" distR="0" wp14:anchorId="502645BB" wp14:editId="674E0527">
+          <wp:inline distT="0" distB="0" distL="0" distR="0" wp14:anchorId="5DF86FBD" wp14:editId="1EE38D5D">
             <wp:extent cx="5577840" cy="3434103"/>
             <wp:effectExtent l="0" t="0" r="0" b="0"/>
             <wp:docPr id="2" name="Picture 2"/>
@@ -8213,7 +8213,7 @@
         <w:keepNext/>
         <w:spacing w:line="480" w:lineRule="auto"/>
       </w:pPr>
-      <w:bookmarkStart w:id="20" w:name="_Toc239252049"/>
+      <w:bookmarkStart w:id="20" w:name="_Toc239252171"/>
       <w:r>
         <w:rPr>
           <w:b/>
@@ -8418,7 +8418,7 @@
         <w:keepNext/>
         <w:spacing w:line="480" w:lineRule="auto"/>
       </w:pPr>
-      <w:bookmarkStart w:id="21" w:name="_Toc239252050"/>
+      <w:bookmarkStart w:id="21" w:name="_Toc239252172"/>
       <w:r>
         <w:rPr>
           <w:b/>
@@ -8531,7 +8531,7 @@
           <w:noProof/>
         </w:rPr>
         <w:drawing>
-          <wp:inline distT="0" distB="0" distL="0" distR="0" wp14:anchorId="37288A6D" wp14:editId="29534899">
+          <wp:inline distT="0" distB="0" distL="0" distR="0" wp14:anchorId="1AB2EB40" wp14:editId="5CF7AE25">
             <wp:extent cx="5577840" cy="4709434"/>
             <wp:effectExtent l="0" t="0" r="0" b="0"/>
             <wp:docPr id="3" name="Picture 3"/>
@@ -8574,7 +8574,7 @@
         <w:keepNext/>
         <w:spacing w:line="480" w:lineRule="auto"/>
       </w:pPr>
-      <w:bookmarkStart w:id="22" w:name="_Toc239252051"/>
+      <w:bookmarkStart w:id="22" w:name="_Toc239252173"/>
       <w:r>
         <w:rPr>
           <w:b/>
@@ -8604,7 +8604,7 @@
         <w:keepNext/>
         <w:spacing w:line="480" w:lineRule="auto"/>
       </w:pPr>
-      <w:bookmarkStart w:id="23" w:name="_Toc239252052"/>
+      <w:bookmarkStart w:id="23" w:name="_Toc239252174"/>
       <w:r>
         <w:rPr>
           <w:b/>
@@ -8775,7 +8775,7 @@
         <w:keepNext/>
         <w:spacing w:line="480" w:lineRule="auto"/>
       </w:pPr>
-      <w:bookmarkStart w:id="24" w:name="_Toc239252053"/>
+      <w:bookmarkStart w:id="24" w:name="_Toc239252175"/>
       <w:r>
         <w:rPr>
           <w:b/>
@@ -8946,7 +8946,7 @@
         <w:keepNext/>
         <w:spacing w:line="480" w:lineRule="auto"/>
       </w:pPr>
-      <w:bookmarkStart w:id="25" w:name="_Toc239252054"/>
+      <w:bookmarkStart w:id="25" w:name="_Toc239252176"/>
       <w:r>
         <w:rPr>
           <w:b/>
@@ -9155,7 +9155,7 @@
         <w:keepNext/>
         <w:spacing w:line="480" w:lineRule="auto"/>
       </w:pPr>
-      <w:bookmarkStart w:id="26" w:name="_Toc239252055"/>
+      <w:bookmarkStart w:id="26" w:name="_Toc239252177"/>
       <w:r>
         <w:rPr>
           <w:b/>
@@ -9211,7 +9211,7 @@
           <w:noProof/>
         </w:rPr>
         <w:drawing>
-          <wp:inline distT="0" distB="0" distL="0" distR="0" wp14:anchorId="7B14D69E" wp14:editId="697A5EB6">
+          <wp:inline distT="0" distB="0" distL="0" distR="0" wp14:anchorId="24E0AE9D" wp14:editId="5A978976">
             <wp:extent cx="5394960" cy="6491029"/>
             <wp:effectExtent l="0" t="0" r="0" b="0"/>
             <wp:docPr id="4" name="Picture 4"/>
@@ -9305,7 +9305,7 @@
         <w:keepNext/>
         <w:spacing w:line="480" w:lineRule="auto"/>
       </w:pPr>
-      <w:bookmarkStart w:id="27" w:name="_Toc239252056"/>
+      <w:bookmarkStart w:id="27" w:name="_Toc239252178"/>
       <w:r>
         <w:rPr>
           <w:b/>
@@ -9373,7 +9373,7 @@
           <w:noProof/>
         </w:rPr>
         <w:drawing>
-          <wp:inline distT="0" distB="0" distL="0" distR="0" wp14:anchorId="16905AF0" wp14:editId="3AFD7577">
+          <wp:inline distT="0" distB="0" distL="0" distR="0" wp14:anchorId="02815833" wp14:editId="37215852">
             <wp:extent cx="5486400" cy="4702629"/>
             <wp:effectExtent l="0" t="0" r="0" b="0"/>
             <wp:docPr id="5" name="Picture 5"/>
@@ -9427,7 +9427,7 @@
         <w:keepNext/>
         <w:spacing w:line="480" w:lineRule="auto"/>
       </w:pPr>
-      <w:bookmarkStart w:id="28" w:name="_Toc239252057"/>
+      <w:bookmarkStart w:id="28" w:name="_Toc239252179"/>
       <w:r>
         <w:rPr>
           <w:b/>
@@ -9447,7 +9447,7 @@
         <w:keepNext/>
         <w:spacing w:line="480" w:lineRule="auto"/>
       </w:pPr>
-      <w:bookmarkStart w:id="29" w:name="_Toc239252058"/>
+      <w:bookmarkStart w:id="29" w:name="_Toc239252180"/>
       <w:r>
         <w:rPr>
           <w:b/>
@@ -9507,7 +9507,7 @@
           <w:noProof/>
         </w:rPr>
         <w:drawing>
-          <wp:inline distT="0" distB="0" distL="0" distR="0" wp14:anchorId="28902CA0" wp14:editId="3E0CBA29">
+          <wp:inline distT="0" distB="0" distL="0" distR="0" wp14:anchorId="154619AF" wp14:editId="3D541B87">
             <wp:extent cx="5577840" cy="2114499"/>
             <wp:effectExtent l="0" t="0" r="0" b="0"/>
             <wp:docPr id="6" name="Picture 6"/>
@@ -9550,7 +9550,7 @@
         <w:keepNext/>
         <w:spacing w:line="480" w:lineRule="auto"/>
       </w:pPr>
-      <w:bookmarkStart w:id="30" w:name="_Toc239252059"/>
+      <w:bookmarkStart w:id="30" w:name="_Toc239252181"/>
       <w:r>
         <w:rPr>
           <w:b/>
@@ -9611,7 +9611,7 @@
           <w:noProof/>
         </w:rPr>
         <w:drawing>
-          <wp:inline distT="0" distB="0" distL="0" distR="0" wp14:anchorId="094E8E0A" wp14:editId="25ABD2A0">
+          <wp:inline distT="0" distB="0" distL="0" distR="0" wp14:anchorId="5EB0D26C" wp14:editId="408564E8">
             <wp:extent cx="5577840" cy="4820912"/>
             <wp:effectExtent l="0" t="0" r="0" b="0"/>
             <wp:docPr id="7" name="Picture 7"/>
@@ -9666,7 +9666,7 @@
         <w:keepNext/>
         <w:spacing w:line="480" w:lineRule="auto"/>
       </w:pPr>
-      <w:bookmarkStart w:id="31" w:name="_Toc239252060"/>
+      <w:bookmarkStart w:id="31" w:name="_Toc239252182"/>
       <w:r>
         <w:rPr>
           <w:b/>
@@ -9728,7 +9728,7 @@
           <w:noProof/>
         </w:rPr>
         <w:drawing>
-          <wp:inline distT="0" distB="0" distL="0" distR="0" wp14:anchorId="4BBC186B" wp14:editId="0A01A7FA">
+          <wp:inline distT="0" distB="0" distL="0" distR="0" wp14:anchorId="587CF2CB" wp14:editId="4C7B3FC5">
             <wp:extent cx="5303520" cy="6584179"/>
             <wp:effectExtent l="0" t="0" r="0" b="0"/>
             <wp:docPr id="8" name="Picture 8"/>
@@ -9813,7 +9813,7 @@
         <w:spacing w:line="480" w:lineRule="auto"/>
         <w:jc w:val="center"/>
       </w:pPr>
-      <w:bookmarkStart w:id="32" w:name="_Toc239252061"/>
+      <w:bookmarkStart w:id="32" w:name="_Toc239252183"/>
       <w:r>
         <w:rPr>
           <w:b/>
@@ -9844,7 +9844,7 @@
         <w:keepNext/>
         <w:spacing w:line="480" w:lineRule="auto"/>
       </w:pPr>
-      <w:bookmarkStart w:id="33" w:name="_Toc239252062"/>
+      <w:bookmarkStart w:id="33" w:name="_Toc239252184"/>
       <w:r>
         <w:rPr>
           <w:b/>
@@ -10530,7 +10530,7 @@
         <w:keepNext/>
         <w:spacing w:line="480" w:lineRule="auto"/>
       </w:pPr>
-      <w:bookmarkStart w:id="34" w:name="_Toc239252063"/>
+      <w:bookmarkStart w:id="34" w:name="_Toc239252185"/>
       <w:r>
         <w:rPr>
           <w:b/>
@@ -10899,7 +10899,7 @@
         <w:keepNext/>
         <w:spacing w:line="480" w:lineRule="auto"/>
       </w:pPr>
-      <w:bookmarkStart w:id="35" w:name="_Toc239252064"/>
+      <w:bookmarkStart w:id="35" w:name="_Toc239252186"/>
       <w:r>
         <w:rPr>
           <w:b/>
@@ -11149,7 +11149,7 @@
         <w:rPr>
           <w:color w:val="000000"/>
         </w:rPr>
-        <w:t>https://github.com/HikmatBaniya/swor</w:t>
+        <w:t>https://github.com/HikmatBaniya/kinyo</w:t>
       </w:r>
     </w:p>
     <w:p>
@@ -11180,7 +11180,7 @@
         <w:rPr>
           <w:color w:val="000000"/>
         </w:rPr>
-        <w:t>https://github.com/HikmatBaniya/swor-front</w:t>
+        <w:t>https://github.com/HikmatBaniya/kinyo-front</w:t>
       </w:r>
     </w:p>
     <w:p>
@@ -11202,7 +11202,7 @@
         <w:spacing w:line="480" w:lineRule="auto"/>
         <w:jc w:val="center"/>
       </w:pPr>
-      <w:bookmarkStart w:id="36" w:name="_Toc239252065"/>
+      <w:bookmarkStart w:id="36" w:name="_Toc239252187"/>
       <w:r>
         <w:rPr>
           <w:b/>
@@ -11233,7 +11233,7 @@
         <w:keepNext/>
         <w:spacing w:line="480" w:lineRule="auto"/>
       </w:pPr>
-      <w:bookmarkStart w:id="37" w:name="_Toc239252066"/>
+      <w:bookmarkStart w:id="37" w:name="_Toc239252188"/>
       <w:r>
         <w:rPr>
           <w:b/>
@@ -11411,7 +11411,7 @@
         <w:keepNext/>
         <w:spacing w:line="480" w:lineRule="auto"/>
       </w:pPr>
-      <w:bookmarkStart w:id="38" w:name="_Toc239252067"/>
+      <w:bookmarkStart w:id="38" w:name="_Toc239252189"/>
       <w:r>
         <w:rPr>
           <w:b/>
@@ -11511,7 +11511,7 @@
         <w:spacing w:line="480" w:lineRule="auto"/>
         <w:jc w:val="center"/>
       </w:pPr>
-      <w:bookmarkStart w:id="39" w:name="_Toc239252068"/>
+      <w:bookmarkStart w:id="39" w:name="_Toc239252190"/>
       <w:r>
         <w:rPr>
           <w:b/>
@@ -11860,9 +11860,9 @@
 <file path=word/numbering.xml><?xml version="1.0" encoding="utf-8"?>
 <w:numbering xmlns:wpc="http://schemas.microsoft.com/office/word/2010/wordprocessingCanvas" xmlns:cx="http://schemas.microsoft.com/office/drawing/2014/chartex" xmlns:cx1="http://schemas.microsoft.com/office/drawing/2015/9/8/chartex" xmlns:cx2="http://schemas.microsoft.com/office/drawing/2015/10/21/chartex" xmlns:cx3="http://schemas.microsoft.com/office/drawing/2016/5/9/chartex" xmlns:cx4="http://schemas.microsoft.com/office/drawing/2016/5/10/chartex" xmlns:cx5="http://schemas.microsoft.com/office/drawing/2016/5/11/chartex" xmlns:cx6="http://schemas.microsoft.com/office/drawing/2016/5/12/chartex" xmlns:cx7="http://schemas.microsoft.com/office/drawing/2016/5/13/chartex" xmlns:cx8="http://schemas.microsoft.com/office/drawing/2016/5/14/chartex" xmlns:mc="http://schemas.openxmlformats.org/markup-compatibility/2006" xmlns:aink="http://schemas.microsoft.com/office/drawing/2016/ink" xmlns:am3d="http://schemas.microsoft.com/office/drawing/2017/model3d" xmlns:o="urn:schemas-microsoft-com:office:office" xmlns:oel="http://schemas.microsoft.com/office/2019/extlst" xmlns:r="http://schemas.openxmlformats.org/officeDocument/2006/relationships" xmlns:m="http://schemas.openxmlformats.org/officeDocument/2006/math" xmlns:v="urn:schemas-microsoft-com:vml" xmlns:wp14="http://schemas.microsoft.com/office/word/2010/wordprocessingDrawing" xmlns:wp="http://schemas.openxmlformats.org/drawingml/2006/wordprocessingDrawing" xmlns:w10="urn:schemas-microsoft-com:office:word" xmlns:w="http://schemas.openxmlformats.org/wordprocessingml/2006/main" xmlns:w14="http://schemas.microsoft.com/office/word/2010/wordml" xmlns:w15="http://schemas.microsoft.com/office/word/2012/wordml" xmlns:w16cex="http://schemas.microsoft.com/office/word/2018/wordml/cex" xmlns:w16cid="http://schemas.microsoft.com/office/word/2016/wordml/cid" xmlns:w16="http://schemas.microsoft.com/office/word/2018/wordml" xmlns:w16du="http://schemas.microsoft.com/office/word/2023/wordml/word16du" xmlns:w16sdtdh="http://schemas.microsoft.com/office/word/2020/wordml/sdtdatahash" xmlns:w16sdtfl="http://schemas.microsoft.com/office/word/2024/wordml/sdtformatlock" xmlns:w16se="http://schemas.microsoft.com/office/word/2015/wordml/symex" xmlns:wpg="http://schemas.microsoft.com/office/word/2010/wordprocessingGroup" xmlns:wpi="http://schemas.microsoft.com/office/word/2010/wordprocessingInk" xmlns:wne="http://schemas.microsoft.com/office/word/2006/wordml" xmlns:wps="http://schemas.microsoft.com/office/word/2010/wordprocessingShape" mc:Ignorable="w14 w15 w16se w16cid w16 w16cex w16sdtdh w16sdtfl w16du wp14">
   <w:abstractNum w:abstractNumId="0" w15:restartNumberingAfterBreak="0">
-    <w:nsid w:val="1C187E50"/>
+    <w:nsid w:val="2C5A2EA9"/>
     <w:multiLevelType w:val="multilevel"/>
-    <w:tmpl w:val="5E2299A0"/>
+    <w:tmpl w:val="D65E4B3C"/>
     <w:lvl w:ilvl="0">
       <w:start w:val="1"/>
       <w:numFmt w:val="decimal"/>
@@ -11941,9 +11941,9 @@
     </w:lvl>
   </w:abstractNum>
   <w:abstractNum w:abstractNumId="1" w15:restartNumberingAfterBreak="0">
-    <w:nsid w:val="700E23C7"/>
+    <w:nsid w:val="3664511A"/>
     <w:multiLevelType w:val="multilevel"/>
-    <w:tmpl w:val="7D5CB632"/>
+    <w:tmpl w:val="4734255A"/>
     <w:lvl w:ilvl="0">
       <w:start w:val="1"/>
       <w:numFmt w:val="bullet"/>
@@ -12025,10 +12025,10 @@
       </w:pPr>
     </w:lvl>
   </w:abstractNum>
-  <w:num w:numId="1" w16cid:durableId="1047290752">
+  <w:num w:numId="1" w16cid:durableId="543752880">
     <w:abstractNumId w:val="0"/>
   </w:num>
-  <w:num w:numId="2" w16cid:durableId="638151234">
+  <w:num w:numId="2" w16cid:durableId="716012128">
     <w:abstractNumId w:val="1"/>
   </w:num>
 </w:numbering>
@@ -12966,7 +12966,7 @@
     <w:autoRedefine/>
     <w:uiPriority w:val="39"/>
     <w:unhideWhenUsed/>
-    <w:rsid w:val="00E623F1"/>
+    <w:rsid w:val="00CE2B4E"/>
     <w:pPr>
       <w:spacing w:after="100"/>
     </w:pPr>
@@ -12978,7 +12978,7 @@
     <w:autoRedefine/>
     <w:uiPriority w:val="39"/>
     <w:unhideWhenUsed/>
-    <w:rsid w:val="00E623F1"/>
+    <w:rsid w:val="00CE2B4E"/>
     <w:pPr>
       <w:spacing w:after="100"/>
       <w:ind w:left="240"/>
@@ -12991,7 +12991,7 @@
     <w:autoRedefine/>
     <w:uiPriority w:val="39"/>
     <w:unhideWhenUsed/>
-    <w:rsid w:val="00E623F1"/>
+    <w:rsid w:val="00CE2B4E"/>
     <w:pPr>
       <w:spacing w:after="100"/>
       <w:ind w:left="480"/>

</xml_diff>

<commit_message>
Drop the supervisor block from the title page
Remove both the "Under the Supervision of" line and the name beneath it, along
with the metadata field that fed them.

Co-Authored-By: Claude Opus 5 (1M context) <noreply@anthropic.com>
Claude-Session: https://claude.ai/code/session_0196JS1u5qEW9XzS4ZPnTL2s
</commit_message>
<xml_diff>
--- a/docs/Kinyo_ProjectVI_Proposal.docx
+++ b/docs/Kinyo_ProjectVI_Proposal.docx
@@ -16,7 +16,7 @@
           <w:noProof/>
         </w:rPr>
         <w:drawing>
-          <wp:inline distT="0" distB="0" distL="0" distR="0" wp14:anchorId="27C3D77E" wp14:editId="1F2EB592">
+          <wp:inline distT="0" distB="0" distL="0" distR="0" wp14:anchorId="08D85E59" wp14:editId="6FA8398C">
             <wp:extent cx="1273012" cy="1114425"/>
             <wp:effectExtent l="0" t="0" r="0" b="0"/>
             <wp:docPr id="1" name="image1.png" descr="Purbanchal University logo"/>
@@ -180,27 +180,6 @@
     <w:p>
       <w:pPr>
         <w:spacing w:line="360" w:lineRule="auto"/>
-        <w:jc w:val="center"/>
-      </w:pPr>
-      <w:r>
-        <w:t>Under the Supervision of</w:t>
-      </w:r>
-    </w:p>
-    <w:p>
-      <w:pPr>
-        <w:spacing w:line="360" w:lineRule="auto"/>
-        <w:jc w:val="center"/>
-      </w:pPr>
-      <w:r>
-        <w:rPr>
-          <w:color w:val="000000"/>
-        </w:rPr>
-        <w:t>[Supervisor Name]</w:t>
-      </w:r>
-    </w:p>
-    <w:p>
-      <w:pPr>
-        <w:spacing w:line="360" w:lineRule="auto"/>
       </w:pPr>
     </w:p>
     <w:p>
@@ -272,7 +251,7 @@
         <w:spacing w:line="480" w:lineRule="auto"/>
         <w:jc w:val="center"/>
       </w:pPr>
-      <w:bookmarkStart w:id="0" w:name="_Toc239252151"/>
+      <w:bookmarkStart w:id="0" w:name="_Toc239252483"/>
       <w:r>
         <w:rPr>
           <w:b/>
@@ -337,7 +316,7 @@
         <w:spacing w:line="480" w:lineRule="auto"/>
         <w:jc w:val="center"/>
       </w:pPr>
-      <w:bookmarkStart w:id="1" w:name="_Toc239252152"/>
+      <w:bookmarkStart w:id="1" w:name="_Toc239252484"/>
       <w:r>
         <w:rPr>
           <w:b/>
@@ -374,7 +353,7 @@
       <w:r>
         <w:fldChar w:fldCharType="separate"/>
       </w:r>
-      <w:hyperlink w:anchor="_Toc239252151" w:history="1">
+      <w:hyperlink w:anchor="_Toc239252483" w:history="1">
         <w:r>
           <w:rPr>
             <w:rStyle w:val="Hyperlink"/>
@@ -402,7 +381,7 @@
             <w:noProof/>
             <w:webHidden/>
           </w:rPr>
-          <w:instrText xml:space="preserve"> PAGEREF _Toc239252151 \h </w:instrText>
+          <w:instrText xml:space="preserve"> PAGEREF _Toc239252483 \h </w:instrText>
         </w:r>
         <w:r>
           <w:rPr>
@@ -447,7 +426,7 @@
           <w14:ligatures w14:val="standardContextual"/>
         </w:rPr>
       </w:pPr>
-      <w:hyperlink w:anchor="_Toc239252152" w:history="1">
+      <w:hyperlink w:anchor="_Toc239252484" w:history="1">
         <w:r>
           <w:rPr>
             <w:rStyle w:val="Hyperlink"/>
@@ -476,7 +455,7 @@
             <w:noProof/>
             <w:webHidden/>
           </w:rPr>
-          <w:instrText xml:space="preserve"> PAGEREF _Toc239252152 \h </w:instrText>
+          <w:instrText xml:space="preserve"> PAGEREF _Toc239252484 \h </w:instrText>
         </w:r>
         <w:r>
           <w:rPr>
@@ -521,7 +500,7 @@
           <w14:ligatures w14:val="standardContextual"/>
         </w:rPr>
       </w:pPr>
-      <w:hyperlink w:anchor="_Toc239252153" w:history="1">
+      <w:hyperlink w:anchor="_Toc239252485" w:history="1">
         <w:r>
           <w:rPr>
             <w:rStyle w:val="Hyperlink"/>
@@ -550,7 +529,7 @@
             <w:noProof/>
             <w:webHidden/>
           </w:rPr>
-          <w:instrText xml:space="preserve"> PAGEREF _Toc239252153 \h </w:instrText>
+          <w:instrText xml:space="preserve"> PAGEREF _Toc239252485 \h </w:instrText>
         </w:r>
         <w:r>
           <w:rPr>
@@ -595,7 +574,7 @@
           <w14:ligatures w14:val="standardContextual"/>
         </w:rPr>
       </w:pPr>
-      <w:hyperlink w:anchor="_Toc239252154" w:history="1">
+      <w:hyperlink w:anchor="_Toc239252486" w:history="1">
         <w:r>
           <w:rPr>
             <w:rStyle w:val="Hyperlink"/>
@@ -624,7 +603,7 @@
             <w:noProof/>
             <w:webHidden/>
           </w:rPr>
-          <w:instrText xml:space="preserve"> PAGEREF _Toc239252154 \h </w:instrText>
+          <w:instrText xml:space="preserve"> PAGEREF _Toc239252486 \h </w:instrText>
         </w:r>
         <w:r>
           <w:rPr>
@@ -669,7 +648,7 @@
           <w14:ligatures w14:val="standardContextual"/>
         </w:rPr>
       </w:pPr>
-      <w:hyperlink w:anchor="_Toc239252155" w:history="1">
+      <w:hyperlink w:anchor="_Toc239252487" w:history="1">
         <w:r>
           <w:rPr>
             <w:rStyle w:val="Hyperlink"/>
@@ -698,7 +677,7 @@
             <w:noProof/>
             <w:webHidden/>
           </w:rPr>
-          <w:instrText xml:space="preserve"> PAGEREF _Toc239252155 \h </w:instrText>
+          <w:instrText xml:space="preserve"> PAGEREF _Toc239252487 \h </w:instrText>
         </w:r>
         <w:r>
           <w:rPr>
@@ -743,7 +722,7 @@
           <w14:ligatures w14:val="standardContextual"/>
         </w:rPr>
       </w:pPr>
-      <w:hyperlink w:anchor="_Toc239252156" w:history="1">
+      <w:hyperlink w:anchor="_Toc239252488" w:history="1">
         <w:r>
           <w:rPr>
             <w:rStyle w:val="Hyperlink"/>
@@ -772,7 +751,7 @@
             <w:noProof/>
             <w:webHidden/>
           </w:rPr>
-          <w:instrText xml:space="preserve"> PAGEREF _Toc239252156 \h </w:instrText>
+          <w:instrText xml:space="preserve"> PAGEREF _Toc239252488 \h </w:instrText>
         </w:r>
         <w:r>
           <w:rPr>
@@ -817,7 +796,7 @@
           <w14:ligatures w14:val="standardContextual"/>
         </w:rPr>
       </w:pPr>
-      <w:hyperlink w:anchor="_Toc239252157" w:history="1">
+      <w:hyperlink w:anchor="_Toc239252489" w:history="1">
         <w:r>
           <w:rPr>
             <w:rStyle w:val="Hyperlink"/>
@@ -846,7 +825,7 @@
             <w:noProof/>
             <w:webHidden/>
           </w:rPr>
-          <w:instrText xml:space="preserve"> PAGEREF _Toc239252157 \h </w:instrText>
+          <w:instrText xml:space="preserve"> PAGEREF _Toc239252489 \h </w:instrText>
         </w:r>
         <w:r>
           <w:rPr>
@@ -891,7 +870,7 @@
           <w14:ligatures w14:val="standardContextual"/>
         </w:rPr>
       </w:pPr>
-      <w:hyperlink w:anchor="_Toc239252158" w:history="1">
+      <w:hyperlink w:anchor="_Toc239252490" w:history="1">
         <w:r>
           <w:rPr>
             <w:rStyle w:val="Hyperlink"/>
@@ -920,7 +899,7 @@
             <w:noProof/>
             <w:webHidden/>
           </w:rPr>
-          <w:instrText xml:space="preserve"> PAGEREF _Toc239252158 \h </w:instrText>
+          <w:instrText xml:space="preserve"> PAGEREF _Toc239252490 \h </w:instrText>
         </w:r>
         <w:r>
           <w:rPr>
@@ -965,7 +944,7 @@
           <w14:ligatures w14:val="standardContextual"/>
         </w:rPr>
       </w:pPr>
-      <w:hyperlink w:anchor="_Toc239252159" w:history="1">
+      <w:hyperlink w:anchor="_Toc239252491" w:history="1">
         <w:r>
           <w:rPr>
             <w:rStyle w:val="Hyperlink"/>
@@ -994,7 +973,7 @@
             <w:noProof/>
             <w:webHidden/>
           </w:rPr>
-          <w:instrText xml:space="preserve"> PAGEREF _Toc239252159 \h </w:instrText>
+          <w:instrText xml:space="preserve"> PAGEREF _Toc239252491 \h </w:instrText>
         </w:r>
         <w:r>
           <w:rPr>
@@ -1039,7 +1018,7 @@
           <w14:ligatures w14:val="standardContextual"/>
         </w:rPr>
       </w:pPr>
-      <w:hyperlink w:anchor="_Toc239252160" w:history="1">
+      <w:hyperlink w:anchor="_Toc239252492" w:history="1">
         <w:r>
           <w:rPr>
             <w:rStyle w:val="Hyperlink"/>
@@ -1069,7 +1048,7 @@
             <w:noProof/>
             <w:webHidden/>
           </w:rPr>
-          <w:instrText xml:space="preserve"> PAGEREF _Toc239252160 \h </w:instrText>
+          <w:instrText xml:space="preserve"> PAGEREF _Toc239252492 \h </w:instrText>
         </w:r>
         <w:r>
           <w:rPr>
@@ -1114,7 +1093,7 @@
           <w14:ligatures w14:val="standardContextual"/>
         </w:rPr>
       </w:pPr>
-      <w:hyperlink w:anchor="_Toc239252161" w:history="1">
+      <w:hyperlink w:anchor="_Toc239252493" w:history="1">
         <w:r>
           <w:rPr>
             <w:rStyle w:val="Hyperlink"/>
@@ -1144,7 +1123,7 @@
             <w:noProof/>
             <w:webHidden/>
           </w:rPr>
-          <w:instrText xml:space="preserve"> PAGEREF _Toc239252161 \h </w:instrText>
+          <w:instrText xml:space="preserve"> PAGEREF _Toc239252493 \h </w:instrText>
         </w:r>
         <w:r>
           <w:rPr>
@@ -1189,7 +1168,7 @@
           <w14:ligatures w14:val="standardContextual"/>
         </w:rPr>
       </w:pPr>
-      <w:hyperlink w:anchor="_Toc239252162" w:history="1">
+      <w:hyperlink w:anchor="_Toc239252494" w:history="1">
         <w:r>
           <w:rPr>
             <w:rStyle w:val="Hyperlink"/>
@@ -1218,7 +1197,7 @@
             <w:noProof/>
             <w:webHidden/>
           </w:rPr>
-          <w:instrText xml:space="preserve"> PAGEREF _Toc239252162 \h </w:instrText>
+          <w:instrText xml:space="preserve"> PAGEREF _Toc239252494 \h </w:instrText>
         </w:r>
         <w:r>
           <w:rPr>
@@ -1263,7 +1242,7 @@
           <w14:ligatures w14:val="standardContextual"/>
         </w:rPr>
       </w:pPr>
-      <w:hyperlink w:anchor="_Toc239252163" w:history="1">
+      <w:hyperlink w:anchor="_Toc239252495" w:history="1">
         <w:r>
           <w:rPr>
             <w:rStyle w:val="Hyperlink"/>
@@ -1292,7 +1271,7 @@
             <w:noProof/>
             <w:webHidden/>
           </w:rPr>
-          <w:instrText xml:space="preserve"> PAGEREF _Toc239252163 \h </w:instrText>
+          <w:instrText xml:space="preserve"> PAGEREF _Toc239252495 \h </w:instrText>
         </w:r>
         <w:r>
           <w:rPr>
@@ -1337,7 +1316,7 @@
           <w14:ligatures w14:val="standardContextual"/>
         </w:rPr>
       </w:pPr>
-      <w:hyperlink w:anchor="_Toc239252164" w:history="1">
+      <w:hyperlink w:anchor="_Toc239252496" w:history="1">
         <w:r>
           <w:rPr>
             <w:rStyle w:val="Hyperlink"/>
@@ -1366,7 +1345,7 @@
             <w:noProof/>
             <w:webHidden/>
           </w:rPr>
-          <w:instrText xml:space="preserve"> PAGEREF _Toc239252164 \h </w:instrText>
+          <w:instrText xml:space="preserve"> PAGEREF _Toc239252496 \h </w:instrText>
         </w:r>
         <w:r>
           <w:rPr>
@@ -1411,7 +1390,7 @@
           <w14:ligatures w14:val="standardContextual"/>
         </w:rPr>
       </w:pPr>
-      <w:hyperlink w:anchor="_Toc239252165" w:history="1">
+      <w:hyperlink w:anchor="_Toc239252497" w:history="1">
         <w:r>
           <w:rPr>
             <w:rStyle w:val="Hyperlink"/>
@@ -1440,7 +1419,7 @@
             <w:noProof/>
             <w:webHidden/>
           </w:rPr>
-          <w:instrText xml:space="preserve"> PAGEREF _Toc239252165 \h </w:instrText>
+          <w:instrText xml:space="preserve"> PAGEREF _Toc239252497 \h </w:instrText>
         </w:r>
         <w:r>
           <w:rPr>
@@ -1485,7 +1464,7 @@
           <w14:ligatures w14:val="standardContextual"/>
         </w:rPr>
       </w:pPr>
-      <w:hyperlink w:anchor="_Toc239252166" w:history="1">
+      <w:hyperlink w:anchor="_Toc239252498" w:history="1">
         <w:r>
           <w:rPr>
             <w:rStyle w:val="Hyperlink"/>
@@ -1514,7 +1493,7 @@
             <w:noProof/>
             <w:webHidden/>
           </w:rPr>
-          <w:instrText xml:space="preserve"> PAGEREF _Toc239252166 \h </w:instrText>
+          <w:instrText xml:space="preserve"> PAGEREF _Toc239252498 \h </w:instrText>
         </w:r>
         <w:r>
           <w:rPr>
@@ -1559,7 +1538,7 @@
           <w14:ligatures w14:val="standardContextual"/>
         </w:rPr>
       </w:pPr>
-      <w:hyperlink w:anchor="_Toc239252167" w:history="1">
+      <w:hyperlink w:anchor="_Toc239252499" w:history="1">
         <w:r>
           <w:rPr>
             <w:rStyle w:val="Hyperlink"/>
@@ -1588,7 +1567,7 @@
             <w:noProof/>
             <w:webHidden/>
           </w:rPr>
-          <w:instrText xml:space="preserve"> PAGEREF _Toc239252167 \h </w:instrText>
+          <w:instrText xml:space="preserve"> PAGEREF _Toc239252499 \h </w:instrText>
         </w:r>
         <w:r>
           <w:rPr>
@@ -1633,7 +1612,7 @@
           <w14:ligatures w14:val="standardContextual"/>
         </w:rPr>
       </w:pPr>
-      <w:hyperlink w:anchor="_Toc239252168" w:history="1">
+      <w:hyperlink w:anchor="_Toc239252500" w:history="1">
         <w:r>
           <w:rPr>
             <w:rStyle w:val="Hyperlink"/>
@@ -1662,7 +1641,7 @@
             <w:noProof/>
             <w:webHidden/>
           </w:rPr>
-          <w:instrText xml:space="preserve"> PAGEREF _Toc239252168 \h </w:instrText>
+          <w:instrText xml:space="preserve"> PAGEREF _Toc239252500 \h </w:instrText>
         </w:r>
         <w:r>
           <w:rPr>
@@ -1707,7 +1686,7 @@
           <w14:ligatures w14:val="standardContextual"/>
         </w:rPr>
       </w:pPr>
-      <w:hyperlink w:anchor="_Toc239252169" w:history="1">
+      <w:hyperlink w:anchor="_Toc239252501" w:history="1">
         <w:r>
           <w:rPr>
             <w:rStyle w:val="Hyperlink"/>
@@ -1736,7 +1715,7 @@
             <w:noProof/>
             <w:webHidden/>
           </w:rPr>
-          <w:instrText xml:space="preserve"> PAGEREF _Toc239252169 \h </w:instrText>
+          <w:instrText xml:space="preserve"> PAGEREF _Toc239252501 \h </w:instrText>
         </w:r>
         <w:r>
           <w:rPr>
@@ -1781,7 +1760,7 @@
           <w14:ligatures w14:val="standardContextual"/>
         </w:rPr>
       </w:pPr>
-      <w:hyperlink w:anchor="_Toc239252170" w:history="1">
+      <w:hyperlink w:anchor="_Toc239252502" w:history="1">
         <w:r>
           <w:rPr>
             <w:rStyle w:val="Hyperlink"/>
@@ -1810,7 +1789,7 @@
             <w:noProof/>
             <w:webHidden/>
           </w:rPr>
-          <w:instrText xml:space="preserve"> PAGEREF _Toc239252170 \h </w:instrText>
+          <w:instrText xml:space="preserve"> PAGEREF _Toc239252502 \h </w:instrText>
         </w:r>
         <w:r>
           <w:rPr>
@@ -1855,7 +1834,7 @@
           <w14:ligatures w14:val="standardContextual"/>
         </w:rPr>
       </w:pPr>
-      <w:hyperlink w:anchor="_Toc239252171" w:history="1">
+      <w:hyperlink w:anchor="_Toc239252503" w:history="1">
         <w:r>
           <w:rPr>
             <w:rStyle w:val="Hyperlink"/>
@@ -1884,7 +1863,7 @@
             <w:noProof/>
             <w:webHidden/>
           </w:rPr>
-          <w:instrText xml:space="preserve"> PAGEREF _Toc239252171 \h </w:instrText>
+          <w:instrText xml:space="preserve"> PAGEREF _Toc239252503 \h </w:instrText>
         </w:r>
         <w:r>
           <w:rPr>
@@ -1929,7 +1908,7 @@
           <w14:ligatures w14:val="standardContextual"/>
         </w:rPr>
       </w:pPr>
-      <w:hyperlink w:anchor="_Toc239252172" w:history="1">
+      <w:hyperlink w:anchor="_Toc239252504" w:history="1">
         <w:r>
           <w:rPr>
             <w:rStyle w:val="Hyperlink"/>
@@ -1958,7 +1937,7 @@
             <w:noProof/>
             <w:webHidden/>
           </w:rPr>
-          <w:instrText xml:space="preserve"> PAGEREF _Toc239252172 \h </w:instrText>
+          <w:instrText xml:space="preserve"> PAGEREF _Toc239252504 \h </w:instrText>
         </w:r>
         <w:r>
           <w:rPr>
@@ -2003,7 +1982,7 @@
           <w14:ligatures w14:val="standardContextual"/>
         </w:rPr>
       </w:pPr>
-      <w:hyperlink w:anchor="_Toc239252173" w:history="1">
+      <w:hyperlink w:anchor="_Toc239252505" w:history="1">
         <w:r>
           <w:rPr>
             <w:rStyle w:val="Hyperlink"/>
@@ -2032,7 +2011,7 @@
             <w:noProof/>
             <w:webHidden/>
           </w:rPr>
-          <w:instrText xml:space="preserve"> PAGEREF _Toc239252173 \h </w:instrText>
+          <w:instrText xml:space="preserve"> PAGEREF _Toc239252505 \h </w:instrText>
         </w:r>
         <w:r>
           <w:rPr>
@@ -2077,7 +2056,7 @@
           <w14:ligatures w14:val="standardContextual"/>
         </w:rPr>
       </w:pPr>
-      <w:hyperlink w:anchor="_Toc239252174" w:history="1">
+      <w:hyperlink w:anchor="_Toc239252506" w:history="1">
         <w:r>
           <w:rPr>
             <w:rStyle w:val="Hyperlink"/>
@@ -2105,7 +2084,7 @@
             <w:noProof/>
             <w:webHidden/>
           </w:rPr>
-          <w:instrText xml:space="preserve"> PAGEREF _Toc239252174 \h </w:instrText>
+          <w:instrText xml:space="preserve"> PAGEREF _Toc239252506 \h </w:instrText>
         </w:r>
         <w:r>
           <w:rPr>
@@ -2150,7 +2129,7 @@
           <w14:ligatures w14:val="standardContextual"/>
         </w:rPr>
       </w:pPr>
-      <w:hyperlink w:anchor="_Toc239252175" w:history="1">
+      <w:hyperlink w:anchor="_Toc239252507" w:history="1">
         <w:r>
           <w:rPr>
             <w:rStyle w:val="Hyperlink"/>
@@ -2178,7 +2157,7 @@
             <w:noProof/>
             <w:webHidden/>
           </w:rPr>
-          <w:instrText xml:space="preserve"> PAGEREF _Toc239252175 \h </w:instrText>
+          <w:instrText xml:space="preserve"> PAGEREF _Toc239252507 \h </w:instrText>
         </w:r>
         <w:r>
           <w:rPr>
@@ -2223,7 +2202,7 @@
           <w14:ligatures w14:val="standardContextual"/>
         </w:rPr>
       </w:pPr>
-      <w:hyperlink w:anchor="_Toc239252176" w:history="1">
+      <w:hyperlink w:anchor="_Toc239252508" w:history="1">
         <w:r>
           <w:rPr>
             <w:rStyle w:val="Hyperlink"/>
@@ -2251,7 +2230,7 @@
             <w:noProof/>
             <w:webHidden/>
           </w:rPr>
-          <w:instrText xml:space="preserve"> PAGEREF _Toc239252176 \h </w:instrText>
+          <w:instrText xml:space="preserve"> PAGEREF _Toc239252508 \h </w:instrText>
         </w:r>
         <w:r>
           <w:rPr>
@@ -2296,7 +2275,7 @@
           <w14:ligatures w14:val="standardContextual"/>
         </w:rPr>
       </w:pPr>
-      <w:hyperlink w:anchor="_Toc239252177" w:history="1">
+      <w:hyperlink w:anchor="_Toc239252509" w:history="1">
         <w:r>
           <w:rPr>
             <w:rStyle w:val="Hyperlink"/>
@@ -2325,7 +2304,7 @@
             <w:noProof/>
             <w:webHidden/>
           </w:rPr>
-          <w:instrText xml:space="preserve"> PAGEREF _Toc239252177 \h </w:instrText>
+          <w:instrText xml:space="preserve"> PAGEREF _Toc239252509 \h </w:instrText>
         </w:r>
         <w:r>
           <w:rPr>
@@ -2370,7 +2349,7 @@
           <w14:ligatures w14:val="standardContextual"/>
         </w:rPr>
       </w:pPr>
-      <w:hyperlink w:anchor="_Toc239252178" w:history="1">
+      <w:hyperlink w:anchor="_Toc239252510" w:history="1">
         <w:r>
           <w:rPr>
             <w:rStyle w:val="Hyperlink"/>
@@ -2399,7 +2378,7 @@
             <w:noProof/>
             <w:webHidden/>
           </w:rPr>
-          <w:instrText xml:space="preserve"> PAGEREF _Toc239252178 \h </w:instrText>
+          <w:instrText xml:space="preserve"> PAGEREF _Toc239252510 \h </w:instrText>
         </w:r>
         <w:r>
           <w:rPr>
@@ -2444,7 +2423,7 @@
           <w14:ligatures w14:val="standardContextual"/>
         </w:rPr>
       </w:pPr>
-      <w:hyperlink w:anchor="_Toc239252179" w:history="1">
+      <w:hyperlink w:anchor="_Toc239252511" w:history="1">
         <w:r>
           <w:rPr>
             <w:rStyle w:val="Hyperlink"/>
@@ -2473,7 +2452,7 @@
             <w:noProof/>
             <w:webHidden/>
           </w:rPr>
-          <w:instrText xml:space="preserve"> PAGEREF _Toc239252179 \h </w:instrText>
+          <w:instrText xml:space="preserve"> PAGEREF _Toc239252511 \h </w:instrText>
         </w:r>
         <w:r>
           <w:rPr>
@@ -2518,7 +2497,7 @@
           <w14:ligatures w14:val="standardContextual"/>
         </w:rPr>
       </w:pPr>
-      <w:hyperlink w:anchor="_Toc239252180" w:history="1">
+      <w:hyperlink w:anchor="_Toc239252512" w:history="1">
         <w:r>
           <w:rPr>
             <w:rStyle w:val="Hyperlink"/>
@@ -2548,7 +2527,7 @@
             <w:noProof/>
             <w:webHidden/>
           </w:rPr>
-          <w:instrText xml:space="preserve"> PAGEREF _Toc239252180 \h </w:instrText>
+          <w:instrText xml:space="preserve"> PAGEREF _Toc239252512 \h </w:instrText>
         </w:r>
         <w:r>
           <w:rPr>
@@ -2593,7 +2572,7 @@
           <w14:ligatures w14:val="standardContextual"/>
         </w:rPr>
       </w:pPr>
-      <w:hyperlink w:anchor="_Toc239252181" w:history="1">
+      <w:hyperlink w:anchor="_Toc239252513" w:history="1">
         <w:r>
           <w:rPr>
             <w:rStyle w:val="Hyperlink"/>
@@ -2623,7 +2602,7 @@
             <w:noProof/>
             <w:webHidden/>
           </w:rPr>
-          <w:instrText xml:space="preserve"> PAGEREF _Toc239252181 \h </w:instrText>
+          <w:instrText xml:space="preserve"> PAGEREF _Toc239252513 \h </w:instrText>
         </w:r>
         <w:r>
           <w:rPr>
@@ -2668,7 +2647,7 @@
           <w14:ligatures w14:val="standardContextual"/>
         </w:rPr>
       </w:pPr>
-      <w:hyperlink w:anchor="_Toc239252182" w:history="1">
+      <w:hyperlink w:anchor="_Toc239252514" w:history="1">
         <w:r>
           <w:rPr>
             <w:rStyle w:val="Hyperlink"/>
@@ -2697,7 +2676,7 @@
             <w:noProof/>
             <w:webHidden/>
           </w:rPr>
-          <w:instrText xml:space="preserve"> PAGEREF _Toc239252182 \h </w:instrText>
+          <w:instrText xml:space="preserve"> PAGEREF _Toc239252514 \h </w:instrText>
         </w:r>
         <w:r>
           <w:rPr>
@@ -2742,7 +2721,7 @@
           <w14:ligatures w14:val="standardContextual"/>
         </w:rPr>
       </w:pPr>
-      <w:hyperlink w:anchor="_Toc239252183" w:history="1">
+      <w:hyperlink w:anchor="_Toc239252515" w:history="1">
         <w:r>
           <w:rPr>
             <w:rStyle w:val="Hyperlink"/>
@@ -2771,7 +2750,7 @@
             <w:noProof/>
             <w:webHidden/>
           </w:rPr>
-          <w:instrText xml:space="preserve"> PAGEREF _Toc239252183 \h </w:instrText>
+          <w:instrText xml:space="preserve"> PAGEREF _Toc239252515 \h </w:instrText>
         </w:r>
         <w:r>
           <w:rPr>
@@ -2816,7 +2795,7 @@
           <w14:ligatures w14:val="standardContextual"/>
         </w:rPr>
       </w:pPr>
-      <w:hyperlink w:anchor="_Toc239252184" w:history="1">
+      <w:hyperlink w:anchor="_Toc239252516" w:history="1">
         <w:r>
           <w:rPr>
             <w:rStyle w:val="Hyperlink"/>
@@ -2845,7 +2824,7 @@
             <w:noProof/>
             <w:webHidden/>
           </w:rPr>
-          <w:instrText xml:space="preserve"> PAGEREF _Toc239252184 \h </w:instrText>
+          <w:instrText xml:space="preserve"> PAGEREF _Toc239252516 \h </w:instrText>
         </w:r>
         <w:r>
           <w:rPr>
@@ -2890,7 +2869,7 @@
           <w14:ligatures w14:val="standardContextual"/>
         </w:rPr>
       </w:pPr>
-      <w:hyperlink w:anchor="_Toc239252185" w:history="1">
+      <w:hyperlink w:anchor="_Toc239252517" w:history="1">
         <w:r>
           <w:rPr>
             <w:rStyle w:val="Hyperlink"/>
@@ -2919,7 +2898,7 @@
             <w:noProof/>
             <w:webHidden/>
           </w:rPr>
-          <w:instrText xml:space="preserve"> PAGEREF _Toc239252185 \h </w:instrText>
+          <w:instrText xml:space="preserve"> PAGEREF _Toc239252517 \h </w:instrText>
         </w:r>
         <w:r>
           <w:rPr>
@@ -2964,7 +2943,7 @@
           <w14:ligatures w14:val="standardContextual"/>
         </w:rPr>
       </w:pPr>
-      <w:hyperlink w:anchor="_Toc239252186" w:history="1">
+      <w:hyperlink w:anchor="_Toc239252518" w:history="1">
         <w:r>
           <w:rPr>
             <w:rStyle w:val="Hyperlink"/>
@@ -2993,7 +2972,7 @@
             <w:noProof/>
             <w:webHidden/>
           </w:rPr>
-          <w:instrText xml:space="preserve"> PAGEREF _Toc239252186 \h </w:instrText>
+          <w:instrText xml:space="preserve"> PAGEREF _Toc239252518 \h </w:instrText>
         </w:r>
         <w:r>
           <w:rPr>
@@ -3038,7 +3017,7 @@
           <w14:ligatures w14:val="standardContextual"/>
         </w:rPr>
       </w:pPr>
-      <w:hyperlink w:anchor="_Toc239252187" w:history="1">
+      <w:hyperlink w:anchor="_Toc239252519" w:history="1">
         <w:r>
           <w:rPr>
             <w:rStyle w:val="Hyperlink"/>
@@ -3067,7 +3046,7 @@
             <w:noProof/>
             <w:webHidden/>
           </w:rPr>
-          <w:instrText xml:space="preserve"> PAGEREF _Toc239252187 \h </w:instrText>
+          <w:instrText xml:space="preserve"> PAGEREF _Toc239252519 \h </w:instrText>
         </w:r>
         <w:r>
           <w:rPr>
@@ -3112,7 +3091,7 @@
           <w14:ligatures w14:val="standardContextual"/>
         </w:rPr>
       </w:pPr>
-      <w:hyperlink w:anchor="_Toc239252188" w:history="1">
+      <w:hyperlink w:anchor="_Toc239252520" w:history="1">
         <w:r>
           <w:rPr>
             <w:rStyle w:val="Hyperlink"/>
@@ -3141,7 +3120,7 @@
             <w:noProof/>
             <w:webHidden/>
           </w:rPr>
-          <w:instrText xml:space="preserve"> PAGEREF _Toc239252188 \h </w:instrText>
+          <w:instrText xml:space="preserve"> PAGEREF _Toc239252520 \h </w:instrText>
         </w:r>
         <w:r>
           <w:rPr>
@@ -3186,7 +3165,7 @@
           <w14:ligatures w14:val="standardContextual"/>
         </w:rPr>
       </w:pPr>
-      <w:hyperlink w:anchor="_Toc239252189" w:history="1">
+      <w:hyperlink w:anchor="_Toc239252521" w:history="1">
         <w:r>
           <w:rPr>
             <w:rStyle w:val="Hyperlink"/>
@@ -3215,7 +3194,7 @@
             <w:noProof/>
             <w:webHidden/>
           </w:rPr>
-          <w:instrText xml:space="preserve"> PAGEREF _Toc239252189 \h </w:instrText>
+          <w:instrText xml:space="preserve"> PAGEREF _Toc239252521 \h </w:instrText>
         </w:r>
         <w:r>
           <w:rPr>
@@ -3260,7 +3239,7 @@
           <w14:ligatures w14:val="standardContextual"/>
         </w:rPr>
       </w:pPr>
-      <w:hyperlink w:anchor="_Toc239252190" w:history="1">
+      <w:hyperlink w:anchor="_Toc239252522" w:history="1">
         <w:r>
           <w:rPr>
             <w:rStyle w:val="Hyperlink"/>
@@ -3289,7 +3268,7 @@
             <w:noProof/>
             <w:webHidden/>
           </w:rPr>
-          <w:instrText xml:space="preserve"> PAGEREF _Toc239252190 \h </w:instrText>
+          <w:instrText xml:space="preserve"> PAGEREF _Toc239252522 \h </w:instrText>
         </w:r>
         <w:r>
           <w:rPr>
@@ -3336,7 +3315,7 @@
         <w:spacing w:line="480" w:lineRule="auto"/>
         <w:jc w:val="center"/>
       </w:pPr>
-      <w:bookmarkStart w:id="2" w:name="_Toc239252153"/>
+      <w:bookmarkStart w:id="2" w:name="_Toc239252485"/>
       <w:r>
         <w:rPr>
           <w:b/>
@@ -3840,7 +3819,7 @@
         <w:spacing w:line="480" w:lineRule="auto"/>
         <w:jc w:val="center"/>
       </w:pPr>
-      <w:bookmarkStart w:id="3" w:name="_Toc239252154"/>
+      <w:bookmarkStart w:id="3" w:name="_Toc239252486"/>
       <w:r>
         <w:rPr>
           <w:b/>
@@ -3873,7 +3852,7 @@
         <w:spacing w:line="480" w:lineRule="auto"/>
         <w:jc w:val="center"/>
       </w:pPr>
-      <w:bookmarkStart w:id="4" w:name="_Toc239252155"/>
+      <w:bookmarkStart w:id="4" w:name="_Toc239252487"/>
       <w:r>
         <w:rPr>
           <w:b/>
@@ -5257,7 +5236,7 @@
         <w:spacing w:line="480" w:lineRule="auto"/>
         <w:jc w:val="center"/>
       </w:pPr>
-      <w:bookmarkStart w:id="5" w:name="_Toc239252156"/>
+      <w:bookmarkStart w:id="5" w:name="_Toc239252488"/>
       <w:r>
         <w:rPr>
           <w:b/>
@@ -5277,7 +5256,7 @@
         <w:keepNext/>
         <w:spacing w:line="480" w:lineRule="auto"/>
       </w:pPr>
-      <w:bookmarkStart w:id="6" w:name="_Toc239252157"/>
+      <w:bookmarkStart w:id="6" w:name="_Toc239252489"/>
       <w:r>
         <w:rPr>
           <w:b/>
@@ -5359,7 +5338,7 @@
         <w:keepNext/>
         <w:spacing w:line="480" w:lineRule="auto"/>
       </w:pPr>
-      <w:bookmarkStart w:id="7" w:name="_Toc239252158"/>
+      <w:bookmarkStart w:id="7" w:name="_Toc239252490"/>
       <w:r>
         <w:rPr>
           <w:b/>
@@ -5430,7 +5409,7 @@
         <w:keepNext/>
         <w:spacing w:line="480" w:lineRule="auto"/>
       </w:pPr>
-      <w:bookmarkStart w:id="8" w:name="_Toc239252159"/>
+      <w:bookmarkStart w:id="8" w:name="_Toc239252491"/>
       <w:r>
         <w:rPr>
           <w:b/>
@@ -5449,7 +5428,7 @@
         <w:keepNext/>
         <w:spacing w:line="480" w:lineRule="auto"/>
       </w:pPr>
-      <w:bookmarkStart w:id="9" w:name="_Toc239252160"/>
+      <w:bookmarkStart w:id="9" w:name="_Toc239252492"/>
       <w:r>
         <w:rPr>
           <w:b/>
@@ -5478,7 +5457,7 @@
         <w:keepNext/>
         <w:spacing w:line="480" w:lineRule="auto"/>
       </w:pPr>
-      <w:bookmarkStart w:id="10" w:name="_Toc239252161"/>
+      <w:bookmarkStart w:id="10" w:name="_Toc239252493"/>
       <w:r>
         <w:rPr>
           <w:b/>
@@ -5604,7 +5583,7 @@
         <w:keepNext/>
         <w:spacing w:line="480" w:lineRule="auto"/>
       </w:pPr>
-      <w:bookmarkStart w:id="11" w:name="_Toc239252162"/>
+      <w:bookmarkStart w:id="11" w:name="_Toc239252494"/>
       <w:r>
         <w:rPr>
           <w:b/>
@@ -5767,7 +5746,7 @@
         <w:spacing w:line="480" w:lineRule="auto"/>
         <w:jc w:val="center"/>
       </w:pPr>
-      <w:bookmarkStart w:id="12" w:name="_Toc239252163"/>
+      <w:bookmarkStart w:id="12" w:name="_Toc239252495"/>
       <w:r>
         <w:rPr>
           <w:b/>
@@ -5787,7 +5766,7 @@
         <w:keepNext/>
         <w:spacing w:line="480" w:lineRule="auto"/>
       </w:pPr>
-      <w:bookmarkStart w:id="13" w:name="_Toc239252164"/>
+      <w:bookmarkStart w:id="13" w:name="_Toc239252496"/>
       <w:r>
         <w:rPr>
           <w:b/>
@@ -5903,7 +5882,7 @@
         <w:keepNext/>
         <w:spacing w:line="480" w:lineRule="auto"/>
       </w:pPr>
-      <w:bookmarkStart w:id="14" w:name="_Toc239252165"/>
+      <w:bookmarkStart w:id="14" w:name="_Toc239252497"/>
       <w:r>
         <w:rPr>
           <w:b/>
@@ -6528,7 +6507,7 @@
         <w:keepNext/>
         <w:spacing w:line="480" w:lineRule="auto"/>
       </w:pPr>
-      <w:bookmarkStart w:id="15" w:name="_Toc239252166"/>
+      <w:bookmarkStart w:id="15" w:name="_Toc239252498"/>
       <w:r>
         <w:rPr>
           <w:b/>
@@ -6685,7 +6664,7 @@
         <w:keepNext/>
         <w:spacing w:line="480" w:lineRule="auto"/>
       </w:pPr>
-      <w:bookmarkStart w:id="16" w:name="_Toc239252167"/>
+      <w:bookmarkStart w:id="16" w:name="_Toc239252499"/>
       <w:r>
         <w:rPr>
           <w:b/>
@@ -7584,7 +7563,7 @@
         <w:keepNext/>
         <w:spacing w:line="480" w:lineRule="auto"/>
       </w:pPr>
-      <w:bookmarkStart w:id="17" w:name="_Toc239252168"/>
+      <w:bookmarkStart w:id="17" w:name="_Toc239252500"/>
       <w:r>
         <w:rPr>
           <w:b/>
@@ -8066,7 +8045,7 @@
         <w:spacing w:line="480" w:lineRule="auto"/>
         <w:jc w:val="center"/>
       </w:pPr>
-      <w:bookmarkStart w:id="18" w:name="_Toc239252169"/>
+      <w:bookmarkStart w:id="18" w:name="_Toc239252501"/>
       <w:r>
         <w:rPr>
           <w:b/>
@@ -8086,7 +8065,7 @@
         <w:keepNext/>
         <w:spacing w:line="480" w:lineRule="auto"/>
       </w:pPr>
-      <w:bookmarkStart w:id="19" w:name="_Toc239252170"/>
+      <w:bookmarkStart w:id="19" w:name="_Toc239252502"/>
       <w:r>
         <w:rPr>
           <w:b/>
@@ -8170,7 +8149,7 @@
           <w:noProof/>
         </w:rPr>
         <w:drawing>
-          <wp:inline distT="0" distB="0" distL="0" distR="0" wp14:anchorId="5DF86FBD" wp14:editId="1EE38D5D">
+          <wp:inline distT="0" distB="0" distL="0" distR="0" wp14:anchorId="23B49910" wp14:editId="6260AF30">
             <wp:extent cx="5577840" cy="3434103"/>
             <wp:effectExtent l="0" t="0" r="0" b="0"/>
             <wp:docPr id="2" name="Picture 2"/>
@@ -8213,7 +8192,7 @@
         <w:keepNext/>
         <w:spacing w:line="480" w:lineRule="auto"/>
       </w:pPr>
-      <w:bookmarkStart w:id="20" w:name="_Toc239252171"/>
+      <w:bookmarkStart w:id="20" w:name="_Toc239252503"/>
       <w:r>
         <w:rPr>
           <w:b/>
@@ -8418,7 +8397,7 @@
         <w:keepNext/>
         <w:spacing w:line="480" w:lineRule="auto"/>
       </w:pPr>
-      <w:bookmarkStart w:id="21" w:name="_Toc239252172"/>
+      <w:bookmarkStart w:id="21" w:name="_Toc239252504"/>
       <w:r>
         <w:rPr>
           <w:b/>
@@ -8531,7 +8510,7 @@
           <w:noProof/>
         </w:rPr>
         <w:drawing>
-          <wp:inline distT="0" distB="0" distL="0" distR="0" wp14:anchorId="1AB2EB40" wp14:editId="5CF7AE25">
+          <wp:inline distT="0" distB="0" distL="0" distR="0" wp14:anchorId="322D9D01" wp14:editId="1AECFDAA">
             <wp:extent cx="5577840" cy="4709434"/>
             <wp:effectExtent l="0" t="0" r="0" b="0"/>
             <wp:docPr id="3" name="Picture 3"/>
@@ -8574,7 +8553,7 @@
         <w:keepNext/>
         <w:spacing w:line="480" w:lineRule="auto"/>
       </w:pPr>
-      <w:bookmarkStart w:id="22" w:name="_Toc239252173"/>
+      <w:bookmarkStart w:id="22" w:name="_Toc239252505"/>
       <w:r>
         <w:rPr>
           <w:b/>
@@ -8604,7 +8583,7 @@
         <w:keepNext/>
         <w:spacing w:line="480" w:lineRule="auto"/>
       </w:pPr>
-      <w:bookmarkStart w:id="23" w:name="_Toc239252174"/>
+      <w:bookmarkStart w:id="23" w:name="_Toc239252506"/>
       <w:r>
         <w:rPr>
           <w:b/>
@@ -8775,7 +8754,7 @@
         <w:keepNext/>
         <w:spacing w:line="480" w:lineRule="auto"/>
       </w:pPr>
-      <w:bookmarkStart w:id="24" w:name="_Toc239252175"/>
+      <w:bookmarkStart w:id="24" w:name="_Toc239252507"/>
       <w:r>
         <w:rPr>
           <w:b/>
@@ -8946,7 +8925,7 @@
         <w:keepNext/>
         <w:spacing w:line="480" w:lineRule="auto"/>
       </w:pPr>
-      <w:bookmarkStart w:id="25" w:name="_Toc239252176"/>
+      <w:bookmarkStart w:id="25" w:name="_Toc239252508"/>
       <w:r>
         <w:rPr>
           <w:b/>
@@ -9155,7 +9134,7 @@
         <w:keepNext/>
         <w:spacing w:line="480" w:lineRule="auto"/>
       </w:pPr>
-      <w:bookmarkStart w:id="26" w:name="_Toc239252177"/>
+      <w:bookmarkStart w:id="26" w:name="_Toc239252509"/>
       <w:r>
         <w:rPr>
           <w:b/>
@@ -9211,7 +9190,7 @@
           <w:noProof/>
         </w:rPr>
         <w:drawing>
-          <wp:inline distT="0" distB="0" distL="0" distR="0" wp14:anchorId="24E0AE9D" wp14:editId="5A978976">
+          <wp:inline distT="0" distB="0" distL="0" distR="0" wp14:anchorId="10CC357B" wp14:editId="052C778B">
             <wp:extent cx="5394960" cy="6491029"/>
             <wp:effectExtent l="0" t="0" r="0" b="0"/>
             <wp:docPr id="4" name="Picture 4"/>
@@ -9305,7 +9284,7 @@
         <w:keepNext/>
         <w:spacing w:line="480" w:lineRule="auto"/>
       </w:pPr>
-      <w:bookmarkStart w:id="27" w:name="_Toc239252178"/>
+      <w:bookmarkStart w:id="27" w:name="_Toc239252510"/>
       <w:r>
         <w:rPr>
           <w:b/>
@@ -9373,7 +9352,7 @@
           <w:noProof/>
         </w:rPr>
         <w:drawing>
-          <wp:inline distT="0" distB="0" distL="0" distR="0" wp14:anchorId="02815833" wp14:editId="37215852">
+          <wp:inline distT="0" distB="0" distL="0" distR="0" wp14:anchorId="15F2CA65" wp14:editId="1E4B2F54">
             <wp:extent cx="5486400" cy="4702629"/>
             <wp:effectExtent l="0" t="0" r="0" b="0"/>
             <wp:docPr id="5" name="Picture 5"/>
@@ -9427,7 +9406,7 @@
         <w:keepNext/>
         <w:spacing w:line="480" w:lineRule="auto"/>
       </w:pPr>
-      <w:bookmarkStart w:id="28" w:name="_Toc239252179"/>
+      <w:bookmarkStart w:id="28" w:name="_Toc239252511"/>
       <w:r>
         <w:rPr>
           <w:b/>
@@ -9447,7 +9426,7 @@
         <w:keepNext/>
         <w:spacing w:line="480" w:lineRule="auto"/>
       </w:pPr>
-      <w:bookmarkStart w:id="29" w:name="_Toc239252180"/>
+      <w:bookmarkStart w:id="29" w:name="_Toc239252512"/>
       <w:r>
         <w:rPr>
           <w:b/>
@@ -9507,7 +9486,7 @@
           <w:noProof/>
         </w:rPr>
         <w:drawing>
-          <wp:inline distT="0" distB="0" distL="0" distR="0" wp14:anchorId="154619AF" wp14:editId="3D541B87">
+          <wp:inline distT="0" distB="0" distL="0" distR="0" wp14:anchorId="45636A8E" wp14:editId="11FB968A">
             <wp:extent cx="5577840" cy="2114499"/>
             <wp:effectExtent l="0" t="0" r="0" b="0"/>
             <wp:docPr id="6" name="Picture 6"/>
@@ -9550,7 +9529,7 @@
         <w:keepNext/>
         <w:spacing w:line="480" w:lineRule="auto"/>
       </w:pPr>
-      <w:bookmarkStart w:id="30" w:name="_Toc239252181"/>
+      <w:bookmarkStart w:id="30" w:name="_Toc239252513"/>
       <w:r>
         <w:rPr>
           <w:b/>
@@ -9611,7 +9590,7 @@
           <w:noProof/>
         </w:rPr>
         <w:drawing>
-          <wp:inline distT="0" distB="0" distL="0" distR="0" wp14:anchorId="5EB0D26C" wp14:editId="408564E8">
+          <wp:inline distT="0" distB="0" distL="0" distR="0" wp14:anchorId="7BCAF483" wp14:editId="34133143">
             <wp:extent cx="5577840" cy="4820912"/>
             <wp:effectExtent l="0" t="0" r="0" b="0"/>
             <wp:docPr id="7" name="Picture 7"/>
@@ -9666,7 +9645,7 @@
         <w:keepNext/>
         <w:spacing w:line="480" w:lineRule="auto"/>
       </w:pPr>
-      <w:bookmarkStart w:id="31" w:name="_Toc239252182"/>
+      <w:bookmarkStart w:id="31" w:name="_Toc239252514"/>
       <w:r>
         <w:rPr>
           <w:b/>
@@ -9728,7 +9707,7 @@
           <w:noProof/>
         </w:rPr>
         <w:drawing>
-          <wp:inline distT="0" distB="0" distL="0" distR="0" wp14:anchorId="587CF2CB" wp14:editId="4C7B3FC5">
+          <wp:inline distT="0" distB="0" distL="0" distR="0" wp14:anchorId="5F55B1ED" wp14:editId="7597C216">
             <wp:extent cx="5303520" cy="6584179"/>
             <wp:effectExtent l="0" t="0" r="0" b="0"/>
             <wp:docPr id="8" name="Picture 8"/>
@@ -9813,7 +9792,7 @@
         <w:spacing w:line="480" w:lineRule="auto"/>
         <w:jc w:val="center"/>
       </w:pPr>
-      <w:bookmarkStart w:id="32" w:name="_Toc239252183"/>
+      <w:bookmarkStart w:id="32" w:name="_Toc239252515"/>
       <w:r>
         <w:rPr>
           <w:b/>
@@ -9844,7 +9823,7 @@
         <w:keepNext/>
         <w:spacing w:line="480" w:lineRule="auto"/>
       </w:pPr>
-      <w:bookmarkStart w:id="33" w:name="_Toc239252184"/>
+      <w:bookmarkStart w:id="33" w:name="_Toc239252516"/>
       <w:r>
         <w:rPr>
           <w:b/>
@@ -10530,7 +10509,7 @@
         <w:keepNext/>
         <w:spacing w:line="480" w:lineRule="auto"/>
       </w:pPr>
-      <w:bookmarkStart w:id="34" w:name="_Toc239252185"/>
+      <w:bookmarkStart w:id="34" w:name="_Toc239252517"/>
       <w:r>
         <w:rPr>
           <w:b/>
@@ -10899,7 +10878,7 @@
         <w:keepNext/>
         <w:spacing w:line="480" w:lineRule="auto"/>
       </w:pPr>
-      <w:bookmarkStart w:id="35" w:name="_Toc239252186"/>
+      <w:bookmarkStart w:id="35" w:name="_Toc239252518"/>
       <w:r>
         <w:rPr>
           <w:b/>
@@ -11202,7 +11181,7 @@
         <w:spacing w:line="480" w:lineRule="auto"/>
         <w:jc w:val="center"/>
       </w:pPr>
-      <w:bookmarkStart w:id="36" w:name="_Toc239252187"/>
+      <w:bookmarkStart w:id="36" w:name="_Toc239252519"/>
       <w:r>
         <w:rPr>
           <w:b/>
@@ -11233,7 +11212,7 @@
         <w:keepNext/>
         <w:spacing w:line="480" w:lineRule="auto"/>
       </w:pPr>
-      <w:bookmarkStart w:id="37" w:name="_Toc239252188"/>
+      <w:bookmarkStart w:id="37" w:name="_Toc239252520"/>
       <w:r>
         <w:rPr>
           <w:b/>
@@ -11411,7 +11390,7 @@
         <w:keepNext/>
         <w:spacing w:line="480" w:lineRule="auto"/>
       </w:pPr>
-      <w:bookmarkStart w:id="38" w:name="_Toc239252189"/>
+      <w:bookmarkStart w:id="38" w:name="_Toc239252521"/>
       <w:r>
         <w:rPr>
           <w:b/>
@@ -11511,7 +11490,7 @@
         <w:spacing w:line="480" w:lineRule="auto"/>
         <w:jc w:val="center"/>
       </w:pPr>
-      <w:bookmarkStart w:id="39" w:name="_Toc239252190"/>
+      <w:bookmarkStart w:id="39" w:name="_Toc239252522"/>
       <w:r>
         <w:rPr>
           <w:b/>
@@ -11860,90 +11839,9 @@
 <file path=word/numbering.xml><?xml version="1.0" encoding="utf-8"?>
 <w:numbering xmlns:wpc="http://schemas.microsoft.com/office/word/2010/wordprocessingCanvas" xmlns:cx="http://schemas.microsoft.com/office/drawing/2014/chartex" xmlns:cx1="http://schemas.microsoft.com/office/drawing/2015/9/8/chartex" xmlns:cx2="http://schemas.microsoft.com/office/drawing/2015/10/21/chartex" xmlns:cx3="http://schemas.microsoft.com/office/drawing/2016/5/9/chartex" xmlns:cx4="http://schemas.microsoft.com/office/drawing/2016/5/10/chartex" xmlns:cx5="http://schemas.microsoft.com/office/drawing/2016/5/11/chartex" xmlns:cx6="http://schemas.microsoft.com/office/drawing/2016/5/12/chartex" xmlns:cx7="http://schemas.microsoft.com/office/drawing/2016/5/13/chartex" xmlns:cx8="http://schemas.microsoft.com/office/drawing/2016/5/14/chartex" xmlns:mc="http://schemas.openxmlformats.org/markup-compatibility/2006" xmlns:aink="http://schemas.microsoft.com/office/drawing/2016/ink" xmlns:am3d="http://schemas.microsoft.com/office/drawing/2017/model3d" xmlns:o="urn:schemas-microsoft-com:office:office" xmlns:oel="http://schemas.microsoft.com/office/2019/extlst" xmlns:r="http://schemas.openxmlformats.org/officeDocument/2006/relationships" xmlns:m="http://schemas.openxmlformats.org/officeDocument/2006/math" xmlns:v="urn:schemas-microsoft-com:vml" xmlns:wp14="http://schemas.microsoft.com/office/word/2010/wordprocessingDrawing" xmlns:wp="http://schemas.openxmlformats.org/drawingml/2006/wordprocessingDrawing" xmlns:w10="urn:schemas-microsoft-com:office:word" xmlns:w="http://schemas.openxmlformats.org/wordprocessingml/2006/main" xmlns:w14="http://schemas.microsoft.com/office/word/2010/wordml" xmlns:w15="http://schemas.microsoft.com/office/word/2012/wordml" xmlns:w16cex="http://schemas.microsoft.com/office/word/2018/wordml/cex" xmlns:w16cid="http://schemas.microsoft.com/office/word/2016/wordml/cid" xmlns:w16="http://schemas.microsoft.com/office/word/2018/wordml" xmlns:w16du="http://schemas.microsoft.com/office/word/2023/wordml/word16du" xmlns:w16sdtdh="http://schemas.microsoft.com/office/word/2020/wordml/sdtdatahash" xmlns:w16sdtfl="http://schemas.microsoft.com/office/word/2024/wordml/sdtformatlock" xmlns:w16se="http://schemas.microsoft.com/office/word/2015/wordml/symex" xmlns:wpg="http://schemas.microsoft.com/office/word/2010/wordprocessingGroup" xmlns:wpi="http://schemas.microsoft.com/office/word/2010/wordprocessingInk" xmlns:wne="http://schemas.microsoft.com/office/word/2006/wordml" xmlns:wps="http://schemas.microsoft.com/office/word/2010/wordprocessingShape" mc:Ignorable="w14 w15 w16se w16cid w16 w16cex w16sdtdh w16sdtfl w16du wp14">
   <w:abstractNum w:abstractNumId="0" w15:restartNumberingAfterBreak="0">
-    <w:nsid w:val="2C5A2EA9"/>
+    <w:nsid w:val="06546D4C"/>
     <w:multiLevelType w:val="multilevel"/>
-    <w:tmpl w:val="D65E4B3C"/>
-    <w:lvl w:ilvl="0">
-      <w:start w:val="1"/>
-      <w:numFmt w:val="decimal"/>
-      <w:lvlText w:val="%1."/>
-      <w:lvlJc w:val="left"/>
-      <w:pPr>
-        <w:ind w:left="720" w:hanging="360"/>
-      </w:pPr>
-      <w:rPr>
-        <w:rFonts w:ascii="Times New Roman" w:eastAsia="Times New Roman" w:hAnsi="Times New Roman" w:cs="Times New Roman"/>
-      </w:rPr>
-    </w:lvl>
-    <w:lvl w:ilvl="1">
-      <w:numFmt w:val="decimal"/>
-      <w:lvlText w:val=""/>
-      <w:lvlJc w:val="left"/>
-      <w:pPr>
-        <w:ind w:left="0" w:firstLine="0"/>
-      </w:pPr>
-    </w:lvl>
-    <w:lvl w:ilvl="2">
-      <w:numFmt w:val="decimal"/>
-      <w:lvlText w:val=""/>
-      <w:lvlJc w:val="left"/>
-      <w:pPr>
-        <w:ind w:left="0" w:firstLine="0"/>
-      </w:pPr>
-    </w:lvl>
-    <w:lvl w:ilvl="3">
-      <w:numFmt w:val="decimal"/>
-      <w:lvlText w:val=""/>
-      <w:lvlJc w:val="left"/>
-      <w:pPr>
-        <w:ind w:left="0" w:firstLine="0"/>
-      </w:pPr>
-    </w:lvl>
-    <w:lvl w:ilvl="4">
-      <w:numFmt w:val="decimal"/>
-      <w:lvlText w:val=""/>
-      <w:lvlJc w:val="left"/>
-      <w:pPr>
-        <w:ind w:left="0" w:firstLine="0"/>
-      </w:pPr>
-    </w:lvl>
-    <w:lvl w:ilvl="5">
-      <w:numFmt w:val="decimal"/>
-      <w:lvlText w:val=""/>
-      <w:lvlJc w:val="left"/>
-      <w:pPr>
-        <w:ind w:left="0" w:firstLine="0"/>
-      </w:pPr>
-    </w:lvl>
-    <w:lvl w:ilvl="6">
-      <w:numFmt w:val="decimal"/>
-      <w:lvlText w:val=""/>
-      <w:lvlJc w:val="left"/>
-      <w:pPr>
-        <w:ind w:left="0" w:firstLine="0"/>
-      </w:pPr>
-    </w:lvl>
-    <w:lvl w:ilvl="7">
-      <w:numFmt w:val="decimal"/>
-      <w:lvlText w:val=""/>
-      <w:lvlJc w:val="left"/>
-      <w:pPr>
-        <w:ind w:left="0" w:firstLine="0"/>
-      </w:pPr>
-    </w:lvl>
-    <w:lvl w:ilvl="8">
-      <w:numFmt w:val="decimal"/>
-      <w:lvlText w:val=""/>
-      <w:lvlJc w:val="left"/>
-      <w:pPr>
-        <w:ind w:left="0" w:firstLine="0"/>
-      </w:pPr>
-    </w:lvl>
-  </w:abstractNum>
-  <w:abstractNum w:abstractNumId="1" w15:restartNumberingAfterBreak="0">
-    <w:nsid w:val="3664511A"/>
-    <w:multiLevelType w:val="multilevel"/>
-    <w:tmpl w:val="4734255A"/>
+    <w:tmpl w:val="9A764684"/>
     <w:lvl w:ilvl="0">
       <w:start w:val="1"/>
       <w:numFmt w:val="bullet"/>
@@ -12025,11 +11923,92 @@
       </w:pPr>
     </w:lvl>
   </w:abstractNum>
-  <w:num w:numId="1" w16cid:durableId="543752880">
+  <w:abstractNum w:abstractNumId="1" w15:restartNumberingAfterBreak="0">
+    <w:nsid w:val="4BC878DB"/>
+    <w:multiLevelType w:val="multilevel"/>
+    <w:tmpl w:val="F2D6C2A0"/>
+    <w:lvl w:ilvl="0">
+      <w:start w:val="1"/>
+      <w:numFmt w:val="decimal"/>
+      <w:lvlText w:val="%1."/>
+      <w:lvlJc w:val="left"/>
+      <w:pPr>
+        <w:ind w:left="720" w:hanging="360"/>
+      </w:pPr>
+      <w:rPr>
+        <w:rFonts w:ascii="Times New Roman" w:eastAsia="Times New Roman" w:hAnsi="Times New Roman" w:cs="Times New Roman"/>
+      </w:rPr>
+    </w:lvl>
+    <w:lvl w:ilvl="1">
+      <w:numFmt w:val="decimal"/>
+      <w:lvlText w:val=""/>
+      <w:lvlJc w:val="left"/>
+      <w:pPr>
+        <w:ind w:left="0" w:firstLine="0"/>
+      </w:pPr>
+    </w:lvl>
+    <w:lvl w:ilvl="2">
+      <w:numFmt w:val="decimal"/>
+      <w:lvlText w:val=""/>
+      <w:lvlJc w:val="left"/>
+      <w:pPr>
+        <w:ind w:left="0" w:firstLine="0"/>
+      </w:pPr>
+    </w:lvl>
+    <w:lvl w:ilvl="3">
+      <w:numFmt w:val="decimal"/>
+      <w:lvlText w:val=""/>
+      <w:lvlJc w:val="left"/>
+      <w:pPr>
+        <w:ind w:left="0" w:firstLine="0"/>
+      </w:pPr>
+    </w:lvl>
+    <w:lvl w:ilvl="4">
+      <w:numFmt w:val="decimal"/>
+      <w:lvlText w:val=""/>
+      <w:lvlJc w:val="left"/>
+      <w:pPr>
+        <w:ind w:left="0" w:firstLine="0"/>
+      </w:pPr>
+    </w:lvl>
+    <w:lvl w:ilvl="5">
+      <w:numFmt w:val="decimal"/>
+      <w:lvlText w:val=""/>
+      <w:lvlJc w:val="left"/>
+      <w:pPr>
+        <w:ind w:left="0" w:firstLine="0"/>
+      </w:pPr>
+    </w:lvl>
+    <w:lvl w:ilvl="6">
+      <w:numFmt w:val="decimal"/>
+      <w:lvlText w:val=""/>
+      <w:lvlJc w:val="left"/>
+      <w:pPr>
+        <w:ind w:left="0" w:firstLine="0"/>
+      </w:pPr>
+    </w:lvl>
+    <w:lvl w:ilvl="7">
+      <w:numFmt w:val="decimal"/>
+      <w:lvlText w:val=""/>
+      <w:lvlJc w:val="left"/>
+      <w:pPr>
+        <w:ind w:left="0" w:firstLine="0"/>
+      </w:pPr>
+    </w:lvl>
+    <w:lvl w:ilvl="8">
+      <w:numFmt w:val="decimal"/>
+      <w:lvlText w:val=""/>
+      <w:lvlJc w:val="left"/>
+      <w:pPr>
+        <w:ind w:left="0" w:firstLine="0"/>
+      </w:pPr>
+    </w:lvl>
+  </w:abstractNum>
+  <w:num w:numId="1" w16cid:durableId="1246110916">
+    <w:abstractNumId w:val="1"/>
+  </w:num>
+  <w:num w:numId="2" w16cid:durableId="22094079">
     <w:abstractNumId w:val="0"/>
-  </w:num>
-  <w:num w:numId="2" w16cid:durableId="716012128">
-    <w:abstractNumId w:val="1"/>
   </w:num>
 </w:numbering>
 </file>
@@ -12966,7 +12945,7 @@
     <w:autoRedefine/>
     <w:uiPriority w:val="39"/>
     <w:unhideWhenUsed/>
-    <w:rsid w:val="00CE2B4E"/>
+    <w:rsid w:val="006F504F"/>
     <w:pPr>
       <w:spacing w:after="100"/>
     </w:pPr>
@@ -12978,7 +12957,7 @@
     <w:autoRedefine/>
     <w:uiPriority w:val="39"/>
     <w:unhideWhenUsed/>
-    <w:rsid w:val="00CE2B4E"/>
+    <w:rsid w:val="006F504F"/>
     <w:pPr>
       <w:spacing w:after="100"/>
       <w:ind w:left="240"/>
@@ -12991,7 +12970,7 @@
     <w:autoRedefine/>
     <w:uiPriority w:val="39"/>
     <w:unhideWhenUsed/>
-    <w:rsid w:val="00CE2B4E"/>
+    <w:rsid w:val="006F504F"/>
     <w:pPr>
       <w:spacing w:after="100"/>
       <w:ind w:left="480"/>

</xml_diff>

<commit_message>
Drop the List of Tables section
With every table converted to prose there is nothing to list, and a page
explaining its own absence is worse than no page. The section is removed when
no numbered tables exist and restored automatically if any are added back.

Co-Authored-By: Claude Opus 5 (1M context) <noreply@anthropic.com>
Claude-Session: https://claude.ai/code/session_0196JS1u5qEW9XzS4ZPnTL2s
</commit_message>
<xml_diff>
--- a/docs/Kinyo_ProjectVI_Proposal.docx
+++ b/docs/Kinyo_ProjectVI_Proposal.docx
@@ -16,7 +16,7 @@
           <w:noProof/>
         </w:rPr>
         <w:drawing>
-          <wp:inline distT="0" distB="0" distL="0" distR="0" wp14:anchorId="08D85E59" wp14:editId="6FA8398C">
+          <wp:inline distT="0" distB="0" distL="0" distR="0" wp14:anchorId="7E37E408" wp14:editId="4133FA85">
             <wp:extent cx="1273012" cy="1114425"/>
             <wp:effectExtent l="0" t="0" r="0" b="0"/>
             <wp:docPr id="1" name="image1.png" descr="Purbanchal University logo"/>
@@ -251,7 +251,7 @@
         <w:spacing w:line="480" w:lineRule="auto"/>
         <w:jc w:val="center"/>
       </w:pPr>
-      <w:bookmarkStart w:id="0" w:name="_Toc239252483"/>
+      <w:bookmarkStart w:id="0" w:name="_Toc239253056"/>
       <w:r>
         <w:rPr>
           <w:b/>
@@ -316,7 +316,7 @@
         <w:spacing w:line="480" w:lineRule="auto"/>
         <w:jc w:val="center"/>
       </w:pPr>
-      <w:bookmarkStart w:id="1" w:name="_Toc239252484"/>
+      <w:bookmarkStart w:id="1" w:name="_Toc239253057"/>
       <w:r>
         <w:rPr>
           <w:b/>
@@ -353,7 +353,7 @@
       <w:r>
         <w:fldChar w:fldCharType="separate"/>
       </w:r>
-      <w:hyperlink w:anchor="_Toc239252483" w:history="1">
+      <w:hyperlink w:anchor="_Toc239253056" w:history="1">
         <w:r>
           <w:rPr>
             <w:rStyle w:val="Hyperlink"/>
@@ -381,7 +381,7 @@
             <w:noProof/>
             <w:webHidden/>
           </w:rPr>
-          <w:instrText xml:space="preserve"> PAGEREF _Toc239252483 \h </w:instrText>
+          <w:instrText xml:space="preserve"> PAGEREF _Toc239253056 \h </w:instrText>
         </w:r>
         <w:r>
           <w:rPr>
@@ -426,7 +426,7 @@
           <w14:ligatures w14:val="standardContextual"/>
         </w:rPr>
       </w:pPr>
-      <w:hyperlink w:anchor="_Toc239252484" w:history="1">
+      <w:hyperlink w:anchor="_Toc239253057" w:history="1">
         <w:r>
           <w:rPr>
             <w:rStyle w:val="Hyperlink"/>
@@ -455,7 +455,7 @@
             <w:noProof/>
             <w:webHidden/>
           </w:rPr>
-          <w:instrText xml:space="preserve"> PAGEREF _Toc239252484 \h </w:instrText>
+          <w:instrText xml:space="preserve"> PAGEREF _Toc239253057 \h </w:instrText>
         </w:r>
         <w:r>
           <w:rPr>
@@ -500,7 +500,7 @@
           <w14:ligatures w14:val="standardContextual"/>
         </w:rPr>
       </w:pPr>
-      <w:hyperlink w:anchor="_Toc239252485" w:history="1">
+      <w:hyperlink w:anchor="_Toc239253058" w:history="1">
         <w:r>
           <w:rPr>
             <w:rStyle w:val="Hyperlink"/>
@@ -529,7 +529,7 @@
             <w:noProof/>
             <w:webHidden/>
           </w:rPr>
-          <w:instrText xml:space="preserve"> PAGEREF _Toc239252485 \h </w:instrText>
+          <w:instrText xml:space="preserve"> PAGEREF _Toc239253058 \h </w:instrText>
         </w:r>
         <w:r>
           <w:rPr>
@@ -574,7 +574,7 @@
           <w14:ligatures w14:val="standardContextual"/>
         </w:rPr>
       </w:pPr>
-      <w:hyperlink w:anchor="_Toc239252486" w:history="1">
+      <w:hyperlink w:anchor="_Toc239253059" w:history="1">
         <w:r>
           <w:rPr>
             <w:rStyle w:val="Hyperlink"/>
@@ -582,7 +582,7 @@
             <w:bCs/>
             <w:noProof/>
           </w:rPr>
-          <w:t>List of Tables</w:t>
+          <w:t>List of Abbreviations</w:t>
         </w:r>
         <w:r>
           <w:rPr>
@@ -603,7 +603,7 @@
             <w:noProof/>
             <w:webHidden/>
           </w:rPr>
-          <w:instrText xml:space="preserve"> PAGEREF _Toc239252486 \h </w:instrText>
+          <w:instrText xml:space="preserve"> PAGEREF _Toc239253059 \h </w:instrText>
         </w:r>
         <w:r>
           <w:rPr>
@@ -648,7 +648,7 @@
           <w14:ligatures w14:val="standardContextual"/>
         </w:rPr>
       </w:pPr>
-      <w:hyperlink w:anchor="_Toc239252487" w:history="1">
+      <w:hyperlink w:anchor="_Toc239253060" w:history="1">
         <w:r>
           <w:rPr>
             <w:rStyle w:val="Hyperlink"/>
@@ -656,7 +656,7 @@
             <w:bCs/>
             <w:noProof/>
           </w:rPr>
-          <w:t>List of Abbreviations</w:t>
+          <w:t>Chapter 1: Introduction</w:t>
         </w:r>
         <w:r>
           <w:rPr>
@@ -677,7 +677,7 @@
             <w:noProof/>
             <w:webHidden/>
           </w:rPr>
-          <w:instrText xml:space="preserve"> PAGEREF _Toc239252487 \h </w:instrText>
+          <w:instrText xml:space="preserve"> PAGEREF _Toc239253060 \h </w:instrText>
         </w:r>
         <w:r>
           <w:rPr>
@@ -697,7 +697,7 @@
             <w:noProof/>
             <w:webHidden/>
           </w:rPr>
-          <w:t>vii</w:t>
+          <w:t>1</w:t>
         </w:r>
         <w:r>
           <w:rPr>
@@ -710,7 +710,7 @@
     </w:p>
     <w:p>
       <w:pPr>
-        <w:pStyle w:val="TOC1"/>
+        <w:pStyle w:val="TOC2"/>
         <w:tabs>
           <w:tab w:val="right" w:leader="dot" w:pos="9350"/>
         </w:tabs>
@@ -722,7 +722,7 @@
           <w14:ligatures w14:val="standardContextual"/>
         </w:rPr>
       </w:pPr>
-      <w:hyperlink w:anchor="_Toc239252488" w:history="1">
+      <w:hyperlink w:anchor="_Toc239253061" w:history="1">
         <w:r>
           <w:rPr>
             <w:rStyle w:val="Hyperlink"/>
@@ -730,7 +730,7 @@
             <w:bCs/>
             <w:noProof/>
           </w:rPr>
-          <w:t>Chapter 1: Introduction</w:t>
+          <w:t>1.1 Background</w:t>
         </w:r>
         <w:r>
           <w:rPr>
@@ -751,7 +751,7 @@
             <w:noProof/>
             <w:webHidden/>
           </w:rPr>
-          <w:instrText xml:space="preserve"> PAGEREF _Toc239252488 \h </w:instrText>
+          <w:instrText xml:space="preserve"> PAGEREF _Toc239253061 \h </w:instrText>
         </w:r>
         <w:r>
           <w:rPr>
@@ -796,7 +796,7 @@
           <w14:ligatures w14:val="standardContextual"/>
         </w:rPr>
       </w:pPr>
-      <w:hyperlink w:anchor="_Toc239252489" w:history="1">
+      <w:hyperlink w:anchor="_Toc239253062" w:history="1">
         <w:r>
           <w:rPr>
             <w:rStyle w:val="Hyperlink"/>
@@ -804,7 +804,7 @@
             <w:bCs/>
             <w:noProof/>
           </w:rPr>
-          <w:t>1.1 Background</w:t>
+          <w:t>1.2 Problem Statement</w:t>
         </w:r>
         <w:r>
           <w:rPr>
@@ -825,7 +825,7 @@
             <w:noProof/>
             <w:webHidden/>
           </w:rPr>
-          <w:instrText xml:space="preserve"> PAGEREF _Toc239252489 \h </w:instrText>
+          <w:instrText xml:space="preserve"> PAGEREF _Toc239253062 \h </w:instrText>
         </w:r>
         <w:r>
           <w:rPr>
@@ -845,7 +845,7 @@
             <w:noProof/>
             <w:webHidden/>
           </w:rPr>
-          <w:t>1</w:t>
+          <w:t>2</w:t>
         </w:r>
         <w:r>
           <w:rPr>
@@ -870,7 +870,7 @@
           <w14:ligatures w14:val="standardContextual"/>
         </w:rPr>
       </w:pPr>
-      <w:hyperlink w:anchor="_Toc239252490" w:history="1">
+      <w:hyperlink w:anchor="_Toc239253063" w:history="1">
         <w:r>
           <w:rPr>
             <w:rStyle w:val="Hyperlink"/>
@@ -878,7 +878,7 @@
             <w:bCs/>
             <w:noProof/>
           </w:rPr>
-          <w:t>1.2 Problem Statement</w:t>
+          <w:t>1.3 Objectives</w:t>
         </w:r>
         <w:r>
           <w:rPr>
@@ -899,7 +899,7 @@
             <w:noProof/>
             <w:webHidden/>
           </w:rPr>
-          <w:instrText xml:space="preserve"> PAGEREF _Toc239252490 \h </w:instrText>
+          <w:instrText xml:space="preserve"> PAGEREF _Toc239253063 \h </w:instrText>
         </w:r>
         <w:r>
           <w:rPr>
@@ -919,7 +919,7 @@
             <w:noProof/>
             <w:webHidden/>
           </w:rPr>
-          <w:t>2</w:t>
+          <w:t>3</w:t>
         </w:r>
         <w:r>
           <w:rPr>
@@ -932,7 +932,7 @@
     </w:p>
     <w:p>
       <w:pPr>
-        <w:pStyle w:val="TOC2"/>
+        <w:pStyle w:val="TOC3"/>
         <w:tabs>
           <w:tab w:val="right" w:leader="dot" w:pos="9350"/>
         </w:tabs>
@@ -944,15 +944,16 @@
           <w14:ligatures w14:val="standardContextual"/>
         </w:rPr>
       </w:pPr>
-      <w:hyperlink w:anchor="_Toc239252491" w:history="1">
+      <w:hyperlink w:anchor="_Toc239253064" w:history="1">
         <w:r>
           <w:rPr>
             <w:rStyle w:val="Hyperlink"/>
             <w:b/>
             <w:bCs/>
-            <w:noProof/>
-          </w:rPr>
-          <w:t>1.3 Objectives</w:t>
+            <w:iCs/>
+            <w:noProof/>
+          </w:rPr>
+          <w:t>1.3.1 General Objective</w:t>
         </w:r>
         <w:r>
           <w:rPr>
@@ -973,7 +974,7 @@
             <w:noProof/>
             <w:webHidden/>
           </w:rPr>
-          <w:instrText xml:space="preserve"> PAGEREF _Toc239252491 \h </w:instrText>
+          <w:instrText xml:space="preserve"> PAGEREF _Toc239253064 \h </w:instrText>
         </w:r>
         <w:r>
           <w:rPr>
@@ -1018,7 +1019,7 @@
           <w14:ligatures w14:val="standardContextual"/>
         </w:rPr>
       </w:pPr>
-      <w:hyperlink w:anchor="_Toc239252492" w:history="1">
+      <w:hyperlink w:anchor="_Toc239253065" w:history="1">
         <w:r>
           <w:rPr>
             <w:rStyle w:val="Hyperlink"/>
@@ -1027,7 +1028,7 @@
             <w:iCs/>
             <w:noProof/>
           </w:rPr>
-          <w:t>1.3.1 General Objective</w:t>
+          <w:t>1.3.2 Specific Objectives</w:t>
         </w:r>
         <w:r>
           <w:rPr>
@@ -1048,7 +1049,7 @@
             <w:noProof/>
             <w:webHidden/>
           </w:rPr>
-          <w:instrText xml:space="preserve"> PAGEREF _Toc239252492 \h </w:instrText>
+          <w:instrText xml:space="preserve"> PAGEREF _Toc239253065 \h </w:instrText>
         </w:r>
         <w:r>
           <w:rPr>
@@ -1081,7 +1082,7 @@
     </w:p>
     <w:p>
       <w:pPr>
-        <w:pStyle w:val="TOC3"/>
+        <w:pStyle w:val="TOC2"/>
         <w:tabs>
           <w:tab w:val="right" w:leader="dot" w:pos="9350"/>
         </w:tabs>
@@ -1093,16 +1094,15 @@
           <w14:ligatures w14:val="standardContextual"/>
         </w:rPr>
       </w:pPr>
-      <w:hyperlink w:anchor="_Toc239252493" w:history="1">
+      <w:hyperlink w:anchor="_Toc239253066" w:history="1">
         <w:r>
           <w:rPr>
             <w:rStyle w:val="Hyperlink"/>
             <w:b/>
             <w:bCs/>
-            <w:iCs/>
-            <w:noProof/>
-          </w:rPr>
-          <w:t>1.3.2 Specific Objectives</w:t>
+            <w:noProof/>
+          </w:rPr>
+          <w:t>1.4 Project Scope</w:t>
         </w:r>
         <w:r>
           <w:rPr>
@@ -1123,7 +1123,7 @@
             <w:noProof/>
             <w:webHidden/>
           </w:rPr>
-          <w:instrText xml:space="preserve"> PAGEREF _Toc239252493 \h </w:instrText>
+          <w:instrText xml:space="preserve"> PAGEREF _Toc239253066 \h </w:instrText>
         </w:r>
         <w:r>
           <w:rPr>
@@ -1143,7 +1143,7 @@
             <w:noProof/>
             <w:webHidden/>
           </w:rPr>
-          <w:t>3</w:t>
+          <w:t>4</w:t>
         </w:r>
         <w:r>
           <w:rPr>
@@ -1156,7 +1156,7 @@
     </w:p>
     <w:p>
       <w:pPr>
-        <w:pStyle w:val="TOC2"/>
+        <w:pStyle w:val="TOC1"/>
         <w:tabs>
           <w:tab w:val="right" w:leader="dot" w:pos="9350"/>
         </w:tabs>
@@ -1168,7 +1168,7 @@
           <w14:ligatures w14:val="standardContextual"/>
         </w:rPr>
       </w:pPr>
-      <w:hyperlink w:anchor="_Toc239252494" w:history="1">
+      <w:hyperlink w:anchor="_Toc239253067" w:history="1">
         <w:r>
           <w:rPr>
             <w:rStyle w:val="Hyperlink"/>
@@ -1176,7 +1176,7 @@
             <w:bCs/>
             <w:noProof/>
           </w:rPr>
-          <w:t>1.4 Project Scope</w:t>
+          <w:t>Chapter 2: Literature Overview</w:t>
         </w:r>
         <w:r>
           <w:rPr>
@@ -1197,7 +1197,7 @@
             <w:noProof/>
             <w:webHidden/>
           </w:rPr>
-          <w:instrText xml:space="preserve"> PAGEREF _Toc239252494 \h </w:instrText>
+          <w:instrText xml:space="preserve"> PAGEREF _Toc239253067 \h </w:instrText>
         </w:r>
         <w:r>
           <w:rPr>
@@ -1217,7 +1217,7 @@
             <w:noProof/>
             <w:webHidden/>
           </w:rPr>
-          <w:t>4</w:t>
+          <w:t>5</w:t>
         </w:r>
         <w:r>
           <w:rPr>
@@ -1230,7 +1230,7 @@
     </w:p>
     <w:p>
       <w:pPr>
-        <w:pStyle w:val="TOC1"/>
+        <w:pStyle w:val="TOC2"/>
         <w:tabs>
           <w:tab w:val="right" w:leader="dot" w:pos="9350"/>
         </w:tabs>
@@ -1242,7 +1242,7 @@
           <w14:ligatures w14:val="standardContextual"/>
         </w:rPr>
       </w:pPr>
-      <w:hyperlink w:anchor="_Toc239252495" w:history="1">
+      <w:hyperlink w:anchor="_Toc239253068" w:history="1">
         <w:r>
           <w:rPr>
             <w:rStyle w:val="Hyperlink"/>
@@ -1250,7 +1250,7 @@
             <w:bCs/>
             <w:noProof/>
           </w:rPr>
-          <w:t>Chapter 2: Literature Overview</w:t>
+          <w:t>2.1 Background and Theoretical Framework</w:t>
         </w:r>
         <w:r>
           <w:rPr>
@@ -1271,7 +1271,7 @@
             <w:noProof/>
             <w:webHidden/>
           </w:rPr>
-          <w:instrText xml:space="preserve"> PAGEREF _Toc239252495 \h </w:instrText>
+          <w:instrText xml:space="preserve"> PAGEREF _Toc239253068 \h </w:instrText>
         </w:r>
         <w:r>
           <w:rPr>
@@ -1316,7 +1316,7 @@
           <w14:ligatures w14:val="standardContextual"/>
         </w:rPr>
       </w:pPr>
-      <w:hyperlink w:anchor="_Toc239252496" w:history="1">
+      <w:hyperlink w:anchor="_Toc239253069" w:history="1">
         <w:r>
           <w:rPr>
             <w:rStyle w:val="Hyperlink"/>
@@ -1324,7 +1324,7 @@
             <w:bCs/>
             <w:noProof/>
           </w:rPr>
-          <w:t>2.1 Background and Theoretical Framework</w:t>
+          <w:t>2.2 Study of Related Systems and Related Work</w:t>
         </w:r>
         <w:r>
           <w:rPr>
@@ -1345,7 +1345,7 @@
             <w:noProof/>
             <w:webHidden/>
           </w:rPr>
-          <w:instrText xml:space="preserve"> PAGEREF _Toc239252496 \h </w:instrText>
+          <w:instrText xml:space="preserve"> PAGEREF _Toc239253069 \h </w:instrText>
         </w:r>
         <w:r>
           <w:rPr>
@@ -1365,7 +1365,7 @@
             <w:noProof/>
             <w:webHidden/>
           </w:rPr>
-          <w:t>5</w:t>
+          <w:t>7</w:t>
         </w:r>
         <w:r>
           <w:rPr>
@@ -1390,7 +1390,7 @@
           <w14:ligatures w14:val="standardContextual"/>
         </w:rPr>
       </w:pPr>
-      <w:hyperlink w:anchor="_Toc239252497" w:history="1">
+      <w:hyperlink w:anchor="_Toc239253070" w:history="1">
         <w:r>
           <w:rPr>
             <w:rStyle w:val="Hyperlink"/>
@@ -1398,7 +1398,7 @@
             <w:bCs/>
             <w:noProof/>
           </w:rPr>
-          <w:t>2.2 Study of Related Systems and Related Work</w:t>
+          <w:t>2.3 Contribution of the Proposed System</w:t>
         </w:r>
         <w:r>
           <w:rPr>
@@ -1419,7 +1419,7 @@
             <w:noProof/>
             <w:webHidden/>
           </w:rPr>
-          <w:instrText xml:space="preserve"> PAGEREF _Toc239252497 \h </w:instrText>
+          <w:instrText xml:space="preserve"> PAGEREF _Toc239253070 \h </w:instrText>
         </w:r>
         <w:r>
           <w:rPr>
@@ -1439,7 +1439,7 @@
             <w:noProof/>
             <w:webHidden/>
           </w:rPr>
-          <w:t>7</w:t>
+          <w:t>9</w:t>
         </w:r>
         <w:r>
           <w:rPr>
@@ -1464,7 +1464,7 @@
           <w14:ligatures w14:val="standardContextual"/>
         </w:rPr>
       </w:pPr>
-      <w:hyperlink w:anchor="_Toc239252498" w:history="1">
+      <w:hyperlink w:anchor="_Toc239253071" w:history="1">
         <w:r>
           <w:rPr>
             <w:rStyle w:val="Hyperlink"/>
@@ -1472,7 +1472,7 @@
             <w:bCs/>
             <w:noProof/>
           </w:rPr>
-          <w:t>2.3 Contribution of the Proposed System</w:t>
+          <w:t>2.4 Functional and Non-Functional Requirements</w:t>
         </w:r>
         <w:r>
           <w:rPr>
@@ -1493,7 +1493,7 @@
             <w:noProof/>
             <w:webHidden/>
           </w:rPr>
-          <w:instrText xml:space="preserve"> PAGEREF _Toc239252498 \h </w:instrText>
+          <w:instrText xml:space="preserve"> PAGEREF _Toc239253071 \h </w:instrText>
         </w:r>
         <w:r>
           <w:rPr>
@@ -1513,7 +1513,7 @@
             <w:noProof/>
             <w:webHidden/>
           </w:rPr>
-          <w:t>9</w:t>
+          <w:t>10</w:t>
         </w:r>
         <w:r>
           <w:rPr>
@@ -1538,7 +1538,7 @@
           <w14:ligatures w14:val="standardContextual"/>
         </w:rPr>
       </w:pPr>
-      <w:hyperlink w:anchor="_Toc239252499" w:history="1">
+      <w:hyperlink w:anchor="_Toc239253072" w:history="1">
         <w:r>
           <w:rPr>
             <w:rStyle w:val="Hyperlink"/>
@@ -1546,7 +1546,7 @@
             <w:bCs/>
             <w:noProof/>
           </w:rPr>
-          <w:t>2.4 Functional and Non-Functional Requirements</w:t>
+          <w:t>2.5 Feasibility Study</w:t>
         </w:r>
         <w:r>
           <w:rPr>
@@ -1567,7 +1567,7 @@
             <w:noProof/>
             <w:webHidden/>
           </w:rPr>
-          <w:instrText xml:space="preserve"> PAGEREF _Toc239252499 \h </w:instrText>
+          <w:instrText xml:space="preserve"> PAGEREF _Toc239253072 \h </w:instrText>
         </w:r>
         <w:r>
           <w:rPr>
@@ -1587,7 +1587,7 @@
             <w:noProof/>
             <w:webHidden/>
           </w:rPr>
-          <w:t>10</w:t>
+          <w:t>14</w:t>
         </w:r>
         <w:r>
           <w:rPr>
@@ -1600,7 +1600,7 @@
     </w:p>
     <w:p>
       <w:pPr>
-        <w:pStyle w:val="TOC2"/>
+        <w:pStyle w:val="TOC1"/>
         <w:tabs>
           <w:tab w:val="right" w:leader="dot" w:pos="9350"/>
         </w:tabs>
@@ -1612,7 +1612,7 @@
           <w14:ligatures w14:val="standardContextual"/>
         </w:rPr>
       </w:pPr>
-      <w:hyperlink w:anchor="_Toc239252500" w:history="1">
+      <w:hyperlink w:anchor="_Toc239253073" w:history="1">
         <w:r>
           <w:rPr>
             <w:rStyle w:val="Hyperlink"/>
@@ -1620,7 +1620,7 @@
             <w:bCs/>
             <w:noProof/>
           </w:rPr>
-          <w:t>2.5 Feasibility Study</w:t>
+          <w:t>Chapter 3: System Design and Methodology</w:t>
         </w:r>
         <w:r>
           <w:rPr>
@@ -1641,7 +1641,7 @@
             <w:noProof/>
             <w:webHidden/>
           </w:rPr>
-          <w:instrText xml:space="preserve"> PAGEREF _Toc239252500 \h </w:instrText>
+          <w:instrText xml:space="preserve"> PAGEREF _Toc239253073 \h </w:instrText>
         </w:r>
         <w:r>
           <w:rPr>
@@ -1661,7 +1661,7 @@
             <w:noProof/>
             <w:webHidden/>
           </w:rPr>
-          <w:t>14</w:t>
+          <w:t>17</w:t>
         </w:r>
         <w:r>
           <w:rPr>
@@ -1674,7 +1674,7 @@
     </w:p>
     <w:p>
       <w:pPr>
-        <w:pStyle w:val="TOC1"/>
+        <w:pStyle w:val="TOC2"/>
         <w:tabs>
           <w:tab w:val="right" w:leader="dot" w:pos="9350"/>
         </w:tabs>
@@ -1686,7 +1686,7 @@
           <w14:ligatures w14:val="standardContextual"/>
         </w:rPr>
       </w:pPr>
-      <w:hyperlink w:anchor="_Toc239252501" w:history="1">
+      <w:hyperlink w:anchor="_Toc239253074" w:history="1">
         <w:r>
           <w:rPr>
             <w:rStyle w:val="Hyperlink"/>
@@ -1694,7 +1694,7 @@
             <w:bCs/>
             <w:noProof/>
           </w:rPr>
-          <w:t>Chapter 3: System Design and Methodology</w:t>
+          <w:t>3.1 Software Development Life Cycle</w:t>
         </w:r>
         <w:r>
           <w:rPr>
@@ -1715,7 +1715,7 @@
             <w:noProof/>
             <w:webHidden/>
           </w:rPr>
-          <w:instrText xml:space="preserve"> PAGEREF _Toc239252501 \h </w:instrText>
+          <w:instrText xml:space="preserve"> PAGEREF _Toc239253074 \h </w:instrText>
         </w:r>
         <w:r>
           <w:rPr>
@@ -1760,7 +1760,7 @@
           <w14:ligatures w14:val="standardContextual"/>
         </w:rPr>
       </w:pPr>
-      <w:hyperlink w:anchor="_Toc239252502" w:history="1">
+      <w:hyperlink w:anchor="_Toc239253075" w:history="1">
         <w:r>
           <w:rPr>
             <w:rStyle w:val="Hyperlink"/>
@@ -1768,7 +1768,7 @@
             <w:bCs/>
             <w:noProof/>
           </w:rPr>
-          <w:t>3.1 Software Development Life Cycle</w:t>
+          <w:t>3.2 Project Timeline</w:t>
         </w:r>
         <w:r>
           <w:rPr>
@@ -1789,7 +1789,7 @@
             <w:noProof/>
             <w:webHidden/>
           </w:rPr>
-          <w:instrText xml:space="preserve"> PAGEREF _Toc239252502 \h </w:instrText>
+          <w:instrText xml:space="preserve"> PAGEREF _Toc239253075 \h </w:instrText>
         </w:r>
         <w:r>
           <w:rPr>
@@ -1809,7 +1809,7 @@
             <w:noProof/>
             <w:webHidden/>
           </w:rPr>
-          <w:t>17</w:t>
+          <w:t>18</w:t>
         </w:r>
         <w:r>
           <w:rPr>
@@ -1834,7 +1834,7 @@
           <w14:ligatures w14:val="standardContextual"/>
         </w:rPr>
       </w:pPr>
-      <w:hyperlink w:anchor="_Toc239252503" w:history="1">
+      <w:hyperlink w:anchor="_Toc239253076" w:history="1">
         <w:r>
           <w:rPr>
             <w:rStyle w:val="Hyperlink"/>
@@ -1842,7 +1842,7 @@
             <w:bCs/>
             <w:noProof/>
           </w:rPr>
-          <w:t>3.2 Project Timeline</w:t>
+          <w:t>3.3 System Architecture</w:t>
         </w:r>
         <w:r>
           <w:rPr>
@@ -1863,7 +1863,7 @@
             <w:noProof/>
             <w:webHidden/>
           </w:rPr>
-          <w:instrText xml:space="preserve"> PAGEREF _Toc239252503 \h </w:instrText>
+          <w:instrText xml:space="preserve"> PAGEREF _Toc239253076 \h </w:instrText>
         </w:r>
         <w:r>
           <w:rPr>
@@ -1883,7 +1883,7 @@
             <w:noProof/>
             <w:webHidden/>
           </w:rPr>
-          <w:t>18</w:t>
+          <w:t>19</w:t>
         </w:r>
         <w:r>
           <w:rPr>
@@ -1908,7 +1908,7 @@
           <w14:ligatures w14:val="standardContextual"/>
         </w:rPr>
       </w:pPr>
-      <w:hyperlink w:anchor="_Toc239252504" w:history="1">
+      <w:hyperlink w:anchor="_Toc239253077" w:history="1">
         <w:r>
           <w:rPr>
             <w:rStyle w:val="Hyperlink"/>
@@ -1916,7 +1916,7 @@
             <w:bCs/>
             <w:noProof/>
           </w:rPr>
-          <w:t>3.3 System Architecture</w:t>
+          <w:t>3.4 Algorithm</w:t>
         </w:r>
         <w:r>
           <w:rPr>
@@ -1937,7 +1937,7 @@
             <w:noProof/>
             <w:webHidden/>
           </w:rPr>
-          <w:instrText xml:space="preserve"> PAGEREF _Toc239252504 \h </w:instrText>
+          <w:instrText xml:space="preserve"> PAGEREF _Toc239253077 \h </w:instrText>
         </w:r>
         <w:r>
           <w:rPr>
@@ -1957,7 +1957,7 @@
             <w:noProof/>
             <w:webHidden/>
           </w:rPr>
-          <w:t>19</w:t>
+          <w:t>21</w:t>
         </w:r>
         <w:r>
           <w:rPr>
@@ -1970,7 +1970,7 @@
     </w:p>
     <w:p>
       <w:pPr>
-        <w:pStyle w:val="TOC2"/>
+        <w:pStyle w:val="TOC3"/>
         <w:tabs>
           <w:tab w:val="right" w:leader="dot" w:pos="9350"/>
         </w:tabs>
@@ -1982,15 +1982,14 @@
           <w14:ligatures w14:val="standardContextual"/>
         </w:rPr>
       </w:pPr>
-      <w:hyperlink w:anchor="_Toc239252505" w:history="1">
+      <w:hyperlink w:anchor="_Toc239253078" w:history="1">
         <w:r>
           <w:rPr>
             <w:rStyle w:val="Hyperlink"/>
             <w:b/>
-            <w:bCs/>
-            <w:noProof/>
-          </w:rPr>
-          <w:t>3.4 Algorithm</w:t>
+            <w:noProof/>
+          </w:rPr>
+          <w:t>3.4.1 Tenant Resolution Algorithm</w:t>
         </w:r>
         <w:r>
           <w:rPr>
@@ -2011,7 +2010,7 @@
             <w:noProof/>
             <w:webHidden/>
           </w:rPr>
-          <w:instrText xml:space="preserve"> PAGEREF _Toc239252505 \h </w:instrText>
+          <w:instrText xml:space="preserve"> PAGEREF _Toc239253078 \h </w:instrText>
         </w:r>
         <w:r>
           <w:rPr>
@@ -2056,14 +2055,14 @@
           <w14:ligatures w14:val="standardContextual"/>
         </w:rPr>
       </w:pPr>
-      <w:hyperlink w:anchor="_Toc239252506" w:history="1">
+      <w:hyperlink w:anchor="_Toc239253079" w:history="1">
         <w:r>
           <w:rPr>
             <w:rStyle w:val="Hyperlink"/>
             <w:b/>
             <w:noProof/>
           </w:rPr>
-          <w:t>3.4.1 Tenant Resolution Algorithm</w:t>
+          <w:t>3.4.2 Cart Pricing and Discount Algorithm</w:t>
         </w:r>
         <w:r>
           <w:rPr>
@@ -2084,7 +2083,7 @@
             <w:noProof/>
             <w:webHidden/>
           </w:rPr>
-          <w:instrText xml:space="preserve"> PAGEREF _Toc239252506 \h </w:instrText>
+          <w:instrText xml:space="preserve"> PAGEREF _Toc239253079 \h </w:instrText>
         </w:r>
         <w:r>
           <w:rPr>
@@ -2104,7 +2103,7 @@
             <w:noProof/>
             <w:webHidden/>
           </w:rPr>
-          <w:t>21</w:t>
+          <w:t>22</w:t>
         </w:r>
         <w:r>
           <w:rPr>
@@ -2129,14 +2128,14 @@
           <w14:ligatures w14:val="standardContextual"/>
         </w:rPr>
       </w:pPr>
-      <w:hyperlink w:anchor="_Toc239252507" w:history="1">
+      <w:hyperlink w:anchor="_Toc239253080" w:history="1">
         <w:r>
           <w:rPr>
             <w:rStyle w:val="Hyperlink"/>
             <w:b/>
             <w:noProof/>
           </w:rPr>
-          <w:t>3.4.2 Cart Pricing and Discount Algorithm</w:t>
+          <w:t>3.4.3 Order Placement and Stock Reservation Algorithm</w:t>
         </w:r>
         <w:r>
           <w:rPr>
@@ -2157,7 +2156,7 @@
             <w:noProof/>
             <w:webHidden/>
           </w:rPr>
-          <w:instrText xml:space="preserve"> PAGEREF _Toc239252507 \h </w:instrText>
+          <w:instrText xml:space="preserve"> PAGEREF _Toc239253080 \h </w:instrText>
         </w:r>
         <w:r>
           <w:rPr>
@@ -2177,7 +2176,7 @@
             <w:noProof/>
             <w:webHidden/>
           </w:rPr>
-          <w:t>22</w:t>
+          <w:t>23</w:t>
         </w:r>
         <w:r>
           <w:rPr>
@@ -2190,7 +2189,7 @@
     </w:p>
     <w:p>
       <w:pPr>
-        <w:pStyle w:val="TOC3"/>
+        <w:pStyle w:val="TOC2"/>
         <w:tabs>
           <w:tab w:val="right" w:leader="dot" w:pos="9350"/>
         </w:tabs>
@@ -2202,14 +2201,15 @@
           <w14:ligatures w14:val="standardContextual"/>
         </w:rPr>
       </w:pPr>
-      <w:hyperlink w:anchor="_Toc239252508" w:history="1">
+      <w:hyperlink w:anchor="_Toc239253081" w:history="1">
         <w:r>
           <w:rPr>
             <w:rStyle w:val="Hyperlink"/>
             <w:b/>
-            <w:noProof/>
-          </w:rPr>
-          <w:t>3.4.3 Order Placement and Stock Reservation Algorithm</w:t>
+            <w:bCs/>
+            <w:noProof/>
+          </w:rPr>
+          <w:t>3.5 System Flowchart</w:t>
         </w:r>
         <w:r>
           <w:rPr>
@@ -2230,7 +2230,7 @@
             <w:noProof/>
             <w:webHidden/>
           </w:rPr>
-          <w:instrText xml:space="preserve"> PAGEREF _Toc239252508 \h </w:instrText>
+          <w:instrText xml:space="preserve"> PAGEREF _Toc239253081 \h </w:instrText>
         </w:r>
         <w:r>
           <w:rPr>
@@ -2250,7 +2250,7 @@
             <w:noProof/>
             <w:webHidden/>
           </w:rPr>
-          <w:t>23</w:t>
+          <w:t>24</w:t>
         </w:r>
         <w:r>
           <w:rPr>
@@ -2275,7 +2275,7 @@
           <w14:ligatures w14:val="standardContextual"/>
         </w:rPr>
       </w:pPr>
-      <w:hyperlink w:anchor="_Toc239252509" w:history="1">
+      <w:hyperlink w:anchor="_Toc239253082" w:history="1">
         <w:r>
           <w:rPr>
             <w:rStyle w:val="Hyperlink"/>
@@ -2283,7 +2283,7 @@
             <w:bCs/>
             <w:noProof/>
           </w:rPr>
-          <w:t>3.5 System Flowchart</w:t>
+          <w:t>3.6 Use Case Diagram</w:t>
         </w:r>
         <w:r>
           <w:rPr>
@@ -2304,7 +2304,7 @@
             <w:noProof/>
             <w:webHidden/>
           </w:rPr>
-          <w:instrText xml:space="preserve"> PAGEREF _Toc239252509 \h </w:instrText>
+          <w:instrText xml:space="preserve"> PAGEREF _Toc239253082 \h </w:instrText>
         </w:r>
         <w:r>
           <w:rPr>
@@ -2324,7 +2324,7 @@
             <w:noProof/>
             <w:webHidden/>
           </w:rPr>
-          <w:t>24</w:t>
+          <w:t>26</w:t>
         </w:r>
         <w:r>
           <w:rPr>
@@ -2349,7 +2349,7 @@
           <w14:ligatures w14:val="standardContextual"/>
         </w:rPr>
       </w:pPr>
-      <w:hyperlink w:anchor="_Toc239252510" w:history="1">
+      <w:hyperlink w:anchor="_Toc239253083" w:history="1">
         <w:r>
           <w:rPr>
             <w:rStyle w:val="Hyperlink"/>
@@ -2357,7 +2357,7 @@
             <w:bCs/>
             <w:noProof/>
           </w:rPr>
-          <w:t>3.6 Use Case Diagram</w:t>
+          <w:t>3.7 Data Flow Diagram</w:t>
         </w:r>
         <w:r>
           <w:rPr>
@@ -2378,7 +2378,7 @@
             <w:noProof/>
             <w:webHidden/>
           </w:rPr>
-          <w:instrText xml:space="preserve"> PAGEREF _Toc239252510 \h </w:instrText>
+          <w:instrText xml:space="preserve"> PAGEREF _Toc239253083 \h </w:instrText>
         </w:r>
         <w:r>
           <w:rPr>
@@ -2398,7 +2398,7 @@
             <w:noProof/>
             <w:webHidden/>
           </w:rPr>
-          <w:t>26</w:t>
+          <w:t>28</w:t>
         </w:r>
         <w:r>
           <w:rPr>
@@ -2411,7 +2411,7 @@
     </w:p>
     <w:p>
       <w:pPr>
-        <w:pStyle w:val="TOC2"/>
+        <w:pStyle w:val="TOC3"/>
         <w:tabs>
           <w:tab w:val="right" w:leader="dot" w:pos="9350"/>
         </w:tabs>
@@ -2423,15 +2423,16 @@
           <w14:ligatures w14:val="standardContextual"/>
         </w:rPr>
       </w:pPr>
-      <w:hyperlink w:anchor="_Toc239252511" w:history="1">
+      <w:hyperlink w:anchor="_Toc239253084" w:history="1">
         <w:r>
           <w:rPr>
             <w:rStyle w:val="Hyperlink"/>
             <w:b/>
             <w:bCs/>
-            <w:noProof/>
-          </w:rPr>
-          <w:t>3.7 Data Flow Diagram</w:t>
+            <w:iCs/>
+            <w:noProof/>
+          </w:rPr>
+          <w:t>3.7.1 Level 0: Context Diagram</w:t>
         </w:r>
         <w:r>
           <w:rPr>
@@ -2452,7 +2453,7 @@
             <w:noProof/>
             <w:webHidden/>
           </w:rPr>
-          <w:instrText xml:space="preserve"> PAGEREF _Toc239252511 \h </w:instrText>
+          <w:instrText xml:space="preserve"> PAGEREF _Toc239253084 \h </w:instrText>
         </w:r>
         <w:r>
           <w:rPr>
@@ -2497,7 +2498,7 @@
           <w14:ligatures w14:val="standardContextual"/>
         </w:rPr>
       </w:pPr>
-      <w:hyperlink w:anchor="_Toc239252512" w:history="1">
+      <w:hyperlink w:anchor="_Toc239253085" w:history="1">
         <w:r>
           <w:rPr>
             <w:rStyle w:val="Hyperlink"/>
@@ -2506,7 +2507,7 @@
             <w:iCs/>
             <w:noProof/>
           </w:rPr>
-          <w:t>3.7.1 Level 0: Context Diagram</w:t>
+          <w:t>3.7.2 Level 1: Detailed Data Flow Diagram</w:t>
         </w:r>
         <w:r>
           <w:rPr>
@@ -2527,7 +2528,7 @@
             <w:noProof/>
             <w:webHidden/>
           </w:rPr>
-          <w:instrText xml:space="preserve"> PAGEREF _Toc239252512 \h </w:instrText>
+          <w:instrText xml:space="preserve"> PAGEREF _Toc239253085 \h </w:instrText>
         </w:r>
         <w:r>
           <w:rPr>
@@ -2560,7 +2561,7 @@
     </w:p>
     <w:p>
       <w:pPr>
-        <w:pStyle w:val="TOC3"/>
+        <w:pStyle w:val="TOC2"/>
         <w:tabs>
           <w:tab w:val="right" w:leader="dot" w:pos="9350"/>
         </w:tabs>
@@ -2572,16 +2573,15 @@
           <w14:ligatures w14:val="standardContextual"/>
         </w:rPr>
       </w:pPr>
-      <w:hyperlink w:anchor="_Toc239252513" w:history="1">
+      <w:hyperlink w:anchor="_Toc239253086" w:history="1">
         <w:r>
           <w:rPr>
             <w:rStyle w:val="Hyperlink"/>
             <w:b/>
             <w:bCs/>
-            <w:iCs/>
-            <w:noProof/>
-          </w:rPr>
-          <w:t>3.7.2 Level 1: Detailed Data Flow Diagram</w:t>
+            <w:noProof/>
+          </w:rPr>
+          <w:t>3.8 Entity Relationship Diagram</w:t>
         </w:r>
         <w:r>
           <w:rPr>
@@ -2602,7 +2602,7 @@
             <w:noProof/>
             <w:webHidden/>
           </w:rPr>
-          <w:instrText xml:space="preserve"> PAGEREF _Toc239252513 \h </w:instrText>
+          <w:instrText xml:space="preserve"> PAGEREF _Toc239253086 \h </w:instrText>
         </w:r>
         <w:r>
           <w:rPr>
@@ -2622,7 +2622,7 @@
             <w:noProof/>
             <w:webHidden/>
           </w:rPr>
-          <w:t>28</w:t>
+          <w:t>30</w:t>
         </w:r>
         <w:r>
           <w:rPr>
@@ -2635,7 +2635,7 @@
     </w:p>
     <w:p>
       <w:pPr>
-        <w:pStyle w:val="TOC2"/>
+        <w:pStyle w:val="TOC1"/>
         <w:tabs>
           <w:tab w:val="right" w:leader="dot" w:pos="9350"/>
         </w:tabs>
@@ -2647,7 +2647,7 @@
           <w14:ligatures w14:val="standardContextual"/>
         </w:rPr>
       </w:pPr>
-      <w:hyperlink w:anchor="_Toc239252514" w:history="1">
+      <w:hyperlink w:anchor="_Toc239253087" w:history="1">
         <w:r>
           <w:rPr>
             <w:rStyle w:val="Hyperlink"/>
@@ -2655,7 +2655,7 @@
             <w:bCs/>
             <w:noProof/>
           </w:rPr>
-          <w:t>3.8 Entity Relationship Diagram</w:t>
+          <w:t>Chapter 4: Implementation Plan</w:t>
         </w:r>
         <w:r>
           <w:rPr>
@@ -2676,7 +2676,7 @@
             <w:noProof/>
             <w:webHidden/>
           </w:rPr>
-          <w:instrText xml:space="preserve"> PAGEREF _Toc239252514 \h </w:instrText>
+          <w:instrText xml:space="preserve"> PAGEREF _Toc239253087 \h </w:instrText>
         </w:r>
         <w:r>
           <w:rPr>
@@ -2696,7 +2696,7 @@
             <w:noProof/>
             <w:webHidden/>
           </w:rPr>
-          <w:t>30</w:t>
+          <w:t>33</w:t>
         </w:r>
         <w:r>
           <w:rPr>
@@ -2709,7 +2709,7 @@
     </w:p>
     <w:p>
       <w:pPr>
-        <w:pStyle w:val="TOC1"/>
+        <w:pStyle w:val="TOC2"/>
         <w:tabs>
           <w:tab w:val="right" w:leader="dot" w:pos="9350"/>
         </w:tabs>
@@ -2721,7 +2721,7 @@
           <w14:ligatures w14:val="standardContextual"/>
         </w:rPr>
       </w:pPr>
-      <w:hyperlink w:anchor="_Toc239252515" w:history="1">
+      <w:hyperlink w:anchor="_Toc239253088" w:history="1">
         <w:r>
           <w:rPr>
             <w:rStyle w:val="Hyperlink"/>
@@ -2729,7 +2729,7 @@
             <w:bCs/>
             <w:noProof/>
           </w:rPr>
-          <w:t>Chapter 4: Implementation Plan</w:t>
+          <w:t>4.1 Hardware and Software Requirements</w:t>
         </w:r>
         <w:r>
           <w:rPr>
@@ -2750,7 +2750,7 @@
             <w:noProof/>
             <w:webHidden/>
           </w:rPr>
-          <w:instrText xml:space="preserve"> PAGEREF _Toc239252515 \h </w:instrText>
+          <w:instrText xml:space="preserve"> PAGEREF _Toc239253088 \h </w:instrText>
         </w:r>
         <w:r>
           <w:rPr>
@@ -2795,7 +2795,7 @@
           <w14:ligatures w14:val="standardContextual"/>
         </w:rPr>
       </w:pPr>
-      <w:hyperlink w:anchor="_Toc239252516" w:history="1">
+      <w:hyperlink w:anchor="_Toc239253089" w:history="1">
         <w:r>
           <w:rPr>
             <w:rStyle w:val="Hyperlink"/>
@@ -2803,7 +2803,7 @@
             <w:bCs/>
             <w:noProof/>
           </w:rPr>
-          <w:t>4.1 Hardware and Software Requirements</w:t>
+          <w:t>4.2 Proposed Technology Stack</w:t>
         </w:r>
         <w:r>
           <w:rPr>
@@ -2824,7 +2824,7 @@
             <w:noProof/>
             <w:webHidden/>
           </w:rPr>
-          <w:instrText xml:space="preserve"> PAGEREF _Toc239252516 \h </w:instrText>
+          <w:instrText xml:space="preserve"> PAGEREF _Toc239253089 \h </w:instrText>
         </w:r>
         <w:r>
           <w:rPr>
@@ -2844,7 +2844,7 @@
             <w:noProof/>
             <w:webHidden/>
           </w:rPr>
-          <w:t>33</w:t>
+          <w:t>35</w:t>
         </w:r>
         <w:r>
           <w:rPr>
@@ -2869,7 +2869,7 @@
           <w14:ligatures w14:val="standardContextual"/>
         </w:rPr>
       </w:pPr>
-      <w:hyperlink w:anchor="_Toc239252517" w:history="1">
+      <w:hyperlink w:anchor="_Toc239253090" w:history="1">
         <w:r>
           <w:rPr>
             <w:rStyle w:val="Hyperlink"/>
@@ -2877,7 +2877,7 @@
             <w:bCs/>
             <w:noProof/>
           </w:rPr>
-          <w:t>4.2 Proposed Technology Stack</w:t>
+          <w:t>4.3 Proposed Testing and Development Approach</w:t>
         </w:r>
         <w:r>
           <w:rPr>
@@ -2898,7 +2898,7 @@
             <w:noProof/>
             <w:webHidden/>
           </w:rPr>
-          <w:instrText xml:space="preserve"> PAGEREF _Toc239252517 \h </w:instrText>
+          <w:instrText xml:space="preserve"> PAGEREF _Toc239253090 \h </w:instrText>
         </w:r>
         <w:r>
           <w:rPr>
@@ -2918,7 +2918,7 @@
             <w:noProof/>
             <w:webHidden/>
           </w:rPr>
-          <w:t>35</w:t>
+          <w:t>37</w:t>
         </w:r>
         <w:r>
           <w:rPr>
@@ -2931,7 +2931,7 @@
     </w:p>
     <w:p>
       <w:pPr>
-        <w:pStyle w:val="TOC2"/>
+        <w:pStyle w:val="TOC1"/>
         <w:tabs>
           <w:tab w:val="right" w:leader="dot" w:pos="9350"/>
         </w:tabs>
@@ -2943,7 +2943,7 @@
           <w14:ligatures w14:val="standardContextual"/>
         </w:rPr>
       </w:pPr>
-      <w:hyperlink w:anchor="_Toc239252518" w:history="1">
+      <w:hyperlink w:anchor="_Toc239253091" w:history="1">
         <w:r>
           <w:rPr>
             <w:rStyle w:val="Hyperlink"/>
@@ -2951,7 +2951,7 @@
             <w:bCs/>
             <w:noProof/>
           </w:rPr>
-          <w:t>4.3 Proposed Testing and Development Approach</w:t>
+          <w:t>Chapter 5: Expected Outcomes</w:t>
         </w:r>
         <w:r>
           <w:rPr>
@@ -2972,7 +2972,7 @@
             <w:noProof/>
             <w:webHidden/>
           </w:rPr>
-          <w:instrText xml:space="preserve"> PAGEREF _Toc239252518 \h </w:instrText>
+          <w:instrText xml:space="preserve"> PAGEREF _Toc239253091 \h </w:instrText>
         </w:r>
         <w:r>
           <w:rPr>
@@ -2992,7 +2992,7 @@
             <w:noProof/>
             <w:webHidden/>
           </w:rPr>
-          <w:t>37</w:t>
+          <w:t>39</w:t>
         </w:r>
         <w:r>
           <w:rPr>
@@ -3005,7 +3005,7 @@
     </w:p>
     <w:p>
       <w:pPr>
-        <w:pStyle w:val="TOC1"/>
+        <w:pStyle w:val="TOC2"/>
         <w:tabs>
           <w:tab w:val="right" w:leader="dot" w:pos="9350"/>
         </w:tabs>
@@ -3017,7 +3017,7 @@
           <w14:ligatures w14:val="standardContextual"/>
         </w:rPr>
       </w:pPr>
-      <w:hyperlink w:anchor="_Toc239252519" w:history="1">
+      <w:hyperlink w:anchor="_Toc239253092" w:history="1">
         <w:r>
           <w:rPr>
             <w:rStyle w:val="Hyperlink"/>
@@ -3025,7 +3025,7 @@
             <w:bCs/>
             <w:noProof/>
           </w:rPr>
-          <w:t>Chapter 5: Expected Outcomes</w:t>
+          <w:t>5.1 Expected System Deliverables</w:t>
         </w:r>
         <w:r>
           <w:rPr>
@@ -3046,7 +3046,7 @@
             <w:noProof/>
             <w:webHidden/>
           </w:rPr>
-          <w:instrText xml:space="preserve"> PAGEREF _Toc239252519 \h </w:instrText>
+          <w:instrText xml:space="preserve"> PAGEREF _Toc239253092 \h </w:instrText>
         </w:r>
         <w:r>
           <w:rPr>
@@ -3091,7 +3091,7 @@
           <w14:ligatures w14:val="standardContextual"/>
         </w:rPr>
       </w:pPr>
-      <w:hyperlink w:anchor="_Toc239252520" w:history="1">
+      <w:hyperlink w:anchor="_Toc239253093" w:history="1">
         <w:r>
           <w:rPr>
             <w:rStyle w:val="Hyperlink"/>
@@ -3099,7 +3099,7 @@
             <w:bCs/>
             <w:noProof/>
           </w:rPr>
-          <w:t>5.1 Expected System Deliverables</w:t>
+          <w:t>5.2 Expected System Features and Benefits</w:t>
         </w:r>
         <w:r>
           <w:rPr>
@@ -3120,7 +3120,7 @@
             <w:noProof/>
             <w:webHidden/>
           </w:rPr>
-          <w:instrText xml:space="preserve"> PAGEREF _Toc239252520 \h </w:instrText>
+          <w:instrText xml:space="preserve"> PAGEREF _Toc239253093 \h </w:instrText>
         </w:r>
         <w:r>
           <w:rPr>
@@ -3140,7 +3140,7 @@
             <w:noProof/>
             <w:webHidden/>
           </w:rPr>
-          <w:t>39</w:t>
+          <w:t>40</w:t>
         </w:r>
         <w:r>
           <w:rPr>
@@ -3153,7 +3153,7 @@
     </w:p>
     <w:p>
       <w:pPr>
-        <w:pStyle w:val="TOC2"/>
+        <w:pStyle w:val="TOC1"/>
         <w:tabs>
           <w:tab w:val="right" w:leader="dot" w:pos="9350"/>
         </w:tabs>
@@ -3165,7 +3165,7 @@
           <w14:ligatures w14:val="standardContextual"/>
         </w:rPr>
       </w:pPr>
-      <w:hyperlink w:anchor="_Toc239252521" w:history="1">
+      <w:hyperlink w:anchor="_Toc239253094" w:history="1">
         <w:r>
           <w:rPr>
             <w:rStyle w:val="Hyperlink"/>
@@ -3173,7 +3173,7 @@
             <w:bCs/>
             <w:noProof/>
           </w:rPr>
-          <w:t>5.2 Expected System Features and Benefits</w:t>
+          <w:t>References</w:t>
         </w:r>
         <w:r>
           <w:rPr>
@@ -3194,81 +3194,7 @@
             <w:noProof/>
             <w:webHidden/>
           </w:rPr>
-          <w:instrText xml:space="preserve"> PAGEREF _Toc239252521 \h </w:instrText>
-        </w:r>
-        <w:r>
-          <w:rPr>
-            <w:noProof/>
-            <w:webHidden/>
-          </w:rPr>
-        </w:r>
-        <w:r>
-          <w:rPr>
-            <w:noProof/>
-            <w:webHidden/>
-          </w:rPr>
-          <w:fldChar w:fldCharType="separate"/>
-        </w:r>
-        <w:r>
-          <w:rPr>
-            <w:noProof/>
-            <w:webHidden/>
-          </w:rPr>
-          <w:t>40</w:t>
-        </w:r>
-        <w:r>
-          <w:rPr>
-            <w:noProof/>
-            <w:webHidden/>
-          </w:rPr>
-          <w:fldChar w:fldCharType="end"/>
-        </w:r>
-      </w:hyperlink>
-    </w:p>
-    <w:p>
-      <w:pPr>
-        <w:pStyle w:val="TOC1"/>
-        <w:tabs>
-          <w:tab w:val="right" w:leader="dot" w:pos="9350"/>
-        </w:tabs>
-        <w:rPr>
-          <w:rFonts w:asciiTheme="minorHAnsi" w:eastAsiaTheme="minorEastAsia" w:hAnsiTheme="minorHAnsi" w:cstheme="minorBidi"/>
-          <w:noProof/>
-          <w:kern w:val="2"/>
-          <w:lang w:val="en-US"/>
-          <w14:ligatures w14:val="standardContextual"/>
-        </w:rPr>
-      </w:pPr>
-      <w:hyperlink w:anchor="_Toc239252522" w:history="1">
-        <w:r>
-          <w:rPr>
-            <w:rStyle w:val="Hyperlink"/>
-            <w:b/>
-            <w:bCs/>
-            <w:noProof/>
-          </w:rPr>
-          <w:t>References</w:t>
-        </w:r>
-        <w:r>
-          <w:rPr>
-            <w:noProof/>
-            <w:webHidden/>
-          </w:rPr>
-          <w:tab/>
-        </w:r>
-        <w:r>
-          <w:rPr>
-            <w:noProof/>
-            <w:webHidden/>
-          </w:rPr>
-          <w:fldChar w:fldCharType="begin"/>
-        </w:r>
-        <w:r>
-          <w:rPr>
-            <w:noProof/>
-            <w:webHidden/>
-          </w:rPr>
-          <w:instrText xml:space="preserve"> PAGEREF _Toc239252522 \h </w:instrText>
+          <w:instrText xml:space="preserve"> PAGEREF _Toc239253094 \h </w:instrText>
         </w:r>
         <w:r>
           <w:rPr>
@@ -3315,7 +3241,7 @@
         <w:spacing w:line="480" w:lineRule="auto"/>
         <w:jc w:val="center"/>
       </w:pPr>
-      <w:bookmarkStart w:id="2" w:name="_Toc239252485"/>
+      <w:bookmarkStart w:id="2" w:name="_Toc239253058"/>
       <w:r>
         <w:rPr>
           <w:b/>
@@ -3819,7 +3745,7 @@
         <w:spacing w:line="480" w:lineRule="auto"/>
         <w:jc w:val="center"/>
       </w:pPr>
-      <w:bookmarkStart w:id="3" w:name="_Toc239252486"/>
+      <w:bookmarkStart w:id="3" w:name="_Toc239253059"/>
       <w:r>
         <w:rPr>
           <w:b/>
@@ -3829,42 +3755,9 @@
           <w:szCs w:val="24"/>
         </w:rPr>
         <w:lastRenderedPageBreak/>
-        <w:t>List of Tables</w:t>
+        <w:t>List of Abbreviations</w:t>
       </w:r>
       <w:bookmarkEnd w:id="3"/>
-    </w:p>
-    <w:p>
-      <w:pPr>
-        <w:spacing w:line="480" w:lineRule="auto"/>
-      </w:pPr>
-      <w:r>
-        <w:rPr>
-          <w:color w:val="000000"/>
-        </w:rPr>
-        <w:t>The report presents its comparative and requirement information in the text rather than in numbered tables, so no table list is required.</w:t>
-      </w:r>
-    </w:p>
-    <w:p>
-      <w:pPr>
-        <w:pStyle w:val="Heading1"/>
-        <w:keepNext/>
-        <w:pageBreakBefore/>
-        <w:spacing w:line="480" w:lineRule="auto"/>
-        <w:jc w:val="center"/>
-      </w:pPr>
-      <w:bookmarkStart w:id="4" w:name="_Toc239252487"/>
-      <w:r>
-        <w:rPr>
-          <w:b/>
-          <w:bCs/>
-          <w:color w:val="000000"/>
-          <w:sz w:val="24"/>
-          <w:szCs w:val="24"/>
-        </w:rPr>
-        <w:lastRenderedPageBreak/>
-        <w:t>List of Abbreviations</w:t>
-      </w:r>
-      <w:bookmarkEnd w:id="4"/>
     </w:p>
     <w:tbl>
       <w:tblPr>
@@ -5236,7 +5129,7 @@
         <w:spacing w:line="480" w:lineRule="auto"/>
         <w:jc w:val="center"/>
       </w:pPr>
-      <w:bookmarkStart w:id="5" w:name="_Toc239252488"/>
+      <w:bookmarkStart w:id="4" w:name="_Toc239253060"/>
       <w:r>
         <w:rPr>
           <w:b/>
@@ -5248,7 +5141,7 @@
         <w:lastRenderedPageBreak/>
         <w:t>Chapter 1: Introduction</w:t>
       </w:r>
-      <w:bookmarkEnd w:id="5"/>
+      <w:bookmarkEnd w:id="4"/>
     </w:p>
     <w:p>
       <w:pPr>
@@ -5256,7 +5149,7 @@
         <w:keepNext/>
         <w:spacing w:line="480" w:lineRule="auto"/>
       </w:pPr>
-      <w:bookmarkStart w:id="6" w:name="_Toc239252489"/>
+      <w:bookmarkStart w:id="5" w:name="_Toc239253061"/>
       <w:r>
         <w:rPr>
           <w:b/>
@@ -5267,7 +5160,7 @@
         </w:rPr>
         <w:t>1.1 Background</w:t>
       </w:r>
-      <w:bookmarkEnd w:id="6"/>
+      <w:bookmarkEnd w:id="5"/>
     </w:p>
     <w:p>
       <w:pPr>
@@ -5338,7 +5231,7 @@
         <w:keepNext/>
         <w:spacing w:line="480" w:lineRule="auto"/>
       </w:pPr>
-      <w:bookmarkStart w:id="7" w:name="_Toc239252490"/>
+      <w:bookmarkStart w:id="6" w:name="_Toc239253062"/>
       <w:r>
         <w:rPr>
           <w:b/>
@@ -5349,7 +5242,7 @@
         </w:rPr>
         <w:t>1.2 Problem Statement</w:t>
       </w:r>
-      <w:bookmarkEnd w:id="7"/>
+      <w:bookmarkEnd w:id="6"/>
     </w:p>
     <w:p>
       <w:pPr>
@@ -5409,7 +5302,7 @@
         <w:keepNext/>
         <w:spacing w:line="480" w:lineRule="auto"/>
       </w:pPr>
-      <w:bookmarkStart w:id="8" w:name="_Toc239252491"/>
+      <w:bookmarkStart w:id="7" w:name="_Toc239253063"/>
       <w:r>
         <w:rPr>
           <w:b/>
@@ -5420,7 +5313,7 @@
         </w:rPr>
         <w:t>1.3 Objectives</w:t>
       </w:r>
-      <w:bookmarkEnd w:id="8"/>
+      <w:bookmarkEnd w:id="7"/>
     </w:p>
     <w:p>
       <w:pPr>
@@ -5428,7 +5321,7 @@
         <w:keepNext/>
         <w:spacing w:line="480" w:lineRule="auto"/>
       </w:pPr>
-      <w:bookmarkStart w:id="9" w:name="_Toc239252492"/>
+      <w:bookmarkStart w:id="8" w:name="_Toc239253064"/>
       <w:r>
         <w:rPr>
           <w:b/>
@@ -5438,7 +5331,7 @@
         </w:rPr>
         <w:t>1.3.1 General Objective</w:t>
       </w:r>
-      <w:bookmarkEnd w:id="9"/>
+      <w:bookmarkEnd w:id="8"/>
     </w:p>
     <w:p>
       <w:pPr>
@@ -5457,7 +5350,7 @@
         <w:keepNext/>
         <w:spacing w:line="480" w:lineRule="auto"/>
       </w:pPr>
-      <w:bookmarkStart w:id="10" w:name="_Toc239252493"/>
+      <w:bookmarkStart w:id="9" w:name="_Toc239253065"/>
       <w:r>
         <w:rPr>
           <w:b/>
@@ -5467,7 +5360,7 @@
         </w:rPr>
         <w:t>1.3.2 Specific Objectives</w:t>
       </w:r>
-      <w:bookmarkEnd w:id="10"/>
+      <w:bookmarkEnd w:id="9"/>
     </w:p>
     <w:p>
       <w:pPr>
@@ -5583,7 +5476,7 @@
         <w:keepNext/>
         <w:spacing w:line="480" w:lineRule="auto"/>
       </w:pPr>
-      <w:bookmarkStart w:id="11" w:name="_Toc239252494"/>
+      <w:bookmarkStart w:id="10" w:name="_Toc239253066"/>
       <w:r>
         <w:rPr>
           <w:b/>
@@ -5595,7 +5488,7 @@
         <w:lastRenderedPageBreak/>
         <w:t>1.4 Project Scope</w:t>
       </w:r>
-      <w:bookmarkEnd w:id="11"/>
+      <w:bookmarkEnd w:id="10"/>
     </w:p>
     <w:p>
       <w:pPr>
@@ -5746,7 +5639,7 @@
         <w:spacing w:line="480" w:lineRule="auto"/>
         <w:jc w:val="center"/>
       </w:pPr>
-      <w:bookmarkStart w:id="12" w:name="_Toc239252495"/>
+      <w:bookmarkStart w:id="11" w:name="_Toc239253067"/>
       <w:r>
         <w:rPr>
           <w:b/>
@@ -5758,7 +5651,7 @@
         <w:lastRenderedPageBreak/>
         <w:t>Chapter 2: Literature Overview</w:t>
       </w:r>
-      <w:bookmarkEnd w:id="12"/>
+      <w:bookmarkEnd w:id="11"/>
     </w:p>
     <w:p>
       <w:pPr>
@@ -5766,7 +5659,7 @@
         <w:keepNext/>
         <w:spacing w:line="480" w:lineRule="auto"/>
       </w:pPr>
-      <w:bookmarkStart w:id="13" w:name="_Toc239252496"/>
+      <w:bookmarkStart w:id="12" w:name="_Toc239253068"/>
       <w:r>
         <w:rPr>
           <w:b/>
@@ -5777,7 +5670,7 @@
         </w:rPr>
         <w:t>2.1 Background and Theoretical Framework</w:t>
       </w:r>
-      <w:bookmarkEnd w:id="13"/>
+      <w:bookmarkEnd w:id="12"/>
     </w:p>
     <w:p>
       <w:pPr>
@@ -5882,7 +5775,7 @@
         <w:keepNext/>
         <w:spacing w:line="480" w:lineRule="auto"/>
       </w:pPr>
-      <w:bookmarkStart w:id="14" w:name="_Toc239252497"/>
+      <w:bookmarkStart w:id="13" w:name="_Toc239253069"/>
       <w:r>
         <w:rPr>
           <w:b/>
@@ -5894,7 +5787,7 @@
         <w:lastRenderedPageBreak/>
         <w:t>2.2 Study of Related Systems and Related Work</w:t>
       </w:r>
-      <w:bookmarkEnd w:id="14"/>
+      <w:bookmarkEnd w:id="13"/>
     </w:p>
     <w:p>
       <w:pPr>
@@ -6507,7 +6400,7 @@
         <w:keepNext/>
         <w:spacing w:line="480" w:lineRule="auto"/>
       </w:pPr>
-      <w:bookmarkStart w:id="15" w:name="_Toc239252498"/>
+      <w:bookmarkStart w:id="14" w:name="_Toc239253070"/>
       <w:r>
         <w:rPr>
           <w:b/>
@@ -6518,7 +6411,7 @@
         </w:rPr>
         <w:t>2.3 Contribution of the Proposed System</w:t>
       </w:r>
-      <w:bookmarkEnd w:id="15"/>
+      <w:bookmarkEnd w:id="14"/>
     </w:p>
     <w:p>
       <w:pPr>
@@ -6664,7 +6557,7 @@
         <w:keepNext/>
         <w:spacing w:line="480" w:lineRule="auto"/>
       </w:pPr>
-      <w:bookmarkStart w:id="16" w:name="_Toc239252499"/>
+      <w:bookmarkStart w:id="15" w:name="_Toc239253071"/>
       <w:r>
         <w:rPr>
           <w:b/>
@@ -6675,7 +6568,7 @@
         </w:rPr>
         <w:t>2.4 Functional and Non-Functional Requirements</w:t>
       </w:r>
-      <w:bookmarkEnd w:id="16"/>
+      <w:bookmarkEnd w:id="15"/>
     </w:p>
     <w:p>
       <w:pPr>
@@ -7563,7 +7456,7 @@
         <w:keepNext/>
         <w:spacing w:line="480" w:lineRule="auto"/>
       </w:pPr>
-      <w:bookmarkStart w:id="17" w:name="_Toc239252500"/>
+      <w:bookmarkStart w:id="16" w:name="_Toc239253072"/>
       <w:r>
         <w:rPr>
           <w:b/>
@@ -7574,7 +7467,7 @@
         </w:rPr>
         <w:t>2.5 Feasibility Study</w:t>
       </w:r>
-      <w:bookmarkEnd w:id="17"/>
+      <w:bookmarkEnd w:id="16"/>
     </w:p>
     <w:p>
       <w:pPr>
@@ -8045,7 +7938,7 @@
         <w:spacing w:line="480" w:lineRule="auto"/>
         <w:jc w:val="center"/>
       </w:pPr>
-      <w:bookmarkStart w:id="18" w:name="_Toc239252501"/>
+      <w:bookmarkStart w:id="17" w:name="_Toc239253073"/>
       <w:r>
         <w:rPr>
           <w:b/>
@@ -8057,7 +7950,7 @@
         <w:lastRenderedPageBreak/>
         <w:t>Chapter 3: System Design and Methodology</w:t>
       </w:r>
-      <w:bookmarkEnd w:id="18"/>
+      <w:bookmarkEnd w:id="17"/>
     </w:p>
     <w:p>
       <w:pPr>
@@ -8065,7 +7958,7 @@
         <w:keepNext/>
         <w:spacing w:line="480" w:lineRule="auto"/>
       </w:pPr>
-      <w:bookmarkStart w:id="19" w:name="_Toc239252502"/>
+      <w:bookmarkStart w:id="18" w:name="_Toc239253074"/>
       <w:r>
         <w:rPr>
           <w:b/>
@@ -8076,7 +7969,7 @@
         </w:rPr>
         <w:t>3.1 Software Development Life Cycle</w:t>
       </w:r>
-      <w:bookmarkEnd w:id="19"/>
+      <w:bookmarkEnd w:id="18"/>
     </w:p>
     <w:p>
       <w:pPr>
@@ -8149,7 +8042,7 @@
           <w:noProof/>
         </w:rPr>
         <w:drawing>
-          <wp:inline distT="0" distB="0" distL="0" distR="0" wp14:anchorId="23B49910" wp14:editId="6260AF30">
+          <wp:inline distT="0" distB="0" distL="0" distR="0" wp14:anchorId="021EA4A6" wp14:editId="6C9F3018">
             <wp:extent cx="5577840" cy="3434103"/>
             <wp:effectExtent l="0" t="0" r="0" b="0"/>
             <wp:docPr id="2" name="Picture 2"/>
@@ -8192,7 +8085,7 @@
         <w:keepNext/>
         <w:spacing w:line="480" w:lineRule="auto"/>
       </w:pPr>
-      <w:bookmarkStart w:id="20" w:name="_Toc239252503"/>
+      <w:bookmarkStart w:id="19" w:name="_Toc239253075"/>
       <w:r>
         <w:rPr>
           <w:b/>
@@ -8203,7 +8096,7 @@
         </w:rPr>
         <w:t>3.2 Project Timeline</w:t>
       </w:r>
-      <w:bookmarkEnd w:id="20"/>
+      <w:bookmarkEnd w:id="19"/>
     </w:p>
     <w:p>
       <w:pPr>
@@ -8397,7 +8290,7 @@
         <w:keepNext/>
         <w:spacing w:line="480" w:lineRule="auto"/>
       </w:pPr>
-      <w:bookmarkStart w:id="21" w:name="_Toc239252504"/>
+      <w:bookmarkStart w:id="20" w:name="_Toc239253076"/>
       <w:r>
         <w:rPr>
           <w:b/>
@@ -8408,7 +8301,7 @@
         </w:rPr>
         <w:t>3.3 System Architecture</w:t>
       </w:r>
-      <w:bookmarkEnd w:id="21"/>
+      <w:bookmarkEnd w:id="20"/>
     </w:p>
     <w:p>
       <w:pPr>
@@ -8510,7 +8403,7 @@
           <w:noProof/>
         </w:rPr>
         <w:drawing>
-          <wp:inline distT="0" distB="0" distL="0" distR="0" wp14:anchorId="322D9D01" wp14:editId="1AECFDAA">
+          <wp:inline distT="0" distB="0" distL="0" distR="0" wp14:anchorId="320506FA" wp14:editId="05E971C7">
             <wp:extent cx="5577840" cy="4709434"/>
             <wp:effectExtent l="0" t="0" r="0" b="0"/>
             <wp:docPr id="3" name="Picture 3"/>
@@ -8553,7 +8446,7 @@
         <w:keepNext/>
         <w:spacing w:line="480" w:lineRule="auto"/>
       </w:pPr>
-      <w:bookmarkStart w:id="22" w:name="_Toc239252505"/>
+      <w:bookmarkStart w:id="21" w:name="_Toc239253077"/>
       <w:r>
         <w:rPr>
           <w:b/>
@@ -8564,7 +8457,7 @@
         </w:rPr>
         <w:t>3.4 Algorithm</w:t>
       </w:r>
-      <w:bookmarkEnd w:id="22"/>
+      <w:bookmarkEnd w:id="21"/>
     </w:p>
     <w:p>
       <w:pPr>
@@ -8583,7 +8476,7 @@
         <w:keepNext/>
         <w:spacing w:line="480" w:lineRule="auto"/>
       </w:pPr>
-      <w:bookmarkStart w:id="23" w:name="_Toc239252506"/>
+      <w:bookmarkStart w:id="22" w:name="_Toc239253078"/>
       <w:r>
         <w:rPr>
           <w:b/>
@@ -8591,7 +8484,7 @@
         </w:rPr>
         <w:t>3.4.1 Tenant Resolution Algorithm</w:t>
       </w:r>
-      <w:bookmarkEnd w:id="23"/>
+      <w:bookmarkEnd w:id="22"/>
     </w:p>
     <w:p>
       <w:pPr>
@@ -8754,7 +8647,7 @@
         <w:keepNext/>
         <w:spacing w:line="480" w:lineRule="auto"/>
       </w:pPr>
-      <w:bookmarkStart w:id="24" w:name="_Toc239252507"/>
+      <w:bookmarkStart w:id="23" w:name="_Toc239253079"/>
       <w:r>
         <w:rPr>
           <w:b/>
@@ -8762,7 +8655,7 @@
         </w:rPr>
         <w:t>3.4.2 Cart Pricing and Discount Algorithm</w:t>
       </w:r>
-      <w:bookmarkEnd w:id="24"/>
+      <w:bookmarkEnd w:id="23"/>
     </w:p>
     <w:p>
       <w:pPr>
@@ -8925,7 +8818,7 @@
         <w:keepNext/>
         <w:spacing w:line="480" w:lineRule="auto"/>
       </w:pPr>
-      <w:bookmarkStart w:id="25" w:name="_Toc239252508"/>
+      <w:bookmarkStart w:id="24" w:name="_Toc239253080"/>
       <w:r>
         <w:rPr>
           <w:b/>
@@ -8933,7 +8826,7 @@
         </w:rPr>
         <w:t>3.4.3 Order Placement and Stock Reservation Algorithm</w:t>
       </w:r>
-      <w:bookmarkEnd w:id="25"/>
+      <w:bookmarkEnd w:id="24"/>
     </w:p>
     <w:p>
       <w:pPr>
@@ -9134,7 +9027,7 @@
         <w:keepNext/>
         <w:spacing w:line="480" w:lineRule="auto"/>
       </w:pPr>
-      <w:bookmarkStart w:id="26" w:name="_Toc239252509"/>
+      <w:bookmarkStart w:id="25" w:name="_Toc239253081"/>
       <w:r>
         <w:rPr>
           <w:b/>
@@ -9145,7 +9038,7 @@
         </w:rPr>
         <w:t>3.5 System Flowchart</w:t>
       </w:r>
-      <w:bookmarkEnd w:id="26"/>
+      <w:bookmarkEnd w:id="25"/>
     </w:p>
     <w:p>
       <w:pPr>
@@ -9190,7 +9083,7 @@
           <w:noProof/>
         </w:rPr>
         <w:drawing>
-          <wp:inline distT="0" distB="0" distL="0" distR="0" wp14:anchorId="10CC357B" wp14:editId="052C778B">
+          <wp:inline distT="0" distB="0" distL="0" distR="0" wp14:anchorId="67BE814F" wp14:editId="12739F60">
             <wp:extent cx="5394960" cy="6491029"/>
             <wp:effectExtent l="0" t="0" r="0" b="0"/>
             <wp:docPr id="4" name="Picture 4"/>
@@ -9284,7 +9177,7 @@
         <w:keepNext/>
         <w:spacing w:line="480" w:lineRule="auto"/>
       </w:pPr>
-      <w:bookmarkStart w:id="27" w:name="_Toc239252510"/>
+      <w:bookmarkStart w:id="26" w:name="_Toc239253082"/>
       <w:r>
         <w:rPr>
           <w:b/>
@@ -9295,7 +9188,7 @@
         </w:rPr>
         <w:t>3.6 Use Case Diagram</w:t>
       </w:r>
-      <w:bookmarkEnd w:id="27"/>
+      <w:bookmarkEnd w:id="26"/>
     </w:p>
     <w:p>
       <w:pPr>
@@ -9352,7 +9245,7 @@
           <w:noProof/>
         </w:rPr>
         <w:drawing>
-          <wp:inline distT="0" distB="0" distL="0" distR="0" wp14:anchorId="15F2CA65" wp14:editId="1E4B2F54">
+          <wp:inline distT="0" distB="0" distL="0" distR="0" wp14:anchorId="78B5DA06" wp14:editId="737A0233">
             <wp:extent cx="5486400" cy="4702629"/>
             <wp:effectExtent l="0" t="0" r="0" b="0"/>
             <wp:docPr id="5" name="Picture 5"/>
@@ -9406,7 +9299,7 @@
         <w:keepNext/>
         <w:spacing w:line="480" w:lineRule="auto"/>
       </w:pPr>
-      <w:bookmarkStart w:id="28" w:name="_Toc239252511"/>
+      <w:bookmarkStart w:id="27" w:name="_Toc239253083"/>
       <w:r>
         <w:rPr>
           <w:b/>
@@ -9418,7 +9311,7 @@
         <w:lastRenderedPageBreak/>
         <w:t>3.7 Data Flow Diagram</w:t>
       </w:r>
-      <w:bookmarkEnd w:id="28"/>
+      <w:bookmarkEnd w:id="27"/>
     </w:p>
     <w:p>
       <w:pPr>
@@ -9426,7 +9319,7 @@
         <w:keepNext/>
         <w:spacing w:line="480" w:lineRule="auto"/>
       </w:pPr>
-      <w:bookmarkStart w:id="29" w:name="_Toc239252512"/>
+      <w:bookmarkStart w:id="28" w:name="_Toc239253084"/>
       <w:r>
         <w:rPr>
           <w:b/>
@@ -9436,7 +9329,7 @@
         </w:rPr>
         <w:t>3.7.1 Level 0: Context Diagram</w:t>
       </w:r>
-      <w:bookmarkEnd w:id="29"/>
+      <w:bookmarkEnd w:id="28"/>
     </w:p>
     <w:p>
       <w:pPr>
@@ -9486,7 +9379,7 @@
           <w:noProof/>
         </w:rPr>
         <w:drawing>
-          <wp:inline distT="0" distB="0" distL="0" distR="0" wp14:anchorId="45636A8E" wp14:editId="11FB968A">
+          <wp:inline distT="0" distB="0" distL="0" distR="0" wp14:anchorId="2AB35FA1" wp14:editId="3E687C21">
             <wp:extent cx="5577840" cy="2114499"/>
             <wp:effectExtent l="0" t="0" r="0" b="0"/>
             <wp:docPr id="6" name="Picture 6"/>
@@ -9529,7 +9422,7 @@
         <w:keepNext/>
         <w:spacing w:line="480" w:lineRule="auto"/>
       </w:pPr>
-      <w:bookmarkStart w:id="30" w:name="_Toc239252513"/>
+      <w:bookmarkStart w:id="29" w:name="_Toc239253085"/>
       <w:r>
         <w:rPr>
           <w:b/>
@@ -9539,7 +9432,7 @@
         </w:rPr>
         <w:t>3.7.2 Level 1: Detailed Data Flow Diagram</w:t>
       </w:r>
-      <w:bookmarkEnd w:id="30"/>
+      <w:bookmarkEnd w:id="29"/>
     </w:p>
     <w:p>
       <w:pPr>
@@ -9590,7 +9483,7 @@
           <w:noProof/>
         </w:rPr>
         <w:drawing>
-          <wp:inline distT="0" distB="0" distL="0" distR="0" wp14:anchorId="7BCAF483" wp14:editId="34133143">
+          <wp:inline distT="0" distB="0" distL="0" distR="0" wp14:anchorId="496ED342" wp14:editId="3BAB5994">
             <wp:extent cx="5577840" cy="4820912"/>
             <wp:effectExtent l="0" t="0" r="0" b="0"/>
             <wp:docPr id="7" name="Picture 7"/>
@@ -9645,7 +9538,7 @@
         <w:keepNext/>
         <w:spacing w:line="480" w:lineRule="auto"/>
       </w:pPr>
-      <w:bookmarkStart w:id="31" w:name="_Toc239252514"/>
+      <w:bookmarkStart w:id="30" w:name="_Toc239253086"/>
       <w:r>
         <w:rPr>
           <w:b/>
@@ -9656,7 +9549,7 @@
         </w:rPr>
         <w:t>3.8 Entity Relationship Diagram</w:t>
       </w:r>
-      <w:bookmarkEnd w:id="31"/>
+      <w:bookmarkEnd w:id="30"/>
     </w:p>
     <w:p>
       <w:pPr>
@@ -9707,7 +9600,7 @@
           <w:noProof/>
         </w:rPr>
         <w:drawing>
-          <wp:inline distT="0" distB="0" distL="0" distR="0" wp14:anchorId="5F55B1ED" wp14:editId="7597C216">
+          <wp:inline distT="0" distB="0" distL="0" distR="0" wp14:anchorId="37984AFF" wp14:editId="6881F65F">
             <wp:extent cx="5303520" cy="6584179"/>
             <wp:effectExtent l="0" t="0" r="0" b="0"/>
             <wp:docPr id="8" name="Picture 8"/>
@@ -9792,7 +9685,7 @@
         <w:spacing w:line="480" w:lineRule="auto"/>
         <w:jc w:val="center"/>
       </w:pPr>
-      <w:bookmarkStart w:id="32" w:name="_Toc239252515"/>
+      <w:bookmarkStart w:id="31" w:name="_Toc239253087"/>
       <w:r>
         <w:rPr>
           <w:b/>
@@ -9804,7 +9697,7 @@
         <w:lastRenderedPageBreak/>
         <w:t>Chapter 4: Implementation Plan</w:t>
       </w:r>
-      <w:bookmarkEnd w:id="32"/>
+      <w:bookmarkEnd w:id="31"/>
     </w:p>
     <w:p>
       <w:pPr>
@@ -9823,7 +9716,7 @@
         <w:keepNext/>
         <w:spacing w:line="480" w:lineRule="auto"/>
       </w:pPr>
-      <w:bookmarkStart w:id="33" w:name="_Toc239252516"/>
+      <w:bookmarkStart w:id="32" w:name="_Toc239253088"/>
       <w:r>
         <w:rPr>
           <w:b/>
@@ -9834,7 +9727,7 @@
         </w:rPr>
         <w:t>4.1 Hardware and Software Requirements</w:t>
       </w:r>
-      <w:bookmarkEnd w:id="33"/>
+      <w:bookmarkEnd w:id="32"/>
     </w:p>
     <w:p>
       <w:pPr>
@@ -10509,7 +10402,7 @@
         <w:keepNext/>
         <w:spacing w:line="480" w:lineRule="auto"/>
       </w:pPr>
-      <w:bookmarkStart w:id="34" w:name="_Toc239252517"/>
+      <w:bookmarkStart w:id="33" w:name="_Toc239253089"/>
       <w:r>
         <w:rPr>
           <w:b/>
@@ -10520,7 +10413,7 @@
         </w:rPr>
         <w:t>4.2 Proposed Technology Stack</w:t>
       </w:r>
-      <w:bookmarkEnd w:id="34"/>
+      <w:bookmarkEnd w:id="33"/>
     </w:p>
     <w:p>
       <w:pPr>
@@ -10878,7 +10771,7 @@
         <w:keepNext/>
         <w:spacing w:line="480" w:lineRule="auto"/>
       </w:pPr>
-      <w:bookmarkStart w:id="35" w:name="_Toc239252518"/>
+      <w:bookmarkStart w:id="34" w:name="_Toc239253090"/>
       <w:r>
         <w:rPr>
           <w:b/>
@@ -10889,7 +10782,7 @@
         </w:rPr>
         <w:t>4.3 Proposed Testing and Development Approach</w:t>
       </w:r>
-      <w:bookmarkEnd w:id="35"/>
+      <w:bookmarkEnd w:id="34"/>
     </w:p>
     <w:p>
       <w:pPr>
@@ -11181,7 +11074,7 @@
         <w:spacing w:line="480" w:lineRule="auto"/>
         <w:jc w:val="center"/>
       </w:pPr>
-      <w:bookmarkStart w:id="36" w:name="_Toc239252519"/>
+      <w:bookmarkStart w:id="35" w:name="_Toc239253091"/>
       <w:r>
         <w:rPr>
           <w:b/>
@@ -11193,7 +11086,7 @@
         <w:lastRenderedPageBreak/>
         <w:t>Chapter 5: Expected Outcomes</w:t>
       </w:r>
-      <w:bookmarkEnd w:id="36"/>
+      <w:bookmarkEnd w:id="35"/>
     </w:p>
     <w:p>
       <w:pPr>
@@ -11212,7 +11105,7 @@
         <w:keepNext/>
         <w:spacing w:line="480" w:lineRule="auto"/>
       </w:pPr>
-      <w:bookmarkStart w:id="37" w:name="_Toc239252520"/>
+      <w:bookmarkStart w:id="36" w:name="_Toc239253092"/>
       <w:r>
         <w:rPr>
           <w:b/>
@@ -11223,7 +11116,7 @@
         </w:rPr>
         <w:t>5.1 Expected System Deliverables</w:t>
       </w:r>
-      <w:bookmarkEnd w:id="37"/>
+      <w:bookmarkEnd w:id="36"/>
     </w:p>
     <w:p>
       <w:pPr>
@@ -11390,7 +11283,7 @@
         <w:keepNext/>
         <w:spacing w:line="480" w:lineRule="auto"/>
       </w:pPr>
-      <w:bookmarkStart w:id="38" w:name="_Toc239252521"/>
+      <w:bookmarkStart w:id="37" w:name="_Toc239253093"/>
       <w:r>
         <w:rPr>
           <w:b/>
@@ -11402,7 +11295,7 @@
         <w:lastRenderedPageBreak/>
         <w:t>5.2 Expected System Features and Benefits</w:t>
       </w:r>
-      <w:bookmarkEnd w:id="38"/>
+      <w:bookmarkEnd w:id="37"/>
     </w:p>
     <w:p>
       <w:pPr>
@@ -11490,7 +11383,7 @@
         <w:spacing w:line="480" w:lineRule="auto"/>
         <w:jc w:val="center"/>
       </w:pPr>
-      <w:bookmarkStart w:id="39" w:name="_Toc239252522"/>
+      <w:bookmarkStart w:id="38" w:name="_Toc239253094"/>
       <w:r>
         <w:rPr>
           <w:b/>
@@ -11502,7 +11395,7 @@
         <w:lastRenderedPageBreak/>
         <w:t>References</w:t>
       </w:r>
-      <w:bookmarkEnd w:id="39"/>
+      <w:bookmarkEnd w:id="38"/>
     </w:p>
     <w:p>
       <w:pPr>
@@ -11839,9 +11732,9 @@
 <file path=word/numbering.xml><?xml version="1.0" encoding="utf-8"?>
 <w:numbering xmlns:wpc="http://schemas.microsoft.com/office/word/2010/wordprocessingCanvas" xmlns:cx="http://schemas.microsoft.com/office/drawing/2014/chartex" xmlns:cx1="http://schemas.microsoft.com/office/drawing/2015/9/8/chartex" xmlns:cx2="http://schemas.microsoft.com/office/drawing/2015/10/21/chartex" xmlns:cx3="http://schemas.microsoft.com/office/drawing/2016/5/9/chartex" xmlns:cx4="http://schemas.microsoft.com/office/drawing/2016/5/10/chartex" xmlns:cx5="http://schemas.microsoft.com/office/drawing/2016/5/11/chartex" xmlns:cx6="http://schemas.microsoft.com/office/drawing/2016/5/12/chartex" xmlns:cx7="http://schemas.microsoft.com/office/drawing/2016/5/13/chartex" xmlns:cx8="http://schemas.microsoft.com/office/drawing/2016/5/14/chartex" xmlns:mc="http://schemas.openxmlformats.org/markup-compatibility/2006" xmlns:aink="http://schemas.microsoft.com/office/drawing/2016/ink" xmlns:am3d="http://schemas.microsoft.com/office/drawing/2017/model3d" xmlns:o="urn:schemas-microsoft-com:office:office" xmlns:oel="http://schemas.microsoft.com/office/2019/extlst" xmlns:r="http://schemas.openxmlformats.org/officeDocument/2006/relationships" xmlns:m="http://schemas.openxmlformats.org/officeDocument/2006/math" xmlns:v="urn:schemas-microsoft-com:vml" xmlns:wp14="http://schemas.microsoft.com/office/word/2010/wordprocessingDrawing" xmlns:wp="http://schemas.openxmlformats.org/drawingml/2006/wordprocessingDrawing" xmlns:w10="urn:schemas-microsoft-com:office:word" xmlns:w="http://schemas.openxmlformats.org/wordprocessingml/2006/main" xmlns:w14="http://schemas.microsoft.com/office/word/2010/wordml" xmlns:w15="http://schemas.microsoft.com/office/word/2012/wordml" xmlns:w16cex="http://schemas.microsoft.com/office/word/2018/wordml/cex" xmlns:w16cid="http://schemas.microsoft.com/office/word/2016/wordml/cid" xmlns:w16="http://schemas.microsoft.com/office/word/2018/wordml" xmlns:w16du="http://schemas.microsoft.com/office/word/2023/wordml/word16du" xmlns:w16sdtdh="http://schemas.microsoft.com/office/word/2020/wordml/sdtdatahash" xmlns:w16sdtfl="http://schemas.microsoft.com/office/word/2024/wordml/sdtformatlock" xmlns:w16se="http://schemas.microsoft.com/office/word/2015/wordml/symex" xmlns:wpg="http://schemas.microsoft.com/office/word/2010/wordprocessingGroup" xmlns:wpi="http://schemas.microsoft.com/office/word/2010/wordprocessingInk" xmlns:wne="http://schemas.microsoft.com/office/word/2006/wordml" xmlns:wps="http://schemas.microsoft.com/office/word/2010/wordprocessingShape" mc:Ignorable="w14 w15 w16se w16cid w16 w16cex w16sdtdh w16sdtfl w16du wp14">
   <w:abstractNum w:abstractNumId="0" w15:restartNumberingAfterBreak="0">
-    <w:nsid w:val="06546D4C"/>
+    <w:nsid w:val="5BF33269"/>
     <w:multiLevelType w:val="multilevel"/>
-    <w:tmpl w:val="9A764684"/>
+    <w:tmpl w:val="238ADC9A"/>
     <w:lvl w:ilvl="0">
       <w:start w:val="1"/>
       <w:numFmt w:val="bullet"/>
@@ -11924,9 +11817,9 @@
     </w:lvl>
   </w:abstractNum>
   <w:abstractNum w:abstractNumId="1" w15:restartNumberingAfterBreak="0">
-    <w:nsid w:val="4BC878DB"/>
+    <w:nsid w:val="6C2A5E41"/>
     <w:multiLevelType w:val="multilevel"/>
-    <w:tmpl w:val="F2D6C2A0"/>
+    <w:tmpl w:val="2960CE6C"/>
     <w:lvl w:ilvl="0">
       <w:start w:val="1"/>
       <w:numFmt w:val="decimal"/>
@@ -12004,10 +11897,10 @@
       </w:pPr>
     </w:lvl>
   </w:abstractNum>
-  <w:num w:numId="1" w16cid:durableId="1246110916">
+  <w:num w:numId="1" w16cid:durableId="824709946">
     <w:abstractNumId w:val="1"/>
   </w:num>
-  <w:num w:numId="2" w16cid:durableId="22094079">
+  <w:num w:numId="2" w16cid:durableId="1954360834">
     <w:abstractNumId w:val="0"/>
   </w:num>
 </w:numbering>
@@ -12945,7 +12838,7 @@
     <w:autoRedefine/>
     <w:uiPriority w:val="39"/>
     <w:unhideWhenUsed/>
-    <w:rsid w:val="006F504F"/>
+    <w:rsid w:val="0022277C"/>
     <w:pPr>
       <w:spacing w:after="100"/>
     </w:pPr>
@@ -12957,7 +12850,7 @@
     <w:autoRedefine/>
     <w:uiPriority w:val="39"/>
     <w:unhideWhenUsed/>
-    <w:rsid w:val="006F504F"/>
+    <w:rsid w:val="0022277C"/>
     <w:pPr>
       <w:spacing w:after="100"/>
       <w:ind w:left="240"/>
@@ -12970,7 +12863,7 @@
     <w:autoRedefine/>
     <w:uiPriority w:val="39"/>
     <w:unhideWhenUsed/>
-    <w:rsid w:val="006F504F"/>
+    <w:rsid w:val="0022277C"/>
     <w:pPr>
       <w:spacing w:after="100"/>
       <w:ind w:left="480"/>

</xml_diff>

<commit_message>
Use the sample's heading sizes and centre page numbers in the footer
Headings move from a flat 12 pt to 16 pt for chapters and 14 pt for sections,
and the page number moves from the top-right header to the centre of the
footer, both matching the sample proposal. This departs from the template's
Tables A1 and A2, which specify 12 pt headings and top-right numbering.

index_pages.py read the printed number from the header, so it is updated to
read the footer instead.

Co-Authored-By: Claude Opus 5 (1M context) <noreply@anthropic.com>
Claude-Session: https://claude.ai/code/session_0196JS1u5qEW9XzS4ZPnTL2s
</commit_message>
<xml_diff>
--- a/docs/Kinyo_ProjectVI_Proposal.docx
+++ b/docs/Kinyo_ProjectVI_Proposal.docx
@@ -16,7 +16,7 @@
           <w:noProof/>
         </w:rPr>
         <w:drawing>
-          <wp:inline distT="0" distB="0" distL="0" distR="0" wp14:anchorId="7E37E408" wp14:editId="4133FA85">
+          <wp:inline distT="0" distB="0" distL="0" distR="0" wp14:anchorId="22D0EBDD" wp14:editId="43F53E2C">
             <wp:extent cx="1273012" cy="1114425"/>
             <wp:effectExtent l="0" t="0" r="0" b="0"/>
             <wp:docPr id="1" name="image1.png" descr="Purbanchal University logo"/>
@@ -232,6 +232,7 @@
         <w:jc w:val="center"/>
         <w:sectPr>
           <w:headerReference w:type="default" r:id="rId9"/>
+          <w:footerReference w:type="default" r:id="rId10"/>
           <w:pgSz w:w="12240" w:h="15840"/>
           <w:pgMar w:top="1440" w:right="1440" w:bottom="1440" w:left="1440" w:header="720" w:footer="720" w:gutter="0"/>
           <w:cols w:space="720"/>
@@ -251,12 +252,11 @@
         <w:spacing w:line="480" w:lineRule="auto"/>
         <w:jc w:val="center"/>
       </w:pPr>
-      <w:bookmarkStart w:id="0" w:name="_Toc239253056"/>
+      <w:bookmarkStart w:id="0" w:name="_Toc239253540"/>
       <w:r>
         <w:rPr>
           <w:b/>
           <w:color w:val="000000"/>
-          <w:sz w:val="24"/>
         </w:rPr>
         <w:lastRenderedPageBreak/>
         <w:t>Abstract</w:t>
@@ -316,13 +316,12 @@
         <w:spacing w:line="480" w:lineRule="auto"/>
         <w:jc w:val="center"/>
       </w:pPr>
-      <w:bookmarkStart w:id="1" w:name="_Toc239253057"/>
+      <w:bookmarkStart w:id="1" w:name="_Toc239253541"/>
       <w:r>
         <w:rPr>
           <w:b/>
           <w:bCs/>
           <w:color w:val="000000"/>
-          <w:sz w:val="24"/>
           <w:szCs w:val="24"/>
         </w:rPr>
         <w:lastRenderedPageBreak/>
@@ -353,7 +352,7 @@
       <w:r>
         <w:fldChar w:fldCharType="separate"/>
       </w:r>
-      <w:hyperlink w:anchor="_Toc239253056" w:history="1">
+      <w:hyperlink w:anchor="_Toc239253540" w:history="1">
         <w:r>
           <w:rPr>
             <w:rStyle w:val="Hyperlink"/>
@@ -381,7 +380,7 @@
             <w:noProof/>
             <w:webHidden/>
           </w:rPr>
-          <w:instrText xml:space="preserve"> PAGEREF _Toc239253056 \h </w:instrText>
+          <w:instrText xml:space="preserve"> PAGEREF _Toc239253540 \h </w:instrText>
         </w:r>
         <w:r>
           <w:rPr>
@@ -426,7 +425,7 @@
           <w14:ligatures w14:val="standardContextual"/>
         </w:rPr>
       </w:pPr>
-      <w:hyperlink w:anchor="_Toc239253057" w:history="1">
+      <w:hyperlink w:anchor="_Toc239253541" w:history="1">
         <w:r>
           <w:rPr>
             <w:rStyle w:val="Hyperlink"/>
@@ -455,7 +454,7 @@
             <w:noProof/>
             <w:webHidden/>
           </w:rPr>
-          <w:instrText xml:space="preserve"> PAGEREF _Toc239253057 \h </w:instrText>
+          <w:instrText xml:space="preserve"> PAGEREF _Toc239253541 \h </w:instrText>
         </w:r>
         <w:r>
           <w:rPr>
@@ -500,7 +499,7 @@
           <w14:ligatures w14:val="standardContextual"/>
         </w:rPr>
       </w:pPr>
-      <w:hyperlink w:anchor="_Toc239253058" w:history="1">
+      <w:hyperlink w:anchor="_Toc239253542" w:history="1">
         <w:r>
           <w:rPr>
             <w:rStyle w:val="Hyperlink"/>
@@ -529,7 +528,7 @@
             <w:noProof/>
             <w:webHidden/>
           </w:rPr>
-          <w:instrText xml:space="preserve"> PAGEREF _Toc239253058 \h </w:instrText>
+          <w:instrText xml:space="preserve"> PAGEREF _Toc239253542 \h </w:instrText>
         </w:r>
         <w:r>
           <w:rPr>
@@ -574,7 +573,7 @@
           <w14:ligatures w14:val="standardContextual"/>
         </w:rPr>
       </w:pPr>
-      <w:hyperlink w:anchor="_Toc239253059" w:history="1">
+      <w:hyperlink w:anchor="_Toc239253543" w:history="1">
         <w:r>
           <w:rPr>
             <w:rStyle w:val="Hyperlink"/>
@@ -603,7 +602,7 @@
             <w:noProof/>
             <w:webHidden/>
           </w:rPr>
-          <w:instrText xml:space="preserve"> PAGEREF _Toc239253059 \h </w:instrText>
+          <w:instrText xml:space="preserve"> PAGEREF _Toc239253543 \h </w:instrText>
         </w:r>
         <w:r>
           <w:rPr>
@@ -648,7 +647,7 @@
           <w14:ligatures w14:val="standardContextual"/>
         </w:rPr>
       </w:pPr>
-      <w:hyperlink w:anchor="_Toc239253060" w:history="1">
+      <w:hyperlink w:anchor="_Toc239253544" w:history="1">
         <w:r>
           <w:rPr>
             <w:rStyle w:val="Hyperlink"/>
@@ -677,7 +676,7 @@
             <w:noProof/>
             <w:webHidden/>
           </w:rPr>
-          <w:instrText xml:space="preserve"> PAGEREF _Toc239253060 \h </w:instrText>
+          <w:instrText xml:space="preserve"> PAGEREF _Toc239253544 \h </w:instrText>
         </w:r>
         <w:r>
           <w:rPr>
@@ -722,7 +721,7 @@
           <w14:ligatures w14:val="standardContextual"/>
         </w:rPr>
       </w:pPr>
-      <w:hyperlink w:anchor="_Toc239253061" w:history="1">
+      <w:hyperlink w:anchor="_Toc239253545" w:history="1">
         <w:r>
           <w:rPr>
             <w:rStyle w:val="Hyperlink"/>
@@ -751,7 +750,7 @@
             <w:noProof/>
             <w:webHidden/>
           </w:rPr>
-          <w:instrText xml:space="preserve"> PAGEREF _Toc239253061 \h </w:instrText>
+          <w:instrText xml:space="preserve"> PAGEREF _Toc239253545 \h </w:instrText>
         </w:r>
         <w:r>
           <w:rPr>
@@ -796,7 +795,7 @@
           <w14:ligatures w14:val="standardContextual"/>
         </w:rPr>
       </w:pPr>
-      <w:hyperlink w:anchor="_Toc239253062" w:history="1">
+      <w:hyperlink w:anchor="_Toc239253546" w:history="1">
         <w:r>
           <w:rPr>
             <w:rStyle w:val="Hyperlink"/>
@@ -825,7 +824,7 @@
             <w:noProof/>
             <w:webHidden/>
           </w:rPr>
-          <w:instrText xml:space="preserve"> PAGEREF _Toc239253062 \h </w:instrText>
+          <w:instrText xml:space="preserve"> PAGEREF _Toc239253546 \h </w:instrText>
         </w:r>
         <w:r>
           <w:rPr>
@@ -870,7 +869,7 @@
           <w14:ligatures w14:val="standardContextual"/>
         </w:rPr>
       </w:pPr>
-      <w:hyperlink w:anchor="_Toc239253063" w:history="1">
+      <w:hyperlink w:anchor="_Toc239253547" w:history="1">
         <w:r>
           <w:rPr>
             <w:rStyle w:val="Hyperlink"/>
@@ -899,7 +898,7 @@
             <w:noProof/>
             <w:webHidden/>
           </w:rPr>
-          <w:instrText xml:space="preserve"> PAGEREF _Toc239253063 \h </w:instrText>
+          <w:instrText xml:space="preserve"> PAGEREF _Toc239253547 \h </w:instrText>
         </w:r>
         <w:r>
           <w:rPr>
@@ -944,7 +943,7 @@
           <w14:ligatures w14:val="standardContextual"/>
         </w:rPr>
       </w:pPr>
-      <w:hyperlink w:anchor="_Toc239253064" w:history="1">
+      <w:hyperlink w:anchor="_Toc239253548" w:history="1">
         <w:r>
           <w:rPr>
             <w:rStyle w:val="Hyperlink"/>
@@ -974,7 +973,7 @@
             <w:noProof/>
             <w:webHidden/>
           </w:rPr>
-          <w:instrText xml:space="preserve"> PAGEREF _Toc239253064 \h </w:instrText>
+          <w:instrText xml:space="preserve"> PAGEREF _Toc239253548 \h </w:instrText>
         </w:r>
         <w:r>
           <w:rPr>
@@ -1019,7 +1018,7 @@
           <w14:ligatures w14:val="standardContextual"/>
         </w:rPr>
       </w:pPr>
-      <w:hyperlink w:anchor="_Toc239253065" w:history="1">
+      <w:hyperlink w:anchor="_Toc239253549" w:history="1">
         <w:r>
           <w:rPr>
             <w:rStyle w:val="Hyperlink"/>
@@ -1049,7 +1048,7 @@
             <w:noProof/>
             <w:webHidden/>
           </w:rPr>
-          <w:instrText xml:space="preserve"> PAGEREF _Toc239253065 \h </w:instrText>
+          <w:instrText xml:space="preserve"> PAGEREF _Toc239253549 \h </w:instrText>
         </w:r>
         <w:r>
           <w:rPr>
@@ -1094,7 +1093,7 @@
           <w14:ligatures w14:val="standardContextual"/>
         </w:rPr>
       </w:pPr>
-      <w:hyperlink w:anchor="_Toc239253066" w:history="1">
+      <w:hyperlink w:anchor="_Toc239253550" w:history="1">
         <w:r>
           <w:rPr>
             <w:rStyle w:val="Hyperlink"/>
@@ -1123,7 +1122,7 @@
             <w:noProof/>
             <w:webHidden/>
           </w:rPr>
-          <w:instrText xml:space="preserve"> PAGEREF _Toc239253066 \h </w:instrText>
+          <w:instrText xml:space="preserve"> PAGEREF _Toc239253550 \h </w:instrText>
         </w:r>
         <w:r>
           <w:rPr>
@@ -1168,7 +1167,7 @@
           <w14:ligatures w14:val="standardContextual"/>
         </w:rPr>
       </w:pPr>
-      <w:hyperlink w:anchor="_Toc239253067" w:history="1">
+      <w:hyperlink w:anchor="_Toc239253551" w:history="1">
         <w:r>
           <w:rPr>
             <w:rStyle w:val="Hyperlink"/>
@@ -1197,7 +1196,7 @@
             <w:noProof/>
             <w:webHidden/>
           </w:rPr>
-          <w:instrText xml:space="preserve"> PAGEREF _Toc239253067 \h </w:instrText>
+          <w:instrText xml:space="preserve"> PAGEREF _Toc239253551 \h </w:instrText>
         </w:r>
         <w:r>
           <w:rPr>
@@ -1242,7 +1241,7 @@
           <w14:ligatures w14:val="standardContextual"/>
         </w:rPr>
       </w:pPr>
-      <w:hyperlink w:anchor="_Toc239253068" w:history="1">
+      <w:hyperlink w:anchor="_Toc239253552" w:history="1">
         <w:r>
           <w:rPr>
             <w:rStyle w:val="Hyperlink"/>
@@ -1271,7 +1270,7 @@
             <w:noProof/>
             <w:webHidden/>
           </w:rPr>
-          <w:instrText xml:space="preserve"> PAGEREF _Toc239253068 \h </w:instrText>
+          <w:instrText xml:space="preserve"> PAGEREF _Toc239253552 \h </w:instrText>
         </w:r>
         <w:r>
           <w:rPr>
@@ -1316,7 +1315,7 @@
           <w14:ligatures w14:val="standardContextual"/>
         </w:rPr>
       </w:pPr>
-      <w:hyperlink w:anchor="_Toc239253069" w:history="1">
+      <w:hyperlink w:anchor="_Toc239253553" w:history="1">
         <w:r>
           <w:rPr>
             <w:rStyle w:val="Hyperlink"/>
@@ -1345,7 +1344,7 @@
             <w:noProof/>
             <w:webHidden/>
           </w:rPr>
-          <w:instrText xml:space="preserve"> PAGEREF _Toc239253069 \h </w:instrText>
+          <w:instrText xml:space="preserve"> PAGEREF _Toc239253553 \h </w:instrText>
         </w:r>
         <w:r>
           <w:rPr>
@@ -1390,7 +1389,7 @@
           <w14:ligatures w14:val="standardContextual"/>
         </w:rPr>
       </w:pPr>
-      <w:hyperlink w:anchor="_Toc239253070" w:history="1">
+      <w:hyperlink w:anchor="_Toc239253554" w:history="1">
         <w:r>
           <w:rPr>
             <w:rStyle w:val="Hyperlink"/>
@@ -1419,7 +1418,7 @@
             <w:noProof/>
             <w:webHidden/>
           </w:rPr>
-          <w:instrText xml:space="preserve"> PAGEREF _Toc239253070 \h </w:instrText>
+          <w:instrText xml:space="preserve"> PAGEREF _Toc239253554 \h </w:instrText>
         </w:r>
         <w:r>
           <w:rPr>
@@ -1464,7 +1463,7 @@
           <w14:ligatures w14:val="standardContextual"/>
         </w:rPr>
       </w:pPr>
-      <w:hyperlink w:anchor="_Toc239253071" w:history="1">
+      <w:hyperlink w:anchor="_Toc239253555" w:history="1">
         <w:r>
           <w:rPr>
             <w:rStyle w:val="Hyperlink"/>
@@ -1493,7 +1492,7 @@
             <w:noProof/>
             <w:webHidden/>
           </w:rPr>
-          <w:instrText xml:space="preserve"> PAGEREF _Toc239253071 \h </w:instrText>
+          <w:instrText xml:space="preserve"> PAGEREF _Toc239253555 \h </w:instrText>
         </w:r>
         <w:r>
           <w:rPr>
@@ -1538,7 +1537,7 @@
           <w14:ligatures w14:val="standardContextual"/>
         </w:rPr>
       </w:pPr>
-      <w:hyperlink w:anchor="_Toc239253072" w:history="1">
+      <w:hyperlink w:anchor="_Toc239253556" w:history="1">
         <w:r>
           <w:rPr>
             <w:rStyle w:val="Hyperlink"/>
@@ -1567,7 +1566,7 @@
             <w:noProof/>
             <w:webHidden/>
           </w:rPr>
-          <w:instrText xml:space="preserve"> PAGEREF _Toc239253072 \h </w:instrText>
+          <w:instrText xml:space="preserve"> PAGEREF _Toc239253556 \h </w:instrText>
         </w:r>
         <w:r>
           <w:rPr>
@@ -1612,7 +1611,7 @@
           <w14:ligatures w14:val="standardContextual"/>
         </w:rPr>
       </w:pPr>
-      <w:hyperlink w:anchor="_Toc239253073" w:history="1">
+      <w:hyperlink w:anchor="_Toc239253557" w:history="1">
         <w:r>
           <w:rPr>
             <w:rStyle w:val="Hyperlink"/>
@@ -1641,7 +1640,7 @@
             <w:noProof/>
             <w:webHidden/>
           </w:rPr>
-          <w:instrText xml:space="preserve"> PAGEREF _Toc239253073 \h </w:instrText>
+          <w:instrText xml:space="preserve"> PAGEREF _Toc239253557 \h </w:instrText>
         </w:r>
         <w:r>
           <w:rPr>
@@ -1686,7 +1685,7 @@
           <w14:ligatures w14:val="standardContextual"/>
         </w:rPr>
       </w:pPr>
-      <w:hyperlink w:anchor="_Toc239253074" w:history="1">
+      <w:hyperlink w:anchor="_Toc239253558" w:history="1">
         <w:r>
           <w:rPr>
             <w:rStyle w:val="Hyperlink"/>
@@ -1715,7 +1714,7 @@
             <w:noProof/>
             <w:webHidden/>
           </w:rPr>
-          <w:instrText xml:space="preserve"> PAGEREF _Toc239253074 \h </w:instrText>
+          <w:instrText xml:space="preserve"> PAGEREF _Toc239253558 \h </w:instrText>
         </w:r>
         <w:r>
           <w:rPr>
@@ -1760,7 +1759,7 @@
           <w14:ligatures w14:val="standardContextual"/>
         </w:rPr>
       </w:pPr>
-      <w:hyperlink w:anchor="_Toc239253075" w:history="1">
+      <w:hyperlink w:anchor="_Toc239253559" w:history="1">
         <w:r>
           <w:rPr>
             <w:rStyle w:val="Hyperlink"/>
@@ -1789,7 +1788,7 @@
             <w:noProof/>
             <w:webHidden/>
           </w:rPr>
-          <w:instrText xml:space="preserve"> PAGEREF _Toc239253075 \h </w:instrText>
+          <w:instrText xml:space="preserve"> PAGEREF _Toc239253559 \h </w:instrText>
         </w:r>
         <w:r>
           <w:rPr>
@@ -1834,7 +1833,7 @@
           <w14:ligatures w14:val="standardContextual"/>
         </w:rPr>
       </w:pPr>
-      <w:hyperlink w:anchor="_Toc239253076" w:history="1">
+      <w:hyperlink w:anchor="_Toc239253560" w:history="1">
         <w:r>
           <w:rPr>
             <w:rStyle w:val="Hyperlink"/>
@@ -1863,7 +1862,7 @@
             <w:noProof/>
             <w:webHidden/>
           </w:rPr>
-          <w:instrText xml:space="preserve"> PAGEREF _Toc239253076 \h </w:instrText>
+          <w:instrText xml:space="preserve"> PAGEREF _Toc239253560 \h </w:instrText>
         </w:r>
         <w:r>
           <w:rPr>
@@ -1908,7 +1907,7 @@
           <w14:ligatures w14:val="standardContextual"/>
         </w:rPr>
       </w:pPr>
-      <w:hyperlink w:anchor="_Toc239253077" w:history="1">
+      <w:hyperlink w:anchor="_Toc239253561" w:history="1">
         <w:r>
           <w:rPr>
             <w:rStyle w:val="Hyperlink"/>
@@ -1937,7 +1936,7 @@
             <w:noProof/>
             <w:webHidden/>
           </w:rPr>
-          <w:instrText xml:space="preserve"> PAGEREF _Toc239253077 \h </w:instrText>
+          <w:instrText xml:space="preserve"> PAGEREF _Toc239253561 \h </w:instrText>
         </w:r>
         <w:r>
           <w:rPr>
@@ -1982,7 +1981,7 @@
           <w14:ligatures w14:val="standardContextual"/>
         </w:rPr>
       </w:pPr>
-      <w:hyperlink w:anchor="_Toc239253078" w:history="1">
+      <w:hyperlink w:anchor="_Toc239253562" w:history="1">
         <w:r>
           <w:rPr>
             <w:rStyle w:val="Hyperlink"/>
@@ -2010,7 +2009,7 @@
             <w:noProof/>
             <w:webHidden/>
           </w:rPr>
-          <w:instrText xml:space="preserve"> PAGEREF _Toc239253078 \h </w:instrText>
+          <w:instrText xml:space="preserve"> PAGEREF _Toc239253562 \h </w:instrText>
         </w:r>
         <w:r>
           <w:rPr>
@@ -2055,7 +2054,7 @@
           <w14:ligatures w14:val="standardContextual"/>
         </w:rPr>
       </w:pPr>
-      <w:hyperlink w:anchor="_Toc239253079" w:history="1">
+      <w:hyperlink w:anchor="_Toc239253563" w:history="1">
         <w:r>
           <w:rPr>
             <w:rStyle w:val="Hyperlink"/>
@@ -2083,7 +2082,7 @@
             <w:noProof/>
             <w:webHidden/>
           </w:rPr>
-          <w:instrText xml:space="preserve"> PAGEREF _Toc239253079 \h </w:instrText>
+          <w:instrText xml:space="preserve"> PAGEREF _Toc239253563 \h </w:instrText>
         </w:r>
         <w:r>
           <w:rPr>
@@ -2128,7 +2127,7 @@
           <w14:ligatures w14:val="standardContextual"/>
         </w:rPr>
       </w:pPr>
-      <w:hyperlink w:anchor="_Toc239253080" w:history="1">
+      <w:hyperlink w:anchor="_Toc239253564" w:history="1">
         <w:r>
           <w:rPr>
             <w:rStyle w:val="Hyperlink"/>
@@ -2156,7 +2155,7 @@
             <w:noProof/>
             <w:webHidden/>
           </w:rPr>
-          <w:instrText xml:space="preserve"> PAGEREF _Toc239253080 \h </w:instrText>
+          <w:instrText xml:space="preserve"> PAGEREF _Toc239253564 \h </w:instrText>
         </w:r>
         <w:r>
           <w:rPr>
@@ -2201,7 +2200,7 @@
           <w14:ligatures w14:val="standardContextual"/>
         </w:rPr>
       </w:pPr>
-      <w:hyperlink w:anchor="_Toc239253081" w:history="1">
+      <w:hyperlink w:anchor="_Toc239253565" w:history="1">
         <w:r>
           <w:rPr>
             <w:rStyle w:val="Hyperlink"/>
@@ -2230,7 +2229,7 @@
             <w:noProof/>
             <w:webHidden/>
           </w:rPr>
-          <w:instrText xml:space="preserve"> PAGEREF _Toc239253081 \h </w:instrText>
+          <w:instrText xml:space="preserve"> PAGEREF _Toc239253565 \h </w:instrText>
         </w:r>
         <w:r>
           <w:rPr>
@@ -2275,7 +2274,7 @@
           <w14:ligatures w14:val="standardContextual"/>
         </w:rPr>
       </w:pPr>
-      <w:hyperlink w:anchor="_Toc239253082" w:history="1">
+      <w:hyperlink w:anchor="_Toc239253566" w:history="1">
         <w:r>
           <w:rPr>
             <w:rStyle w:val="Hyperlink"/>
@@ -2304,7 +2303,7 @@
             <w:noProof/>
             <w:webHidden/>
           </w:rPr>
-          <w:instrText xml:space="preserve"> PAGEREF _Toc239253082 \h </w:instrText>
+          <w:instrText xml:space="preserve"> PAGEREF _Toc239253566 \h </w:instrText>
         </w:r>
         <w:r>
           <w:rPr>
@@ -2349,7 +2348,7 @@
           <w14:ligatures w14:val="standardContextual"/>
         </w:rPr>
       </w:pPr>
-      <w:hyperlink w:anchor="_Toc239253083" w:history="1">
+      <w:hyperlink w:anchor="_Toc239253567" w:history="1">
         <w:r>
           <w:rPr>
             <w:rStyle w:val="Hyperlink"/>
@@ -2378,7 +2377,7 @@
             <w:noProof/>
             <w:webHidden/>
           </w:rPr>
-          <w:instrText xml:space="preserve"> PAGEREF _Toc239253083 \h </w:instrText>
+          <w:instrText xml:space="preserve"> PAGEREF _Toc239253567 \h </w:instrText>
         </w:r>
         <w:r>
           <w:rPr>
@@ -2423,7 +2422,7 @@
           <w14:ligatures w14:val="standardContextual"/>
         </w:rPr>
       </w:pPr>
-      <w:hyperlink w:anchor="_Toc239253084" w:history="1">
+      <w:hyperlink w:anchor="_Toc239253568" w:history="1">
         <w:r>
           <w:rPr>
             <w:rStyle w:val="Hyperlink"/>
@@ -2453,7 +2452,7 @@
             <w:noProof/>
             <w:webHidden/>
           </w:rPr>
-          <w:instrText xml:space="preserve"> PAGEREF _Toc239253084 \h </w:instrText>
+          <w:instrText xml:space="preserve"> PAGEREF _Toc239253568 \h </w:instrText>
         </w:r>
         <w:r>
           <w:rPr>
@@ -2498,7 +2497,7 @@
           <w14:ligatures w14:val="standardContextual"/>
         </w:rPr>
       </w:pPr>
-      <w:hyperlink w:anchor="_Toc239253085" w:history="1">
+      <w:hyperlink w:anchor="_Toc239253569" w:history="1">
         <w:r>
           <w:rPr>
             <w:rStyle w:val="Hyperlink"/>
@@ -2528,7 +2527,7 @@
             <w:noProof/>
             <w:webHidden/>
           </w:rPr>
-          <w:instrText xml:space="preserve"> PAGEREF _Toc239253085 \h </w:instrText>
+          <w:instrText xml:space="preserve"> PAGEREF _Toc239253569 \h </w:instrText>
         </w:r>
         <w:r>
           <w:rPr>
@@ -2573,7 +2572,7 @@
           <w14:ligatures w14:val="standardContextual"/>
         </w:rPr>
       </w:pPr>
-      <w:hyperlink w:anchor="_Toc239253086" w:history="1">
+      <w:hyperlink w:anchor="_Toc239253570" w:history="1">
         <w:r>
           <w:rPr>
             <w:rStyle w:val="Hyperlink"/>
@@ -2602,7 +2601,7 @@
             <w:noProof/>
             <w:webHidden/>
           </w:rPr>
-          <w:instrText xml:space="preserve"> PAGEREF _Toc239253086 \h </w:instrText>
+          <w:instrText xml:space="preserve"> PAGEREF _Toc239253570 \h </w:instrText>
         </w:r>
         <w:r>
           <w:rPr>
@@ -2647,7 +2646,7 @@
           <w14:ligatures w14:val="standardContextual"/>
         </w:rPr>
       </w:pPr>
-      <w:hyperlink w:anchor="_Toc239253087" w:history="1">
+      <w:hyperlink w:anchor="_Toc239253571" w:history="1">
         <w:r>
           <w:rPr>
             <w:rStyle w:val="Hyperlink"/>
@@ -2676,7 +2675,7 @@
             <w:noProof/>
             <w:webHidden/>
           </w:rPr>
-          <w:instrText xml:space="preserve"> PAGEREF _Toc239253087 \h </w:instrText>
+          <w:instrText xml:space="preserve"> PAGEREF _Toc239253571 \h </w:instrText>
         </w:r>
         <w:r>
           <w:rPr>
@@ -2721,7 +2720,7 @@
           <w14:ligatures w14:val="standardContextual"/>
         </w:rPr>
       </w:pPr>
-      <w:hyperlink w:anchor="_Toc239253088" w:history="1">
+      <w:hyperlink w:anchor="_Toc239253572" w:history="1">
         <w:r>
           <w:rPr>
             <w:rStyle w:val="Hyperlink"/>
@@ -2750,7 +2749,7 @@
             <w:noProof/>
             <w:webHidden/>
           </w:rPr>
-          <w:instrText xml:space="preserve"> PAGEREF _Toc239253088 \h </w:instrText>
+          <w:instrText xml:space="preserve"> PAGEREF _Toc239253572 \h </w:instrText>
         </w:r>
         <w:r>
           <w:rPr>
@@ -2795,7 +2794,7 @@
           <w14:ligatures w14:val="standardContextual"/>
         </w:rPr>
       </w:pPr>
-      <w:hyperlink w:anchor="_Toc239253089" w:history="1">
+      <w:hyperlink w:anchor="_Toc239253573" w:history="1">
         <w:r>
           <w:rPr>
             <w:rStyle w:val="Hyperlink"/>
@@ -2824,7 +2823,7 @@
             <w:noProof/>
             <w:webHidden/>
           </w:rPr>
-          <w:instrText xml:space="preserve"> PAGEREF _Toc239253089 \h </w:instrText>
+          <w:instrText xml:space="preserve"> PAGEREF _Toc239253573 \h </w:instrText>
         </w:r>
         <w:r>
           <w:rPr>
@@ -2869,7 +2868,7 @@
           <w14:ligatures w14:val="standardContextual"/>
         </w:rPr>
       </w:pPr>
-      <w:hyperlink w:anchor="_Toc239253090" w:history="1">
+      <w:hyperlink w:anchor="_Toc239253574" w:history="1">
         <w:r>
           <w:rPr>
             <w:rStyle w:val="Hyperlink"/>
@@ -2898,7 +2897,7 @@
             <w:noProof/>
             <w:webHidden/>
           </w:rPr>
-          <w:instrText xml:space="preserve"> PAGEREF _Toc239253090 \h </w:instrText>
+          <w:instrText xml:space="preserve"> PAGEREF _Toc239253574 \h </w:instrText>
         </w:r>
         <w:r>
           <w:rPr>
@@ -2943,7 +2942,7 @@
           <w14:ligatures w14:val="standardContextual"/>
         </w:rPr>
       </w:pPr>
-      <w:hyperlink w:anchor="_Toc239253091" w:history="1">
+      <w:hyperlink w:anchor="_Toc239253575" w:history="1">
         <w:r>
           <w:rPr>
             <w:rStyle w:val="Hyperlink"/>
@@ -2972,7 +2971,7 @@
             <w:noProof/>
             <w:webHidden/>
           </w:rPr>
-          <w:instrText xml:space="preserve"> PAGEREF _Toc239253091 \h </w:instrText>
+          <w:instrText xml:space="preserve"> PAGEREF _Toc239253575 \h </w:instrText>
         </w:r>
         <w:r>
           <w:rPr>
@@ -3017,7 +3016,7 @@
           <w14:ligatures w14:val="standardContextual"/>
         </w:rPr>
       </w:pPr>
-      <w:hyperlink w:anchor="_Toc239253092" w:history="1">
+      <w:hyperlink w:anchor="_Toc239253576" w:history="1">
         <w:r>
           <w:rPr>
             <w:rStyle w:val="Hyperlink"/>
@@ -3046,7 +3045,7 @@
             <w:noProof/>
             <w:webHidden/>
           </w:rPr>
-          <w:instrText xml:space="preserve"> PAGEREF _Toc239253092 \h </w:instrText>
+          <w:instrText xml:space="preserve"> PAGEREF _Toc239253576 \h </w:instrText>
         </w:r>
         <w:r>
           <w:rPr>
@@ -3091,7 +3090,7 @@
           <w14:ligatures w14:val="standardContextual"/>
         </w:rPr>
       </w:pPr>
-      <w:hyperlink w:anchor="_Toc239253093" w:history="1">
+      <w:hyperlink w:anchor="_Toc239253577" w:history="1">
         <w:r>
           <w:rPr>
             <w:rStyle w:val="Hyperlink"/>
@@ -3120,7 +3119,7 @@
             <w:noProof/>
             <w:webHidden/>
           </w:rPr>
-          <w:instrText xml:space="preserve"> PAGEREF _Toc239253093 \h </w:instrText>
+          <w:instrText xml:space="preserve"> PAGEREF _Toc239253577 \h </w:instrText>
         </w:r>
         <w:r>
           <w:rPr>
@@ -3165,7 +3164,7 @@
           <w14:ligatures w14:val="standardContextual"/>
         </w:rPr>
       </w:pPr>
-      <w:hyperlink w:anchor="_Toc239253094" w:history="1">
+      <w:hyperlink w:anchor="_Toc239253578" w:history="1">
         <w:r>
           <w:rPr>
             <w:rStyle w:val="Hyperlink"/>
@@ -3194,7 +3193,7 @@
             <w:noProof/>
             <w:webHidden/>
           </w:rPr>
-          <w:instrText xml:space="preserve"> PAGEREF _Toc239253094 \h </w:instrText>
+          <w:instrText xml:space="preserve"> PAGEREF _Toc239253578 \h </w:instrText>
         </w:r>
         <w:r>
           <w:rPr>
@@ -3241,13 +3240,12 @@
         <w:spacing w:line="480" w:lineRule="auto"/>
         <w:jc w:val="center"/>
       </w:pPr>
-      <w:bookmarkStart w:id="2" w:name="_Toc239253058"/>
+      <w:bookmarkStart w:id="2" w:name="_Toc239253542"/>
       <w:r>
         <w:rPr>
           <w:b/>
           <w:bCs/>
           <w:color w:val="000000"/>
-          <w:sz w:val="24"/>
           <w:szCs w:val="24"/>
         </w:rPr>
         <w:lastRenderedPageBreak/>
@@ -3745,13 +3743,12 @@
         <w:spacing w:line="480" w:lineRule="auto"/>
         <w:jc w:val="center"/>
       </w:pPr>
-      <w:bookmarkStart w:id="3" w:name="_Toc239253059"/>
+      <w:bookmarkStart w:id="3" w:name="_Toc239253543"/>
       <w:r>
         <w:rPr>
           <w:b/>
           <w:bCs/>
           <w:color w:val="000000"/>
-          <w:sz w:val="24"/>
           <w:szCs w:val="24"/>
         </w:rPr>
         <w:lastRenderedPageBreak/>
@@ -5089,6 +5086,7 @@
               <w:rPr>
                 <w:color w:val="000000"/>
               </w:rPr>
+              <w:lastRenderedPageBreak/>
               <w:t>UX</w:t>
             </w:r>
           </w:p>
@@ -5114,7 +5112,8 @@
     <w:p>
       <w:pPr>
         <w:sectPr>
-          <w:headerReference w:type="default" r:id="rId10"/>
+          <w:headerReference w:type="default" r:id="rId11"/>
+          <w:footerReference w:type="default" r:id="rId12"/>
           <w:pgSz w:w="12240" w:h="15840"/>
           <w:pgMar w:top="1440" w:right="1440" w:bottom="1440" w:left="1440" w:header="720" w:footer="720" w:gutter="0"/>
           <w:pgNumType w:fmt="lowerRoman" w:start="2"/>
@@ -5129,13 +5128,12 @@
         <w:spacing w:line="480" w:lineRule="auto"/>
         <w:jc w:val="center"/>
       </w:pPr>
-      <w:bookmarkStart w:id="4" w:name="_Toc239253060"/>
+      <w:bookmarkStart w:id="4" w:name="_Toc239253544"/>
       <w:r>
         <w:rPr>
           <w:b/>
           <w:bCs/>
           <w:color w:val="000000"/>
-          <w:sz w:val="24"/>
           <w:szCs w:val="24"/>
         </w:rPr>
         <w:lastRenderedPageBreak/>
@@ -5149,13 +5147,12 @@
         <w:keepNext/>
         <w:spacing w:line="480" w:lineRule="auto"/>
       </w:pPr>
-      <w:bookmarkStart w:id="5" w:name="_Toc239253061"/>
+      <w:bookmarkStart w:id="5" w:name="_Toc239253545"/>
       <w:r>
         <w:rPr>
           <w:b/>
           <w:bCs/>
           <w:color w:val="000000"/>
-          <w:sz w:val="24"/>
           <w:szCs w:val="24"/>
         </w:rPr>
         <w:t>1.1 Background</w:t>
@@ -5231,13 +5228,12 @@
         <w:keepNext/>
         <w:spacing w:line="480" w:lineRule="auto"/>
       </w:pPr>
-      <w:bookmarkStart w:id="6" w:name="_Toc239253062"/>
+      <w:bookmarkStart w:id="6" w:name="_Toc239253546"/>
       <w:r>
         <w:rPr>
           <w:b/>
           <w:bCs/>
           <w:color w:val="000000"/>
-          <w:sz w:val="24"/>
           <w:szCs w:val="24"/>
         </w:rPr>
         <w:t>1.2 Problem Statement</w:t>
@@ -5302,13 +5298,12 @@
         <w:keepNext/>
         <w:spacing w:line="480" w:lineRule="auto"/>
       </w:pPr>
-      <w:bookmarkStart w:id="7" w:name="_Toc239253063"/>
+      <w:bookmarkStart w:id="7" w:name="_Toc239253547"/>
       <w:r>
         <w:rPr>
           <w:b/>
           <w:bCs/>
           <w:color w:val="000000"/>
-          <w:sz w:val="24"/>
           <w:szCs w:val="24"/>
         </w:rPr>
         <w:t>1.3 Objectives</w:t>
@@ -5321,7 +5316,7 @@
         <w:keepNext/>
         <w:spacing w:line="480" w:lineRule="auto"/>
       </w:pPr>
-      <w:bookmarkStart w:id="8" w:name="_Toc239253064"/>
+      <w:bookmarkStart w:id="8" w:name="_Toc239253548"/>
       <w:r>
         <w:rPr>
           <w:b/>
@@ -5350,7 +5345,7 @@
         <w:keepNext/>
         <w:spacing w:line="480" w:lineRule="auto"/>
       </w:pPr>
-      <w:bookmarkStart w:id="9" w:name="_Toc239253065"/>
+      <w:bookmarkStart w:id="9" w:name="_Toc239253549"/>
       <w:r>
         <w:rPr>
           <w:b/>
@@ -5476,13 +5471,12 @@
         <w:keepNext/>
         <w:spacing w:line="480" w:lineRule="auto"/>
       </w:pPr>
-      <w:bookmarkStart w:id="10" w:name="_Toc239253066"/>
+      <w:bookmarkStart w:id="10" w:name="_Toc239253550"/>
       <w:r>
         <w:rPr>
           <w:b/>
           <w:bCs/>
           <w:color w:val="000000"/>
-          <w:sz w:val="24"/>
           <w:szCs w:val="24"/>
         </w:rPr>
         <w:lastRenderedPageBreak/>
@@ -5639,13 +5633,12 @@
         <w:spacing w:line="480" w:lineRule="auto"/>
         <w:jc w:val="center"/>
       </w:pPr>
-      <w:bookmarkStart w:id="11" w:name="_Toc239253067"/>
+      <w:bookmarkStart w:id="11" w:name="_Toc239253551"/>
       <w:r>
         <w:rPr>
           <w:b/>
           <w:bCs/>
           <w:color w:val="000000"/>
-          <w:sz w:val="24"/>
           <w:szCs w:val="24"/>
         </w:rPr>
         <w:lastRenderedPageBreak/>
@@ -5659,13 +5652,12 @@
         <w:keepNext/>
         <w:spacing w:line="480" w:lineRule="auto"/>
       </w:pPr>
-      <w:bookmarkStart w:id="12" w:name="_Toc239253068"/>
+      <w:bookmarkStart w:id="12" w:name="_Toc239253552"/>
       <w:r>
         <w:rPr>
           <w:b/>
           <w:bCs/>
           <w:color w:val="000000"/>
-          <w:sz w:val="24"/>
           <w:szCs w:val="24"/>
         </w:rPr>
         <w:t>2.1 Background and Theoretical Framework</w:t>
@@ -5775,13 +5767,12 @@
         <w:keepNext/>
         <w:spacing w:line="480" w:lineRule="auto"/>
       </w:pPr>
-      <w:bookmarkStart w:id="13" w:name="_Toc239253069"/>
+      <w:bookmarkStart w:id="13" w:name="_Toc239253553"/>
       <w:r>
         <w:rPr>
           <w:b/>
           <w:bCs/>
           <w:color w:val="000000"/>
-          <w:sz w:val="24"/>
           <w:szCs w:val="24"/>
         </w:rPr>
         <w:lastRenderedPageBreak/>
@@ -6400,13 +6391,12 @@
         <w:keepNext/>
         <w:spacing w:line="480" w:lineRule="auto"/>
       </w:pPr>
-      <w:bookmarkStart w:id="14" w:name="_Toc239253070"/>
+      <w:bookmarkStart w:id="14" w:name="_Toc239253554"/>
       <w:r>
         <w:rPr>
           <w:b/>
           <w:bCs/>
           <w:color w:val="000000"/>
-          <w:sz w:val="24"/>
           <w:szCs w:val="24"/>
         </w:rPr>
         <w:t>2.3 Contribution of the Proposed System</w:t>
@@ -6557,13 +6547,12 @@
         <w:keepNext/>
         <w:spacing w:line="480" w:lineRule="auto"/>
       </w:pPr>
-      <w:bookmarkStart w:id="15" w:name="_Toc239253071"/>
+      <w:bookmarkStart w:id="15" w:name="_Toc239253555"/>
       <w:r>
         <w:rPr>
           <w:b/>
           <w:bCs/>
           <w:color w:val="000000"/>
-          <w:sz w:val="24"/>
           <w:szCs w:val="24"/>
         </w:rPr>
         <w:t>2.4 Functional and Non-Functional Requirements</w:t>
@@ -7456,13 +7445,12 @@
         <w:keepNext/>
         <w:spacing w:line="480" w:lineRule="auto"/>
       </w:pPr>
-      <w:bookmarkStart w:id="16" w:name="_Toc239253072"/>
+      <w:bookmarkStart w:id="16" w:name="_Toc239253556"/>
       <w:r>
         <w:rPr>
           <w:b/>
           <w:bCs/>
           <w:color w:val="000000"/>
-          <w:sz w:val="24"/>
           <w:szCs w:val="24"/>
         </w:rPr>
         <w:t>2.5 Feasibility Study</w:t>
@@ -7938,13 +7926,12 @@
         <w:spacing w:line="480" w:lineRule="auto"/>
         <w:jc w:val="center"/>
       </w:pPr>
-      <w:bookmarkStart w:id="17" w:name="_Toc239253073"/>
+      <w:bookmarkStart w:id="17" w:name="_Toc239253557"/>
       <w:r>
         <w:rPr>
           <w:b/>
           <w:bCs/>
           <w:color w:val="000000"/>
-          <w:sz w:val="24"/>
           <w:szCs w:val="24"/>
         </w:rPr>
         <w:lastRenderedPageBreak/>
@@ -7958,13 +7945,12 @@
         <w:keepNext/>
         <w:spacing w:line="480" w:lineRule="auto"/>
       </w:pPr>
-      <w:bookmarkStart w:id="18" w:name="_Toc239253074"/>
+      <w:bookmarkStart w:id="18" w:name="_Toc239253558"/>
       <w:r>
         <w:rPr>
           <w:b/>
           <w:bCs/>
           <w:color w:val="000000"/>
-          <w:sz w:val="24"/>
           <w:szCs w:val="24"/>
         </w:rPr>
         <w:t>3.1 Software Development Life Cycle</w:t>
@@ -8042,7 +8028,7 @@
           <w:noProof/>
         </w:rPr>
         <w:drawing>
-          <wp:inline distT="0" distB="0" distL="0" distR="0" wp14:anchorId="021EA4A6" wp14:editId="6C9F3018">
+          <wp:inline distT="0" distB="0" distL="0" distR="0" wp14:anchorId="325F035D" wp14:editId="0210D769">
             <wp:extent cx="5577840" cy="3434103"/>
             <wp:effectExtent l="0" t="0" r="0" b="0"/>
             <wp:docPr id="2" name="Picture 2"/>
@@ -8057,7 +8043,7 @@
                     <pic:cNvPicPr/>
                   </pic:nvPicPr>
                   <pic:blipFill>
-                    <a:blip r:embed="rId11"/>
+                    <a:blip r:embed="rId13"/>
                     <a:stretch>
                       <a:fillRect/>
                     </a:stretch>
@@ -8085,13 +8071,12 @@
         <w:keepNext/>
         <w:spacing w:line="480" w:lineRule="auto"/>
       </w:pPr>
-      <w:bookmarkStart w:id="19" w:name="_Toc239253075"/>
+      <w:bookmarkStart w:id="19" w:name="_Toc239253559"/>
       <w:r>
         <w:rPr>
           <w:b/>
           <w:bCs/>
           <w:color w:val="000000"/>
-          <w:sz w:val="24"/>
           <w:szCs w:val="24"/>
         </w:rPr>
         <w:t>3.2 Project Timeline</w:t>
@@ -8290,13 +8275,12 @@
         <w:keepNext/>
         <w:spacing w:line="480" w:lineRule="auto"/>
       </w:pPr>
-      <w:bookmarkStart w:id="20" w:name="_Toc239253076"/>
+      <w:bookmarkStart w:id="20" w:name="_Toc239253560"/>
       <w:r>
         <w:rPr>
           <w:b/>
           <w:bCs/>
           <w:color w:val="000000"/>
-          <w:sz w:val="24"/>
           <w:szCs w:val="24"/>
         </w:rPr>
         <w:t>3.3 System Architecture</w:t>
@@ -8403,7 +8387,7 @@
           <w:noProof/>
         </w:rPr>
         <w:drawing>
-          <wp:inline distT="0" distB="0" distL="0" distR="0" wp14:anchorId="320506FA" wp14:editId="05E971C7">
+          <wp:inline distT="0" distB="0" distL="0" distR="0" wp14:anchorId="5B249BB4" wp14:editId="267629F4">
             <wp:extent cx="5577840" cy="4709434"/>
             <wp:effectExtent l="0" t="0" r="0" b="0"/>
             <wp:docPr id="3" name="Picture 3"/>
@@ -8418,7 +8402,7 @@
                     <pic:cNvPicPr/>
                   </pic:nvPicPr>
                   <pic:blipFill>
-                    <a:blip r:embed="rId12"/>
+                    <a:blip r:embed="rId14"/>
                     <a:stretch>
                       <a:fillRect/>
                     </a:stretch>
@@ -8446,13 +8430,12 @@
         <w:keepNext/>
         <w:spacing w:line="480" w:lineRule="auto"/>
       </w:pPr>
-      <w:bookmarkStart w:id="21" w:name="_Toc239253077"/>
+      <w:bookmarkStart w:id="21" w:name="_Toc239253561"/>
       <w:r>
         <w:rPr>
           <w:b/>
           <w:bCs/>
           <w:color w:val="000000"/>
-          <w:sz w:val="24"/>
           <w:szCs w:val="24"/>
         </w:rPr>
         <w:t>3.4 Algorithm</w:t>
@@ -8476,7 +8459,7 @@
         <w:keepNext/>
         <w:spacing w:line="480" w:lineRule="auto"/>
       </w:pPr>
-      <w:bookmarkStart w:id="22" w:name="_Toc239253078"/>
+      <w:bookmarkStart w:id="22" w:name="_Toc239253562"/>
       <w:r>
         <w:rPr>
           <w:b/>
@@ -8506,6 +8489,7 @@
         <w:rPr>
           <w:color w:val="000000"/>
         </w:rPr>
+        <w:lastRenderedPageBreak/>
         <w:t>1.</w:t>
       </w:r>
       <w:r>
@@ -8530,7 +8514,6 @@
         <w:rPr>
           <w:color w:val="000000"/>
         </w:rPr>
-        <w:lastRenderedPageBreak/>
         <w:t>2.</w:t>
       </w:r>
       <w:r>
@@ -8647,7 +8630,7 @@
         <w:keepNext/>
         <w:spacing w:line="480" w:lineRule="auto"/>
       </w:pPr>
-      <w:bookmarkStart w:id="23" w:name="_Toc239253079"/>
+      <w:bookmarkStart w:id="23" w:name="_Toc239253563"/>
       <w:r>
         <w:rPr>
           <w:b/>
@@ -8715,6 +8698,7 @@
         <w:rPr>
           <w:color w:val="000000"/>
         </w:rPr>
+        <w:lastRenderedPageBreak/>
         <w:t>3.</w:t>
       </w:r>
       <w:r>
@@ -8739,7 +8723,6 @@
         <w:rPr>
           <w:color w:val="000000"/>
         </w:rPr>
-        <w:lastRenderedPageBreak/>
         <w:t>4.</w:t>
       </w:r>
       <w:r>
@@ -8818,7 +8801,7 @@
         <w:keepNext/>
         <w:spacing w:line="480" w:lineRule="auto"/>
       </w:pPr>
-      <w:bookmarkStart w:id="24" w:name="_Toc239253080"/>
+      <w:bookmarkStart w:id="24" w:name="_Toc239253564"/>
       <w:r>
         <w:rPr>
           <w:b/>
@@ -8948,6 +8931,7 @@
         <w:rPr>
           <w:color w:val="000000"/>
         </w:rPr>
+        <w:lastRenderedPageBreak/>
         <w:t>6.</w:t>
       </w:r>
       <w:r>
@@ -8967,7 +8951,6 @@
         <w:rPr>
           <w:color w:val="000000"/>
         </w:rPr>
-        <w:lastRenderedPageBreak/>
         <w:t>7.</w:t>
       </w:r>
       <w:r>
@@ -9027,13 +9010,12 @@
         <w:keepNext/>
         <w:spacing w:line="480" w:lineRule="auto"/>
       </w:pPr>
-      <w:bookmarkStart w:id="25" w:name="_Toc239253081"/>
+      <w:bookmarkStart w:id="25" w:name="_Toc239253565"/>
       <w:r>
         <w:rPr>
           <w:b/>
           <w:bCs/>
           <w:color w:val="000000"/>
-          <w:sz w:val="24"/>
           <w:szCs w:val="24"/>
         </w:rPr>
         <w:t>3.5 System Flowchart</w:t>
@@ -9083,7 +9065,7 @@
           <w:noProof/>
         </w:rPr>
         <w:drawing>
-          <wp:inline distT="0" distB="0" distL="0" distR="0" wp14:anchorId="67BE814F" wp14:editId="12739F60">
+          <wp:inline distT="0" distB="0" distL="0" distR="0" wp14:anchorId="1E342CCA" wp14:editId="52A70F3C">
             <wp:extent cx="5394960" cy="6491029"/>
             <wp:effectExtent l="0" t="0" r="0" b="0"/>
             <wp:docPr id="4" name="Picture 4"/>
@@ -9098,7 +9080,7 @@
                     <pic:cNvPicPr/>
                   </pic:nvPicPr>
                   <pic:blipFill>
-                    <a:blip r:embed="rId13"/>
+                    <a:blip r:embed="rId15"/>
                     <a:stretch>
                       <a:fillRect/>
                     </a:stretch>
@@ -9177,13 +9159,12 @@
         <w:keepNext/>
         <w:spacing w:line="480" w:lineRule="auto"/>
       </w:pPr>
-      <w:bookmarkStart w:id="26" w:name="_Toc239253082"/>
+      <w:bookmarkStart w:id="26" w:name="_Toc239253566"/>
       <w:r>
         <w:rPr>
           <w:b/>
           <w:bCs/>
           <w:color w:val="000000"/>
-          <w:sz w:val="24"/>
           <w:szCs w:val="24"/>
         </w:rPr>
         <w:t>3.6 Use Case Diagram</w:t>
@@ -9245,7 +9226,7 @@
           <w:noProof/>
         </w:rPr>
         <w:drawing>
-          <wp:inline distT="0" distB="0" distL="0" distR="0" wp14:anchorId="78B5DA06" wp14:editId="737A0233">
+          <wp:inline distT="0" distB="0" distL="0" distR="0" wp14:anchorId="6E004012" wp14:editId="1AA6D320">
             <wp:extent cx="5486400" cy="4702629"/>
             <wp:effectExtent l="0" t="0" r="0" b="0"/>
             <wp:docPr id="5" name="Picture 5"/>
@@ -9260,7 +9241,7 @@
                     <pic:cNvPicPr/>
                   </pic:nvPicPr>
                   <pic:blipFill>
-                    <a:blip r:embed="rId14"/>
+                    <a:blip r:embed="rId16"/>
                     <a:stretch>
                       <a:fillRect/>
                     </a:stretch>
@@ -9299,13 +9280,12 @@
         <w:keepNext/>
         <w:spacing w:line="480" w:lineRule="auto"/>
       </w:pPr>
-      <w:bookmarkStart w:id="27" w:name="_Toc239253083"/>
+      <w:bookmarkStart w:id="27" w:name="_Toc239253567"/>
       <w:r>
         <w:rPr>
           <w:b/>
           <w:bCs/>
           <w:color w:val="000000"/>
-          <w:sz w:val="24"/>
           <w:szCs w:val="24"/>
         </w:rPr>
         <w:lastRenderedPageBreak/>
@@ -9319,7 +9299,7 @@
         <w:keepNext/>
         <w:spacing w:line="480" w:lineRule="auto"/>
       </w:pPr>
-      <w:bookmarkStart w:id="28" w:name="_Toc239253084"/>
+      <w:bookmarkStart w:id="28" w:name="_Toc239253568"/>
       <w:r>
         <w:rPr>
           <w:b/>
@@ -9379,7 +9359,7 @@
           <w:noProof/>
         </w:rPr>
         <w:drawing>
-          <wp:inline distT="0" distB="0" distL="0" distR="0" wp14:anchorId="2AB35FA1" wp14:editId="3E687C21">
+          <wp:inline distT="0" distB="0" distL="0" distR="0" wp14:anchorId="0CFE2B59" wp14:editId="0DD1BC11">
             <wp:extent cx="5577840" cy="2114499"/>
             <wp:effectExtent l="0" t="0" r="0" b="0"/>
             <wp:docPr id="6" name="Picture 6"/>
@@ -9394,7 +9374,7 @@
                     <pic:cNvPicPr/>
                   </pic:nvPicPr>
                   <pic:blipFill>
-                    <a:blip r:embed="rId15"/>
+                    <a:blip r:embed="rId17"/>
                     <a:stretch>
                       <a:fillRect/>
                     </a:stretch>
@@ -9422,7 +9402,7 @@
         <w:keepNext/>
         <w:spacing w:line="480" w:lineRule="auto"/>
       </w:pPr>
-      <w:bookmarkStart w:id="29" w:name="_Toc239253085"/>
+      <w:bookmarkStart w:id="29" w:name="_Toc239253569"/>
       <w:r>
         <w:rPr>
           <w:b/>
@@ -9442,14 +9422,20 @@
         <w:rPr>
           <w:color w:val="000000"/>
         </w:rPr>
-        <w:t xml:space="preserve">Figure 7 decomposes the single process of Figure 6 into six processes and six data stores. Process 1.0, Manage Users and Access, authenticates platform users and issues session tokens against the user and role store. Process 2.0, Provision Store and Domain, creates tenant records and domain mappings and applies the administrator's approval decisions. Process 3.0, Manage </w:t>
+        <w:t xml:space="preserve">Figure 7 decomposes the single process of Figure 6 into six processes and six data stores. Process 1.0, Manage Users and Access, authenticates platform users and issues session tokens against the user and role store. Process 2.0, Provision Store and Domain, creates tenant records </w:t>
       </w:r>
       <w:r>
         <w:rPr>
           <w:color w:val="000000"/>
         </w:rPr>
         <w:lastRenderedPageBreak/>
-        <w:t>Catalog and Inventory, maintains products, variants and stock levels. Process 4.0, Serve Storefront and Cart, resolves the tenant, reads the catalogue and maintains cart records for storefront visitors. Process 5.0, Process Order, converts a cart into an order, reserves stock, records the customer, and reports fulfilment progress. Process 6.0, Generate Reports, reads order and catalogue data to produce sales reports for sellers and an activity summary for administrators.</w:t>
+        <w:t xml:space="preserve">and domain mappings and applies the administrator's approval decisions. Process 3.0, Manage Catalog and Inventory, maintains products, variants and stock levels. Process 4.0, Serve Storefront and Cart, resolves the tenant, reads the catalogue and maintains cart records for storefront visitors. Process 5.0, Process Order, converts a cart into an order, reserves stock, records the customer, and reports fulfilment progress. Process 6.0, Generate Reports, reads order and catalogue data to produce sales reports </w:t>
+      </w:r>
+      <w:r>
+        <w:rPr>
+          <w:color w:val="000000"/>
+        </w:rPr>
+        <w:t>for sellers and an activity summary for administrators.</w:t>
       </w:r>
     </w:p>
     <w:p>
@@ -9483,7 +9469,7 @@
           <w:noProof/>
         </w:rPr>
         <w:drawing>
-          <wp:inline distT="0" distB="0" distL="0" distR="0" wp14:anchorId="496ED342" wp14:editId="3BAB5994">
+          <wp:inline distT="0" distB="0" distL="0" distR="0" wp14:anchorId="42289DA2" wp14:editId="2B34384E">
             <wp:extent cx="5577840" cy="4820912"/>
             <wp:effectExtent l="0" t="0" r="0" b="0"/>
             <wp:docPr id="7" name="Picture 7"/>
@@ -9498,7 +9484,7 @@
                     <pic:cNvPicPr/>
                   </pic:nvPicPr>
                   <pic:blipFill>
-                    <a:blip r:embed="rId16"/>
+                    <a:blip r:embed="rId18"/>
                     <a:stretch>
                       <a:fillRect/>
                     </a:stretch>
@@ -9538,13 +9524,12 @@
         <w:keepNext/>
         <w:spacing w:line="480" w:lineRule="auto"/>
       </w:pPr>
-      <w:bookmarkStart w:id="30" w:name="_Toc239253086"/>
+      <w:bookmarkStart w:id="30" w:name="_Toc239253570"/>
       <w:r>
         <w:rPr>
           <w:b/>
           <w:bCs/>
           <w:color w:val="000000"/>
-          <w:sz w:val="24"/>
           <w:szCs w:val="24"/>
         </w:rPr>
         <w:t>3.8 Entity Relationship Diagram</w:t>
@@ -9600,7 +9585,7 @@
           <w:noProof/>
         </w:rPr>
         <w:drawing>
-          <wp:inline distT="0" distB="0" distL="0" distR="0" wp14:anchorId="37984AFF" wp14:editId="6881F65F">
+          <wp:inline distT="0" distB="0" distL="0" distR="0" wp14:anchorId="0D60C3C2" wp14:editId="54429E86">
             <wp:extent cx="5303520" cy="6584179"/>
             <wp:effectExtent l="0" t="0" r="0" b="0"/>
             <wp:docPr id="8" name="Picture 8"/>
@@ -9615,7 +9600,7 @@
                     <pic:cNvPicPr/>
                   </pic:nvPicPr>
                   <pic:blipFill>
-                    <a:blip r:embed="rId17"/>
+                    <a:blip r:embed="rId19"/>
                     <a:stretch>
                       <a:fillRect/>
                     </a:stretch>
@@ -9685,13 +9670,12 @@
         <w:spacing w:line="480" w:lineRule="auto"/>
         <w:jc w:val="center"/>
       </w:pPr>
-      <w:bookmarkStart w:id="31" w:name="_Toc239253087"/>
+      <w:bookmarkStart w:id="31" w:name="_Toc239253571"/>
       <w:r>
         <w:rPr>
           <w:b/>
           <w:bCs/>
           <w:color w:val="000000"/>
-          <w:sz w:val="24"/>
           <w:szCs w:val="24"/>
         </w:rPr>
         <w:lastRenderedPageBreak/>
@@ -9716,13 +9700,12 @@
         <w:keepNext/>
         <w:spacing w:line="480" w:lineRule="auto"/>
       </w:pPr>
-      <w:bookmarkStart w:id="32" w:name="_Toc239253088"/>
+      <w:bookmarkStart w:id="32" w:name="_Toc239253572"/>
       <w:r>
         <w:rPr>
           <w:b/>
           <w:bCs/>
           <w:color w:val="000000"/>
-          <w:sz w:val="24"/>
           <w:szCs w:val="24"/>
         </w:rPr>
         <w:t>4.1 Hardware and Software Requirements</w:t>
@@ -10402,13 +10385,12 @@
         <w:keepNext/>
         <w:spacing w:line="480" w:lineRule="auto"/>
       </w:pPr>
-      <w:bookmarkStart w:id="33" w:name="_Toc239253089"/>
+      <w:bookmarkStart w:id="33" w:name="_Toc239253573"/>
       <w:r>
         <w:rPr>
           <w:b/>
           <w:bCs/>
           <w:color w:val="000000"/>
-          <w:sz w:val="24"/>
           <w:szCs w:val="24"/>
         </w:rPr>
         <w:t>4.2 Proposed Technology Stack</w:t>
@@ -10771,13 +10753,12 @@
         <w:keepNext/>
         <w:spacing w:line="480" w:lineRule="auto"/>
       </w:pPr>
-      <w:bookmarkStart w:id="34" w:name="_Toc239253090"/>
+      <w:bookmarkStart w:id="34" w:name="_Toc239253574"/>
       <w:r>
         <w:rPr>
           <w:b/>
           <w:bCs/>
           <w:color w:val="000000"/>
-          <w:sz w:val="24"/>
           <w:szCs w:val="24"/>
         </w:rPr>
         <w:t>4.3 Proposed Testing and Development Approach</w:t>
@@ -11074,13 +11055,12 @@
         <w:spacing w:line="480" w:lineRule="auto"/>
         <w:jc w:val="center"/>
       </w:pPr>
-      <w:bookmarkStart w:id="35" w:name="_Toc239253091"/>
+      <w:bookmarkStart w:id="35" w:name="_Toc239253575"/>
       <w:r>
         <w:rPr>
           <w:b/>
           <w:bCs/>
           <w:color w:val="000000"/>
-          <w:sz w:val="24"/>
           <w:szCs w:val="24"/>
         </w:rPr>
         <w:lastRenderedPageBreak/>
@@ -11105,13 +11085,12 @@
         <w:keepNext/>
         <w:spacing w:line="480" w:lineRule="auto"/>
       </w:pPr>
-      <w:bookmarkStart w:id="36" w:name="_Toc239253092"/>
+      <w:bookmarkStart w:id="36" w:name="_Toc239253576"/>
       <w:r>
         <w:rPr>
           <w:b/>
           <w:bCs/>
           <w:color w:val="000000"/>
-          <w:sz w:val="24"/>
           <w:szCs w:val="24"/>
         </w:rPr>
         <w:t>5.1 Expected System Deliverables</w:t>
@@ -11283,13 +11262,12 @@
         <w:keepNext/>
         <w:spacing w:line="480" w:lineRule="auto"/>
       </w:pPr>
-      <w:bookmarkStart w:id="37" w:name="_Toc239253093"/>
+      <w:bookmarkStart w:id="37" w:name="_Toc239253577"/>
       <w:r>
         <w:rPr>
           <w:b/>
           <w:bCs/>
           <w:color w:val="000000"/>
-          <w:sz w:val="24"/>
           <w:szCs w:val="24"/>
         </w:rPr>
         <w:lastRenderedPageBreak/>
@@ -11383,13 +11361,12 @@
         <w:spacing w:line="480" w:lineRule="auto"/>
         <w:jc w:val="center"/>
       </w:pPr>
-      <w:bookmarkStart w:id="38" w:name="_Toc239253094"/>
+      <w:bookmarkStart w:id="38" w:name="_Toc239253578"/>
       <w:r>
         <w:rPr>
           <w:b/>
           <w:bCs/>
           <w:color w:val="000000"/>
-          <w:sz w:val="24"/>
           <w:szCs w:val="24"/>
         </w:rPr>
         <w:lastRenderedPageBreak/>
@@ -11615,7 +11592,8 @@
       </w:r>
     </w:p>
     <w:sectPr>
-      <w:headerReference w:type="default" r:id="rId18"/>
+      <w:headerReference w:type="default" r:id="rId20"/>
+      <w:footerReference w:type="default" r:id="rId21"/>
       <w:pgSz w:w="12240" w:h="15840"/>
       <w:pgMar w:top="1440" w:right="1440" w:bottom="1440" w:left="1440" w:header="708" w:footer="708" w:gutter="0"/>
       <w:pgNumType w:start="1"/>
@@ -11644,40 +11622,21 @@
 </w:endnotes>
 </file>
 
-<file path=word/footnotes.xml><?xml version="1.0" encoding="utf-8"?>
-<w:footnotes xmlns:wpc="http://schemas.microsoft.com/office/word/2010/wordprocessingCanvas" xmlns:cx="http://schemas.microsoft.com/office/drawing/2014/chartex" xmlns:cx1="http://schemas.microsoft.com/office/drawing/2015/9/8/chartex" xmlns:cx2="http://schemas.microsoft.com/office/drawing/2015/10/21/chartex" xmlns:cx3="http://schemas.microsoft.com/office/drawing/2016/5/9/chartex" xmlns:cx4="http://schemas.microsoft.com/office/drawing/2016/5/10/chartex" xmlns:cx5="http://schemas.microsoft.com/office/drawing/2016/5/11/chartex" xmlns:cx6="http://schemas.microsoft.com/office/drawing/2016/5/12/chartex" xmlns:cx7="http://schemas.microsoft.com/office/drawing/2016/5/13/chartex" xmlns:cx8="http://schemas.microsoft.com/office/drawing/2016/5/14/chartex" xmlns:mc="http://schemas.openxmlformats.org/markup-compatibility/2006" xmlns:aink="http://schemas.microsoft.com/office/drawing/2016/ink" xmlns:am3d="http://schemas.microsoft.com/office/drawing/2017/model3d" xmlns:o="urn:schemas-microsoft-com:office:office" xmlns:oel="http://schemas.microsoft.com/office/2019/extlst" xmlns:r="http://schemas.openxmlformats.org/officeDocument/2006/relationships" xmlns:m="http://schemas.openxmlformats.org/officeDocument/2006/math" xmlns:v="urn:schemas-microsoft-com:vml" xmlns:wp14="http://schemas.microsoft.com/office/word/2010/wordprocessingDrawing" xmlns:wp="http://schemas.openxmlformats.org/drawingml/2006/wordprocessingDrawing" xmlns:w10="urn:schemas-microsoft-com:office:word" xmlns:w="http://schemas.openxmlformats.org/wordprocessingml/2006/main" xmlns:w14="http://schemas.microsoft.com/office/word/2010/wordml" xmlns:w15="http://schemas.microsoft.com/office/word/2012/wordml" xmlns:w16cex="http://schemas.microsoft.com/office/word/2018/wordml/cex" xmlns:w16cid="http://schemas.microsoft.com/office/word/2016/wordml/cid" xmlns:w16="http://schemas.microsoft.com/office/word/2018/wordml" xmlns:w16du="http://schemas.microsoft.com/office/word/2023/wordml/word16du" xmlns:w16sdtdh="http://schemas.microsoft.com/office/word/2020/wordml/sdtdatahash" xmlns:w16sdtfl="http://schemas.microsoft.com/office/word/2024/wordml/sdtformatlock" xmlns:w16se="http://schemas.microsoft.com/office/word/2015/wordml/symex" xmlns:wpg="http://schemas.microsoft.com/office/word/2010/wordprocessingGroup" xmlns:wpi="http://schemas.microsoft.com/office/word/2010/wordprocessingInk" xmlns:wne="http://schemas.microsoft.com/office/word/2006/wordml" xmlns:wps="http://schemas.microsoft.com/office/word/2010/wordprocessingShape" mc:Ignorable="w14 w15 w16se w16cid w16 w16cex w16sdtdh w16sdtfl w16du wp14">
-  <w:footnote w:type="separator" w:id="-1">
-    <w:p>
-      <w:r>
-        <w:separator/>
-      </w:r>
-    </w:p>
-  </w:footnote>
-  <w:footnote w:type="continuationSeparator" w:id="0">
-    <w:p>
-      <w:r>
-        <w:continuationSeparator/>
-      </w:r>
-    </w:p>
-  </w:footnote>
-</w:footnotes>
+<file path=word/footer1.xml><?xml version="1.0" encoding="utf-8"?>
+<w:ftr xmlns:wpc="http://schemas.microsoft.com/office/word/2010/wordprocessingCanvas" xmlns:cx="http://schemas.microsoft.com/office/drawing/2014/chartex" xmlns:cx1="http://schemas.microsoft.com/office/drawing/2015/9/8/chartex" xmlns:cx2="http://schemas.microsoft.com/office/drawing/2015/10/21/chartex" xmlns:cx3="http://schemas.microsoft.com/office/drawing/2016/5/9/chartex" xmlns:cx4="http://schemas.microsoft.com/office/drawing/2016/5/10/chartex" xmlns:cx5="http://schemas.microsoft.com/office/drawing/2016/5/11/chartex" xmlns:cx6="http://schemas.microsoft.com/office/drawing/2016/5/12/chartex" xmlns:cx7="http://schemas.microsoft.com/office/drawing/2016/5/13/chartex" xmlns:cx8="http://schemas.microsoft.com/office/drawing/2016/5/14/chartex" xmlns:mc="http://schemas.openxmlformats.org/markup-compatibility/2006" xmlns:aink="http://schemas.microsoft.com/office/drawing/2016/ink" xmlns:am3d="http://schemas.microsoft.com/office/drawing/2017/model3d" xmlns:o="urn:schemas-microsoft-com:office:office" xmlns:oel="http://schemas.microsoft.com/office/2019/extlst" xmlns:r="http://schemas.openxmlformats.org/officeDocument/2006/relationships" xmlns:m="http://schemas.openxmlformats.org/officeDocument/2006/math" xmlns:v="urn:schemas-microsoft-com:vml" xmlns:wp14="http://schemas.microsoft.com/office/word/2010/wordprocessingDrawing" xmlns:wp="http://schemas.openxmlformats.org/drawingml/2006/wordprocessingDrawing" xmlns:w10="urn:schemas-microsoft-com:office:word" xmlns:w="http://schemas.openxmlformats.org/wordprocessingml/2006/main" xmlns:w14="http://schemas.microsoft.com/office/word/2010/wordml" xmlns:w15="http://schemas.microsoft.com/office/word/2012/wordml" xmlns:w16cex="http://schemas.microsoft.com/office/word/2018/wordml/cex" xmlns:w16cid="http://schemas.microsoft.com/office/word/2016/wordml/cid" xmlns:w16="http://schemas.microsoft.com/office/word/2018/wordml" xmlns:w16du="http://schemas.microsoft.com/office/word/2023/wordml/word16du" xmlns:w16sdtdh="http://schemas.microsoft.com/office/word/2020/wordml/sdtdatahash" xmlns:w16sdtfl="http://schemas.microsoft.com/office/word/2024/wordml/sdtformatlock" xmlns:w16se="http://schemas.microsoft.com/office/word/2015/wordml/symex" xmlns:wpg="http://schemas.microsoft.com/office/word/2010/wordprocessingGroup" xmlns:wpi="http://schemas.microsoft.com/office/word/2010/wordprocessingInk" xmlns:wne="http://schemas.microsoft.com/office/word/2006/wordml" xmlns:wps="http://schemas.microsoft.com/office/word/2010/wordprocessingShape" mc:Ignorable="w14 w15 w16se w16cid w16 w16cex w16sdtdh w16sdtfl w16du wp14">
+  <w:p>
+    <w:pPr>
+      <w:jc w:val="center"/>
+    </w:pPr>
+  </w:p>
+</w:ftr>
 </file>
 
-<file path=word/header1.xml><?xml version="1.0" encoding="utf-8"?>
-<w:hdr xmlns:wpc="http://schemas.microsoft.com/office/word/2010/wordprocessingCanvas" xmlns:cx="http://schemas.microsoft.com/office/drawing/2014/chartex" xmlns:cx1="http://schemas.microsoft.com/office/drawing/2015/9/8/chartex" xmlns:cx2="http://schemas.microsoft.com/office/drawing/2015/10/21/chartex" xmlns:cx3="http://schemas.microsoft.com/office/drawing/2016/5/9/chartex" xmlns:cx4="http://schemas.microsoft.com/office/drawing/2016/5/10/chartex" xmlns:cx5="http://schemas.microsoft.com/office/drawing/2016/5/11/chartex" xmlns:cx6="http://schemas.microsoft.com/office/drawing/2016/5/12/chartex" xmlns:cx7="http://schemas.microsoft.com/office/drawing/2016/5/13/chartex" xmlns:cx8="http://schemas.microsoft.com/office/drawing/2016/5/14/chartex" xmlns:mc="http://schemas.openxmlformats.org/markup-compatibility/2006" xmlns:aink="http://schemas.microsoft.com/office/drawing/2016/ink" xmlns:am3d="http://schemas.microsoft.com/office/drawing/2017/model3d" xmlns:o="urn:schemas-microsoft-com:office:office" xmlns:oel="http://schemas.microsoft.com/office/2019/extlst" xmlns:r="http://schemas.openxmlformats.org/officeDocument/2006/relationships" xmlns:m="http://schemas.openxmlformats.org/officeDocument/2006/math" xmlns:v="urn:schemas-microsoft-com:vml" xmlns:wp14="http://schemas.microsoft.com/office/word/2010/wordprocessingDrawing" xmlns:wp="http://schemas.openxmlformats.org/drawingml/2006/wordprocessingDrawing" xmlns:w10="urn:schemas-microsoft-com:office:word" xmlns:w="http://schemas.openxmlformats.org/wordprocessingml/2006/main" xmlns:w14="http://schemas.microsoft.com/office/word/2010/wordml" xmlns:w15="http://schemas.microsoft.com/office/word/2012/wordml" xmlns:w16cex="http://schemas.microsoft.com/office/word/2018/wordml/cex" xmlns:w16cid="http://schemas.microsoft.com/office/word/2016/wordml/cid" xmlns:w16="http://schemas.microsoft.com/office/word/2018/wordml" xmlns:w16du="http://schemas.microsoft.com/office/word/2023/wordml/word16du" xmlns:w16sdtdh="http://schemas.microsoft.com/office/word/2020/wordml/sdtdatahash" xmlns:w16sdtfl="http://schemas.microsoft.com/office/word/2024/wordml/sdtformatlock" xmlns:w16se="http://schemas.microsoft.com/office/word/2015/wordml/symex" xmlns:wpg="http://schemas.microsoft.com/office/word/2010/wordprocessingGroup" xmlns:wpi="http://schemas.microsoft.com/office/word/2010/wordprocessingInk" xmlns:wne="http://schemas.microsoft.com/office/word/2006/wordml" xmlns:wps="http://schemas.microsoft.com/office/word/2010/wordprocessingShape" mc:Ignorable="w14 w15 w16se w16cid w16 w16cex w16sdtdh w16sdtfl w16du wp14">
+<file path=word/footer2.xml><?xml version="1.0" encoding="utf-8"?>
+<w:ftr xmlns:wpc="http://schemas.microsoft.com/office/word/2010/wordprocessingCanvas" xmlns:cx="http://schemas.microsoft.com/office/drawing/2014/chartex" xmlns:cx1="http://schemas.microsoft.com/office/drawing/2015/9/8/chartex" xmlns:cx2="http://schemas.microsoft.com/office/drawing/2015/10/21/chartex" xmlns:cx3="http://schemas.microsoft.com/office/drawing/2016/5/9/chartex" xmlns:cx4="http://schemas.microsoft.com/office/drawing/2016/5/10/chartex" xmlns:cx5="http://schemas.microsoft.com/office/drawing/2016/5/11/chartex" xmlns:cx6="http://schemas.microsoft.com/office/drawing/2016/5/12/chartex" xmlns:cx7="http://schemas.microsoft.com/office/drawing/2016/5/13/chartex" xmlns:cx8="http://schemas.microsoft.com/office/drawing/2016/5/14/chartex" xmlns:mc="http://schemas.openxmlformats.org/markup-compatibility/2006" xmlns:aink="http://schemas.microsoft.com/office/drawing/2016/ink" xmlns:am3d="http://schemas.microsoft.com/office/drawing/2017/model3d" xmlns:o="urn:schemas-microsoft-com:office:office" xmlns:oel="http://schemas.microsoft.com/office/2019/extlst" xmlns:r="http://schemas.openxmlformats.org/officeDocument/2006/relationships" xmlns:m="http://schemas.openxmlformats.org/officeDocument/2006/math" xmlns:v="urn:schemas-microsoft-com:vml" xmlns:wp14="http://schemas.microsoft.com/office/word/2010/wordprocessingDrawing" xmlns:wp="http://schemas.openxmlformats.org/drawingml/2006/wordprocessingDrawing" xmlns:w10="urn:schemas-microsoft-com:office:word" xmlns:w="http://schemas.openxmlformats.org/wordprocessingml/2006/main" xmlns:w14="http://schemas.microsoft.com/office/word/2010/wordml" xmlns:w15="http://schemas.microsoft.com/office/word/2012/wordml" xmlns:w16cex="http://schemas.microsoft.com/office/word/2018/wordml/cex" xmlns:w16cid="http://schemas.microsoft.com/office/word/2016/wordml/cid" xmlns:w16="http://schemas.microsoft.com/office/word/2018/wordml" xmlns:w16du="http://schemas.microsoft.com/office/word/2023/wordml/word16du" xmlns:w16sdtdh="http://schemas.microsoft.com/office/word/2020/wordml/sdtdatahash" xmlns:w16sdtfl="http://schemas.microsoft.com/office/word/2024/wordml/sdtformatlock" xmlns:w16se="http://schemas.microsoft.com/office/word/2015/wordml/symex" xmlns:wpg="http://schemas.microsoft.com/office/word/2010/wordprocessingGroup" xmlns:wpi="http://schemas.microsoft.com/office/word/2010/wordprocessingInk" xmlns:wne="http://schemas.microsoft.com/office/word/2006/wordml" xmlns:wps="http://schemas.microsoft.com/office/word/2010/wordprocessingShape" mc:Ignorable="w14 w15 w16se w16cid w16 w16cex w16sdtdh w16sdtfl w16du wp14">
   <w:p>
     <w:pPr>
-      <w:jc w:val="right"/>
-    </w:pPr>
-  </w:p>
-</w:hdr>
-</file>
-
-<file path=word/header2.xml><?xml version="1.0" encoding="utf-8"?>
-<w:hdr xmlns:wpc="http://schemas.microsoft.com/office/word/2010/wordprocessingCanvas" xmlns:cx="http://schemas.microsoft.com/office/drawing/2014/chartex" xmlns:cx1="http://schemas.microsoft.com/office/drawing/2015/9/8/chartex" xmlns:cx2="http://schemas.microsoft.com/office/drawing/2015/10/21/chartex" xmlns:cx3="http://schemas.microsoft.com/office/drawing/2016/5/9/chartex" xmlns:cx4="http://schemas.microsoft.com/office/drawing/2016/5/10/chartex" xmlns:cx5="http://schemas.microsoft.com/office/drawing/2016/5/11/chartex" xmlns:cx6="http://schemas.microsoft.com/office/drawing/2016/5/12/chartex" xmlns:cx7="http://schemas.microsoft.com/office/drawing/2016/5/13/chartex" xmlns:cx8="http://schemas.microsoft.com/office/drawing/2016/5/14/chartex" xmlns:mc="http://schemas.openxmlformats.org/markup-compatibility/2006" xmlns:aink="http://schemas.microsoft.com/office/drawing/2016/ink" xmlns:am3d="http://schemas.microsoft.com/office/drawing/2017/model3d" xmlns:o="urn:schemas-microsoft-com:office:office" xmlns:oel="http://schemas.microsoft.com/office/2019/extlst" xmlns:r="http://schemas.openxmlformats.org/officeDocument/2006/relationships" xmlns:m="http://schemas.openxmlformats.org/officeDocument/2006/math" xmlns:v="urn:schemas-microsoft-com:vml" xmlns:wp14="http://schemas.microsoft.com/office/word/2010/wordprocessingDrawing" xmlns:wp="http://schemas.openxmlformats.org/drawingml/2006/wordprocessingDrawing" xmlns:w10="urn:schemas-microsoft-com:office:word" xmlns:w="http://schemas.openxmlformats.org/wordprocessingml/2006/main" xmlns:w14="http://schemas.microsoft.com/office/word/2010/wordml" xmlns:w15="http://schemas.microsoft.com/office/word/2012/wordml" xmlns:w16cex="http://schemas.microsoft.com/office/word/2018/wordml/cex" xmlns:w16cid="http://schemas.microsoft.com/office/word/2016/wordml/cid" xmlns:w16="http://schemas.microsoft.com/office/word/2018/wordml" xmlns:w16du="http://schemas.microsoft.com/office/word/2023/wordml/word16du" xmlns:w16sdtdh="http://schemas.microsoft.com/office/word/2020/wordml/sdtdatahash" xmlns:w16sdtfl="http://schemas.microsoft.com/office/word/2024/wordml/sdtformatlock" xmlns:w16se="http://schemas.microsoft.com/office/word/2015/wordml/symex" xmlns:wpg="http://schemas.microsoft.com/office/word/2010/wordprocessingGroup" xmlns:wpi="http://schemas.microsoft.com/office/word/2010/wordprocessingInk" xmlns:wne="http://schemas.microsoft.com/office/word/2006/wordml" xmlns:wps="http://schemas.microsoft.com/office/word/2010/wordprocessingShape" mc:Ignorable="w14 w15 w16se w16cid w16 w16cex w16sdtdh w16sdtfl w16du wp14">
-  <w:p>
-    <w:pPr>
-      <w:jc w:val="right"/>
+      <w:jc w:val="center"/>
     </w:pPr>
     <w:r>
       <w:fldChar w:fldCharType="begin"/>
@@ -11698,14 +11657,14 @@
       <w:fldChar w:fldCharType="end"/>
     </w:r>
   </w:p>
-</w:hdr>
+</w:ftr>
 </file>
 
-<file path=word/header3.xml><?xml version="1.0" encoding="utf-8"?>
-<w:hdr xmlns:wpc="http://schemas.microsoft.com/office/word/2010/wordprocessingCanvas" xmlns:cx="http://schemas.microsoft.com/office/drawing/2014/chartex" xmlns:cx1="http://schemas.microsoft.com/office/drawing/2015/9/8/chartex" xmlns:cx2="http://schemas.microsoft.com/office/drawing/2015/10/21/chartex" xmlns:cx3="http://schemas.microsoft.com/office/drawing/2016/5/9/chartex" xmlns:cx4="http://schemas.microsoft.com/office/drawing/2016/5/10/chartex" xmlns:cx5="http://schemas.microsoft.com/office/drawing/2016/5/11/chartex" xmlns:cx6="http://schemas.microsoft.com/office/drawing/2016/5/12/chartex" xmlns:cx7="http://schemas.microsoft.com/office/drawing/2016/5/13/chartex" xmlns:cx8="http://schemas.microsoft.com/office/drawing/2016/5/14/chartex" xmlns:mc="http://schemas.openxmlformats.org/markup-compatibility/2006" xmlns:aink="http://schemas.microsoft.com/office/drawing/2016/ink" xmlns:am3d="http://schemas.microsoft.com/office/drawing/2017/model3d" xmlns:o="urn:schemas-microsoft-com:office:office" xmlns:oel="http://schemas.microsoft.com/office/2019/extlst" xmlns:r="http://schemas.openxmlformats.org/officeDocument/2006/relationships" xmlns:m="http://schemas.openxmlformats.org/officeDocument/2006/math" xmlns:v="urn:schemas-microsoft-com:vml" xmlns:wp14="http://schemas.microsoft.com/office/word/2010/wordprocessingDrawing" xmlns:wp="http://schemas.openxmlformats.org/drawingml/2006/wordprocessingDrawing" xmlns:w10="urn:schemas-microsoft-com:office:word" xmlns:w="http://schemas.openxmlformats.org/wordprocessingml/2006/main" xmlns:w14="http://schemas.microsoft.com/office/word/2010/wordml" xmlns:w15="http://schemas.microsoft.com/office/word/2012/wordml" xmlns:w16cex="http://schemas.microsoft.com/office/word/2018/wordml/cex" xmlns:w16cid="http://schemas.microsoft.com/office/word/2016/wordml/cid" xmlns:w16="http://schemas.microsoft.com/office/word/2018/wordml" xmlns:w16du="http://schemas.microsoft.com/office/word/2023/wordml/word16du" xmlns:w16sdtdh="http://schemas.microsoft.com/office/word/2020/wordml/sdtdatahash" xmlns:w16sdtfl="http://schemas.microsoft.com/office/word/2024/wordml/sdtformatlock" xmlns:w16se="http://schemas.microsoft.com/office/word/2015/wordml/symex" xmlns:wpg="http://schemas.microsoft.com/office/word/2010/wordprocessingGroup" xmlns:wpi="http://schemas.microsoft.com/office/word/2010/wordprocessingInk" xmlns:wne="http://schemas.microsoft.com/office/word/2006/wordml" xmlns:wps="http://schemas.microsoft.com/office/word/2010/wordprocessingShape" mc:Ignorable="w14 w15 w16se w16cid w16 w16cex w16sdtdh w16sdtfl w16du wp14">
+<file path=word/footer3.xml><?xml version="1.0" encoding="utf-8"?>
+<w:ftr xmlns:wpc="http://schemas.microsoft.com/office/word/2010/wordprocessingCanvas" xmlns:cx="http://schemas.microsoft.com/office/drawing/2014/chartex" xmlns:cx1="http://schemas.microsoft.com/office/drawing/2015/9/8/chartex" xmlns:cx2="http://schemas.microsoft.com/office/drawing/2015/10/21/chartex" xmlns:cx3="http://schemas.microsoft.com/office/drawing/2016/5/9/chartex" xmlns:cx4="http://schemas.microsoft.com/office/drawing/2016/5/10/chartex" xmlns:cx5="http://schemas.microsoft.com/office/drawing/2016/5/11/chartex" xmlns:cx6="http://schemas.microsoft.com/office/drawing/2016/5/12/chartex" xmlns:cx7="http://schemas.microsoft.com/office/drawing/2016/5/13/chartex" xmlns:cx8="http://schemas.microsoft.com/office/drawing/2016/5/14/chartex" xmlns:mc="http://schemas.openxmlformats.org/markup-compatibility/2006" xmlns:aink="http://schemas.microsoft.com/office/drawing/2016/ink" xmlns:am3d="http://schemas.microsoft.com/office/drawing/2017/model3d" xmlns:o="urn:schemas-microsoft-com:office:office" xmlns:oel="http://schemas.microsoft.com/office/2019/extlst" xmlns:r="http://schemas.openxmlformats.org/officeDocument/2006/relationships" xmlns:m="http://schemas.openxmlformats.org/officeDocument/2006/math" xmlns:v="urn:schemas-microsoft-com:vml" xmlns:wp14="http://schemas.microsoft.com/office/word/2010/wordprocessingDrawing" xmlns:wp="http://schemas.openxmlformats.org/drawingml/2006/wordprocessingDrawing" xmlns:w10="urn:schemas-microsoft-com:office:word" xmlns:w="http://schemas.openxmlformats.org/wordprocessingml/2006/main" xmlns:w14="http://schemas.microsoft.com/office/word/2010/wordml" xmlns:w15="http://schemas.microsoft.com/office/word/2012/wordml" xmlns:w16cex="http://schemas.microsoft.com/office/word/2018/wordml/cex" xmlns:w16cid="http://schemas.microsoft.com/office/word/2016/wordml/cid" xmlns:w16="http://schemas.microsoft.com/office/word/2018/wordml" xmlns:w16du="http://schemas.microsoft.com/office/word/2023/wordml/word16du" xmlns:w16sdtdh="http://schemas.microsoft.com/office/word/2020/wordml/sdtdatahash" xmlns:w16sdtfl="http://schemas.microsoft.com/office/word/2024/wordml/sdtformatlock" xmlns:w16se="http://schemas.microsoft.com/office/word/2015/wordml/symex" xmlns:wpg="http://schemas.microsoft.com/office/word/2010/wordprocessingGroup" xmlns:wpi="http://schemas.microsoft.com/office/word/2010/wordprocessingInk" xmlns:wne="http://schemas.microsoft.com/office/word/2006/wordml" xmlns:wps="http://schemas.microsoft.com/office/word/2010/wordprocessingShape" mc:Ignorable="w14 w15 w16se w16cid w16 w16cex w16sdtdh w16sdtfl w16du wp14">
   <w:p>
     <w:pPr>
-      <w:jc w:val="right"/>
+      <w:jc w:val="center"/>
     </w:pPr>
     <w:r>
       <w:fldChar w:fldCharType="begin"/>
@@ -11726,15 +11685,133 @@
       <w:fldChar w:fldCharType="end"/>
     </w:r>
   </w:p>
+</w:ftr>
+</file>
+
+<file path=word/footnotes.xml><?xml version="1.0" encoding="utf-8"?>
+<w:footnotes xmlns:wpc="http://schemas.microsoft.com/office/word/2010/wordprocessingCanvas" xmlns:cx="http://schemas.microsoft.com/office/drawing/2014/chartex" xmlns:cx1="http://schemas.microsoft.com/office/drawing/2015/9/8/chartex" xmlns:cx2="http://schemas.microsoft.com/office/drawing/2015/10/21/chartex" xmlns:cx3="http://schemas.microsoft.com/office/drawing/2016/5/9/chartex" xmlns:cx4="http://schemas.microsoft.com/office/drawing/2016/5/10/chartex" xmlns:cx5="http://schemas.microsoft.com/office/drawing/2016/5/11/chartex" xmlns:cx6="http://schemas.microsoft.com/office/drawing/2016/5/12/chartex" xmlns:cx7="http://schemas.microsoft.com/office/drawing/2016/5/13/chartex" xmlns:cx8="http://schemas.microsoft.com/office/drawing/2016/5/14/chartex" xmlns:mc="http://schemas.openxmlformats.org/markup-compatibility/2006" xmlns:aink="http://schemas.microsoft.com/office/drawing/2016/ink" xmlns:am3d="http://schemas.microsoft.com/office/drawing/2017/model3d" xmlns:o="urn:schemas-microsoft-com:office:office" xmlns:oel="http://schemas.microsoft.com/office/2019/extlst" xmlns:r="http://schemas.openxmlformats.org/officeDocument/2006/relationships" xmlns:m="http://schemas.openxmlformats.org/officeDocument/2006/math" xmlns:v="urn:schemas-microsoft-com:vml" xmlns:wp14="http://schemas.microsoft.com/office/word/2010/wordprocessingDrawing" xmlns:wp="http://schemas.openxmlformats.org/drawingml/2006/wordprocessingDrawing" xmlns:w10="urn:schemas-microsoft-com:office:word" xmlns:w="http://schemas.openxmlformats.org/wordprocessingml/2006/main" xmlns:w14="http://schemas.microsoft.com/office/word/2010/wordml" xmlns:w15="http://schemas.microsoft.com/office/word/2012/wordml" xmlns:w16cex="http://schemas.microsoft.com/office/word/2018/wordml/cex" xmlns:w16cid="http://schemas.microsoft.com/office/word/2016/wordml/cid" xmlns:w16="http://schemas.microsoft.com/office/word/2018/wordml" xmlns:w16du="http://schemas.microsoft.com/office/word/2023/wordml/word16du" xmlns:w16sdtdh="http://schemas.microsoft.com/office/word/2020/wordml/sdtdatahash" xmlns:w16sdtfl="http://schemas.microsoft.com/office/word/2024/wordml/sdtformatlock" xmlns:w16se="http://schemas.microsoft.com/office/word/2015/wordml/symex" xmlns:wpg="http://schemas.microsoft.com/office/word/2010/wordprocessingGroup" xmlns:wpi="http://schemas.microsoft.com/office/word/2010/wordprocessingInk" xmlns:wne="http://schemas.microsoft.com/office/word/2006/wordml" xmlns:wps="http://schemas.microsoft.com/office/word/2010/wordprocessingShape" mc:Ignorable="w14 w15 w16se w16cid w16 w16cex w16sdtdh w16sdtfl w16du wp14">
+  <w:footnote w:type="separator" w:id="-1">
+    <w:p>
+      <w:r>
+        <w:separator/>
+      </w:r>
+    </w:p>
+  </w:footnote>
+  <w:footnote w:type="continuationSeparator" w:id="0">
+    <w:p>
+      <w:r>
+        <w:continuationSeparator/>
+      </w:r>
+    </w:p>
+  </w:footnote>
+</w:footnotes>
+</file>
+
+<file path=word/header1.xml><?xml version="1.0" encoding="utf-8"?>
+<w:hdr xmlns:wpc="http://schemas.microsoft.com/office/word/2010/wordprocessingCanvas" xmlns:cx="http://schemas.microsoft.com/office/drawing/2014/chartex" xmlns:cx1="http://schemas.microsoft.com/office/drawing/2015/9/8/chartex" xmlns:cx2="http://schemas.microsoft.com/office/drawing/2015/10/21/chartex" xmlns:cx3="http://schemas.microsoft.com/office/drawing/2016/5/9/chartex" xmlns:cx4="http://schemas.microsoft.com/office/drawing/2016/5/10/chartex" xmlns:cx5="http://schemas.microsoft.com/office/drawing/2016/5/11/chartex" xmlns:cx6="http://schemas.microsoft.com/office/drawing/2016/5/12/chartex" xmlns:cx7="http://schemas.microsoft.com/office/drawing/2016/5/13/chartex" xmlns:cx8="http://schemas.microsoft.com/office/drawing/2016/5/14/chartex" xmlns:mc="http://schemas.openxmlformats.org/markup-compatibility/2006" xmlns:aink="http://schemas.microsoft.com/office/drawing/2016/ink" xmlns:am3d="http://schemas.microsoft.com/office/drawing/2017/model3d" xmlns:o="urn:schemas-microsoft-com:office:office" xmlns:oel="http://schemas.microsoft.com/office/2019/extlst" xmlns:r="http://schemas.openxmlformats.org/officeDocument/2006/relationships" xmlns:m="http://schemas.openxmlformats.org/officeDocument/2006/math" xmlns:v="urn:schemas-microsoft-com:vml" xmlns:wp14="http://schemas.microsoft.com/office/word/2010/wordprocessingDrawing" xmlns:wp="http://schemas.openxmlformats.org/drawingml/2006/wordprocessingDrawing" xmlns:w10="urn:schemas-microsoft-com:office:word" xmlns:w="http://schemas.openxmlformats.org/wordprocessingml/2006/main" xmlns:w14="http://schemas.microsoft.com/office/word/2010/wordml" xmlns:w15="http://schemas.microsoft.com/office/word/2012/wordml" xmlns:w16cex="http://schemas.microsoft.com/office/word/2018/wordml/cex" xmlns:w16cid="http://schemas.microsoft.com/office/word/2016/wordml/cid" xmlns:w16="http://schemas.microsoft.com/office/word/2018/wordml" xmlns:w16du="http://schemas.microsoft.com/office/word/2023/wordml/word16du" xmlns:w16sdtdh="http://schemas.microsoft.com/office/word/2020/wordml/sdtdatahash" xmlns:w16sdtfl="http://schemas.microsoft.com/office/word/2024/wordml/sdtformatlock" xmlns:w16se="http://schemas.microsoft.com/office/word/2015/wordml/symex" xmlns:wpg="http://schemas.microsoft.com/office/word/2010/wordprocessingGroup" xmlns:wpi="http://schemas.microsoft.com/office/word/2010/wordprocessingInk" xmlns:wne="http://schemas.microsoft.com/office/word/2006/wordml" xmlns:wps="http://schemas.microsoft.com/office/word/2010/wordprocessingShape" mc:Ignorable="w14 w15 w16se w16cid w16 w16cex w16sdtdh w16sdtfl w16du wp14">
+  <w:p/>
+</w:hdr>
+</file>
+
+<file path=word/header2.xml><?xml version="1.0" encoding="utf-8"?>
+<w:hdr xmlns:wpc="http://schemas.microsoft.com/office/word/2010/wordprocessingCanvas" xmlns:cx="http://schemas.microsoft.com/office/drawing/2014/chartex" xmlns:cx1="http://schemas.microsoft.com/office/drawing/2015/9/8/chartex" xmlns:cx2="http://schemas.microsoft.com/office/drawing/2015/10/21/chartex" xmlns:cx3="http://schemas.microsoft.com/office/drawing/2016/5/9/chartex" xmlns:cx4="http://schemas.microsoft.com/office/drawing/2016/5/10/chartex" xmlns:cx5="http://schemas.microsoft.com/office/drawing/2016/5/11/chartex" xmlns:cx6="http://schemas.microsoft.com/office/drawing/2016/5/12/chartex" xmlns:cx7="http://schemas.microsoft.com/office/drawing/2016/5/13/chartex" xmlns:cx8="http://schemas.microsoft.com/office/drawing/2016/5/14/chartex" xmlns:mc="http://schemas.openxmlformats.org/markup-compatibility/2006" xmlns:aink="http://schemas.microsoft.com/office/drawing/2016/ink" xmlns:am3d="http://schemas.microsoft.com/office/drawing/2017/model3d" xmlns:o="urn:schemas-microsoft-com:office:office" xmlns:oel="http://schemas.microsoft.com/office/2019/extlst" xmlns:r="http://schemas.openxmlformats.org/officeDocument/2006/relationships" xmlns:m="http://schemas.openxmlformats.org/officeDocument/2006/math" xmlns:v="urn:schemas-microsoft-com:vml" xmlns:wp14="http://schemas.microsoft.com/office/word/2010/wordprocessingDrawing" xmlns:wp="http://schemas.openxmlformats.org/drawingml/2006/wordprocessingDrawing" xmlns:w10="urn:schemas-microsoft-com:office:word" xmlns:w="http://schemas.openxmlformats.org/wordprocessingml/2006/main" xmlns:w14="http://schemas.microsoft.com/office/word/2010/wordml" xmlns:w15="http://schemas.microsoft.com/office/word/2012/wordml" xmlns:w16cex="http://schemas.microsoft.com/office/word/2018/wordml/cex" xmlns:w16cid="http://schemas.microsoft.com/office/word/2016/wordml/cid" xmlns:w16="http://schemas.microsoft.com/office/word/2018/wordml" xmlns:w16du="http://schemas.microsoft.com/office/word/2023/wordml/word16du" xmlns:w16sdtdh="http://schemas.microsoft.com/office/word/2020/wordml/sdtdatahash" xmlns:w16sdtfl="http://schemas.microsoft.com/office/word/2024/wordml/sdtformatlock" xmlns:w16se="http://schemas.microsoft.com/office/word/2015/wordml/symex" xmlns:wpg="http://schemas.microsoft.com/office/word/2010/wordprocessingGroup" xmlns:wpi="http://schemas.microsoft.com/office/word/2010/wordprocessingInk" xmlns:wne="http://schemas.microsoft.com/office/word/2006/wordml" xmlns:wps="http://schemas.microsoft.com/office/word/2010/wordprocessingShape" mc:Ignorable="w14 w15 w16se w16cid w16 w16cex w16sdtdh w16sdtfl w16du wp14">
+  <w:p/>
+</w:hdr>
+</file>
+
+<file path=word/header3.xml><?xml version="1.0" encoding="utf-8"?>
+<w:hdr xmlns:wpc="http://schemas.microsoft.com/office/word/2010/wordprocessingCanvas" xmlns:cx="http://schemas.microsoft.com/office/drawing/2014/chartex" xmlns:cx1="http://schemas.microsoft.com/office/drawing/2015/9/8/chartex" xmlns:cx2="http://schemas.microsoft.com/office/drawing/2015/10/21/chartex" xmlns:cx3="http://schemas.microsoft.com/office/drawing/2016/5/9/chartex" xmlns:cx4="http://schemas.microsoft.com/office/drawing/2016/5/10/chartex" xmlns:cx5="http://schemas.microsoft.com/office/drawing/2016/5/11/chartex" xmlns:cx6="http://schemas.microsoft.com/office/drawing/2016/5/12/chartex" xmlns:cx7="http://schemas.microsoft.com/office/drawing/2016/5/13/chartex" xmlns:cx8="http://schemas.microsoft.com/office/drawing/2016/5/14/chartex" xmlns:mc="http://schemas.openxmlformats.org/markup-compatibility/2006" xmlns:aink="http://schemas.microsoft.com/office/drawing/2016/ink" xmlns:am3d="http://schemas.microsoft.com/office/drawing/2017/model3d" xmlns:o="urn:schemas-microsoft-com:office:office" xmlns:oel="http://schemas.microsoft.com/office/2019/extlst" xmlns:r="http://schemas.openxmlformats.org/officeDocument/2006/relationships" xmlns:m="http://schemas.openxmlformats.org/officeDocument/2006/math" xmlns:v="urn:schemas-microsoft-com:vml" xmlns:wp14="http://schemas.microsoft.com/office/word/2010/wordprocessingDrawing" xmlns:wp="http://schemas.openxmlformats.org/drawingml/2006/wordprocessingDrawing" xmlns:w10="urn:schemas-microsoft-com:office:word" xmlns:w="http://schemas.openxmlformats.org/wordprocessingml/2006/main" xmlns:w14="http://schemas.microsoft.com/office/word/2010/wordml" xmlns:w15="http://schemas.microsoft.com/office/word/2012/wordml" xmlns:w16cex="http://schemas.microsoft.com/office/word/2018/wordml/cex" xmlns:w16cid="http://schemas.microsoft.com/office/word/2016/wordml/cid" xmlns:w16="http://schemas.microsoft.com/office/word/2018/wordml" xmlns:w16du="http://schemas.microsoft.com/office/word/2023/wordml/word16du" xmlns:w16sdtdh="http://schemas.microsoft.com/office/word/2020/wordml/sdtdatahash" xmlns:w16sdtfl="http://schemas.microsoft.com/office/word/2024/wordml/sdtformatlock" xmlns:w16se="http://schemas.microsoft.com/office/word/2015/wordml/symex" xmlns:wpg="http://schemas.microsoft.com/office/word/2010/wordprocessingGroup" xmlns:wpi="http://schemas.microsoft.com/office/word/2010/wordprocessingInk" xmlns:wne="http://schemas.microsoft.com/office/word/2006/wordml" xmlns:wps="http://schemas.microsoft.com/office/word/2010/wordprocessingShape" mc:Ignorable="w14 w15 w16se w16cid w16 w16cex w16sdtdh w16sdtfl w16du wp14">
+  <w:p/>
 </w:hdr>
 </file>
 
 <file path=word/numbering.xml><?xml version="1.0" encoding="utf-8"?>
 <w:numbering xmlns:wpc="http://schemas.microsoft.com/office/word/2010/wordprocessingCanvas" xmlns:cx="http://schemas.microsoft.com/office/drawing/2014/chartex" xmlns:cx1="http://schemas.microsoft.com/office/drawing/2015/9/8/chartex" xmlns:cx2="http://schemas.microsoft.com/office/drawing/2015/10/21/chartex" xmlns:cx3="http://schemas.microsoft.com/office/drawing/2016/5/9/chartex" xmlns:cx4="http://schemas.microsoft.com/office/drawing/2016/5/10/chartex" xmlns:cx5="http://schemas.microsoft.com/office/drawing/2016/5/11/chartex" xmlns:cx6="http://schemas.microsoft.com/office/drawing/2016/5/12/chartex" xmlns:cx7="http://schemas.microsoft.com/office/drawing/2016/5/13/chartex" xmlns:cx8="http://schemas.microsoft.com/office/drawing/2016/5/14/chartex" xmlns:mc="http://schemas.openxmlformats.org/markup-compatibility/2006" xmlns:aink="http://schemas.microsoft.com/office/drawing/2016/ink" xmlns:am3d="http://schemas.microsoft.com/office/drawing/2017/model3d" xmlns:o="urn:schemas-microsoft-com:office:office" xmlns:oel="http://schemas.microsoft.com/office/2019/extlst" xmlns:r="http://schemas.openxmlformats.org/officeDocument/2006/relationships" xmlns:m="http://schemas.openxmlformats.org/officeDocument/2006/math" xmlns:v="urn:schemas-microsoft-com:vml" xmlns:wp14="http://schemas.microsoft.com/office/word/2010/wordprocessingDrawing" xmlns:wp="http://schemas.openxmlformats.org/drawingml/2006/wordprocessingDrawing" xmlns:w10="urn:schemas-microsoft-com:office:word" xmlns:w="http://schemas.openxmlformats.org/wordprocessingml/2006/main" xmlns:w14="http://schemas.microsoft.com/office/word/2010/wordml" xmlns:w15="http://schemas.microsoft.com/office/word/2012/wordml" xmlns:w16cex="http://schemas.microsoft.com/office/word/2018/wordml/cex" xmlns:w16cid="http://schemas.microsoft.com/office/word/2016/wordml/cid" xmlns:w16="http://schemas.microsoft.com/office/word/2018/wordml" xmlns:w16du="http://schemas.microsoft.com/office/word/2023/wordml/word16du" xmlns:w16sdtdh="http://schemas.microsoft.com/office/word/2020/wordml/sdtdatahash" xmlns:w16sdtfl="http://schemas.microsoft.com/office/word/2024/wordml/sdtformatlock" xmlns:w16se="http://schemas.microsoft.com/office/word/2015/wordml/symex" xmlns:wpg="http://schemas.microsoft.com/office/word/2010/wordprocessingGroup" xmlns:wpi="http://schemas.microsoft.com/office/word/2010/wordprocessingInk" xmlns:wne="http://schemas.microsoft.com/office/word/2006/wordml" xmlns:wps="http://schemas.microsoft.com/office/word/2010/wordprocessingShape" mc:Ignorable="w14 w15 w16se w16cid w16 w16cex w16sdtdh w16sdtfl w16du wp14">
   <w:abstractNum w:abstractNumId="0" w15:restartNumberingAfterBreak="0">
-    <w:nsid w:val="5BF33269"/>
+    <w:nsid w:val="1B2A40DD"/>
     <w:multiLevelType w:val="multilevel"/>
-    <w:tmpl w:val="238ADC9A"/>
+    <w:tmpl w:val="3710EAFE"/>
+    <w:lvl w:ilvl="0">
+      <w:start w:val="1"/>
+      <w:numFmt w:val="decimal"/>
+      <w:lvlText w:val="%1."/>
+      <w:lvlJc w:val="left"/>
+      <w:pPr>
+        <w:ind w:left="720" w:hanging="360"/>
+      </w:pPr>
+      <w:rPr>
+        <w:rFonts w:ascii="Times New Roman" w:eastAsia="Times New Roman" w:hAnsi="Times New Roman" w:cs="Times New Roman"/>
+      </w:rPr>
+    </w:lvl>
+    <w:lvl w:ilvl="1">
+      <w:numFmt w:val="decimal"/>
+      <w:lvlText w:val=""/>
+      <w:lvlJc w:val="left"/>
+      <w:pPr>
+        <w:ind w:left="0" w:firstLine="0"/>
+      </w:pPr>
+    </w:lvl>
+    <w:lvl w:ilvl="2">
+      <w:numFmt w:val="decimal"/>
+      <w:lvlText w:val=""/>
+      <w:lvlJc w:val="left"/>
+      <w:pPr>
+        <w:ind w:left="0" w:firstLine="0"/>
+      </w:pPr>
+    </w:lvl>
+    <w:lvl w:ilvl="3">
+      <w:numFmt w:val="decimal"/>
+      <w:lvlText w:val=""/>
+      <w:lvlJc w:val="left"/>
+      <w:pPr>
+        <w:ind w:left="0" w:firstLine="0"/>
+      </w:pPr>
+    </w:lvl>
+    <w:lvl w:ilvl="4">
+      <w:numFmt w:val="decimal"/>
+      <w:lvlText w:val=""/>
+      <w:lvlJc w:val="left"/>
+      <w:pPr>
+        <w:ind w:left="0" w:firstLine="0"/>
+      </w:pPr>
+    </w:lvl>
+    <w:lvl w:ilvl="5">
+      <w:numFmt w:val="decimal"/>
+      <w:lvlText w:val=""/>
+      <w:lvlJc w:val="left"/>
+      <w:pPr>
+        <w:ind w:left="0" w:firstLine="0"/>
+      </w:pPr>
+    </w:lvl>
+    <w:lvl w:ilvl="6">
+      <w:numFmt w:val="decimal"/>
+      <w:lvlText w:val=""/>
+      <w:lvlJc w:val="left"/>
+      <w:pPr>
+        <w:ind w:left="0" w:firstLine="0"/>
+      </w:pPr>
+    </w:lvl>
+    <w:lvl w:ilvl="7">
+      <w:numFmt w:val="decimal"/>
+      <w:lvlText w:val=""/>
+      <w:lvlJc w:val="left"/>
+      <w:pPr>
+        <w:ind w:left="0" w:firstLine="0"/>
+      </w:pPr>
+    </w:lvl>
+    <w:lvl w:ilvl="8">
+      <w:numFmt w:val="decimal"/>
+      <w:lvlText w:val=""/>
+      <w:lvlJc w:val="left"/>
+      <w:pPr>
+        <w:ind w:left="0" w:firstLine="0"/>
+      </w:pPr>
+    </w:lvl>
+  </w:abstractNum>
+  <w:abstractNum w:abstractNumId="1" w15:restartNumberingAfterBreak="0">
+    <w:nsid w:val="7AC41310"/>
+    <w:multiLevelType w:val="multilevel"/>
+    <w:tmpl w:val="E182C268"/>
     <w:lvl w:ilvl="0">
       <w:start w:val="1"/>
       <w:numFmt w:val="bullet"/>
@@ -11816,92 +11893,11 @@
       </w:pPr>
     </w:lvl>
   </w:abstractNum>
-  <w:abstractNum w:abstractNumId="1" w15:restartNumberingAfterBreak="0">
-    <w:nsid w:val="6C2A5E41"/>
-    <w:multiLevelType w:val="multilevel"/>
-    <w:tmpl w:val="2960CE6C"/>
-    <w:lvl w:ilvl="0">
-      <w:start w:val="1"/>
-      <w:numFmt w:val="decimal"/>
-      <w:lvlText w:val="%1."/>
-      <w:lvlJc w:val="left"/>
-      <w:pPr>
-        <w:ind w:left="720" w:hanging="360"/>
-      </w:pPr>
-      <w:rPr>
-        <w:rFonts w:ascii="Times New Roman" w:eastAsia="Times New Roman" w:hAnsi="Times New Roman" w:cs="Times New Roman"/>
-      </w:rPr>
-    </w:lvl>
-    <w:lvl w:ilvl="1">
-      <w:numFmt w:val="decimal"/>
-      <w:lvlText w:val=""/>
-      <w:lvlJc w:val="left"/>
-      <w:pPr>
-        <w:ind w:left="0" w:firstLine="0"/>
-      </w:pPr>
-    </w:lvl>
-    <w:lvl w:ilvl="2">
-      <w:numFmt w:val="decimal"/>
-      <w:lvlText w:val=""/>
-      <w:lvlJc w:val="left"/>
-      <w:pPr>
-        <w:ind w:left="0" w:firstLine="0"/>
-      </w:pPr>
-    </w:lvl>
-    <w:lvl w:ilvl="3">
-      <w:numFmt w:val="decimal"/>
-      <w:lvlText w:val=""/>
-      <w:lvlJc w:val="left"/>
-      <w:pPr>
-        <w:ind w:left="0" w:firstLine="0"/>
-      </w:pPr>
-    </w:lvl>
-    <w:lvl w:ilvl="4">
-      <w:numFmt w:val="decimal"/>
-      <w:lvlText w:val=""/>
-      <w:lvlJc w:val="left"/>
-      <w:pPr>
-        <w:ind w:left="0" w:firstLine="0"/>
-      </w:pPr>
-    </w:lvl>
-    <w:lvl w:ilvl="5">
-      <w:numFmt w:val="decimal"/>
-      <w:lvlText w:val=""/>
-      <w:lvlJc w:val="left"/>
-      <w:pPr>
-        <w:ind w:left="0" w:firstLine="0"/>
-      </w:pPr>
-    </w:lvl>
-    <w:lvl w:ilvl="6">
-      <w:numFmt w:val="decimal"/>
-      <w:lvlText w:val=""/>
-      <w:lvlJc w:val="left"/>
-      <w:pPr>
-        <w:ind w:left="0" w:firstLine="0"/>
-      </w:pPr>
-    </w:lvl>
-    <w:lvl w:ilvl="7">
-      <w:numFmt w:val="decimal"/>
-      <w:lvlText w:val=""/>
-      <w:lvlJc w:val="left"/>
-      <w:pPr>
-        <w:ind w:left="0" w:firstLine="0"/>
-      </w:pPr>
-    </w:lvl>
-    <w:lvl w:ilvl="8">
-      <w:numFmt w:val="decimal"/>
-      <w:lvlText w:val=""/>
-      <w:lvlJc w:val="left"/>
-      <w:pPr>
-        <w:ind w:left="0" w:firstLine="0"/>
-      </w:pPr>
-    </w:lvl>
-  </w:abstractNum>
-  <w:num w:numId="1" w16cid:durableId="824709946">
+  <w:num w:numId="1" w16cid:durableId="2135980831">
+    <w:abstractNumId w:val="0"/>
+  </w:num>
+  <w:num w:numId="2" w16cid:durableId="1946497099">
     <w:abstractNumId w:val="1"/>
-  </w:num>
-  <w:num w:numId="2" w16cid:durableId="1954360834">
-    <w:abstractNumId w:val="0"/>
   </w:num>
 </w:numbering>
 </file>
@@ -12342,7 +12338,7 @@
     </w:pPr>
     <w:rPr>
       <w:color w:val="2E74B5"/>
-      <w:sz w:val="26"/>
+      <w:sz w:val="28"/>
       <w:szCs w:val="26"/>
     </w:rPr>
   </w:style>
@@ -12365,6 +12361,7 @@
     </w:pPr>
     <w:rPr>
       <w:color w:val="1F4D78"/>
+      <w:sz w:val="28"/>
     </w:rPr>
   </w:style>
   <w:style w:type="paragraph" w:styleId="Heading4">
@@ -12838,7 +12835,7 @@
     <w:autoRedefine/>
     <w:uiPriority w:val="39"/>
     <w:unhideWhenUsed/>
-    <w:rsid w:val="0022277C"/>
+    <w:rsid w:val="008F5F71"/>
     <w:pPr>
       <w:spacing w:after="100"/>
     </w:pPr>
@@ -12850,7 +12847,7 @@
     <w:autoRedefine/>
     <w:uiPriority w:val="39"/>
     <w:unhideWhenUsed/>
-    <w:rsid w:val="0022277C"/>
+    <w:rsid w:val="008F5F71"/>
     <w:pPr>
       <w:spacing w:after="100"/>
       <w:ind w:left="240"/>
@@ -12863,7 +12860,7 @@
     <w:autoRedefine/>
     <w:uiPriority w:val="39"/>
     <w:unhideWhenUsed/>
-    <w:rsid w:val="0022277C"/>
+    <w:rsid w:val="008F5F71"/>
     <w:pPr>
       <w:spacing w:after="100"/>
       <w:ind w:left="480"/>

</xml_diff>

<commit_message>
Fix the ER diagram arrows and mark figures as the sample does
The crow's foot markers were sized in stroke-width units, so at the report's
line weight the three prongs merged into a solid arrowhead; they are now sized
in user space with thinner strokes. Marker orientation becomes
auto-start-reverse so the foot opens toward the entity at both ends of a
relationship rather than pointing away at the start.

Figure captions move beneath the image and put the number and title on one
line, following the sample. Italics are removed from the diagram labels, which
the earlier sweep could not reach because they live inside the images.

index_pages.py matched captions on the figure number alone, which also caught
body sentences such as "Figure 7 decomposes ..." and mis-recorded two pages; it
now matches the number together with the exact title.

Co-Authored-By: Claude Opus 5 (1M context) <noreply@anthropic.com>
Claude-Session: https://claude.ai/code/session_0196JS1u5qEW9XzS4ZPnTL2s
</commit_message>
<xml_diff>
--- a/docs/Kinyo_ProjectVI_Proposal.docx
+++ b/docs/Kinyo_ProjectVI_Proposal.docx
@@ -16,7 +16,7 @@
           <w:noProof/>
         </w:rPr>
         <w:drawing>
-          <wp:inline distT="0" distB="0" distL="0" distR="0" wp14:anchorId="22D0EBDD" wp14:editId="43F53E2C">
+          <wp:inline distT="0" distB="0" distL="0" distR="0" wp14:anchorId="3C885631" wp14:editId="555F6214">
             <wp:extent cx="1273012" cy="1114425"/>
             <wp:effectExtent l="0" t="0" r="0" b="0"/>
             <wp:docPr id="1" name="image1.png" descr="Purbanchal University logo"/>
@@ -252,7 +252,7 @@
         <w:spacing w:line="480" w:lineRule="auto"/>
         <w:jc w:val="center"/>
       </w:pPr>
-      <w:bookmarkStart w:id="0" w:name="_Toc239253540"/>
+      <w:bookmarkStart w:id="0" w:name="_Toc239255150"/>
       <w:r>
         <w:rPr>
           <w:b/>
@@ -316,7 +316,7 @@
         <w:spacing w:line="480" w:lineRule="auto"/>
         <w:jc w:val="center"/>
       </w:pPr>
-      <w:bookmarkStart w:id="1" w:name="_Toc239253541"/>
+      <w:bookmarkStart w:id="1" w:name="_Toc239255151"/>
       <w:r>
         <w:rPr>
           <w:b/>
@@ -352,7 +352,7 @@
       <w:r>
         <w:fldChar w:fldCharType="separate"/>
       </w:r>
-      <w:hyperlink w:anchor="_Toc239253540" w:history="1">
+      <w:hyperlink w:anchor="_Toc239255150" w:history="1">
         <w:r>
           <w:rPr>
             <w:rStyle w:val="Hyperlink"/>
@@ -380,7 +380,7 @@
             <w:noProof/>
             <w:webHidden/>
           </w:rPr>
-          <w:instrText xml:space="preserve"> PAGEREF _Toc239253540 \h </w:instrText>
+          <w:instrText xml:space="preserve"> PAGEREF _Toc239255150 \h </w:instrText>
         </w:r>
         <w:r>
           <w:rPr>
@@ -425,7 +425,7 @@
           <w14:ligatures w14:val="standardContextual"/>
         </w:rPr>
       </w:pPr>
-      <w:hyperlink w:anchor="_Toc239253541" w:history="1">
+      <w:hyperlink w:anchor="_Toc239255151" w:history="1">
         <w:r>
           <w:rPr>
             <w:rStyle w:val="Hyperlink"/>
@@ -454,7 +454,7 @@
             <w:noProof/>
             <w:webHidden/>
           </w:rPr>
-          <w:instrText xml:space="preserve"> PAGEREF _Toc239253541 \h </w:instrText>
+          <w:instrText xml:space="preserve"> PAGEREF _Toc239255151 \h </w:instrText>
         </w:r>
         <w:r>
           <w:rPr>
@@ -499,7 +499,7 @@
           <w14:ligatures w14:val="standardContextual"/>
         </w:rPr>
       </w:pPr>
-      <w:hyperlink w:anchor="_Toc239253542" w:history="1">
+      <w:hyperlink w:anchor="_Toc239255152" w:history="1">
         <w:r>
           <w:rPr>
             <w:rStyle w:val="Hyperlink"/>
@@ -528,7 +528,7 @@
             <w:noProof/>
             <w:webHidden/>
           </w:rPr>
-          <w:instrText xml:space="preserve"> PAGEREF _Toc239253542 \h </w:instrText>
+          <w:instrText xml:space="preserve"> PAGEREF _Toc239255152 \h </w:instrText>
         </w:r>
         <w:r>
           <w:rPr>
@@ -573,7 +573,7 @@
           <w14:ligatures w14:val="standardContextual"/>
         </w:rPr>
       </w:pPr>
-      <w:hyperlink w:anchor="_Toc239253543" w:history="1">
+      <w:hyperlink w:anchor="_Toc239255153" w:history="1">
         <w:r>
           <w:rPr>
             <w:rStyle w:val="Hyperlink"/>
@@ -602,7 +602,7 @@
             <w:noProof/>
             <w:webHidden/>
           </w:rPr>
-          <w:instrText xml:space="preserve"> PAGEREF _Toc239253543 \h </w:instrText>
+          <w:instrText xml:space="preserve"> PAGEREF _Toc239255153 \h </w:instrText>
         </w:r>
         <w:r>
           <w:rPr>
@@ -647,7 +647,7 @@
           <w14:ligatures w14:val="standardContextual"/>
         </w:rPr>
       </w:pPr>
-      <w:hyperlink w:anchor="_Toc239253544" w:history="1">
+      <w:hyperlink w:anchor="_Toc239255154" w:history="1">
         <w:r>
           <w:rPr>
             <w:rStyle w:val="Hyperlink"/>
@@ -676,7 +676,7 @@
             <w:noProof/>
             <w:webHidden/>
           </w:rPr>
-          <w:instrText xml:space="preserve"> PAGEREF _Toc239253544 \h </w:instrText>
+          <w:instrText xml:space="preserve"> PAGEREF _Toc239255154 \h </w:instrText>
         </w:r>
         <w:r>
           <w:rPr>
@@ -721,7 +721,7 @@
           <w14:ligatures w14:val="standardContextual"/>
         </w:rPr>
       </w:pPr>
-      <w:hyperlink w:anchor="_Toc239253545" w:history="1">
+      <w:hyperlink w:anchor="_Toc239255155" w:history="1">
         <w:r>
           <w:rPr>
             <w:rStyle w:val="Hyperlink"/>
@@ -750,7 +750,7 @@
             <w:noProof/>
             <w:webHidden/>
           </w:rPr>
-          <w:instrText xml:space="preserve"> PAGEREF _Toc239253545 \h </w:instrText>
+          <w:instrText xml:space="preserve"> PAGEREF _Toc239255155 \h </w:instrText>
         </w:r>
         <w:r>
           <w:rPr>
@@ -795,7 +795,7 @@
           <w14:ligatures w14:val="standardContextual"/>
         </w:rPr>
       </w:pPr>
-      <w:hyperlink w:anchor="_Toc239253546" w:history="1">
+      <w:hyperlink w:anchor="_Toc239255156" w:history="1">
         <w:r>
           <w:rPr>
             <w:rStyle w:val="Hyperlink"/>
@@ -824,7 +824,7 @@
             <w:noProof/>
             <w:webHidden/>
           </w:rPr>
-          <w:instrText xml:space="preserve"> PAGEREF _Toc239253546 \h </w:instrText>
+          <w:instrText xml:space="preserve"> PAGEREF _Toc239255156 \h </w:instrText>
         </w:r>
         <w:r>
           <w:rPr>
@@ -869,7 +869,7 @@
           <w14:ligatures w14:val="standardContextual"/>
         </w:rPr>
       </w:pPr>
-      <w:hyperlink w:anchor="_Toc239253547" w:history="1">
+      <w:hyperlink w:anchor="_Toc239255157" w:history="1">
         <w:r>
           <w:rPr>
             <w:rStyle w:val="Hyperlink"/>
@@ -898,7 +898,7 @@
             <w:noProof/>
             <w:webHidden/>
           </w:rPr>
-          <w:instrText xml:space="preserve"> PAGEREF _Toc239253547 \h </w:instrText>
+          <w:instrText xml:space="preserve"> PAGEREF _Toc239255157 \h </w:instrText>
         </w:r>
         <w:r>
           <w:rPr>
@@ -943,7 +943,7 @@
           <w14:ligatures w14:val="standardContextual"/>
         </w:rPr>
       </w:pPr>
-      <w:hyperlink w:anchor="_Toc239253548" w:history="1">
+      <w:hyperlink w:anchor="_Toc239255158" w:history="1">
         <w:r>
           <w:rPr>
             <w:rStyle w:val="Hyperlink"/>
@@ -973,7 +973,7 @@
             <w:noProof/>
             <w:webHidden/>
           </w:rPr>
-          <w:instrText xml:space="preserve"> PAGEREF _Toc239253548 \h </w:instrText>
+          <w:instrText xml:space="preserve"> PAGEREF _Toc239255158 \h </w:instrText>
         </w:r>
         <w:r>
           <w:rPr>
@@ -1018,7 +1018,7 @@
           <w14:ligatures w14:val="standardContextual"/>
         </w:rPr>
       </w:pPr>
-      <w:hyperlink w:anchor="_Toc239253549" w:history="1">
+      <w:hyperlink w:anchor="_Toc239255159" w:history="1">
         <w:r>
           <w:rPr>
             <w:rStyle w:val="Hyperlink"/>
@@ -1048,7 +1048,7 @@
             <w:noProof/>
             <w:webHidden/>
           </w:rPr>
-          <w:instrText xml:space="preserve"> PAGEREF _Toc239253549 \h </w:instrText>
+          <w:instrText xml:space="preserve"> PAGEREF _Toc239255159 \h </w:instrText>
         </w:r>
         <w:r>
           <w:rPr>
@@ -1093,7 +1093,7 @@
           <w14:ligatures w14:val="standardContextual"/>
         </w:rPr>
       </w:pPr>
-      <w:hyperlink w:anchor="_Toc239253550" w:history="1">
+      <w:hyperlink w:anchor="_Toc239255160" w:history="1">
         <w:r>
           <w:rPr>
             <w:rStyle w:val="Hyperlink"/>
@@ -1122,7 +1122,7 @@
             <w:noProof/>
             <w:webHidden/>
           </w:rPr>
-          <w:instrText xml:space="preserve"> PAGEREF _Toc239253550 \h </w:instrText>
+          <w:instrText xml:space="preserve"> PAGEREF _Toc239255160 \h </w:instrText>
         </w:r>
         <w:r>
           <w:rPr>
@@ -1167,7 +1167,7 @@
           <w14:ligatures w14:val="standardContextual"/>
         </w:rPr>
       </w:pPr>
-      <w:hyperlink w:anchor="_Toc239253551" w:history="1">
+      <w:hyperlink w:anchor="_Toc239255161" w:history="1">
         <w:r>
           <w:rPr>
             <w:rStyle w:val="Hyperlink"/>
@@ -1196,7 +1196,7 @@
             <w:noProof/>
             <w:webHidden/>
           </w:rPr>
-          <w:instrText xml:space="preserve"> PAGEREF _Toc239253551 \h </w:instrText>
+          <w:instrText xml:space="preserve"> PAGEREF _Toc239255161 \h </w:instrText>
         </w:r>
         <w:r>
           <w:rPr>
@@ -1241,7 +1241,7 @@
           <w14:ligatures w14:val="standardContextual"/>
         </w:rPr>
       </w:pPr>
-      <w:hyperlink w:anchor="_Toc239253552" w:history="1">
+      <w:hyperlink w:anchor="_Toc239255162" w:history="1">
         <w:r>
           <w:rPr>
             <w:rStyle w:val="Hyperlink"/>
@@ -1270,7 +1270,7 @@
             <w:noProof/>
             <w:webHidden/>
           </w:rPr>
-          <w:instrText xml:space="preserve"> PAGEREF _Toc239253552 \h </w:instrText>
+          <w:instrText xml:space="preserve"> PAGEREF _Toc239255162 \h </w:instrText>
         </w:r>
         <w:r>
           <w:rPr>
@@ -1315,7 +1315,7 @@
           <w14:ligatures w14:val="standardContextual"/>
         </w:rPr>
       </w:pPr>
-      <w:hyperlink w:anchor="_Toc239253553" w:history="1">
+      <w:hyperlink w:anchor="_Toc239255163" w:history="1">
         <w:r>
           <w:rPr>
             <w:rStyle w:val="Hyperlink"/>
@@ -1344,7 +1344,7 @@
             <w:noProof/>
             <w:webHidden/>
           </w:rPr>
-          <w:instrText xml:space="preserve"> PAGEREF _Toc239253553 \h </w:instrText>
+          <w:instrText xml:space="preserve"> PAGEREF _Toc239255163 \h </w:instrText>
         </w:r>
         <w:r>
           <w:rPr>
@@ -1389,7 +1389,7 @@
           <w14:ligatures w14:val="standardContextual"/>
         </w:rPr>
       </w:pPr>
-      <w:hyperlink w:anchor="_Toc239253554" w:history="1">
+      <w:hyperlink w:anchor="_Toc239255164" w:history="1">
         <w:r>
           <w:rPr>
             <w:rStyle w:val="Hyperlink"/>
@@ -1418,7 +1418,7 @@
             <w:noProof/>
             <w:webHidden/>
           </w:rPr>
-          <w:instrText xml:space="preserve"> PAGEREF _Toc239253554 \h </w:instrText>
+          <w:instrText xml:space="preserve"> PAGEREF _Toc239255164 \h </w:instrText>
         </w:r>
         <w:r>
           <w:rPr>
@@ -1463,7 +1463,7 @@
           <w14:ligatures w14:val="standardContextual"/>
         </w:rPr>
       </w:pPr>
-      <w:hyperlink w:anchor="_Toc239253555" w:history="1">
+      <w:hyperlink w:anchor="_Toc239255165" w:history="1">
         <w:r>
           <w:rPr>
             <w:rStyle w:val="Hyperlink"/>
@@ -1492,7 +1492,7 @@
             <w:noProof/>
             <w:webHidden/>
           </w:rPr>
-          <w:instrText xml:space="preserve"> PAGEREF _Toc239253555 \h </w:instrText>
+          <w:instrText xml:space="preserve"> PAGEREF _Toc239255165 \h </w:instrText>
         </w:r>
         <w:r>
           <w:rPr>
@@ -1537,7 +1537,7 @@
           <w14:ligatures w14:val="standardContextual"/>
         </w:rPr>
       </w:pPr>
-      <w:hyperlink w:anchor="_Toc239253556" w:history="1">
+      <w:hyperlink w:anchor="_Toc239255166" w:history="1">
         <w:r>
           <w:rPr>
             <w:rStyle w:val="Hyperlink"/>
@@ -1566,7 +1566,7 @@
             <w:noProof/>
             <w:webHidden/>
           </w:rPr>
-          <w:instrText xml:space="preserve"> PAGEREF _Toc239253556 \h </w:instrText>
+          <w:instrText xml:space="preserve"> PAGEREF _Toc239255166 \h </w:instrText>
         </w:r>
         <w:r>
           <w:rPr>
@@ -1611,7 +1611,7 @@
           <w14:ligatures w14:val="standardContextual"/>
         </w:rPr>
       </w:pPr>
-      <w:hyperlink w:anchor="_Toc239253557" w:history="1">
+      <w:hyperlink w:anchor="_Toc239255167" w:history="1">
         <w:r>
           <w:rPr>
             <w:rStyle w:val="Hyperlink"/>
@@ -1640,7 +1640,7 @@
             <w:noProof/>
             <w:webHidden/>
           </w:rPr>
-          <w:instrText xml:space="preserve"> PAGEREF _Toc239253557 \h </w:instrText>
+          <w:instrText xml:space="preserve"> PAGEREF _Toc239255167 \h </w:instrText>
         </w:r>
         <w:r>
           <w:rPr>
@@ -1685,7 +1685,7 @@
           <w14:ligatures w14:val="standardContextual"/>
         </w:rPr>
       </w:pPr>
-      <w:hyperlink w:anchor="_Toc239253558" w:history="1">
+      <w:hyperlink w:anchor="_Toc239255168" w:history="1">
         <w:r>
           <w:rPr>
             <w:rStyle w:val="Hyperlink"/>
@@ -1714,7 +1714,7 @@
             <w:noProof/>
             <w:webHidden/>
           </w:rPr>
-          <w:instrText xml:space="preserve"> PAGEREF _Toc239253558 \h </w:instrText>
+          <w:instrText xml:space="preserve"> PAGEREF _Toc239255168 \h </w:instrText>
         </w:r>
         <w:r>
           <w:rPr>
@@ -1759,7 +1759,7 @@
           <w14:ligatures w14:val="standardContextual"/>
         </w:rPr>
       </w:pPr>
-      <w:hyperlink w:anchor="_Toc239253559" w:history="1">
+      <w:hyperlink w:anchor="_Toc239255169" w:history="1">
         <w:r>
           <w:rPr>
             <w:rStyle w:val="Hyperlink"/>
@@ -1788,7 +1788,7 @@
             <w:noProof/>
             <w:webHidden/>
           </w:rPr>
-          <w:instrText xml:space="preserve"> PAGEREF _Toc239253559 \h </w:instrText>
+          <w:instrText xml:space="preserve"> PAGEREF _Toc239255169 \h </w:instrText>
         </w:r>
         <w:r>
           <w:rPr>
@@ -1833,7 +1833,7 @@
           <w14:ligatures w14:val="standardContextual"/>
         </w:rPr>
       </w:pPr>
-      <w:hyperlink w:anchor="_Toc239253560" w:history="1">
+      <w:hyperlink w:anchor="_Toc239255170" w:history="1">
         <w:r>
           <w:rPr>
             <w:rStyle w:val="Hyperlink"/>
@@ -1862,7 +1862,7 @@
             <w:noProof/>
             <w:webHidden/>
           </w:rPr>
-          <w:instrText xml:space="preserve"> PAGEREF _Toc239253560 \h </w:instrText>
+          <w:instrText xml:space="preserve"> PAGEREF _Toc239255170 \h </w:instrText>
         </w:r>
         <w:r>
           <w:rPr>
@@ -1907,7 +1907,7 @@
           <w14:ligatures w14:val="standardContextual"/>
         </w:rPr>
       </w:pPr>
-      <w:hyperlink w:anchor="_Toc239253561" w:history="1">
+      <w:hyperlink w:anchor="_Toc239255171" w:history="1">
         <w:r>
           <w:rPr>
             <w:rStyle w:val="Hyperlink"/>
@@ -1936,7 +1936,7 @@
             <w:noProof/>
             <w:webHidden/>
           </w:rPr>
-          <w:instrText xml:space="preserve"> PAGEREF _Toc239253561 \h </w:instrText>
+          <w:instrText xml:space="preserve"> PAGEREF _Toc239255171 \h </w:instrText>
         </w:r>
         <w:r>
           <w:rPr>
@@ -1981,7 +1981,7 @@
           <w14:ligatures w14:val="standardContextual"/>
         </w:rPr>
       </w:pPr>
-      <w:hyperlink w:anchor="_Toc239253562" w:history="1">
+      <w:hyperlink w:anchor="_Toc239255172" w:history="1">
         <w:r>
           <w:rPr>
             <w:rStyle w:val="Hyperlink"/>
@@ -2009,7 +2009,7 @@
             <w:noProof/>
             <w:webHidden/>
           </w:rPr>
-          <w:instrText xml:space="preserve"> PAGEREF _Toc239253562 \h </w:instrText>
+          <w:instrText xml:space="preserve"> PAGEREF _Toc239255172 \h </w:instrText>
         </w:r>
         <w:r>
           <w:rPr>
@@ -2054,7 +2054,7 @@
           <w14:ligatures w14:val="standardContextual"/>
         </w:rPr>
       </w:pPr>
-      <w:hyperlink w:anchor="_Toc239253563" w:history="1">
+      <w:hyperlink w:anchor="_Toc239255173" w:history="1">
         <w:r>
           <w:rPr>
             <w:rStyle w:val="Hyperlink"/>
@@ -2082,7 +2082,7 @@
             <w:noProof/>
             <w:webHidden/>
           </w:rPr>
-          <w:instrText xml:space="preserve"> PAGEREF _Toc239253563 \h </w:instrText>
+          <w:instrText xml:space="preserve"> PAGEREF _Toc239255173 \h </w:instrText>
         </w:r>
         <w:r>
           <w:rPr>
@@ -2127,7 +2127,7 @@
           <w14:ligatures w14:val="standardContextual"/>
         </w:rPr>
       </w:pPr>
-      <w:hyperlink w:anchor="_Toc239253564" w:history="1">
+      <w:hyperlink w:anchor="_Toc239255174" w:history="1">
         <w:r>
           <w:rPr>
             <w:rStyle w:val="Hyperlink"/>
@@ -2155,7 +2155,7 @@
             <w:noProof/>
             <w:webHidden/>
           </w:rPr>
-          <w:instrText xml:space="preserve"> PAGEREF _Toc239253564 \h </w:instrText>
+          <w:instrText xml:space="preserve"> PAGEREF _Toc239255174 \h </w:instrText>
         </w:r>
         <w:r>
           <w:rPr>
@@ -2200,7 +2200,7 @@
           <w14:ligatures w14:val="standardContextual"/>
         </w:rPr>
       </w:pPr>
-      <w:hyperlink w:anchor="_Toc239253565" w:history="1">
+      <w:hyperlink w:anchor="_Toc239255175" w:history="1">
         <w:r>
           <w:rPr>
             <w:rStyle w:val="Hyperlink"/>
@@ -2229,7 +2229,7 @@
             <w:noProof/>
             <w:webHidden/>
           </w:rPr>
-          <w:instrText xml:space="preserve"> PAGEREF _Toc239253565 \h </w:instrText>
+          <w:instrText xml:space="preserve"> PAGEREF _Toc239255175 \h </w:instrText>
         </w:r>
         <w:r>
           <w:rPr>
@@ -2274,7 +2274,7 @@
           <w14:ligatures w14:val="standardContextual"/>
         </w:rPr>
       </w:pPr>
-      <w:hyperlink w:anchor="_Toc239253566" w:history="1">
+      <w:hyperlink w:anchor="_Toc239255176" w:history="1">
         <w:r>
           <w:rPr>
             <w:rStyle w:val="Hyperlink"/>
@@ -2303,7 +2303,7 @@
             <w:noProof/>
             <w:webHidden/>
           </w:rPr>
-          <w:instrText xml:space="preserve"> PAGEREF _Toc239253566 \h </w:instrText>
+          <w:instrText xml:space="preserve"> PAGEREF _Toc239255176 \h </w:instrText>
         </w:r>
         <w:r>
           <w:rPr>
@@ -2348,7 +2348,7 @@
           <w14:ligatures w14:val="standardContextual"/>
         </w:rPr>
       </w:pPr>
-      <w:hyperlink w:anchor="_Toc239253567" w:history="1">
+      <w:hyperlink w:anchor="_Toc239255177" w:history="1">
         <w:r>
           <w:rPr>
             <w:rStyle w:val="Hyperlink"/>
@@ -2377,7 +2377,7 @@
             <w:noProof/>
             <w:webHidden/>
           </w:rPr>
-          <w:instrText xml:space="preserve"> PAGEREF _Toc239253567 \h </w:instrText>
+          <w:instrText xml:space="preserve"> PAGEREF _Toc239255177 \h </w:instrText>
         </w:r>
         <w:r>
           <w:rPr>
@@ -2397,7 +2397,7 @@
             <w:noProof/>
             <w:webHidden/>
           </w:rPr>
-          <w:t>28</w:t>
+          <w:t>27</w:t>
         </w:r>
         <w:r>
           <w:rPr>
@@ -2422,7 +2422,7 @@
           <w14:ligatures w14:val="standardContextual"/>
         </w:rPr>
       </w:pPr>
-      <w:hyperlink w:anchor="_Toc239253568" w:history="1">
+      <w:hyperlink w:anchor="_Toc239255178" w:history="1">
         <w:r>
           <w:rPr>
             <w:rStyle w:val="Hyperlink"/>
@@ -2452,7 +2452,7 @@
             <w:noProof/>
             <w:webHidden/>
           </w:rPr>
-          <w:instrText xml:space="preserve"> PAGEREF _Toc239253568 \h </w:instrText>
+          <w:instrText xml:space="preserve"> PAGEREF _Toc239255178 \h </w:instrText>
         </w:r>
         <w:r>
           <w:rPr>
@@ -2472,7 +2472,7 @@
             <w:noProof/>
             <w:webHidden/>
           </w:rPr>
-          <w:t>28</w:t>
+          <w:t>27</w:t>
         </w:r>
         <w:r>
           <w:rPr>
@@ -2497,7 +2497,7 @@
           <w14:ligatures w14:val="standardContextual"/>
         </w:rPr>
       </w:pPr>
-      <w:hyperlink w:anchor="_Toc239253569" w:history="1">
+      <w:hyperlink w:anchor="_Toc239255179" w:history="1">
         <w:r>
           <w:rPr>
             <w:rStyle w:val="Hyperlink"/>
@@ -2527,7 +2527,7 @@
             <w:noProof/>
             <w:webHidden/>
           </w:rPr>
-          <w:instrText xml:space="preserve"> PAGEREF _Toc239253569 \h </w:instrText>
+          <w:instrText xml:space="preserve"> PAGEREF _Toc239255179 \h </w:instrText>
         </w:r>
         <w:r>
           <w:rPr>
@@ -2572,7 +2572,7 @@
           <w14:ligatures w14:val="standardContextual"/>
         </w:rPr>
       </w:pPr>
-      <w:hyperlink w:anchor="_Toc239253570" w:history="1">
+      <w:hyperlink w:anchor="_Toc239255180" w:history="1">
         <w:r>
           <w:rPr>
             <w:rStyle w:val="Hyperlink"/>
@@ -2601,7 +2601,7 @@
             <w:noProof/>
             <w:webHidden/>
           </w:rPr>
-          <w:instrText xml:space="preserve"> PAGEREF _Toc239253570 \h </w:instrText>
+          <w:instrText xml:space="preserve"> PAGEREF _Toc239255180 \h </w:instrText>
         </w:r>
         <w:r>
           <w:rPr>
@@ -2621,7 +2621,7 @@
             <w:noProof/>
             <w:webHidden/>
           </w:rPr>
-          <w:t>30</w:t>
+          <w:t>29</w:t>
         </w:r>
         <w:r>
           <w:rPr>
@@ -2646,7 +2646,7 @@
           <w14:ligatures w14:val="standardContextual"/>
         </w:rPr>
       </w:pPr>
-      <w:hyperlink w:anchor="_Toc239253571" w:history="1">
+      <w:hyperlink w:anchor="_Toc239255181" w:history="1">
         <w:r>
           <w:rPr>
             <w:rStyle w:val="Hyperlink"/>
@@ -2675,7 +2675,7 @@
             <w:noProof/>
             <w:webHidden/>
           </w:rPr>
-          <w:instrText xml:space="preserve"> PAGEREF _Toc239253571 \h </w:instrText>
+          <w:instrText xml:space="preserve"> PAGEREF _Toc239255181 \h </w:instrText>
         </w:r>
         <w:r>
           <w:rPr>
@@ -2720,7 +2720,7 @@
           <w14:ligatures w14:val="standardContextual"/>
         </w:rPr>
       </w:pPr>
-      <w:hyperlink w:anchor="_Toc239253572" w:history="1">
+      <w:hyperlink w:anchor="_Toc239255182" w:history="1">
         <w:r>
           <w:rPr>
             <w:rStyle w:val="Hyperlink"/>
@@ -2749,7 +2749,7 @@
             <w:noProof/>
             <w:webHidden/>
           </w:rPr>
-          <w:instrText xml:space="preserve"> PAGEREF _Toc239253572 \h </w:instrText>
+          <w:instrText xml:space="preserve"> PAGEREF _Toc239255182 \h </w:instrText>
         </w:r>
         <w:r>
           <w:rPr>
@@ -2794,7 +2794,7 @@
           <w14:ligatures w14:val="standardContextual"/>
         </w:rPr>
       </w:pPr>
-      <w:hyperlink w:anchor="_Toc239253573" w:history="1">
+      <w:hyperlink w:anchor="_Toc239255183" w:history="1">
         <w:r>
           <w:rPr>
             <w:rStyle w:val="Hyperlink"/>
@@ -2823,7 +2823,7 @@
             <w:noProof/>
             <w:webHidden/>
           </w:rPr>
-          <w:instrText xml:space="preserve"> PAGEREF _Toc239253573 \h </w:instrText>
+          <w:instrText xml:space="preserve"> PAGEREF _Toc239255183 \h </w:instrText>
         </w:r>
         <w:r>
           <w:rPr>
@@ -2868,7 +2868,7 @@
           <w14:ligatures w14:val="standardContextual"/>
         </w:rPr>
       </w:pPr>
-      <w:hyperlink w:anchor="_Toc239253574" w:history="1">
+      <w:hyperlink w:anchor="_Toc239255184" w:history="1">
         <w:r>
           <w:rPr>
             <w:rStyle w:val="Hyperlink"/>
@@ -2897,7 +2897,7 @@
             <w:noProof/>
             <w:webHidden/>
           </w:rPr>
-          <w:instrText xml:space="preserve"> PAGEREF _Toc239253574 \h </w:instrText>
+          <w:instrText xml:space="preserve"> PAGEREF _Toc239255184 \h </w:instrText>
         </w:r>
         <w:r>
           <w:rPr>
@@ -2942,7 +2942,7 @@
           <w14:ligatures w14:val="standardContextual"/>
         </w:rPr>
       </w:pPr>
-      <w:hyperlink w:anchor="_Toc239253575" w:history="1">
+      <w:hyperlink w:anchor="_Toc239255185" w:history="1">
         <w:r>
           <w:rPr>
             <w:rStyle w:val="Hyperlink"/>
@@ -2971,7 +2971,7 @@
             <w:noProof/>
             <w:webHidden/>
           </w:rPr>
-          <w:instrText xml:space="preserve"> PAGEREF _Toc239253575 \h </w:instrText>
+          <w:instrText xml:space="preserve"> PAGEREF _Toc239255185 \h </w:instrText>
         </w:r>
         <w:r>
           <w:rPr>
@@ -3016,7 +3016,7 @@
           <w14:ligatures w14:val="standardContextual"/>
         </w:rPr>
       </w:pPr>
-      <w:hyperlink w:anchor="_Toc239253576" w:history="1">
+      <w:hyperlink w:anchor="_Toc239255186" w:history="1">
         <w:r>
           <w:rPr>
             <w:rStyle w:val="Hyperlink"/>
@@ -3045,7 +3045,7 @@
             <w:noProof/>
             <w:webHidden/>
           </w:rPr>
-          <w:instrText xml:space="preserve"> PAGEREF _Toc239253576 \h </w:instrText>
+          <w:instrText xml:space="preserve"> PAGEREF _Toc239255186 \h </w:instrText>
         </w:r>
         <w:r>
           <w:rPr>
@@ -3090,7 +3090,7 @@
           <w14:ligatures w14:val="standardContextual"/>
         </w:rPr>
       </w:pPr>
-      <w:hyperlink w:anchor="_Toc239253577" w:history="1">
+      <w:hyperlink w:anchor="_Toc239255187" w:history="1">
         <w:r>
           <w:rPr>
             <w:rStyle w:val="Hyperlink"/>
@@ -3119,7 +3119,7 @@
             <w:noProof/>
             <w:webHidden/>
           </w:rPr>
-          <w:instrText xml:space="preserve"> PAGEREF _Toc239253577 \h </w:instrText>
+          <w:instrText xml:space="preserve"> PAGEREF _Toc239255187 \h </w:instrText>
         </w:r>
         <w:r>
           <w:rPr>
@@ -3164,7 +3164,7 @@
           <w14:ligatures w14:val="standardContextual"/>
         </w:rPr>
       </w:pPr>
-      <w:hyperlink w:anchor="_Toc239253578" w:history="1">
+      <w:hyperlink w:anchor="_Toc239255188" w:history="1">
         <w:r>
           <w:rPr>
             <w:rStyle w:val="Hyperlink"/>
@@ -3193,7 +3193,7 @@
             <w:noProof/>
             <w:webHidden/>
           </w:rPr>
-          <w:instrText xml:space="preserve"> PAGEREF _Toc239253578 \h </w:instrText>
+          <w:instrText xml:space="preserve"> PAGEREF _Toc239255188 \h </w:instrText>
         </w:r>
         <w:r>
           <w:rPr>
@@ -3240,7 +3240,7 @@
         <w:spacing w:line="480" w:lineRule="auto"/>
         <w:jc w:val="center"/>
       </w:pPr>
-      <w:bookmarkStart w:id="2" w:name="_Toc239253542"/>
+      <w:bookmarkStart w:id="2" w:name="_Toc239255152"/>
       <w:r>
         <w:rPr>
           <w:b/>
@@ -3743,7 +3743,7 @@
         <w:spacing w:line="480" w:lineRule="auto"/>
         <w:jc w:val="center"/>
       </w:pPr>
-      <w:bookmarkStart w:id="3" w:name="_Toc239253543"/>
+      <w:bookmarkStart w:id="3" w:name="_Toc239255153"/>
       <w:r>
         <w:rPr>
           <w:b/>
@@ -5128,7 +5128,7 @@
         <w:spacing w:line="480" w:lineRule="auto"/>
         <w:jc w:val="center"/>
       </w:pPr>
-      <w:bookmarkStart w:id="4" w:name="_Toc239253544"/>
+      <w:bookmarkStart w:id="4" w:name="_Toc239255154"/>
       <w:r>
         <w:rPr>
           <w:b/>
@@ -5147,7 +5147,7 @@
         <w:keepNext/>
         <w:spacing w:line="480" w:lineRule="auto"/>
       </w:pPr>
-      <w:bookmarkStart w:id="5" w:name="_Toc239253545"/>
+      <w:bookmarkStart w:id="5" w:name="_Toc239255155"/>
       <w:r>
         <w:rPr>
           <w:b/>
@@ -5228,7 +5228,7 @@
         <w:keepNext/>
         <w:spacing w:line="480" w:lineRule="auto"/>
       </w:pPr>
-      <w:bookmarkStart w:id="6" w:name="_Toc239253546"/>
+      <w:bookmarkStart w:id="6" w:name="_Toc239255156"/>
       <w:r>
         <w:rPr>
           <w:b/>
@@ -5298,7 +5298,7 @@
         <w:keepNext/>
         <w:spacing w:line="480" w:lineRule="auto"/>
       </w:pPr>
-      <w:bookmarkStart w:id="7" w:name="_Toc239253547"/>
+      <w:bookmarkStart w:id="7" w:name="_Toc239255157"/>
       <w:r>
         <w:rPr>
           <w:b/>
@@ -5316,7 +5316,7 @@
         <w:keepNext/>
         <w:spacing w:line="480" w:lineRule="auto"/>
       </w:pPr>
-      <w:bookmarkStart w:id="8" w:name="_Toc239253548"/>
+      <w:bookmarkStart w:id="8" w:name="_Toc239255158"/>
       <w:r>
         <w:rPr>
           <w:b/>
@@ -5345,7 +5345,7 @@
         <w:keepNext/>
         <w:spacing w:line="480" w:lineRule="auto"/>
       </w:pPr>
-      <w:bookmarkStart w:id="9" w:name="_Toc239253549"/>
+      <w:bookmarkStart w:id="9" w:name="_Toc239255159"/>
       <w:r>
         <w:rPr>
           <w:b/>
@@ -5471,7 +5471,7 @@
         <w:keepNext/>
         <w:spacing w:line="480" w:lineRule="auto"/>
       </w:pPr>
-      <w:bookmarkStart w:id="10" w:name="_Toc239253550"/>
+      <w:bookmarkStart w:id="10" w:name="_Toc239255160"/>
       <w:r>
         <w:rPr>
           <w:b/>
@@ -5633,7 +5633,7 @@
         <w:spacing w:line="480" w:lineRule="auto"/>
         <w:jc w:val="center"/>
       </w:pPr>
-      <w:bookmarkStart w:id="11" w:name="_Toc239253551"/>
+      <w:bookmarkStart w:id="11" w:name="_Toc239255161"/>
       <w:r>
         <w:rPr>
           <w:b/>
@@ -5652,7 +5652,7 @@
         <w:keepNext/>
         <w:spacing w:line="480" w:lineRule="auto"/>
       </w:pPr>
-      <w:bookmarkStart w:id="12" w:name="_Toc239253552"/>
+      <w:bookmarkStart w:id="12" w:name="_Toc239255162"/>
       <w:r>
         <w:rPr>
           <w:b/>
@@ -5767,7 +5767,7 @@
         <w:keepNext/>
         <w:spacing w:line="480" w:lineRule="auto"/>
       </w:pPr>
-      <w:bookmarkStart w:id="13" w:name="_Toc239253553"/>
+      <w:bookmarkStart w:id="13" w:name="_Toc239255163"/>
       <w:r>
         <w:rPr>
           <w:b/>
@@ -6391,7 +6391,7 @@
         <w:keepNext/>
         <w:spacing w:line="480" w:lineRule="auto"/>
       </w:pPr>
-      <w:bookmarkStart w:id="14" w:name="_Toc239253554"/>
+      <w:bookmarkStart w:id="14" w:name="_Toc239255164"/>
       <w:r>
         <w:rPr>
           <w:b/>
@@ -6547,7 +6547,7 @@
         <w:keepNext/>
         <w:spacing w:line="480" w:lineRule="auto"/>
       </w:pPr>
-      <w:bookmarkStart w:id="15" w:name="_Toc239253555"/>
+      <w:bookmarkStart w:id="15" w:name="_Toc239255165"/>
       <w:r>
         <w:rPr>
           <w:b/>
@@ -7445,7 +7445,7 @@
         <w:keepNext/>
         <w:spacing w:line="480" w:lineRule="auto"/>
       </w:pPr>
-      <w:bookmarkStart w:id="16" w:name="_Toc239253556"/>
+      <w:bookmarkStart w:id="16" w:name="_Toc239255166"/>
       <w:r>
         <w:rPr>
           <w:b/>
@@ -7926,7 +7926,7 @@
         <w:spacing w:line="480" w:lineRule="auto"/>
         <w:jc w:val="center"/>
       </w:pPr>
-      <w:bookmarkStart w:id="17" w:name="_Toc239253557"/>
+      <w:bookmarkStart w:id="17" w:name="_Toc239255167"/>
       <w:r>
         <w:rPr>
           <w:b/>
@@ -7945,7 +7945,7 @@
         <w:keepNext/>
         <w:spacing w:line="480" w:lineRule="auto"/>
       </w:pPr>
-      <w:bookmarkStart w:id="18" w:name="_Toc239253558"/>
+      <w:bookmarkStart w:id="18" w:name="_Toc239255168"/>
       <w:r>
         <w:rPr>
           <w:b/>
@@ -7999,36 +7999,15 @@
     <w:p>
       <w:pPr>
         <w:keepNext/>
-        <w:spacing w:line="480" w:lineRule="auto"/>
-      </w:pPr>
-      <w:r>
-        <w:rPr>
-          <w:b/>
-          <w:color w:val="000000"/>
+        <w:jc w:val="center"/>
+      </w:pPr>
+      <w:r>
+        <w:rPr>
+          <w:noProof/>
         </w:rPr>
         <w:lastRenderedPageBreak/>
-        <w:t>Figure 1</w:t>
-      </w:r>
-    </w:p>
-    <w:p>
-      <w:pPr>
-        <w:keepNext/>
-        <w:spacing w:line="480" w:lineRule="auto"/>
-      </w:pPr>
-      <w:r>
-        <w:rPr>
-          <w:color w:val="000000"/>
-        </w:rPr>
-        <w:t>SDLC Model: Iterative and Incremental Development</w:t>
-      </w:r>
-    </w:p>
-    <w:p>
-      <w:r>
-        <w:rPr>
-          <w:noProof/>
-        </w:rPr>
         <w:drawing>
-          <wp:inline distT="0" distB="0" distL="0" distR="0" wp14:anchorId="325F035D" wp14:editId="0210D769">
+          <wp:inline distT="0" distB="0" distL="0" distR="0" wp14:anchorId="47426FA8" wp14:editId="5AC26A6E">
             <wp:extent cx="5577840" cy="3434103"/>
             <wp:effectExtent l="0" t="0" r="0" b="0"/>
             <wp:docPr id="2" name="Picture 2"/>
@@ -8064,6 +8043,25 @@
         </w:drawing>
       </w:r>
     </w:p>
+    <w:p>
+      <w:pPr>
+        <w:spacing w:after="120"/>
+        <w:jc w:val="center"/>
+      </w:pPr>
+      <w:r>
+        <w:rPr>
+          <w:b/>
+          <w:color w:val="000000"/>
+        </w:rPr>
+        <w:t xml:space="preserve">Figure 1 </w:t>
+      </w:r>
+      <w:r>
+        <w:rPr>
+          <w:color w:val="000000"/>
+        </w:rPr>
+        <w:t>SDLC Model: Iterative and Incremental Development</w:t>
+      </w:r>
+    </w:p>
     <w:p/>
     <w:p>
       <w:pPr>
@@ -8071,7 +8069,7 @@
         <w:keepNext/>
         <w:spacing w:line="480" w:lineRule="auto"/>
       </w:pPr>
-      <w:bookmarkStart w:id="19" w:name="_Toc239253559"/>
+      <w:bookmarkStart w:id="19" w:name="_Toc239255169"/>
       <w:r>
         <w:rPr>
           <w:b/>
@@ -8235,37 +8233,32 @@
     <w:p>
       <w:pPr>
         <w:keepNext/>
-        <w:spacing w:line="480" w:lineRule="auto"/>
+        <w:jc w:val="center"/>
+      </w:pPr>
+      <w:r>
+        <w:rPr>
+          <w:color w:val="000000"/>
+        </w:rPr>
+        <w:t>[ Insert Gantt chart here ]</w:t>
+      </w:r>
+    </w:p>
+    <w:p>
+      <w:pPr>
+        <w:spacing w:after="120"/>
+        <w:jc w:val="center"/>
       </w:pPr>
       <w:r>
         <w:rPr>
           <w:b/>
           <w:color w:val="000000"/>
         </w:rPr>
-        <w:t>Figure 2</w:t>
-      </w:r>
-    </w:p>
-    <w:p>
-      <w:pPr>
-        <w:keepNext/>
-        <w:spacing w:line="480" w:lineRule="auto"/>
-      </w:pPr>
+        <w:t xml:space="preserve">Figure 2 </w:t>
+      </w:r>
       <w:r>
         <w:rPr>
           <w:color w:val="000000"/>
         </w:rPr>
         <w:t>Gantt Chart</w:t>
-      </w:r>
-    </w:p>
-    <w:p>
-      <w:pPr>
-        <w:jc w:val="center"/>
-      </w:pPr>
-      <w:r>
-        <w:rPr>
-          <w:color w:val="000000"/>
-        </w:rPr>
-        <w:t>[ Insert Gantt chart here ]</w:t>
       </w:r>
     </w:p>
     <w:p/>
@@ -8275,7 +8268,7 @@
         <w:keepNext/>
         <w:spacing w:line="480" w:lineRule="auto"/>
       </w:pPr>
-      <w:bookmarkStart w:id="20" w:name="_Toc239253560"/>
+      <w:bookmarkStart w:id="20" w:name="_Toc239255170"/>
       <w:r>
         <w:rPr>
           <w:b/>
@@ -8323,14 +8316,14 @@
         <w:rPr>
           <w:color w:val="000000"/>
         </w:rPr>
-        <w:t xml:space="preserve">The application tier is a FastAPI service that exposes a versioned REST interface. It is organised into service modules for authentication and access control, tenant and domain management, catalogue and inventory, cart and orders, and reporting. Every module reaches the database </w:t>
+        <w:t xml:space="preserve">The application tier is a FastAPI service that exposes a versioned REST interface. It is organised into service modules for authentication and access control, tenant and domain management, catalogue and inventory, cart and orders, and reporting. Every module reaches the database through a single data-access layer built on the SQLAlchemy ORM. That layer holds the tenancy logic: the tenant established for the request is stored in a request-scoped context, and every query </w:t>
       </w:r>
       <w:r>
         <w:rPr>
           <w:color w:val="000000"/>
         </w:rPr>
         <w:lastRenderedPageBreak/>
-        <w:t>through a single data-access layer built on the SQLAlchemy ORM. That layer holds the tenancy logic: the tenant established for the request is stored in a request-scoped context, and every query against a tenant-owned table is filtered by it, so that isolation does not depend on each individual query being written correctly.</w:t>
+        <w:t>against a tenant-owned table is filtered by it, so that isolation does not depend on each individual query being written correctly.</w:t>
       </w:r>
     </w:p>
     <w:p>
@@ -8358,36 +8351,15 @@
     <w:p>
       <w:pPr>
         <w:keepNext/>
-        <w:spacing w:line="480" w:lineRule="auto"/>
-      </w:pPr>
-      <w:r>
-        <w:rPr>
-          <w:b/>
-          <w:color w:val="000000"/>
+        <w:jc w:val="center"/>
+      </w:pPr>
+      <w:r>
+        <w:rPr>
+          <w:noProof/>
         </w:rPr>
         <w:lastRenderedPageBreak/>
-        <w:t>Figure 3</w:t>
-      </w:r>
-    </w:p>
-    <w:p>
-      <w:pPr>
-        <w:keepNext/>
-        <w:spacing w:line="480" w:lineRule="auto"/>
-      </w:pPr>
-      <w:r>
-        <w:rPr>
-          <w:color w:val="000000"/>
-        </w:rPr>
-        <w:t>System Architecture of the Kinyo Platform</w:t>
-      </w:r>
-    </w:p>
-    <w:p>
-      <w:r>
-        <w:rPr>
-          <w:noProof/>
-        </w:rPr>
         <w:drawing>
-          <wp:inline distT="0" distB="0" distL="0" distR="0" wp14:anchorId="5B249BB4" wp14:editId="267629F4">
+          <wp:inline distT="0" distB="0" distL="0" distR="0" wp14:anchorId="6F79D51A" wp14:editId="2FF129CD">
             <wp:extent cx="5577840" cy="4709434"/>
             <wp:effectExtent l="0" t="0" r="0" b="0"/>
             <wp:docPr id="3" name="Picture 3"/>
@@ -8423,6 +8395,25 @@
         </w:drawing>
       </w:r>
     </w:p>
+    <w:p>
+      <w:pPr>
+        <w:spacing w:after="120"/>
+        <w:jc w:val="center"/>
+      </w:pPr>
+      <w:r>
+        <w:rPr>
+          <w:b/>
+          <w:color w:val="000000"/>
+        </w:rPr>
+        <w:t xml:space="preserve">Figure 3 </w:t>
+      </w:r>
+      <w:r>
+        <w:rPr>
+          <w:color w:val="000000"/>
+        </w:rPr>
+        <w:t>System Architecture of the Kinyo Platform</w:t>
+      </w:r>
+    </w:p>
     <w:p/>
     <w:p>
       <w:pPr>
@@ -8430,7 +8421,7 @@
         <w:keepNext/>
         <w:spacing w:line="480" w:lineRule="auto"/>
       </w:pPr>
-      <w:bookmarkStart w:id="21" w:name="_Toc239253561"/>
+      <w:bookmarkStart w:id="21" w:name="_Toc239255171"/>
       <w:r>
         <w:rPr>
           <w:b/>
@@ -8459,7 +8450,7 @@
         <w:keepNext/>
         <w:spacing w:line="480" w:lineRule="auto"/>
       </w:pPr>
-      <w:bookmarkStart w:id="22" w:name="_Toc239253562"/>
+      <w:bookmarkStart w:id="22" w:name="_Toc239255172"/>
       <w:r>
         <w:rPr>
           <w:b/>
@@ -8489,31 +8480,31 @@
         <w:rPr>
           <w:color w:val="000000"/>
         </w:rPr>
+        <w:t>1.</w:t>
+      </w:r>
+      <w:r>
+        <w:rPr>
+          <w:color w:val="000000"/>
+        </w:rPr>
+        <w:tab/>
+      </w:r>
+      <w:r>
+        <w:rPr>
+          <w:color w:val="000000"/>
+        </w:rPr>
+        <w:t>Read the Host header of the incoming request and convert it to lower case, removing any port suffix.</w:t>
+      </w:r>
+    </w:p>
+    <w:p>
+      <w:pPr>
+        <w:spacing w:line="480" w:lineRule="auto"/>
+        <w:ind w:left="720" w:hanging="360"/>
+      </w:pPr>
+      <w:r>
+        <w:rPr>
+          <w:color w:val="000000"/>
+        </w:rPr>
         <w:lastRenderedPageBreak/>
-        <w:t>1.</w:t>
-      </w:r>
-      <w:r>
-        <w:rPr>
-          <w:color w:val="000000"/>
-        </w:rPr>
-        <w:tab/>
-      </w:r>
-      <w:r>
-        <w:rPr>
-          <w:color w:val="000000"/>
-        </w:rPr>
-        <w:t>Read the Host header of the incoming request and convert it to lower case, removing any port suffix.</w:t>
-      </w:r>
-    </w:p>
-    <w:p>
-      <w:pPr>
-        <w:spacing w:line="480" w:lineRule="auto"/>
-        <w:ind w:left="720" w:hanging="360"/>
-      </w:pPr>
-      <w:r>
-        <w:rPr>
-          <w:color w:val="000000"/>
-        </w:rPr>
         <w:t>2.</w:t>
       </w:r>
       <w:r>
@@ -8630,7 +8621,7 @@
         <w:keepNext/>
         <w:spacing w:line="480" w:lineRule="auto"/>
       </w:pPr>
-      <w:bookmarkStart w:id="23" w:name="_Toc239253563"/>
+      <w:bookmarkStart w:id="23" w:name="_Toc239255173"/>
       <w:r>
         <w:rPr>
           <w:b/>
@@ -8698,31 +8689,31 @@
         <w:rPr>
           <w:color w:val="000000"/>
         </w:rPr>
+        <w:t>3.</w:t>
+      </w:r>
+      <w:r>
+        <w:rPr>
+          <w:color w:val="000000"/>
+        </w:rPr>
+        <w:tab/>
+      </w:r>
+      <w:r>
+        <w:rPr>
+          <w:color w:val="000000"/>
+        </w:rPr>
+        <w:t>If a discount code has been supplied, retrieve the discount belonging to the current tenant with that code; if it does not exist, has expired, or its minimum order value exceeds the subtotal, reject the code and set the discount amount to zero.</w:t>
+      </w:r>
+    </w:p>
+    <w:p>
+      <w:pPr>
+        <w:spacing w:line="480" w:lineRule="auto"/>
+        <w:ind w:left="720" w:hanging="360"/>
+      </w:pPr>
+      <w:r>
+        <w:rPr>
+          <w:color w:val="000000"/>
+        </w:rPr>
         <w:lastRenderedPageBreak/>
-        <w:t>3.</w:t>
-      </w:r>
-      <w:r>
-        <w:rPr>
-          <w:color w:val="000000"/>
-        </w:rPr>
-        <w:tab/>
-      </w:r>
-      <w:r>
-        <w:rPr>
-          <w:color w:val="000000"/>
-        </w:rPr>
-        <w:t>If a discount code has been supplied, retrieve the discount belonging to the current tenant with that code; if it does not exist, has expired, or its minimum order value exceeds the subtotal, reject the code and set the discount amount to zero.</w:t>
-      </w:r>
-    </w:p>
-    <w:p>
-      <w:pPr>
-        <w:spacing w:line="480" w:lineRule="auto"/>
-        <w:ind w:left="720" w:hanging="360"/>
-      </w:pPr>
-      <w:r>
-        <w:rPr>
-          <w:color w:val="000000"/>
-        </w:rPr>
         <w:t>4.</w:t>
       </w:r>
       <w:r>
@@ -8801,7 +8792,7 @@
         <w:keepNext/>
         <w:spacing w:line="480" w:lineRule="auto"/>
       </w:pPr>
-      <w:bookmarkStart w:id="24" w:name="_Toc239253564"/>
+      <w:bookmarkStart w:id="24" w:name="_Toc239255174"/>
       <w:r>
         <w:rPr>
           <w:b/>
@@ -8931,26 +8922,26 @@
         <w:rPr>
           <w:color w:val="000000"/>
         </w:rPr>
+        <w:t>6.</w:t>
+      </w:r>
+      <w:r>
+        <w:rPr>
+          <w:color w:val="000000"/>
+        </w:rPr>
+        <w:tab/>
+        <w:t>Create the order record with a generated order number, the resolved tenant, the customer, the delivery address, the computed totals, a status of pending and a payment method of cash on delivery.</w:t>
+      </w:r>
+    </w:p>
+    <w:p>
+      <w:pPr>
+        <w:spacing w:line="480" w:lineRule="auto"/>
+        <w:ind w:left="720" w:hanging="360"/>
+      </w:pPr>
+      <w:r>
+        <w:rPr>
+          <w:color w:val="000000"/>
+        </w:rPr>
         <w:lastRenderedPageBreak/>
-        <w:t>6.</w:t>
-      </w:r>
-      <w:r>
-        <w:rPr>
-          <w:color w:val="000000"/>
-        </w:rPr>
-        <w:tab/>
-        <w:t>Create the order record with a generated order number, the resolved tenant, the customer, the delivery address, the computed totals, a status of pending and a payment method of cash on delivery.</w:t>
-      </w:r>
-    </w:p>
-    <w:p>
-      <w:pPr>
-        <w:spacing w:line="480" w:lineRule="auto"/>
-        <w:ind w:left="720" w:hanging="360"/>
-      </w:pPr>
-      <w:r>
-        <w:rPr>
-          <w:color w:val="000000"/>
-        </w:rPr>
         <w:t>7.</w:t>
       </w:r>
       <w:r>
@@ -9010,7 +9001,7 @@
         <w:keepNext/>
         <w:spacing w:line="480" w:lineRule="auto"/>
       </w:pPr>
-      <w:bookmarkStart w:id="25" w:name="_Toc239253565"/>
+      <w:bookmarkStart w:id="25" w:name="_Toc239255175"/>
       <w:r>
         <w:rPr>
           <w:b/>
@@ -9036,36 +9027,15 @@
     <w:p>
       <w:pPr>
         <w:keepNext/>
-        <w:spacing w:line="480" w:lineRule="auto"/>
-      </w:pPr>
-      <w:r>
-        <w:rPr>
-          <w:b/>
-          <w:color w:val="000000"/>
+        <w:jc w:val="center"/>
+      </w:pPr>
+      <w:r>
+        <w:rPr>
+          <w:noProof/>
         </w:rPr>
         <w:lastRenderedPageBreak/>
-        <w:t>Figure 4</w:t>
-      </w:r>
-    </w:p>
-    <w:p>
-      <w:pPr>
-        <w:keepNext/>
-        <w:spacing w:line="480" w:lineRule="auto"/>
-      </w:pPr>
-      <w:r>
-        <w:rPr>
-          <w:color w:val="000000"/>
-        </w:rPr>
-        <w:t>System Flowchart: Storefront Resolution to Order Confirmation</w:t>
-      </w:r>
-    </w:p>
-    <w:p>
-      <w:r>
-        <w:rPr>
-          <w:noProof/>
-        </w:rPr>
         <w:drawing>
-          <wp:inline distT="0" distB="0" distL="0" distR="0" wp14:anchorId="1E342CCA" wp14:editId="52A70F3C">
+          <wp:inline distT="0" distB="0" distL="0" distR="0" wp14:anchorId="51DD71EB" wp14:editId="3768130C">
             <wp:extent cx="5394960" cy="6491029"/>
             <wp:effectExtent l="0" t="0" r="0" b="0"/>
             <wp:docPr id="4" name="Picture 4"/>
@@ -9103,6 +9073,25 @@
     </w:p>
     <w:p>
       <w:pPr>
+        <w:spacing w:after="120"/>
+        <w:jc w:val="center"/>
+      </w:pPr>
+      <w:r>
+        <w:rPr>
+          <w:b/>
+          <w:color w:val="000000"/>
+        </w:rPr>
+        <w:t xml:space="preserve">Figure 4 </w:t>
+      </w:r>
+      <w:r>
+        <w:rPr>
+          <w:color w:val="000000"/>
+        </w:rPr>
+        <w:t>System Flowchart: Storefront Resolution to Order Confirmation</w:t>
+      </w:r>
+    </w:p>
+    <w:p>
+      <w:pPr>
         <w:spacing w:line="480" w:lineRule="auto"/>
       </w:pPr>
       <w:r>
@@ -9121,14 +9110,14 @@
         <w:rPr>
           <w:color w:val="000000"/>
         </w:rPr>
+        <w:t xml:space="preserve">Stage A resolves the store and serves the catalogue. The middleware extracts the Host header and applies the tenant resolution algorithm of Section 3.4.1; if no active store matches, the visitor is </w:t>
+      </w:r>
+      <w:r>
+        <w:rPr>
+          <w:color w:val="000000"/>
+        </w:rPr>
         <w:lastRenderedPageBreak/>
-        <w:t>Stage A resolves the store and serves the catalogue. The middleware extracts the Host header and applies the tenant resolution algorithm of Section 3.4.1; if no active store matches, the visitor is shown a store-not-found page and the flow ends. Otherwise the tenant context and theme are loaded and the catalogue for that tenant is rendered. When the customer adds an item, the system checks that the chosen variant is in stock before creating or updating the cart line, and the customer may continue browsing o</w:t>
-      </w:r>
-      <w:r>
-        <w:rPr>
-          <w:color w:val="000000"/>
-        </w:rPr>
-        <w:t>r proceed to checkout.</w:t>
+        <w:t>shown a store-not-found page and the flow ends. Otherwise the tenant context and theme are loaded and the catalogue for that tenant is rendered. When the customer adds an item, the system checks that the chosen variant is in stock before creating or updating the cart line, and the customer may continue browsing or proceed to checkout.</w:t>
       </w:r>
     </w:p>
     <w:p>
@@ -9159,7 +9148,7 @@
         <w:keepNext/>
         <w:spacing w:line="480" w:lineRule="auto"/>
       </w:pPr>
-      <w:bookmarkStart w:id="26" w:name="_Toc239253566"/>
+      <w:bookmarkStart w:id="26" w:name="_Toc239255176"/>
       <w:r>
         <w:rPr>
           <w:b/>
@@ -9185,48 +9174,21 @@
         <w:rPr>
           <w:color w:val="000000"/>
         </w:rPr>
-        <w:t xml:space="preserve">ss and fulfil orders. The registered customer creates a customer account, browses and searches the storefront, manages a shopping cart, places orders </w:t>
-      </w:r>
-      <w:r>
-        <w:rPr>
-          <w:color w:val="000000"/>
+        <w:t>ss and fulfil orders. The registered customer creates a customer account, browses and searches the storefront, manages a shopping cart, places orders and tracks their status. The guest visitor may browse, manage a cart and place an order without creating an account.</w:t>
+      </w:r>
+    </w:p>
+    <w:p>
+      <w:pPr>
+        <w:keepNext/>
+        <w:jc w:val="center"/>
+      </w:pPr>
+      <w:r>
+        <w:rPr>
+          <w:noProof/>
         </w:rPr>
         <w:lastRenderedPageBreak/>
-        <w:t>and tracks their status. The guest visitor may browse, manage a cart and place an order without creating an account.</w:t>
-      </w:r>
-    </w:p>
-    <w:p>
-      <w:pPr>
-        <w:keepNext/>
-        <w:spacing w:line="480" w:lineRule="auto"/>
-      </w:pPr>
-      <w:r>
-        <w:rPr>
-          <w:b/>
-          <w:color w:val="000000"/>
-        </w:rPr>
-        <w:t>Figure 5</w:t>
-      </w:r>
-    </w:p>
-    <w:p>
-      <w:pPr>
-        <w:keepNext/>
-        <w:spacing w:line="480" w:lineRule="auto"/>
-      </w:pPr>
-      <w:r>
-        <w:rPr>
-          <w:color w:val="000000"/>
-        </w:rPr>
-        <w:t>Use Case Diagram</w:t>
-      </w:r>
-    </w:p>
-    <w:p>
-      <w:r>
-        <w:rPr>
-          <w:noProof/>
-        </w:rPr>
         <w:drawing>
-          <wp:inline distT="0" distB="0" distL="0" distR="0" wp14:anchorId="6E004012" wp14:editId="1AA6D320">
+          <wp:inline distT="0" distB="0" distL="0" distR="0" wp14:anchorId="2EAF828F" wp14:editId="1E308191">
             <wp:extent cx="5486400" cy="4702629"/>
             <wp:effectExtent l="0" t="0" r="0" b="0"/>
             <wp:docPr id="5" name="Picture 5"/>
@@ -9262,6 +9224,25 @@
         </w:drawing>
       </w:r>
     </w:p>
+    <w:p>
+      <w:pPr>
+        <w:spacing w:after="120"/>
+        <w:jc w:val="center"/>
+      </w:pPr>
+      <w:r>
+        <w:rPr>
+          <w:b/>
+          <w:color w:val="000000"/>
+        </w:rPr>
+        <w:t xml:space="preserve">Figure 5 </w:t>
+      </w:r>
+      <w:r>
+        <w:rPr>
+          <w:color w:val="000000"/>
+        </w:rPr>
+        <w:t>Use Case Diagram</w:t>
+      </w:r>
+    </w:p>
     <w:p/>
     <w:p>
       <w:pPr>
@@ -9280,7 +9261,7 @@
         <w:keepNext/>
         <w:spacing w:line="480" w:lineRule="auto"/>
       </w:pPr>
-      <w:bookmarkStart w:id="27" w:name="_Toc239253567"/>
+      <w:bookmarkStart w:id="27" w:name="_Toc239255177"/>
       <w:r>
         <w:rPr>
           <w:b/>
@@ -9288,7 +9269,6 @@
           <w:color w:val="000000"/>
           <w:szCs w:val="24"/>
         </w:rPr>
-        <w:lastRenderedPageBreak/>
         <w:t>3.7 Data Flow Diagram</w:t>
       </w:r>
       <w:bookmarkEnd w:id="27"/>
@@ -9299,7 +9279,7 @@
         <w:keepNext/>
         <w:spacing w:line="480" w:lineRule="auto"/>
       </w:pPr>
-      <w:bookmarkStart w:id="28" w:name="_Toc239253568"/>
+      <w:bookmarkStart w:id="28" w:name="_Toc239255178"/>
       <w:r>
         <w:rPr>
           <w:b/>
@@ -9319,47 +9299,33 @@
         <w:rPr>
           <w:color w:val="000000"/>
         </w:rPr>
-        <w:t>The context diagram in Figure 6 represents the whole platform as a single process and shows the data that crosses its boundary. Four external entities interact with the system. The store owner supplies store details, product data, and discount and shipping rules, and receives the store dashboard, sales reports and order alerts. Store staff supply stock updates and fulfilment status, and receive the order queue and inventory alerts. The customer supplies search terms, cart items and order and address details</w:t>
-      </w:r>
-      <w:r>
-        <w:rPr>
-          <w:color w:val="000000"/>
-        </w:rPr>
-        <w:t>, and receives product listings, cart summaries and order status. The platform administrator supplies store approval decisions and platform settings, and receives the store registry and a platform activity summary.</w:t>
+        <w:t xml:space="preserve">The context diagram in Figure 6 represents the whole platform as a single process and shows the data that crosses its boundary. Four external entities interact with the system. The store owner </w:t>
+      </w:r>
+      <w:r>
+        <w:rPr>
+          <w:color w:val="000000"/>
+        </w:rPr>
+        <w:lastRenderedPageBreak/>
+        <w:t>supplies store details, product data, and discount and shipping rules, and receives the store dashboard, sales reports and order alerts. Store staff supply stock updates and fulfilment status, and receive the order queue and inventory alerts. The customer supplies search terms, cart items and order and address details, and receives product listings, cart summaries and order status. The platform administrator supplies store approval decisions and platform settings, and receives the store registry and a platf</w:t>
+      </w:r>
+      <w:r>
+        <w:rPr>
+          <w:color w:val="000000"/>
+        </w:rPr>
+        <w:t>orm activity summary.</w:t>
       </w:r>
     </w:p>
     <w:p>
       <w:pPr>
         <w:keepNext/>
-        <w:spacing w:line="480" w:lineRule="auto"/>
-      </w:pPr>
-      <w:r>
-        <w:rPr>
-          <w:b/>
-          <w:color w:val="000000"/>
-        </w:rPr>
-        <w:t>Figure 6</w:t>
-      </w:r>
-    </w:p>
-    <w:p>
-      <w:pPr>
-        <w:keepNext/>
-        <w:spacing w:line="480" w:lineRule="auto"/>
-      </w:pPr>
-      <w:r>
-        <w:rPr>
-          <w:color w:val="000000"/>
-        </w:rPr>
-        <w:t>Data Flow Diagram: Level 0 (Context Diagram)</w:t>
-      </w:r>
-    </w:p>
-    <w:p>
+        <w:jc w:val="center"/>
+      </w:pPr>
       <w:r>
         <w:rPr>
           <w:noProof/>
         </w:rPr>
         <w:drawing>
-          <wp:inline distT="0" distB="0" distL="0" distR="0" wp14:anchorId="0CFE2B59" wp14:editId="0DD1BC11">
+          <wp:inline distT="0" distB="0" distL="0" distR="0" wp14:anchorId="45E75471" wp14:editId="569F58CD">
             <wp:extent cx="5577840" cy="2114499"/>
             <wp:effectExtent l="0" t="0" r="0" b="0"/>
             <wp:docPr id="6" name="Picture 6"/>
@@ -9395,6 +9361,25 @@
         </w:drawing>
       </w:r>
     </w:p>
+    <w:p>
+      <w:pPr>
+        <w:spacing w:after="120"/>
+        <w:jc w:val="center"/>
+      </w:pPr>
+      <w:r>
+        <w:rPr>
+          <w:b/>
+          <w:color w:val="000000"/>
+        </w:rPr>
+        <w:t xml:space="preserve">Figure 6 </w:t>
+      </w:r>
+      <w:r>
+        <w:rPr>
+          <w:color w:val="000000"/>
+        </w:rPr>
+        <w:t>Data Flow Diagram: Level 0 (Context Diagram)</w:t>
+      </w:r>
+    </w:p>
     <w:p/>
     <w:p>
       <w:pPr>
@@ -9402,7 +9387,7 @@
         <w:keepNext/>
         <w:spacing w:line="480" w:lineRule="auto"/>
       </w:pPr>
-      <w:bookmarkStart w:id="29" w:name="_Toc239253569"/>
+      <w:bookmarkStart w:id="29" w:name="_Toc239255179"/>
       <w:r>
         <w:rPr>
           <w:b/>
@@ -9422,54 +9407,33 @@
         <w:rPr>
           <w:color w:val="000000"/>
         </w:rPr>
-        <w:t xml:space="preserve">Figure 7 decomposes the single process of Figure 6 into six processes and six data stores. Process 1.0, Manage Users and Access, authenticates platform users and issues session tokens against the user and role store. Process 2.0, Provision Store and Domain, creates tenant records </w:t>
+        <w:t>Figure 7 decomposes the single process of Figure 6 into six processes and six data stores. Process 1.0, Manage Users and Access, authenticates platform users and issues session tokens against the user and role store. Process 2.0, Provision Store and Domain, creates tenant records and domain mappings and applies the administrator's approval decisions. Process 3.0, Manage Catalog and Inventory, maintains products, variants and stock levels. Process 4.0, Serve Storefront and Cart, resolves the tenant, reads th</w:t>
+      </w:r>
+      <w:r>
+        <w:rPr>
+          <w:color w:val="000000"/>
+        </w:rPr>
+        <w:t xml:space="preserve">e catalogue and maintains cart records for storefront visitors. Process 5.0, Process Order, converts a cart into an order, reserves stock, records the customer, and reports fulfilment progress. Process 6.0, Generate Reports, reads order </w:t>
       </w:r>
       <w:r>
         <w:rPr>
           <w:color w:val="000000"/>
         </w:rPr>
         <w:lastRenderedPageBreak/>
-        <w:t xml:space="preserve">and domain mappings and applies the administrator's approval decisions. Process 3.0, Manage Catalog and Inventory, maintains products, variants and stock levels. Process 4.0, Serve Storefront and Cart, resolves the tenant, reads the catalogue and maintains cart records for storefront visitors. Process 5.0, Process Order, converts a cart into an order, reserves stock, records the customer, and reports fulfilment progress. Process 6.0, Generate Reports, reads order and catalogue data to produce sales reports </w:t>
-      </w:r>
-      <w:r>
-        <w:rPr>
-          <w:color w:val="000000"/>
-        </w:rPr>
-        <w:t>for sellers and an activity summary for administrators.</w:t>
+        <w:t>and catalogue data to produce sales reports for sellers and an activity summary for administrators.</w:t>
       </w:r>
     </w:p>
     <w:p>
       <w:pPr>
         <w:keepNext/>
-        <w:spacing w:line="480" w:lineRule="auto"/>
-      </w:pPr>
-      <w:r>
-        <w:rPr>
-          <w:b/>
-          <w:color w:val="000000"/>
-        </w:rPr>
-        <w:t>Figure 7</w:t>
-      </w:r>
-    </w:p>
-    <w:p>
-      <w:pPr>
-        <w:keepNext/>
-        <w:spacing w:line="480" w:lineRule="auto"/>
-      </w:pPr>
-      <w:r>
-        <w:rPr>
-          <w:color w:val="000000"/>
-        </w:rPr>
-        <w:t>Data Flow Diagram: Level 1</w:t>
-      </w:r>
-    </w:p>
-    <w:p>
+        <w:jc w:val="center"/>
+      </w:pPr>
       <w:r>
         <w:rPr>
           <w:noProof/>
         </w:rPr>
         <w:drawing>
-          <wp:inline distT="0" distB="0" distL="0" distR="0" wp14:anchorId="42289DA2" wp14:editId="2B34384E">
+          <wp:inline distT="0" distB="0" distL="0" distR="0" wp14:anchorId="3A1EA3F0" wp14:editId="44840481">
             <wp:extent cx="5577840" cy="4820912"/>
             <wp:effectExtent l="0" t="0" r="0" b="0"/>
             <wp:docPr id="7" name="Picture 7"/>
@@ -9505,6 +9469,25 @@
         </w:drawing>
       </w:r>
     </w:p>
+    <w:p>
+      <w:pPr>
+        <w:spacing w:after="120"/>
+        <w:jc w:val="center"/>
+      </w:pPr>
+      <w:r>
+        <w:rPr>
+          <w:b/>
+          <w:color w:val="000000"/>
+        </w:rPr>
+        <w:t xml:space="preserve">Figure 7 </w:t>
+      </w:r>
+      <w:r>
+        <w:rPr>
+          <w:color w:val="000000"/>
+        </w:rPr>
+        <w:t>Data Flow Diagram: Level 1</w:t>
+      </w:r>
+    </w:p>
     <w:p/>
     <w:p>
       <w:pPr>
@@ -9514,7 +9497,6 @@
         <w:rPr>
           <w:color w:val="000000"/>
         </w:rPr>
-        <w:lastRenderedPageBreak/>
         <w:t>The data stores mirror the entity groups of Section 3.8: D1 holds users and roles, D2 tenants and domains, D3 products and inventory, D4 carts, D5 orders and D6 storefront customers. Every store except D1 is partitioned internally by tenant identifier.</w:t>
       </w:r>
     </w:p>
@@ -9524,7 +9506,7 @@
         <w:keepNext/>
         <w:spacing w:line="480" w:lineRule="auto"/>
       </w:pPr>
-      <w:bookmarkStart w:id="30" w:name="_Toc239253570"/>
+      <w:bookmarkStart w:id="30" w:name="_Toc239255180"/>
       <w:r>
         <w:rPr>
           <w:b/>
@@ -9544,48 +9526,28 @@
         <w:rPr>
           <w:color w:val="000000"/>
         </w:rPr>
-        <w:t>The entity relationship diagram in Figure 8 shows the principal entities of the database, their primary and foreign keys and the cardinality of each relationship. TENANT is the root of the tenant-owned data: a tenant has many domains, products, collections, customers, carts, orders, discounts and shipping zones, and every one of those tables carries tenant_id as a foreign key referencing TENANT. Platform users are held separately in USER and are connected to tenants through MEMBERSHIP, which carries the rol</w:t>
-      </w:r>
-      <w:r>
-        <w:rPr>
-          <w:color w:val="000000"/>
-        </w:rPr>
-        <w:t>e held by that user in that tenant; this allows one person to hold different roles in different stores.</w:t>
+        <w:t xml:space="preserve">The entity relationship diagram in Figure 8 shows the principal entities of the database, their primary and foreign keys and the cardinality of each relationship. TENANT is the root of the </w:t>
+      </w:r>
+      <w:r>
+        <w:rPr>
+          <w:color w:val="000000"/>
+        </w:rPr>
+        <w:lastRenderedPageBreak/>
+        <w:t>tenant-owned data: a tenant has many domains, products, collections, customers, carts, orders, discounts and shipping zones, and every one of those tables carries tenant_id as a foreign key referencing TENANT. Platform users are held separately in USER and are connected to tenants through MEMBERSHIP, which carries the role held by that user in that tenant; this allows one person to hold different roles in different stores.</w:t>
       </w:r>
     </w:p>
     <w:p>
       <w:pPr>
         <w:keepNext/>
-        <w:spacing w:line="480" w:lineRule="auto"/>
-      </w:pPr>
-      <w:r>
-        <w:rPr>
-          <w:b/>
-          <w:color w:val="000000"/>
+        <w:jc w:val="center"/>
+      </w:pPr>
+      <w:r>
+        <w:rPr>
+          <w:noProof/>
         </w:rPr>
         <w:lastRenderedPageBreak/>
-        <w:t>Figure 8</w:t>
-      </w:r>
-    </w:p>
-    <w:p>
-      <w:pPr>
-        <w:keepNext/>
-        <w:spacing w:line="480" w:lineRule="auto"/>
-      </w:pPr>
-      <w:r>
-        <w:rPr>
-          <w:color w:val="000000"/>
-        </w:rPr>
-        <w:t>Entity Relationship (ER) Diagram</w:t>
-      </w:r>
-    </w:p>
-    <w:p>
-      <w:r>
-        <w:rPr>
-          <w:noProof/>
-        </w:rPr>
         <w:drawing>
-          <wp:inline distT="0" distB="0" distL="0" distR="0" wp14:anchorId="0D60C3C2" wp14:editId="54429E86">
+          <wp:inline distT="0" distB="0" distL="0" distR="0" wp14:anchorId="17ADAC4C" wp14:editId="7CB79481">
             <wp:extent cx="5303520" cy="6584179"/>
             <wp:effectExtent l="0" t="0" r="0" b="0"/>
             <wp:docPr id="8" name="Picture 8"/>
@@ -9623,6 +9585,25 @@
     </w:p>
     <w:p>
       <w:pPr>
+        <w:spacing w:after="120"/>
+        <w:jc w:val="center"/>
+      </w:pPr>
+      <w:r>
+        <w:rPr>
+          <w:b/>
+          <w:color w:val="000000"/>
+        </w:rPr>
+        <w:t xml:space="preserve">Figure 8 </w:t>
+      </w:r>
+      <w:r>
+        <w:rPr>
+          <w:color w:val="000000"/>
+        </w:rPr>
+        <w:t>Entity Relationship (ER) Diagram</w:t>
+      </w:r>
+    </w:p>
+    <w:p>
+      <w:pPr>
         <w:spacing w:line="480" w:lineRule="auto"/>
       </w:pPr>
       <w:r>
@@ -9670,7 +9651,7 @@
         <w:spacing w:line="480" w:lineRule="auto"/>
         <w:jc w:val="center"/>
       </w:pPr>
-      <w:bookmarkStart w:id="31" w:name="_Toc239253571"/>
+      <w:bookmarkStart w:id="31" w:name="_Toc239255181"/>
       <w:r>
         <w:rPr>
           <w:b/>
@@ -9700,7 +9681,7 @@
         <w:keepNext/>
         <w:spacing w:line="480" w:lineRule="auto"/>
       </w:pPr>
-      <w:bookmarkStart w:id="32" w:name="_Toc239253572"/>
+      <w:bookmarkStart w:id="32" w:name="_Toc239255182"/>
       <w:r>
         <w:rPr>
           <w:b/>
@@ -10385,7 +10366,7 @@
         <w:keepNext/>
         <w:spacing w:line="480" w:lineRule="auto"/>
       </w:pPr>
-      <w:bookmarkStart w:id="33" w:name="_Toc239253573"/>
+      <w:bookmarkStart w:id="33" w:name="_Toc239255183"/>
       <w:r>
         <w:rPr>
           <w:b/>
@@ -10753,7 +10734,7 @@
         <w:keepNext/>
         <w:spacing w:line="480" w:lineRule="auto"/>
       </w:pPr>
-      <w:bookmarkStart w:id="34" w:name="_Toc239253574"/>
+      <w:bookmarkStart w:id="34" w:name="_Toc239255184"/>
       <w:r>
         <w:rPr>
           <w:b/>
@@ -11055,7 +11036,7 @@
         <w:spacing w:line="480" w:lineRule="auto"/>
         <w:jc w:val="center"/>
       </w:pPr>
-      <w:bookmarkStart w:id="35" w:name="_Toc239253575"/>
+      <w:bookmarkStart w:id="35" w:name="_Toc239255185"/>
       <w:r>
         <w:rPr>
           <w:b/>
@@ -11085,7 +11066,7 @@
         <w:keepNext/>
         <w:spacing w:line="480" w:lineRule="auto"/>
       </w:pPr>
-      <w:bookmarkStart w:id="36" w:name="_Toc239253576"/>
+      <w:bookmarkStart w:id="36" w:name="_Toc239255186"/>
       <w:r>
         <w:rPr>
           <w:b/>
@@ -11262,7 +11243,7 @@
         <w:keepNext/>
         <w:spacing w:line="480" w:lineRule="auto"/>
       </w:pPr>
-      <w:bookmarkStart w:id="37" w:name="_Toc239253577"/>
+      <w:bookmarkStart w:id="37" w:name="_Toc239255187"/>
       <w:r>
         <w:rPr>
           <w:b/>
@@ -11361,7 +11342,7 @@
         <w:spacing w:line="480" w:lineRule="auto"/>
         <w:jc w:val="center"/>
       </w:pPr>
-      <w:bookmarkStart w:id="38" w:name="_Toc239253578"/>
+      <w:bookmarkStart w:id="38" w:name="_Toc239255188"/>
       <w:r>
         <w:rPr>
           <w:b/>
@@ -11728,90 +11709,9 @@
 <file path=word/numbering.xml><?xml version="1.0" encoding="utf-8"?>
 <w:numbering xmlns:wpc="http://schemas.microsoft.com/office/word/2010/wordprocessingCanvas" xmlns:cx="http://schemas.microsoft.com/office/drawing/2014/chartex" xmlns:cx1="http://schemas.microsoft.com/office/drawing/2015/9/8/chartex" xmlns:cx2="http://schemas.microsoft.com/office/drawing/2015/10/21/chartex" xmlns:cx3="http://schemas.microsoft.com/office/drawing/2016/5/9/chartex" xmlns:cx4="http://schemas.microsoft.com/office/drawing/2016/5/10/chartex" xmlns:cx5="http://schemas.microsoft.com/office/drawing/2016/5/11/chartex" xmlns:cx6="http://schemas.microsoft.com/office/drawing/2016/5/12/chartex" xmlns:cx7="http://schemas.microsoft.com/office/drawing/2016/5/13/chartex" xmlns:cx8="http://schemas.microsoft.com/office/drawing/2016/5/14/chartex" xmlns:mc="http://schemas.openxmlformats.org/markup-compatibility/2006" xmlns:aink="http://schemas.microsoft.com/office/drawing/2016/ink" xmlns:am3d="http://schemas.microsoft.com/office/drawing/2017/model3d" xmlns:o="urn:schemas-microsoft-com:office:office" xmlns:oel="http://schemas.microsoft.com/office/2019/extlst" xmlns:r="http://schemas.openxmlformats.org/officeDocument/2006/relationships" xmlns:m="http://schemas.openxmlformats.org/officeDocument/2006/math" xmlns:v="urn:schemas-microsoft-com:vml" xmlns:wp14="http://schemas.microsoft.com/office/word/2010/wordprocessingDrawing" xmlns:wp="http://schemas.openxmlformats.org/drawingml/2006/wordprocessingDrawing" xmlns:w10="urn:schemas-microsoft-com:office:word" xmlns:w="http://schemas.openxmlformats.org/wordprocessingml/2006/main" xmlns:w14="http://schemas.microsoft.com/office/word/2010/wordml" xmlns:w15="http://schemas.microsoft.com/office/word/2012/wordml" xmlns:w16cex="http://schemas.microsoft.com/office/word/2018/wordml/cex" xmlns:w16cid="http://schemas.microsoft.com/office/word/2016/wordml/cid" xmlns:w16="http://schemas.microsoft.com/office/word/2018/wordml" xmlns:w16du="http://schemas.microsoft.com/office/word/2023/wordml/word16du" xmlns:w16sdtdh="http://schemas.microsoft.com/office/word/2020/wordml/sdtdatahash" xmlns:w16sdtfl="http://schemas.microsoft.com/office/word/2024/wordml/sdtformatlock" xmlns:w16se="http://schemas.microsoft.com/office/word/2015/wordml/symex" xmlns:wpg="http://schemas.microsoft.com/office/word/2010/wordprocessingGroup" xmlns:wpi="http://schemas.microsoft.com/office/word/2010/wordprocessingInk" xmlns:wne="http://schemas.microsoft.com/office/word/2006/wordml" xmlns:wps="http://schemas.microsoft.com/office/word/2010/wordprocessingShape" mc:Ignorable="w14 w15 w16se w16cid w16 w16cex w16sdtdh w16sdtfl w16du wp14">
   <w:abstractNum w:abstractNumId="0" w15:restartNumberingAfterBreak="0">
-    <w:nsid w:val="1B2A40DD"/>
+    <w:nsid w:val="14372D53"/>
     <w:multiLevelType w:val="multilevel"/>
-    <w:tmpl w:val="3710EAFE"/>
-    <w:lvl w:ilvl="0">
-      <w:start w:val="1"/>
-      <w:numFmt w:val="decimal"/>
-      <w:lvlText w:val="%1."/>
-      <w:lvlJc w:val="left"/>
-      <w:pPr>
-        <w:ind w:left="720" w:hanging="360"/>
-      </w:pPr>
-      <w:rPr>
-        <w:rFonts w:ascii="Times New Roman" w:eastAsia="Times New Roman" w:hAnsi="Times New Roman" w:cs="Times New Roman"/>
-      </w:rPr>
-    </w:lvl>
-    <w:lvl w:ilvl="1">
-      <w:numFmt w:val="decimal"/>
-      <w:lvlText w:val=""/>
-      <w:lvlJc w:val="left"/>
-      <w:pPr>
-        <w:ind w:left="0" w:firstLine="0"/>
-      </w:pPr>
-    </w:lvl>
-    <w:lvl w:ilvl="2">
-      <w:numFmt w:val="decimal"/>
-      <w:lvlText w:val=""/>
-      <w:lvlJc w:val="left"/>
-      <w:pPr>
-        <w:ind w:left="0" w:firstLine="0"/>
-      </w:pPr>
-    </w:lvl>
-    <w:lvl w:ilvl="3">
-      <w:numFmt w:val="decimal"/>
-      <w:lvlText w:val=""/>
-      <w:lvlJc w:val="left"/>
-      <w:pPr>
-        <w:ind w:left="0" w:firstLine="0"/>
-      </w:pPr>
-    </w:lvl>
-    <w:lvl w:ilvl="4">
-      <w:numFmt w:val="decimal"/>
-      <w:lvlText w:val=""/>
-      <w:lvlJc w:val="left"/>
-      <w:pPr>
-        <w:ind w:left="0" w:firstLine="0"/>
-      </w:pPr>
-    </w:lvl>
-    <w:lvl w:ilvl="5">
-      <w:numFmt w:val="decimal"/>
-      <w:lvlText w:val=""/>
-      <w:lvlJc w:val="left"/>
-      <w:pPr>
-        <w:ind w:left="0" w:firstLine="0"/>
-      </w:pPr>
-    </w:lvl>
-    <w:lvl w:ilvl="6">
-      <w:numFmt w:val="decimal"/>
-      <w:lvlText w:val=""/>
-      <w:lvlJc w:val="left"/>
-      <w:pPr>
-        <w:ind w:left="0" w:firstLine="0"/>
-      </w:pPr>
-    </w:lvl>
-    <w:lvl w:ilvl="7">
-      <w:numFmt w:val="decimal"/>
-      <w:lvlText w:val=""/>
-      <w:lvlJc w:val="left"/>
-      <w:pPr>
-        <w:ind w:left="0" w:firstLine="0"/>
-      </w:pPr>
-    </w:lvl>
-    <w:lvl w:ilvl="8">
-      <w:numFmt w:val="decimal"/>
-      <w:lvlText w:val=""/>
-      <w:lvlJc w:val="left"/>
-      <w:pPr>
-        <w:ind w:left="0" w:firstLine="0"/>
-      </w:pPr>
-    </w:lvl>
-  </w:abstractNum>
-  <w:abstractNum w:abstractNumId="1" w15:restartNumberingAfterBreak="0">
-    <w:nsid w:val="7AC41310"/>
-    <w:multiLevelType w:val="multilevel"/>
-    <w:tmpl w:val="E182C268"/>
+    <w:tmpl w:val="F12CA386"/>
     <w:lvl w:ilvl="0">
       <w:start w:val="1"/>
       <w:numFmt w:val="bullet"/>
@@ -11893,11 +11793,92 @@
       </w:pPr>
     </w:lvl>
   </w:abstractNum>
-  <w:num w:numId="1" w16cid:durableId="2135980831">
+  <w:abstractNum w:abstractNumId="1" w15:restartNumberingAfterBreak="0">
+    <w:nsid w:val="7F581DEE"/>
+    <w:multiLevelType w:val="multilevel"/>
+    <w:tmpl w:val="8E943A4E"/>
+    <w:lvl w:ilvl="0">
+      <w:start w:val="1"/>
+      <w:numFmt w:val="decimal"/>
+      <w:lvlText w:val="%1."/>
+      <w:lvlJc w:val="left"/>
+      <w:pPr>
+        <w:ind w:left="720" w:hanging="360"/>
+      </w:pPr>
+      <w:rPr>
+        <w:rFonts w:ascii="Times New Roman" w:eastAsia="Times New Roman" w:hAnsi="Times New Roman" w:cs="Times New Roman"/>
+      </w:rPr>
+    </w:lvl>
+    <w:lvl w:ilvl="1">
+      <w:numFmt w:val="decimal"/>
+      <w:lvlText w:val=""/>
+      <w:lvlJc w:val="left"/>
+      <w:pPr>
+        <w:ind w:left="0" w:firstLine="0"/>
+      </w:pPr>
+    </w:lvl>
+    <w:lvl w:ilvl="2">
+      <w:numFmt w:val="decimal"/>
+      <w:lvlText w:val=""/>
+      <w:lvlJc w:val="left"/>
+      <w:pPr>
+        <w:ind w:left="0" w:firstLine="0"/>
+      </w:pPr>
+    </w:lvl>
+    <w:lvl w:ilvl="3">
+      <w:numFmt w:val="decimal"/>
+      <w:lvlText w:val=""/>
+      <w:lvlJc w:val="left"/>
+      <w:pPr>
+        <w:ind w:left="0" w:firstLine="0"/>
+      </w:pPr>
+    </w:lvl>
+    <w:lvl w:ilvl="4">
+      <w:numFmt w:val="decimal"/>
+      <w:lvlText w:val=""/>
+      <w:lvlJc w:val="left"/>
+      <w:pPr>
+        <w:ind w:left="0" w:firstLine="0"/>
+      </w:pPr>
+    </w:lvl>
+    <w:lvl w:ilvl="5">
+      <w:numFmt w:val="decimal"/>
+      <w:lvlText w:val=""/>
+      <w:lvlJc w:val="left"/>
+      <w:pPr>
+        <w:ind w:left="0" w:firstLine="0"/>
+      </w:pPr>
+    </w:lvl>
+    <w:lvl w:ilvl="6">
+      <w:numFmt w:val="decimal"/>
+      <w:lvlText w:val=""/>
+      <w:lvlJc w:val="left"/>
+      <w:pPr>
+        <w:ind w:left="0" w:firstLine="0"/>
+      </w:pPr>
+    </w:lvl>
+    <w:lvl w:ilvl="7">
+      <w:numFmt w:val="decimal"/>
+      <w:lvlText w:val=""/>
+      <w:lvlJc w:val="left"/>
+      <w:pPr>
+        <w:ind w:left="0" w:firstLine="0"/>
+      </w:pPr>
+    </w:lvl>
+    <w:lvl w:ilvl="8">
+      <w:numFmt w:val="decimal"/>
+      <w:lvlText w:val=""/>
+      <w:lvlJc w:val="left"/>
+      <w:pPr>
+        <w:ind w:left="0" w:firstLine="0"/>
+      </w:pPr>
+    </w:lvl>
+  </w:abstractNum>
+  <w:num w:numId="1" w16cid:durableId="134879262">
+    <w:abstractNumId w:val="1"/>
+  </w:num>
+  <w:num w:numId="2" w16cid:durableId="793135719">
     <w:abstractNumId w:val="0"/>
-  </w:num>
-  <w:num w:numId="2" w16cid:durableId="1946497099">
-    <w:abstractNumId w:val="1"/>
   </w:num>
 </w:numbering>
 </file>
@@ -12835,7 +12816,7 @@
     <w:autoRedefine/>
     <w:uiPriority w:val="39"/>
     <w:unhideWhenUsed/>
-    <w:rsid w:val="008F5F71"/>
+    <w:rsid w:val="0013187D"/>
     <w:pPr>
       <w:spacing w:after="100"/>
     </w:pPr>
@@ -12847,7 +12828,7 @@
     <w:autoRedefine/>
     <w:uiPriority w:val="39"/>
     <w:unhideWhenUsed/>
-    <w:rsid w:val="008F5F71"/>
+    <w:rsid w:val="0013187D"/>
     <w:pPr>
       <w:spacing w:after="100"/>
       <w:ind w:left="240"/>
@@ -12860,7 +12841,7 @@
     <w:autoRedefine/>
     <w:uiPriority w:val="39"/>
     <w:unhideWhenUsed/>
-    <w:rsid w:val="008F5F71"/>
+    <w:rsid w:val="0013187D"/>
     <w:pPr>
       <w:spacing w:after="100"/>
       <w:ind w:left="480"/>

</xml_diff>

<commit_message>
Tighten specific objectives 2 and 3
Objective 3 crammed four modules, host-based routing and the verification
clause into one sentence and read as a task list. Routing moves into the design
objective where it belongs, leaving the implementation objective to name the
modules and the test-case count.

The "verify against 40 defined test cases" clause stays: it is what makes the
objective measurable, which Section 1.3.2 and the mandatory checklist both
require, and it follows the template's own worked example.

Co-Authored-By: Claude Opus 5 (1M context) <noreply@anthropic.com>
Claude-Session: https://claude.ai/code/session_0196JS1u5qEW9XzS4ZPnTL2s
</commit_message>
<xml_diff>
--- a/docs/Kinyo_ProjectVI_Proposal.docx
+++ b/docs/Kinyo_ProjectVI_Proposal.docx
@@ -5380,35 +5380,31 @@
       </w:pPr>
       <w:r>
         <w:rPr>
-          <w:color w:val="000000"/>
+          <w:b w:val="0"/>
+          <w:i w:val="0"/>
+          <w:sz w:val="24"/>
+          <w:rFonts w:ascii="Times New Roman" w:hAnsi="Times New Roman" w:cs="Times New Roman" w:eastAsia="Times New Roman"/>
         </w:rPr>
         <w:t>2.</w:t>
-      </w:r>
-      <w:r>
-        <w:rPr>
-          <w:color w:val="000000"/>
-        </w:rPr>
-        <w:tab/>
-        <w:t>To design a shared-database multi-tenant data model and a three-tier system architecture in which every tenant-owned record is isolated by a tenant identifier.</w:t>
-      </w:r>
-    </w:p>
-    <w:p>
-      <w:pPr>
-        <w:spacing w:line="480" w:lineRule="auto"/>
-        <w:ind w:left="720" w:hanging="360"/>
-      </w:pPr>
-      <w:r>
-        <w:rPr>
-          <w:color w:val="000000"/>
+        <w:tab/>
+        <w:t>To design a multi-tenant data model and a three-tier architecture that isolates every tenant-owned record and resolves each storefront from its host name.</w:t>
+      </w:r>
+    </w:p>
+    <w:p>
+      <w:pPr>
+        <w:spacing w:line="480" w:lineRule="auto"/>
+        <w:ind w:left="720" w:hanging="360"/>
+      </w:pPr>
+      <w:r>
+        <w:rPr>
+          <w:b w:val="0"/>
+          <w:i w:val="0"/>
+          <w:sz w:val="24"/>
+          <w:rFonts w:ascii="Times New Roman" w:hAnsi="Times New Roman" w:cs="Times New Roman" w:eastAsia="Times New Roman"/>
         </w:rPr>
         <w:t>3.</w:t>
-      </w:r>
-      <w:r>
-        <w:rPr>
-          <w:color w:val="000000"/>
-        </w:rPr>
-        <w:tab/>
-        <w:t>To implement the store provisioning, catalogue, cart and order modules, including host-based storefront routing, and to verify them against 40 defined test cases covering functional behaviour and cross-tenant data isolation.</w:t>
+        <w:tab/>
+        <w:t>To implement the store provisioning, catalogue, cart and order modules, and to verify them against 40 defined test cases covering functional behaviour and tenant isolation.</w:t>
       </w:r>
     </w:p>
     <w:p>

</xml_diff>

<commit_message>
Remove the implementation and verification objective
Leaves three specific objectives: analyse, design, deploy. The follow-up
sentence that referred to the removed objective goes with it.

Note for later: this was the only measurable objective, which Section 1.3.2 and
the mandatory checklist both require.

Co-Authored-By: Claude Opus 5 (1M context) <noreply@anthropic.com>
Claude-Session: https://claude.ai/code/session_0196JS1u5qEW9XzS4ZPnTL2s
</commit_message>
<xml_diff>
--- a/docs/Kinyo_ProjectVI_Proposal.docx
+++ b/docs/Kinyo_ProjectVI_Proposal.docx
@@ -5404,37 +5404,7 @@
         </w:rPr>
         <w:t>3.</w:t>
         <w:tab/>
-        <w:t>To implement the store provisioning, catalogue, cart and order modules, and to verify them against 40 defined test cases covering functional behaviour and tenant isolation.</w:t>
-      </w:r>
-    </w:p>
-    <w:p>
-      <w:pPr>
-        <w:spacing w:line="480" w:lineRule="auto"/>
-        <w:ind w:left="720" w:hanging="360"/>
-      </w:pPr>
-      <w:r>
-        <w:rPr>
-          <w:color w:val="000000"/>
-        </w:rPr>
-        <w:t>4.</w:t>
-      </w:r>
-      <w:r>
-        <w:rPr>
-          <w:color w:val="000000"/>
-        </w:rPr>
-        <w:tab/>
         <w:t>To deploy the platform as a web application that serves seller dashboards and customer storefronts over subdomain and custom-domain addresses.</w:t>
-      </w:r>
-    </w:p>
-    <w:p>
-      <w:pPr>
-        <w:spacing w:line="480" w:lineRule="auto"/>
-      </w:pPr>
-      <w:r>
-        <w:rPr>
-          <w:color w:val="000000"/>
-        </w:rPr>
-        <w:t>The third objective is measurable and verifiable: the modules named are either present or absent, and the 40 test cases described in Section 4.3 either pass or fail. No performance improvement is claimed, because no baseline has been measured.</w:t>
       </w:r>
     </w:p>
     <w:p>

</xml_diff>

<commit_message>
Return the page number to the top right corner
Table A1 of the template puts the number in the top right corner of every page,
with the front matter in lower-case roman and the body restarting at 1 from
Chapter 1. The numbering scheme itself is unchanged; only the position moves
back from the centre of the footer.

move_page_numbers.py switches the position on an existing document, so a file
that has been edited by hand does not have to be rebuilt. index_pages.py reads
the printed number to fill the List of Figures and now looks at the header
again.

Co-Authored-By: Claude Opus 5 (1M context) <noreply@anthropic.com>
Claude-Session: https://claude.ai/code/session_0196JS1u5qEW9XzS4ZPnTL2s
</commit_message>
<xml_diff>
--- a/docs/Kinyo_ProjectVI_Proposal.docx
+++ b/docs/Kinyo_ProjectVI_Proposal.docx
@@ -11303,24 +11303,6 @@
     <w:pPr>
       <w:jc w:val="center"/>
     </w:pPr>
-    <w:r>
-      <w:fldChar w:fldCharType="begin"/>
-    </w:r>
-    <w:r>
-      <w:instrText xml:space="preserve"> PAGE </w:instrText>
-    </w:r>
-    <w:r>
-      <w:fldChar w:fldCharType="separate"/>
-    </w:r>
-    <w:r>
-      <w:rPr>
-        <w:color w:val="000000"/>
-      </w:rPr>
-      <w:t>1</w:t>
-    </w:r>
-    <w:r>
-      <w:fldChar w:fldCharType="end"/>
-    </w:r>
   </w:p>
 </w:ftr>
 </file>
@@ -11331,24 +11313,6 @@
     <w:pPr>
       <w:jc w:val="center"/>
     </w:pPr>
-    <w:r>
-      <w:fldChar w:fldCharType="begin"/>
-    </w:r>
-    <w:r>
-      <w:instrText xml:space="preserve"> PAGE </w:instrText>
-    </w:r>
-    <w:r>
-      <w:fldChar w:fldCharType="separate"/>
-    </w:r>
-    <w:r>
-      <w:rPr>
-        <w:color w:val="000000"/>
-      </w:rPr>
-      <w:t>1</w:t>
-    </w:r>
-    <w:r>
-      <w:fldChar w:fldCharType="end"/>
-    </w:r>
   </w:p>
 </w:ftr>
 </file>
@@ -11380,13 +11344,95 @@
 
 <file path=word/header2.xml><?xml version="1.0" encoding="utf-8"?>
 <w:hdr xmlns:wpc="http://schemas.microsoft.com/office/word/2010/wordprocessingCanvas" xmlns:cx="http://schemas.microsoft.com/office/drawing/2014/chartex" xmlns:cx1="http://schemas.microsoft.com/office/drawing/2015/9/8/chartex" xmlns:cx2="http://schemas.microsoft.com/office/drawing/2015/10/21/chartex" xmlns:cx3="http://schemas.microsoft.com/office/drawing/2016/5/9/chartex" xmlns:cx4="http://schemas.microsoft.com/office/drawing/2016/5/10/chartex" xmlns:cx5="http://schemas.microsoft.com/office/drawing/2016/5/11/chartex" xmlns:cx6="http://schemas.microsoft.com/office/drawing/2016/5/12/chartex" xmlns:cx7="http://schemas.microsoft.com/office/drawing/2016/5/13/chartex" xmlns:cx8="http://schemas.microsoft.com/office/drawing/2016/5/14/chartex" xmlns:mc="http://schemas.openxmlformats.org/markup-compatibility/2006" xmlns:aink="http://schemas.microsoft.com/office/drawing/2016/ink" xmlns:am3d="http://schemas.microsoft.com/office/drawing/2017/model3d" xmlns:o="urn:schemas-microsoft-com:office:office" xmlns:oel="http://schemas.microsoft.com/office/2019/extlst" xmlns:r="http://schemas.openxmlformats.org/officeDocument/2006/relationships" xmlns:m="http://schemas.openxmlformats.org/officeDocument/2006/math" xmlns:v="urn:schemas-microsoft-com:vml" xmlns:wp14="http://schemas.microsoft.com/office/word/2010/wordprocessingDrawing" xmlns:wp="http://schemas.openxmlformats.org/drawingml/2006/wordprocessingDrawing" xmlns:w10="urn:schemas-microsoft-com:office:word" xmlns:w="http://schemas.openxmlformats.org/wordprocessingml/2006/main" xmlns:w14="http://schemas.microsoft.com/office/word/2010/wordml" xmlns:w15="http://schemas.microsoft.com/office/word/2012/wordml" xmlns:w16cex="http://schemas.microsoft.com/office/word/2018/wordml/cex" xmlns:w16cid="http://schemas.microsoft.com/office/word/2016/wordml/cid" xmlns:w16="http://schemas.microsoft.com/office/word/2018/wordml" xmlns:w16du="http://schemas.microsoft.com/office/word/2023/wordml/word16du" xmlns:w16sdtdh="http://schemas.microsoft.com/office/word/2020/wordml/sdtdatahash" xmlns:w16sdtfl="http://schemas.microsoft.com/office/word/2024/wordml/sdtformatlock" xmlns:w16se="http://schemas.microsoft.com/office/word/2015/wordml/symex" xmlns:wpg="http://schemas.microsoft.com/office/word/2010/wordprocessingGroup" xmlns:wpi="http://schemas.microsoft.com/office/word/2010/wordprocessingInk" xmlns:wne="http://schemas.microsoft.com/office/word/2006/wordml" xmlns:wps="http://schemas.microsoft.com/office/word/2010/wordprocessingShape" mc:Ignorable="w14 w15 w16se w16cid w16 w16cex w16sdtdh w16sdtfl w16du wp14">
-  <w:p/>
+  <w:p>
+    <w:pPr>
+      <w:spacing w:before="0" w:after="0" w:line="240" w:lineRule="auto"/>
+      <w:ind w:firstLine="0"/>
+      <w:jc w:val="right"/>
+    </w:pPr>
+    <w:r>
+      <w:rPr>
+        <w:sz w:val="24"/>
+        <w:rFonts w:ascii="Times New Roman" w:hAnsi="Times New Roman" w:cs="Times New Roman" w:eastAsia="Times New Roman"/>
+      </w:rPr>
+      <w:fldChar w:fldCharType="begin"/>
+    </w:r>
+    <w:r>
+      <w:rPr>
+        <w:sz w:val="24"/>
+        <w:rFonts w:ascii="Times New Roman" w:hAnsi="Times New Roman" w:cs="Times New Roman" w:eastAsia="Times New Roman"/>
+      </w:rPr>
+      <w:instrText xml:space="preserve"> PAGE </w:instrText>
+    </w:r>
+    <w:r>
+      <w:rPr>
+        <w:sz w:val="24"/>
+        <w:rFonts w:ascii="Times New Roman" w:hAnsi="Times New Roman" w:cs="Times New Roman" w:eastAsia="Times New Roman"/>
+      </w:rPr>
+      <w:fldChar w:fldCharType="separate"/>
+    </w:r>
+    <w:r>
+      <w:rPr>
+        <w:sz w:val="24"/>
+        <w:rFonts w:ascii="Times New Roman" w:hAnsi="Times New Roman" w:cs="Times New Roman" w:eastAsia="Times New Roman"/>
+      </w:rPr>
+      <w:t>1</w:t>
+    </w:r>
+    <w:r>
+      <w:rPr>
+        <w:sz w:val="24"/>
+        <w:rFonts w:ascii="Times New Roman" w:hAnsi="Times New Roman" w:cs="Times New Roman" w:eastAsia="Times New Roman"/>
+      </w:rPr>
+      <w:fldChar w:fldCharType="end"/>
+    </w:r>
+  </w:p>
 </w:hdr>
 </file>
 
 <file path=word/header3.xml><?xml version="1.0" encoding="utf-8"?>
 <w:hdr xmlns:wpc="http://schemas.microsoft.com/office/word/2010/wordprocessingCanvas" xmlns:cx="http://schemas.microsoft.com/office/drawing/2014/chartex" xmlns:cx1="http://schemas.microsoft.com/office/drawing/2015/9/8/chartex" xmlns:cx2="http://schemas.microsoft.com/office/drawing/2015/10/21/chartex" xmlns:cx3="http://schemas.microsoft.com/office/drawing/2016/5/9/chartex" xmlns:cx4="http://schemas.microsoft.com/office/drawing/2016/5/10/chartex" xmlns:cx5="http://schemas.microsoft.com/office/drawing/2016/5/11/chartex" xmlns:cx6="http://schemas.microsoft.com/office/drawing/2016/5/12/chartex" xmlns:cx7="http://schemas.microsoft.com/office/drawing/2016/5/13/chartex" xmlns:cx8="http://schemas.microsoft.com/office/drawing/2016/5/14/chartex" xmlns:mc="http://schemas.openxmlformats.org/markup-compatibility/2006" xmlns:aink="http://schemas.microsoft.com/office/drawing/2016/ink" xmlns:am3d="http://schemas.microsoft.com/office/drawing/2017/model3d" xmlns:o="urn:schemas-microsoft-com:office:office" xmlns:oel="http://schemas.microsoft.com/office/2019/extlst" xmlns:r="http://schemas.openxmlformats.org/officeDocument/2006/relationships" xmlns:m="http://schemas.openxmlformats.org/officeDocument/2006/math" xmlns:v="urn:schemas-microsoft-com:vml" xmlns:wp14="http://schemas.microsoft.com/office/word/2010/wordprocessingDrawing" xmlns:wp="http://schemas.openxmlformats.org/drawingml/2006/wordprocessingDrawing" xmlns:w10="urn:schemas-microsoft-com:office:word" xmlns:w="http://schemas.openxmlformats.org/wordprocessingml/2006/main" xmlns:w14="http://schemas.microsoft.com/office/word/2010/wordml" xmlns:w15="http://schemas.microsoft.com/office/word/2012/wordml" xmlns:w16cex="http://schemas.microsoft.com/office/word/2018/wordml/cex" xmlns:w16cid="http://schemas.microsoft.com/office/word/2016/wordml/cid" xmlns:w16="http://schemas.microsoft.com/office/word/2018/wordml" xmlns:w16du="http://schemas.microsoft.com/office/word/2023/wordml/word16du" xmlns:w16sdtdh="http://schemas.microsoft.com/office/word/2020/wordml/sdtdatahash" xmlns:w16sdtfl="http://schemas.microsoft.com/office/word/2024/wordml/sdtformatlock" xmlns:w16se="http://schemas.microsoft.com/office/word/2015/wordml/symex" xmlns:wpg="http://schemas.microsoft.com/office/word/2010/wordprocessingGroup" xmlns:wpi="http://schemas.microsoft.com/office/word/2010/wordprocessingInk" xmlns:wne="http://schemas.microsoft.com/office/word/2006/wordml" xmlns:wps="http://schemas.microsoft.com/office/word/2010/wordprocessingShape" mc:Ignorable="w14 w15 w16se w16cid w16 w16cex w16sdtdh w16sdtfl w16du wp14">
-  <w:p/>
+  <w:p>
+    <w:pPr>
+      <w:spacing w:before="0" w:after="0" w:line="240" w:lineRule="auto"/>
+      <w:ind w:firstLine="0"/>
+      <w:jc w:val="right"/>
+    </w:pPr>
+    <w:r>
+      <w:rPr>
+        <w:sz w:val="24"/>
+        <w:rFonts w:ascii="Times New Roman" w:hAnsi="Times New Roman" w:cs="Times New Roman" w:eastAsia="Times New Roman"/>
+      </w:rPr>
+      <w:fldChar w:fldCharType="begin"/>
+    </w:r>
+    <w:r>
+      <w:rPr>
+        <w:sz w:val="24"/>
+        <w:rFonts w:ascii="Times New Roman" w:hAnsi="Times New Roman" w:cs="Times New Roman" w:eastAsia="Times New Roman"/>
+      </w:rPr>
+      <w:instrText xml:space="preserve"> PAGE </w:instrText>
+    </w:r>
+    <w:r>
+      <w:rPr>
+        <w:sz w:val="24"/>
+        <w:rFonts w:ascii="Times New Roman" w:hAnsi="Times New Roman" w:cs="Times New Roman" w:eastAsia="Times New Roman"/>
+      </w:rPr>
+      <w:fldChar w:fldCharType="separate"/>
+    </w:r>
+    <w:r>
+      <w:rPr>
+        <w:sz w:val="24"/>
+        <w:rFonts w:ascii="Times New Roman" w:hAnsi="Times New Roman" w:cs="Times New Roman" w:eastAsia="Times New Roman"/>
+      </w:rPr>
+      <w:t>1</w:t>
+    </w:r>
+    <w:r>
+      <w:rPr>
+        <w:sz w:val="24"/>
+        <w:rFonts w:ascii="Times New Roman" w:hAnsi="Times New Roman" w:cs="Times New Roman" w:eastAsia="Times New Roman"/>
+      </w:rPr>
+      <w:fldChar w:fldCharType="end"/>
+    </w:r>
+  </w:p>
 </w:hdr>
 </file>
 

</xml_diff>